<commit_message>
Nuevos formatos Limite en ads, comisiones, compromisos adiccionales.
</commit_message>
<xml_diff>
--- a/formatos/New_draft/acuerdo_con_ads_juridica.docx
+++ b/formatos/New_draft/acuerdo_con_ads_juridica.docx
@@ -105,7 +105,7 @@
           <w:szCs w:val="23"/>
           <w:highlight w:val="yellow"/>
         </w:rPr>
-        <w:t xml:space="preserve">{{ </w:t>
+        <w:t xml:space="preserve">{{ RAZÓN_SOCIAL_ENCABEZADO }}</w:t>
       </w:r>
       <w:proofErr w:type="spellStart"/>
       <w:r>
@@ -117,18 +117,18 @@
           <w:szCs w:val="23"/>
           <w:highlight w:val="yellow"/>
         </w:rPr>
-        <w:t>RAZÓN_SOCIAL</w:t>
-      </w:r>
-      <w:r>
-        <w:rPr>
-          <w:rFonts w:ascii="Garamond" w:eastAsia="Garamond" w:hAnsi="Garamond" w:cs="Garamond"/>
-          <w:b/>
-          <w:bCs/>
-          <w:sz w:val="23"/>
-          <w:szCs w:val="23"/>
-          <w:highlight w:val="yellow"/>
-        </w:rPr>
-        <w:t>|upper</w:t>
+        <w:t/>
+      </w:r>
+      <w:r>
+        <w:rPr>
+          <w:rFonts w:ascii="Garamond" w:eastAsia="Garamond" w:hAnsi="Garamond" w:cs="Garamond"/>
+          <w:b/>
+          <w:bCs/>
+          <w:sz w:val="23"/>
+          <w:szCs w:val="23"/>
+          <w:highlight w:val="yellow"/>
+        </w:rPr>
+        <w:t/>
       </w:r>
       <w:proofErr w:type="spellEnd"/>
       <w:r>
@@ -140,7 +140,7 @@
           <w:szCs w:val="23"/>
           <w:highlight w:val="yellow"/>
         </w:rPr>
-        <w:t xml:space="preserve"> }}</w:t>
+        <w:t xml:space="preserve"/>
       </w:r>
       <w:r>
         <w:rPr>
@@ -3996,15 +3996,15 @@
         <w:rPr>
           <w:rFonts w:ascii="Garamond" w:eastAsia="Garamond" w:hAnsi="Garamond" w:cs="Garamond"/>
         </w:rPr>
-        <w:t xml:space="preserve"> Eliminar todo el software que pertenezca a Rappi una vez cese el uso de la Plataforma Rappi por parte del Aliado Comercial; y </w:t>
-      </w:r>
-      <w:r>
-        <w:rPr>
-          <w:rFonts w:ascii="Garamond" w:eastAsia="Garamond" w:hAnsi="Garamond" w:cs="Garamond"/>
-          <w:b/>
-          <w:bCs/>
-        </w:rPr>
-        <w:t>(</w:t>
+        <w:t xml:space="preserve"> Eliminar todo el software que pertenezca a Rappi una vez cese el uso de la Plataforma Rappi por parte del Aliado Comercial; y {{ ROM_ADS }} {% if tipo_ads == 'aliado' %}</w:t>
+      </w:r>
+      <w:r>
+        <w:rPr>
+          <w:rFonts w:ascii="Garamond" w:eastAsia="Garamond" w:hAnsi="Garamond" w:cs="Garamond"/>
+          <w:b/>
+          <w:bCs/>
+        </w:rPr>
+        <w:t/>
       </w:r>
       <w:proofErr w:type="spellStart"/>
       <w:r>
@@ -4013,7 +4013,7 @@
           <w:b/>
           <w:bCs/>
         </w:rPr>
-        <w:t>xviii</w:t>
+        <w:t/>
       </w:r>
       <w:proofErr w:type="spellEnd"/>
       <w:r>
@@ -4022,22 +4022,22 @@
           <w:b/>
           <w:bCs/>
         </w:rPr>
-        <w:t>)</w:t>
-      </w:r>
-      <w:r>
-        <w:rPr>
-          <w:rFonts w:ascii="Garamond" w:eastAsia="Garamond" w:hAnsi="Garamond" w:cs="Garamond"/>
-          <w:b/>
-          <w:bCs/>
-        </w:rPr>
-        <w:t xml:space="preserve"> </w:t>
-      </w:r>
-      <w:r>
-        <w:rPr>
-          <w:rFonts w:ascii="Garamond" w:eastAsia="Garamond" w:hAnsi="Garamond" w:cs="Garamond"/>
-          <w:highlight w:val="yellow"/>
-        </w:rPr>
-        <w:t xml:space="preserve">{%p </w:t>
+        <w:t/>
+      </w:r>
+      <w:r>
+        <w:rPr>
+          <w:rFonts w:ascii="Garamond" w:eastAsia="Garamond" w:hAnsi="Garamond" w:cs="Garamond"/>
+          <w:b/>
+          <w:bCs/>
+        </w:rPr>
+        <w:t xml:space="preserve"/>
+      </w:r>
+      <w:r>
+        <w:rPr>
+          <w:rFonts w:ascii="Garamond" w:eastAsia="Garamond" w:hAnsi="Garamond" w:cs="Garamond"/>
+          <w:highlight w:val="yellow"/>
+        </w:rPr>
+        <w:t xml:space="preserve"/>
       </w:r>
       <w:proofErr w:type="spellStart"/>
       <w:r>
@@ -4045,7 +4045,7 @@
           <w:rFonts w:ascii="Garamond" w:eastAsia="Garamond" w:hAnsi="Garamond" w:cs="Garamond"/>
           <w:highlight w:val="yellow"/>
         </w:rPr>
-        <w:t>if</w:t>
+        <w:t/>
       </w:r>
       <w:proofErr w:type="spellEnd"/>
       <w:r>
@@ -4053,7 +4053,7 @@
           <w:rFonts w:ascii="Garamond" w:eastAsia="Garamond" w:hAnsi="Garamond" w:cs="Garamond"/>
           <w:highlight w:val="yellow"/>
         </w:rPr>
-        <w:t xml:space="preserve"> </w:t>
+        <w:t xml:space="preserve"/>
       </w:r>
       <w:proofErr w:type="spellStart"/>
       <w:r>
@@ -4061,7 +4061,7 @@
           <w:rFonts w:ascii="Garamond" w:eastAsia="Garamond" w:hAnsi="Garamond" w:cs="Garamond"/>
           <w:highlight w:val="yellow"/>
         </w:rPr>
-        <w:t>tipo_ads</w:t>
+        <w:t/>
       </w:r>
       <w:proofErr w:type="spellEnd"/>
       <w:r>
@@ -4069,52 +4069,52 @@
           <w:rFonts w:ascii="Garamond" w:eastAsia="Garamond" w:hAnsi="Garamond" w:cs="Garamond"/>
           <w:highlight w:val="yellow"/>
         </w:rPr>
-        <w:t xml:space="preserve"> == </w:t>
-      </w:r>
-      <w:r>
-        <w:rPr>
-          <w:rFonts w:ascii="Garamond" w:eastAsia="Garamond" w:hAnsi="Garamond" w:cs="Garamond"/>
-          <w:sz w:val="23"/>
-          <w:szCs w:val="23"/>
-          <w:highlight w:val="yellow"/>
-        </w:rPr>
-        <w:t>'</w:t>
-      </w:r>
-      <w:r>
-        <w:rPr>
-          <w:rFonts w:ascii="Garamond" w:eastAsia="Garamond" w:hAnsi="Garamond" w:cs="Garamond"/>
-          <w:highlight w:val="yellow"/>
-        </w:rPr>
-        <w:t>aliado</w:t>
-      </w:r>
-      <w:r>
-        <w:rPr>
-          <w:rFonts w:ascii="Garamond" w:eastAsia="Garamond" w:hAnsi="Garamond" w:cs="Garamond"/>
-          <w:sz w:val="23"/>
-          <w:szCs w:val="23"/>
-          <w:highlight w:val="yellow"/>
-        </w:rPr>
-        <w:t>'</w:t>
-      </w:r>
-      <w:r>
-        <w:rPr>
-          <w:rFonts w:ascii="Garamond" w:eastAsia="Garamond" w:hAnsi="Garamond" w:cs="Garamond"/>
-        </w:rPr>
-        <w:t xml:space="preserve"> </w:t>
-      </w:r>
-      <w:r>
-        <w:rPr>
-          <w:rFonts w:ascii="Garamond" w:eastAsia="Garamond" w:hAnsi="Garamond" w:cs="Garamond"/>
-          <w:highlight w:val="yellow"/>
-        </w:rPr>
-        <w:t>%</w:t>
-      </w:r>
-      <w:r>
-        <w:rPr>
-          <w:rFonts w:ascii="Garamond" w:eastAsia="Garamond" w:hAnsi="Garamond" w:cs="Garamond"/>
-          <w:highlight w:val="yellow"/>
-        </w:rPr>
-        <w:t>}</w:t>
+        <w:t xml:space="preserve"/>
+      </w:r>
+      <w:r>
+        <w:rPr>
+          <w:rFonts w:ascii="Garamond" w:eastAsia="Garamond" w:hAnsi="Garamond" w:cs="Garamond"/>
+          <w:sz w:val="23"/>
+          <w:szCs w:val="23"/>
+          <w:highlight w:val="yellow"/>
+        </w:rPr>
+        <w:t/>
+      </w:r>
+      <w:r>
+        <w:rPr>
+          <w:rFonts w:ascii="Garamond" w:eastAsia="Garamond" w:hAnsi="Garamond" w:cs="Garamond"/>
+          <w:highlight w:val="yellow"/>
+        </w:rPr>
+        <w:t/>
+      </w:r>
+      <w:r>
+        <w:rPr>
+          <w:rFonts w:ascii="Garamond" w:eastAsia="Garamond" w:hAnsi="Garamond" w:cs="Garamond"/>
+          <w:sz w:val="23"/>
+          <w:szCs w:val="23"/>
+          <w:highlight w:val="yellow"/>
+        </w:rPr>
+        <w:t/>
+      </w:r>
+      <w:r>
+        <w:rPr>
+          <w:rFonts w:ascii="Garamond" w:eastAsia="Garamond" w:hAnsi="Garamond" w:cs="Garamond"/>
+        </w:rPr>
+        <w:t xml:space="preserve"/>
+      </w:r>
+      <w:r>
+        <w:rPr>
+          <w:rFonts w:ascii="Garamond" w:eastAsia="Garamond" w:hAnsi="Garamond" w:cs="Garamond"/>
+          <w:highlight w:val="yellow"/>
+        </w:rPr>
+        <w:t/>
+      </w:r>
+      <w:r>
+        <w:rPr>
+          <w:rFonts w:ascii="Garamond" w:eastAsia="Garamond" w:hAnsi="Garamond" w:cs="Garamond"/>
+          <w:highlight w:val="yellow"/>
+        </w:rPr>
+        <w:t/>
       </w:r>
       <w:r>
         <w:rPr>
@@ -4207,21 +4207,972 @@
           <w:rFonts w:ascii="Garamond" w:eastAsia="Garamond" w:hAnsi="Garamond" w:cs="Garamond"/>
           <w:highlight w:val="yellow"/>
         </w:rPr>
+        <w:t xml:space="preserve">{% elif tipo_ads == 'aliado_y_rappi' %}</w:t>
+      </w:r>
+      <w:proofErr w:type="spellStart"/>
+      <w:r>
+        <w:rPr>
+          <w:rFonts w:ascii="Garamond" w:eastAsia="Garamond" w:hAnsi="Garamond" w:cs="Garamond"/>
+          <w:highlight w:val="yellow"/>
+        </w:rPr>
+        <w:t/>
+      </w:r>
+      <w:proofErr w:type="spellEnd"/>
+      <w:r>
+        <w:rPr>
+          <w:rFonts w:ascii="Garamond" w:eastAsia="Garamond" w:hAnsi="Garamond" w:cs="Garamond"/>
+          <w:highlight w:val="yellow"/>
+        </w:rPr>
+        <w:t xml:space="preserve"/>
+      </w:r>
+      <w:proofErr w:type="spellStart"/>
+      <w:r>
+        <w:rPr>
+          <w:rFonts w:ascii="Garamond" w:eastAsia="Garamond" w:hAnsi="Garamond" w:cs="Garamond"/>
+          <w:highlight w:val="yellow"/>
+        </w:rPr>
+        <w:t/>
+      </w:r>
+      <w:proofErr w:type="spellEnd"/>
+      <w:r>
+        <w:rPr>
+          <w:rFonts w:ascii="Garamond" w:eastAsia="Garamond" w:hAnsi="Garamond" w:cs="Garamond"/>
+          <w:highlight w:val="yellow"/>
+        </w:rPr>
+        <w:t xml:space="preserve"/>
+      </w:r>
+      <w:r>
+        <w:rPr>
+          <w:rFonts w:ascii="Garamond" w:eastAsia="Garamond" w:hAnsi="Garamond" w:cs="Garamond"/>
+          <w:sz w:val="23"/>
+          <w:szCs w:val="23"/>
+          <w:highlight w:val="yellow"/>
+        </w:rPr>
+        <w:t/>
+      </w:r>
+      <w:proofErr w:type="spellStart"/>
+      <w:r>
+        <w:rPr>
+          <w:rFonts w:ascii="Garamond" w:eastAsia="Garamond" w:hAnsi="Garamond" w:cs="Garamond"/>
+          <w:sz w:val="23"/>
+          <w:szCs w:val="23"/>
+          <w:highlight w:val="yellow"/>
+        </w:rPr>
+        <w:t/>
+      </w:r>
+      <w:proofErr w:type="spellEnd"/>
+      <w:r>
+        <w:rPr>
+          <w:rFonts w:ascii="Garamond" w:eastAsia="Garamond" w:hAnsi="Garamond" w:cs="Garamond"/>
+          <w:sz w:val="23"/>
+          <w:szCs w:val="23"/>
+          <w:highlight w:val="yellow"/>
+        </w:rPr>
+        <w:t/>
+      </w:r>
+      <w:r>
+        <w:rPr>
+          <w:rFonts w:ascii="Garamond" w:eastAsia="Garamond" w:hAnsi="Garamond" w:cs="Garamond"/>
+          <w:highlight w:val="yellow"/>
+        </w:rPr>
+        <w:t xml:space="preserve"/>
+      </w:r>
+      <w:r>
+        <w:rPr>
+          <w:rFonts w:ascii="Garamond" w:eastAsia="Garamond" w:hAnsi="Garamond" w:cs="Garamond"/>
+        </w:rPr>
+        <w:t xml:space="preserve"> </w:t>
+      </w:r>
+      <w:r>
+        <w:rPr>
+          <w:rFonts w:ascii="Garamond" w:eastAsia="Garamond" w:hAnsi="Garamond" w:cs="Garamond"/>
+        </w:rPr>
+        <w:t xml:space="preserve">El Aliado realizará una inversión mensual en </w:t>
+      </w:r>
+      <w:proofErr w:type="spellStart"/>
+      <w:r>
+        <w:rPr>
+          <w:rFonts w:ascii="Garamond" w:eastAsia="Garamond" w:hAnsi="Garamond" w:cs="Garamond"/>
+        </w:rPr>
+        <w:t>Ads</w:t>
+      </w:r>
+      <w:proofErr w:type="spellEnd"/>
+      <w:r>
+        <w:rPr>
+          <w:rFonts w:ascii="Garamond" w:eastAsia="Garamond" w:hAnsi="Garamond" w:cs="Garamond"/>
+        </w:rPr>
+        <w:t xml:space="preserve"> equivalente al </w:t>
+      </w:r>
+      <w:proofErr w:type="gramStart"/>
+      <w:r>
+        <w:rPr>
+          <w:rFonts w:ascii="Garamond" w:eastAsia="Garamond" w:hAnsi="Garamond" w:cs="Garamond"/>
+          <w:highlight w:val="yellow"/>
+          <w:lang w:val="es-ES"/>
+        </w:rPr>
+        <w:t>{{ N</w:t>
+      </w:r>
+      <w:proofErr w:type="gramEnd"/>
+      <w:r>
+        <w:rPr>
+          <w:rFonts w:ascii="Garamond" w:eastAsia="Garamond" w:hAnsi="Garamond" w:cs="Garamond"/>
+          <w:highlight w:val="yellow"/>
+          <w:lang w:val="es-ES"/>
+        </w:rPr>
+        <w:t>_</w:t>
+      </w:r>
+      <w:proofErr w:type="gramStart"/>
+      <w:r>
+        <w:rPr>
+          <w:rFonts w:ascii="Garamond" w:eastAsia="Garamond" w:hAnsi="Garamond" w:cs="Garamond"/>
+          <w:highlight w:val="yellow"/>
+          <w:lang w:val="es-ES"/>
+        </w:rPr>
+        <w:t>ADS }</w:t>
+      </w:r>
+      <w:proofErr w:type="gramEnd"/>
+      <w:r>
+        <w:rPr>
+          <w:rFonts w:ascii="Garamond" w:eastAsia="Garamond" w:hAnsi="Garamond" w:cs="Garamond"/>
+          <w:highlight w:val="yellow"/>
+          <w:lang w:val="es-ES"/>
+        </w:rPr>
+        <w:t>}</w:t>
+      </w:r>
+      <w:r>
+        <w:rPr>
+          <w:rFonts w:ascii="Garamond" w:eastAsia="Garamond" w:hAnsi="Garamond" w:cs="Garamond"/>
+          <w:lang w:val="es-ES"/>
+        </w:rPr>
+        <w:t xml:space="preserve"> % </w:t>
+      </w:r>
+      <w:r>
+        <w:rPr>
+          <w:rFonts w:ascii="Garamond" w:eastAsia="Garamond" w:hAnsi="Garamond" w:cs="Garamond"/>
+          <w:highlight w:val="yellow"/>
+          <w:lang w:val="es-ES"/>
+        </w:rPr>
+        <w:t>(</w:t>
+      </w:r>
+      <w:proofErr w:type="gramStart"/>
+      <w:r>
+        <w:rPr>
+          <w:rFonts w:ascii="Garamond" w:eastAsia="Garamond" w:hAnsi="Garamond" w:cs="Garamond"/>
+          <w:highlight w:val="yellow"/>
+          <w:lang w:val="es-ES"/>
+        </w:rPr>
+        <w:t>{{ VALOR</w:t>
+      </w:r>
+      <w:proofErr w:type="gramEnd"/>
+      <w:r>
+        <w:rPr>
+          <w:rFonts w:ascii="Garamond" w:eastAsia="Garamond" w:hAnsi="Garamond" w:cs="Garamond"/>
+          <w:highlight w:val="yellow"/>
+          <w:lang w:val="es-ES"/>
+        </w:rPr>
+        <w:t>_</w:t>
+      </w:r>
+      <w:proofErr w:type="gramStart"/>
+      <w:r>
+        <w:rPr>
+          <w:rFonts w:ascii="Garamond" w:eastAsia="Garamond" w:hAnsi="Garamond" w:cs="Garamond"/>
+          <w:highlight w:val="yellow"/>
+          <w:lang w:val="es-ES"/>
+        </w:rPr>
+        <w:t>ADS }</w:t>
+      </w:r>
+      <w:proofErr w:type="gramEnd"/>
+      <w:r>
+        <w:rPr>
+          <w:rFonts w:ascii="Garamond" w:eastAsia="Garamond" w:hAnsi="Garamond" w:cs="Garamond"/>
+          <w:highlight w:val="yellow"/>
+          <w:lang w:val="es-ES"/>
+        </w:rPr>
+        <w:t>})</w:t>
+      </w:r>
+      <w:r>
+        <w:rPr>
+          <w:rFonts w:ascii="Garamond" w:eastAsia="Garamond" w:hAnsi="Garamond" w:cs="Garamond"/>
+        </w:rPr>
+        <w:t xml:space="preserve"> de sus ventas totales en la Plataforma Rappi del mes anterior y Rappi realizará una inversión mensual en </w:t>
+      </w:r>
+      <w:proofErr w:type="spellStart"/>
+      <w:r>
+        <w:rPr>
+          <w:rFonts w:ascii="Garamond" w:eastAsia="Garamond" w:hAnsi="Garamond" w:cs="Garamond"/>
+        </w:rPr>
+        <w:t>Ads</w:t>
+      </w:r>
+      <w:proofErr w:type="spellEnd"/>
+      <w:r>
+        <w:rPr>
+          <w:rFonts w:ascii="Garamond" w:eastAsia="Garamond" w:hAnsi="Garamond" w:cs="Garamond"/>
+        </w:rPr>
+        <w:t xml:space="preserve"> </w:t>
+      </w:r>
+      <w:r>
+        <w:rPr>
+          <w:rFonts w:ascii="Garamond" w:eastAsia="Garamond" w:hAnsi="Garamond" w:cs="Garamond"/>
+        </w:rPr>
+        <w:t xml:space="preserve">equivalente al </w:t>
+      </w:r>
+      <w:proofErr w:type="gramStart"/>
+      <w:r>
+        <w:rPr>
+          <w:rFonts w:ascii="Garamond" w:eastAsia="Garamond" w:hAnsi="Garamond" w:cs="Garamond"/>
+          <w:highlight w:val="yellow"/>
+        </w:rPr>
+        <w:t>{{ N</w:t>
+      </w:r>
+      <w:proofErr w:type="gramEnd"/>
+      <w:r>
+        <w:rPr>
+          <w:rFonts w:ascii="Garamond" w:eastAsia="Garamond" w:hAnsi="Garamond" w:cs="Garamond"/>
+          <w:highlight w:val="yellow"/>
+        </w:rPr>
+        <w:t>_ADS_</w:t>
+      </w:r>
+      <w:proofErr w:type="gramStart"/>
+      <w:r>
+        <w:rPr>
+          <w:rFonts w:ascii="Garamond" w:eastAsia="Garamond" w:hAnsi="Garamond" w:cs="Garamond"/>
+          <w:highlight w:val="yellow"/>
+        </w:rPr>
+        <w:t>RAPPI }}</w:t>
+      </w:r>
+      <w:r>
+        <w:rPr>
+          <w:rFonts w:ascii="Garamond" w:eastAsia="Garamond" w:hAnsi="Garamond" w:cs="Garamond"/>
+        </w:rPr>
+        <w:t>%</w:t>
+      </w:r>
+      <w:proofErr w:type="gramEnd"/>
+      <w:r>
+        <w:rPr>
+          <w:rFonts w:ascii="Garamond" w:eastAsia="Garamond" w:hAnsi="Garamond" w:cs="Garamond"/>
+        </w:rPr>
+        <w:t xml:space="preserve"> </w:t>
+      </w:r>
+      <w:r>
+        <w:rPr>
+          <w:rFonts w:ascii="Garamond" w:eastAsia="Garamond" w:hAnsi="Garamond" w:cs="Garamond"/>
+          <w:highlight w:val="yellow"/>
+        </w:rPr>
+        <w:t>(</w:t>
+      </w:r>
+      <w:proofErr w:type="gramStart"/>
+      <w:r>
+        <w:rPr>
+          <w:rFonts w:ascii="Garamond" w:eastAsia="Garamond" w:hAnsi="Garamond" w:cs="Garamond"/>
+          <w:highlight w:val="yellow"/>
+        </w:rPr>
+        <w:t>{{ VALOR</w:t>
+      </w:r>
+      <w:proofErr w:type="gramEnd"/>
+      <w:r>
+        <w:rPr>
+          <w:rFonts w:ascii="Garamond" w:eastAsia="Garamond" w:hAnsi="Garamond" w:cs="Garamond"/>
+          <w:highlight w:val="yellow"/>
+        </w:rPr>
+        <w:t>_ADS_</w:t>
+      </w:r>
+      <w:proofErr w:type="gramStart"/>
+      <w:r>
+        <w:rPr>
+          <w:rFonts w:ascii="Garamond" w:eastAsia="Garamond" w:hAnsi="Garamond" w:cs="Garamond"/>
+          <w:highlight w:val="yellow"/>
+        </w:rPr>
+        <w:t>RAPPI }</w:t>
+      </w:r>
+      <w:proofErr w:type="gramEnd"/>
+      <w:r>
+        <w:rPr>
+          <w:rFonts w:ascii="Garamond" w:eastAsia="Garamond" w:hAnsi="Garamond" w:cs="Garamond"/>
+          <w:highlight w:val="yellow"/>
+        </w:rPr>
+        <w:t>}</w:t>
+      </w:r>
+      <w:r>
+        <w:rPr>
+          <w:rFonts w:ascii="Garamond" w:eastAsia="Garamond" w:hAnsi="Garamond" w:cs="Garamond"/>
+          <w:highlight w:val="yellow"/>
+        </w:rPr>
+        <w:t>)</w:t>
+      </w:r>
+      <w:r>
+        <w:rPr>
+          <w:rFonts w:ascii="Garamond" w:eastAsia="Garamond" w:hAnsi="Garamond" w:cs="Garamond"/>
+        </w:rPr>
+        <w:t xml:space="preserve"> de las ventas totales del Aliado en la Plataforma Rappi del mes anterior. Rappi activará los </w:t>
+      </w:r>
+      <w:proofErr w:type="spellStart"/>
+      <w:r>
+        <w:rPr>
+          <w:rFonts w:ascii="Garamond" w:eastAsia="Garamond" w:hAnsi="Garamond" w:cs="Garamond"/>
+        </w:rPr>
+        <w:t>Ads</w:t>
+      </w:r>
+      <w:proofErr w:type="spellEnd"/>
+      <w:r>
+        <w:rPr>
+          <w:rFonts w:ascii="Garamond" w:eastAsia="Garamond" w:hAnsi="Garamond" w:cs="Garamond"/>
+        </w:rPr>
+        <w:t xml:space="preserve"> en las fechas acordadas por las Partes, sujetándose su ejecución y cobro a los términos disponibles en https://legal.rappi.com.co/mexico/terminos-y-condiciones-ads-vertical-restaurantes-mexico Solo se facturarán los </w:t>
+      </w:r>
+      <w:proofErr w:type="spellStart"/>
+      <w:r>
+        <w:rPr>
+          <w:rFonts w:ascii="Garamond" w:eastAsia="Garamond" w:hAnsi="Garamond" w:cs="Garamond"/>
+        </w:rPr>
+        <w:t>Clicks</w:t>
+      </w:r>
+      <w:proofErr w:type="spellEnd"/>
+      <w:r>
+        <w:rPr>
+          <w:rFonts w:ascii="Garamond" w:eastAsia="Garamond" w:hAnsi="Garamond" w:cs="Garamond"/>
+        </w:rPr>
+        <w:t xml:space="preserve"> efectivamente ejecutados. {% endif %}</w:t>
+      </w:r>
+    </w:p>
+    <w:p>
+      <w:pPr>
+        <w:jc w:val="both"/>
+        <w:rPr>
+          <w:rFonts w:ascii="Garamond" w:eastAsia="Garamond" w:hAnsi="Garamond" w:cs="Garamond"/>
+          <w:sz w:val="23"/>
+          <w:szCs w:val="23"/>
+          <w:lang w:val="es-ES"/>
+        </w:rPr>
+      </w:pPr>
+      <w:r>
+        <w:rPr>
+          <w:rFonts w:ascii="Garamond" w:eastAsia="Garamond" w:hAnsi="Garamond" w:cs="Garamond"/>
+          <w:sz w:val="23"/>
+          <w:szCs w:val="23"/>
+          <w:highlight w:val="yellow"/>
+          <w:lang w:val="es-ES"/>
+        </w:rPr>
+        <w:t xml:space="preserve">{%p if activa_descuento_menu %}</w:t>
+      </w:r>
+      <w:proofErr w:type="spellStart"/>
+      <w:r>
+        <w:rPr>
+          <w:rFonts w:ascii="Garamond" w:eastAsia="Garamond" w:hAnsi="Garamond" w:cs="Garamond"/>
+          <w:sz w:val="23"/>
+          <w:szCs w:val="23"/>
+          <w:highlight w:val="yellow"/>
+          <w:lang w:val="es-ES"/>
+        </w:rPr>
+        <w:t/>
+      </w:r>
+      <w:proofErr w:type="spellEnd"/>
+      <w:r>
+        <w:rPr>
+          <w:rFonts w:ascii="Garamond" w:eastAsia="Garamond" w:hAnsi="Garamond" w:cs="Garamond"/>
+          <w:sz w:val="23"/>
+          <w:szCs w:val="23"/>
+          <w:highlight w:val="yellow"/>
+          <w:lang w:val="es-ES"/>
+        </w:rPr>
+        <w:t xml:space="preserve"/>
+      </w:r>
+      <w:proofErr w:type="spellStart"/>
+      <w:r>
+        <w:rPr>
+          <w:rFonts w:ascii="Garamond" w:eastAsia="Garamond" w:hAnsi="Garamond" w:cs="Garamond"/>
+          <w:sz w:val="23"/>
+          <w:szCs w:val="23"/>
+          <w:highlight w:val="yellow"/>
+          <w:lang w:val="es-ES"/>
+        </w:rPr>
+        <w:t/>
+      </w:r>
+      <w:r>
+        <w:rPr>
+          <w:rFonts w:ascii="Garamond" w:eastAsia="Garamond" w:hAnsi="Garamond" w:cs="Garamond"/>
+          <w:sz w:val="23"/>
+          <w:szCs w:val="23"/>
+          <w:highlight w:val="yellow"/>
+          <w:lang w:val="es-ES"/>
+        </w:rPr>
+        <w:t/>
+      </w:r>
+      <w:r>
+        <w:rPr>
+          <w:rFonts w:ascii="Garamond" w:eastAsia="Garamond" w:hAnsi="Garamond" w:cs="Garamond"/>
+          <w:sz w:val="23"/>
+          <w:szCs w:val="23"/>
+          <w:highlight w:val="yellow"/>
+          <w:lang w:val="es-ES"/>
+        </w:rPr>
+        <w:t/>
+      </w:r>
+      <w:proofErr w:type="spellEnd"/>
+      <w:r>
+        <w:rPr>
+          <w:rFonts w:ascii="Garamond" w:eastAsia="Garamond" w:hAnsi="Garamond" w:cs="Garamond"/>
+          <w:sz w:val="23"/>
+          <w:szCs w:val="23"/>
+          <w:highlight w:val="yellow"/>
+          <w:lang w:val="es-ES"/>
+        </w:rPr>
+        <w:t xml:space="preserve"/>
+      </w:r>
+    </w:p>
+    <w:p>
+      <w:pPr>
+        <w:jc w:val="both"/>
+        <w:rPr>
+          <w:rFonts w:ascii="Garamond" w:eastAsia="Garamond" w:hAnsi="Garamond" w:cs="Garamond"/>
+          <w:sz w:val="23"/>
+          <w:szCs w:val="23"/>
+        </w:rPr>
+      </w:pPr>
+      <w:r>
+        <w:rPr>
+          <w:rFonts w:ascii="Garamond" w:eastAsia="Garamond" w:hAnsi="Garamond" w:cs="Garamond"/>
+          <w:sz w:val="23"/>
+          <w:szCs w:val="23"/>
+        </w:rPr>
+        <w:t xml:space="preserve">{{ ROM_DESCUENTO_MENU }} Realizar un descuento de por lo menos el </w:t>
+      </w:r>
+      <w:proofErr w:type="gramStart"/>
+      <w:r>
+        <w:rPr>
+          <w:rFonts w:ascii="Garamond" w:eastAsia="Garamond" w:hAnsi="Garamond" w:cs="Garamond"/>
+          <w:sz w:val="23"/>
+          <w:szCs w:val="23"/>
+          <w:highlight w:val="yellow"/>
+        </w:rPr>
+        <w:t>{{ N</w:t>
+      </w:r>
+      <w:proofErr w:type="gramEnd"/>
+      <w:r>
+        <w:rPr>
+          <w:rFonts w:ascii="Garamond" w:eastAsia="Garamond" w:hAnsi="Garamond" w:cs="Garamond"/>
+          <w:sz w:val="23"/>
+          <w:szCs w:val="23"/>
+          <w:highlight w:val="yellow"/>
+        </w:rPr>
+        <w:t>_DESCUENTO_</w:t>
+      </w:r>
+      <w:proofErr w:type="gramStart"/>
+      <w:r>
+        <w:rPr>
+          <w:rFonts w:ascii="Garamond" w:eastAsia="Garamond" w:hAnsi="Garamond" w:cs="Garamond"/>
+          <w:sz w:val="23"/>
+          <w:szCs w:val="23"/>
+          <w:highlight w:val="yellow"/>
+        </w:rPr>
+        <w:t>MENU }}</w:t>
+      </w:r>
+      <w:r>
+        <w:rPr>
+          <w:rFonts w:ascii="Garamond" w:eastAsia="Garamond" w:hAnsi="Garamond" w:cs="Garamond"/>
+          <w:sz w:val="23"/>
+          <w:szCs w:val="23"/>
+        </w:rPr>
+        <w:t>%</w:t>
+      </w:r>
+      <w:proofErr w:type="gramEnd"/>
+      <w:r>
+        <w:rPr>
+          <w:rFonts w:ascii="Garamond" w:eastAsia="Garamond" w:hAnsi="Garamond" w:cs="Garamond"/>
+          <w:sz w:val="23"/>
+          <w:szCs w:val="23"/>
+        </w:rPr>
+        <w:t xml:space="preserve"> (</w:t>
+      </w:r>
+      <w:proofErr w:type="gramStart"/>
+      <w:r>
+        <w:rPr>
+          <w:rFonts w:ascii="Garamond" w:eastAsia="Garamond" w:hAnsi="Garamond" w:cs="Garamond"/>
+          <w:sz w:val="23"/>
+          <w:szCs w:val="23"/>
+          <w:highlight w:val="yellow"/>
+        </w:rPr>
+        <w:t xml:space="preserve">{{ </w:t>
+      </w:r>
+      <w:proofErr w:type="spellStart"/>
+      <w:r>
+        <w:rPr>
+          <w:rFonts w:ascii="Garamond" w:eastAsia="Garamond" w:hAnsi="Garamond" w:cs="Garamond"/>
+          <w:sz w:val="23"/>
+          <w:szCs w:val="23"/>
+          <w:highlight w:val="yellow"/>
+        </w:rPr>
+        <w:t>VALOR</w:t>
+      </w:r>
+      <w:proofErr w:type="gramEnd"/>
+      <w:r>
+        <w:rPr>
+          <w:rFonts w:ascii="Garamond" w:eastAsia="Garamond" w:hAnsi="Garamond" w:cs="Garamond"/>
+          <w:sz w:val="23"/>
+          <w:szCs w:val="23"/>
+          <w:highlight w:val="yellow"/>
+        </w:rPr>
+        <w:t>_DESCUENTO_MENU</w:t>
+      </w:r>
+      <w:r>
+        <w:rPr>
+          <w:rFonts w:ascii="Garamond" w:eastAsia="Garamond" w:hAnsi="Garamond" w:cs="Garamond"/>
+          <w:sz w:val="23"/>
+          <w:szCs w:val="23"/>
+          <w:highlight w:val="yellow"/>
+        </w:rPr>
+        <w:t>|</w:t>
+      </w:r>
+      <w:proofErr w:type="gramStart"/>
+      <w:r>
+        <w:rPr>
+          <w:rFonts w:ascii="Garamond" w:eastAsia="Garamond" w:hAnsi="Garamond" w:cs="Garamond"/>
+          <w:sz w:val="23"/>
+          <w:szCs w:val="23"/>
+          <w:highlight w:val="yellow"/>
+        </w:rPr>
+        <w:t>lower</w:t>
+      </w:r>
+      <w:proofErr w:type="spellEnd"/>
+      <w:r>
+        <w:rPr>
+          <w:rFonts w:ascii="Garamond" w:eastAsia="Garamond" w:hAnsi="Garamond" w:cs="Garamond"/>
+          <w:sz w:val="23"/>
+          <w:szCs w:val="23"/>
+          <w:highlight w:val="yellow"/>
+        </w:rPr>
+        <w:t xml:space="preserve"> }</w:t>
+      </w:r>
+      <w:proofErr w:type="gramEnd"/>
+      <w:r>
+        <w:rPr>
+          <w:rFonts w:ascii="Garamond" w:eastAsia="Garamond" w:hAnsi="Garamond" w:cs="Garamond"/>
+          <w:sz w:val="23"/>
+          <w:szCs w:val="23"/>
+          <w:highlight w:val="yellow"/>
+        </w:rPr>
+        <w:t>}</w:t>
+      </w:r>
+      <w:r>
+        <w:rPr>
+          <w:rFonts w:ascii="Garamond" w:eastAsia="Garamond" w:hAnsi="Garamond" w:cs="Garamond"/>
+          <w:sz w:val="23"/>
+          <w:szCs w:val="23"/>
+        </w:rPr>
+        <w:t xml:space="preserve"> </w:t>
+      </w:r>
+      <w:r>
+        <w:rPr>
+          <w:rFonts w:ascii="Garamond" w:eastAsia="Garamond" w:hAnsi="Garamond" w:cs="Garamond"/>
+          <w:sz w:val="23"/>
+          <w:szCs w:val="23"/>
+        </w:rPr>
+        <w:t xml:space="preserve">por ciento) en todo el menú dentro de la Plataforma Rappi durante los primeros </w:t>
+      </w:r>
+      <w:proofErr w:type="gramStart"/>
+      <w:r>
+        <w:rPr>
+          <w:rFonts w:ascii="Garamond" w:eastAsia="Garamond" w:hAnsi="Garamond" w:cs="Garamond"/>
+          <w:sz w:val="23"/>
+          <w:szCs w:val="23"/>
+          <w:highlight w:val="yellow"/>
+        </w:rPr>
+        <w:t>{{ N</w:t>
+      </w:r>
+      <w:proofErr w:type="gramEnd"/>
+      <w:r>
+        <w:rPr>
+          <w:rFonts w:ascii="Garamond" w:eastAsia="Garamond" w:hAnsi="Garamond" w:cs="Garamond"/>
+          <w:sz w:val="23"/>
+          <w:szCs w:val="23"/>
+          <w:highlight w:val="yellow"/>
+        </w:rPr>
+        <w:t>_MESES_DESCUENTO_</w:t>
+      </w:r>
+      <w:proofErr w:type="gramStart"/>
+      <w:r>
+        <w:rPr>
+          <w:rFonts w:ascii="Garamond" w:eastAsia="Garamond" w:hAnsi="Garamond" w:cs="Garamond"/>
+          <w:sz w:val="23"/>
+          <w:szCs w:val="23"/>
+          <w:highlight w:val="yellow"/>
+        </w:rPr>
+        <w:t>MENU }</w:t>
+      </w:r>
+      <w:proofErr w:type="gramEnd"/>
+      <w:r>
+        <w:rPr>
+          <w:rFonts w:ascii="Garamond" w:eastAsia="Garamond" w:hAnsi="Garamond" w:cs="Garamond"/>
+          <w:sz w:val="23"/>
+          <w:szCs w:val="23"/>
+          <w:highlight w:val="yellow"/>
+        </w:rPr>
+        <w:t>}</w:t>
+      </w:r>
+      <w:r>
+        <w:rPr>
+          <w:rFonts w:ascii="Garamond" w:eastAsia="Garamond" w:hAnsi="Garamond" w:cs="Garamond"/>
+          <w:sz w:val="23"/>
+          <w:szCs w:val="23"/>
+        </w:rPr>
+        <w:t xml:space="preserve"> (</w:t>
+      </w:r>
+      <w:proofErr w:type="gramStart"/>
+      <w:r>
+        <w:rPr>
+          <w:rFonts w:ascii="Garamond" w:eastAsia="Garamond" w:hAnsi="Garamond" w:cs="Garamond"/>
+          <w:sz w:val="23"/>
+          <w:szCs w:val="23"/>
+          <w:highlight w:val="yellow"/>
+        </w:rPr>
+        <w:t xml:space="preserve">{{ </w:t>
+      </w:r>
+      <w:proofErr w:type="spellStart"/>
+      <w:r>
+        <w:rPr>
+          <w:rFonts w:ascii="Garamond" w:eastAsia="Garamond" w:hAnsi="Garamond" w:cs="Garamond"/>
+          <w:sz w:val="23"/>
+          <w:szCs w:val="23"/>
+          <w:highlight w:val="yellow"/>
+        </w:rPr>
+        <w:t>VALOR</w:t>
+      </w:r>
+      <w:proofErr w:type="gramEnd"/>
+      <w:r>
+        <w:rPr>
+          <w:rFonts w:ascii="Garamond" w:eastAsia="Garamond" w:hAnsi="Garamond" w:cs="Garamond"/>
+          <w:sz w:val="23"/>
+          <w:szCs w:val="23"/>
+          <w:highlight w:val="yellow"/>
+        </w:rPr>
+        <w:t>_MES_DESCUENTO_MENU</w:t>
+      </w:r>
+      <w:r>
+        <w:rPr>
+          <w:rFonts w:ascii="Garamond" w:eastAsia="Garamond" w:hAnsi="Garamond" w:cs="Garamond"/>
+          <w:sz w:val="23"/>
+          <w:szCs w:val="23"/>
+          <w:highlight w:val="yellow"/>
+        </w:rPr>
+        <w:t>|</w:t>
+      </w:r>
+      <w:proofErr w:type="gramStart"/>
+      <w:r>
+        <w:rPr>
+          <w:rFonts w:ascii="Garamond" w:eastAsia="Garamond" w:hAnsi="Garamond" w:cs="Garamond"/>
+          <w:sz w:val="23"/>
+          <w:szCs w:val="23"/>
+          <w:highlight w:val="yellow"/>
+        </w:rPr>
+        <w:t>lower</w:t>
+      </w:r>
+      <w:proofErr w:type="spellEnd"/>
+      <w:r>
+        <w:rPr>
+          <w:rFonts w:ascii="Garamond" w:eastAsia="Garamond" w:hAnsi="Garamond" w:cs="Garamond"/>
+          <w:sz w:val="23"/>
+          <w:szCs w:val="23"/>
+          <w:highlight w:val="yellow"/>
+        </w:rPr>
+        <w:t xml:space="preserve"> }</w:t>
+      </w:r>
+      <w:proofErr w:type="gramEnd"/>
+      <w:r>
+        <w:rPr>
+          <w:rFonts w:ascii="Garamond" w:eastAsia="Garamond" w:hAnsi="Garamond" w:cs="Garamond"/>
+          <w:sz w:val="23"/>
+          <w:szCs w:val="23"/>
+          <w:highlight w:val="yellow"/>
+        </w:rPr>
+        <w:t>}</w:t>
+      </w:r>
+      <w:r>
+        <w:rPr>
+          <w:rFonts w:ascii="Garamond" w:eastAsia="Garamond" w:hAnsi="Garamond" w:cs="Garamond"/>
+          <w:sz w:val="23"/>
+          <w:szCs w:val="23"/>
+        </w:rPr>
+        <w:t>) meses de ejecución del presente Acuerdo.</w:t>
+      </w:r>
+    </w:p>
+    <w:p>
+      <w:pPr>
+        <w:jc w:val="both"/>
+        <w:rPr>
+          <w:rFonts w:ascii="Garamond" w:eastAsia="Garamond" w:hAnsi="Garamond" w:cs="Garamond"/>
+          <w:sz w:val="23"/>
+          <w:szCs w:val="23"/>
+          <w:lang w:val="en-US"/>
+        </w:rPr>
+      </w:pPr>
+      <w:r>
+        <w:rPr>
+          <w:rFonts w:ascii="Garamond" w:eastAsia="Garamond" w:hAnsi="Garamond" w:cs="Garamond"/>
+          <w:sz w:val="23"/>
+          <w:szCs w:val="23"/>
+          <w:highlight w:val="yellow"/>
+          <w:lang w:val="en-US"/>
+        </w:rPr>
+        <w:t>{%p endif %}</w:t>
+      </w:r>
+    </w:p>
+    <w:p>
+      <w:pPr>
+        <w:jc w:val="both"/>
+        <w:rPr>
+          <w:rFonts w:ascii="Garamond" w:eastAsia="Garamond" w:hAnsi="Garamond" w:cs="Garamond"/>
+          <w:sz w:val="23"/>
+          <w:szCs w:val="23"/>
+          <w:lang w:val="en-US"/>
+        </w:rPr>
+      </w:pPr>
+      <w:r>
+        <w:rPr>
+          <w:rFonts w:ascii="Garamond" w:eastAsia="Garamond" w:hAnsi="Garamond" w:cs="Garamond"/>
+          <w:sz w:val="23"/>
+          <w:szCs w:val="23"/>
+          <w:highlight w:val="yellow"/>
+          <w:lang w:val="en-US"/>
+        </w:rPr>
+        <w:t xml:space="preserve">{%p if </w:t>
+      </w:r>
+      <w:proofErr w:type="spellStart"/>
+      <w:r>
+        <w:rPr>
+          <w:rFonts w:ascii="Garamond" w:eastAsia="Garamond" w:hAnsi="Garamond" w:cs="Garamond"/>
+          <w:sz w:val="23"/>
+          <w:szCs w:val="23"/>
+          <w:highlight w:val="yellow"/>
+          <w:lang w:val="en-US"/>
+        </w:rPr>
+        <w:t>activa_mark_down</w:t>
+      </w:r>
+      <w:proofErr w:type="spellEnd"/>
+      <w:r>
+        <w:rPr>
+          <w:rFonts w:ascii="Garamond" w:eastAsia="Garamond" w:hAnsi="Garamond" w:cs="Garamond"/>
+          <w:sz w:val="23"/>
+          <w:szCs w:val="23"/>
+          <w:highlight w:val="yellow"/>
+          <w:lang w:val="en-US"/>
+        </w:rPr>
+        <w:t xml:space="preserve"> %}</w:t>
+      </w:r>
+    </w:p>
+    <w:p>
+      <w:pPr>
+        <w:jc w:val="both"/>
+        <w:rPr>
+          <w:rFonts w:ascii="Garamond" w:eastAsia="Garamond" w:hAnsi="Garamond" w:cs="Garamond"/>
+          <w:sz w:val="23"/>
+          <w:szCs w:val="23"/>
+        </w:rPr>
+      </w:pPr>
+      <w:r>
+        <w:rPr>
+          <w:rFonts w:ascii="Garamond" w:eastAsia="Garamond" w:hAnsi="Garamond" w:cs="Garamond"/>
+          <w:sz w:val="23"/>
+          <w:szCs w:val="23"/>
+        </w:rPr>
+        <w:t xml:space="preserve">{{ ROM_MARK_DOWN }} Realizar una inversión mensual en promociones del </w:t>
+      </w:r>
+      <w:proofErr w:type="gramStart"/>
+      <w:r>
+        <w:rPr>
+          <w:rFonts w:ascii="Garamond" w:eastAsia="Garamond" w:hAnsi="Garamond" w:cs="Garamond"/>
+          <w:sz w:val="23"/>
+          <w:szCs w:val="23"/>
+          <w:highlight w:val="yellow"/>
+        </w:rPr>
+        <w:t>{{ N</w:t>
+      </w:r>
+      <w:proofErr w:type="gramEnd"/>
+      <w:r>
+        <w:rPr>
+          <w:rFonts w:ascii="Garamond" w:eastAsia="Garamond" w:hAnsi="Garamond" w:cs="Garamond"/>
+          <w:sz w:val="23"/>
+          <w:szCs w:val="23"/>
+          <w:highlight w:val="yellow"/>
+        </w:rPr>
+        <w:t>_DESCUENTO_MARK_</w:t>
+      </w:r>
+      <w:proofErr w:type="gramStart"/>
+      <w:r>
+        <w:rPr>
+          <w:rFonts w:ascii="Garamond" w:eastAsia="Garamond" w:hAnsi="Garamond" w:cs="Garamond"/>
+          <w:sz w:val="23"/>
+          <w:szCs w:val="23"/>
+          <w:highlight w:val="yellow"/>
+        </w:rPr>
+        <w:t>DOWN }}</w:t>
+      </w:r>
+      <w:r>
+        <w:rPr>
+          <w:rFonts w:ascii="Garamond" w:eastAsia="Garamond" w:hAnsi="Garamond" w:cs="Garamond"/>
+          <w:sz w:val="23"/>
+          <w:szCs w:val="23"/>
+        </w:rPr>
+        <w:t>%</w:t>
+      </w:r>
+      <w:proofErr w:type="gramEnd"/>
+      <w:r>
+        <w:rPr>
+          <w:rFonts w:ascii="Garamond" w:eastAsia="Garamond" w:hAnsi="Garamond" w:cs="Garamond"/>
+          <w:sz w:val="23"/>
+          <w:szCs w:val="23"/>
+        </w:rPr>
+        <w:t xml:space="preserve"> (</w:t>
+      </w:r>
+      <w:proofErr w:type="gramStart"/>
+      <w:r>
+        <w:rPr>
+          <w:rFonts w:ascii="Garamond" w:eastAsia="Garamond" w:hAnsi="Garamond" w:cs="Garamond"/>
+          <w:sz w:val="23"/>
+          <w:szCs w:val="23"/>
+          <w:highlight w:val="yellow"/>
+        </w:rPr>
+        <w:t xml:space="preserve">{{ </w:t>
+      </w:r>
+      <w:proofErr w:type="spellStart"/>
+      <w:r>
+        <w:rPr>
+          <w:rFonts w:ascii="Garamond" w:eastAsia="Garamond" w:hAnsi="Garamond" w:cs="Garamond"/>
+          <w:sz w:val="23"/>
+          <w:szCs w:val="23"/>
+          <w:highlight w:val="yellow"/>
+        </w:rPr>
+        <w:t>VALOR</w:t>
+      </w:r>
+      <w:proofErr w:type="gramEnd"/>
+      <w:r>
+        <w:rPr>
+          <w:rFonts w:ascii="Garamond" w:eastAsia="Garamond" w:hAnsi="Garamond" w:cs="Garamond"/>
+          <w:sz w:val="23"/>
+          <w:szCs w:val="23"/>
+          <w:highlight w:val="yellow"/>
+        </w:rPr>
+        <w:t>_DESCUENTO_MARK_DOWN|</w:t>
+      </w:r>
+      <w:proofErr w:type="gramStart"/>
+      <w:r>
+        <w:rPr>
+          <w:rFonts w:ascii="Garamond" w:eastAsia="Garamond" w:hAnsi="Garamond" w:cs="Garamond"/>
+          <w:sz w:val="23"/>
+          <w:szCs w:val="23"/>
+          <w:highlight w:val="yellow"/>
+        </w:rPr>
+        <w:t>lower</w:t>
+      </w:r>
+      <w:proofErr w:type="spellEnd"/>
+      <w:r>
+        <w:rPr>
+          <w:rFonts w:ascii="Garamond" w:eastAsia="Garamond" w:hAnsi="Garamond" w:cs="Garamond"/>
+          <w:sz w:val="23"/>
+          <w:szCs w:val="23"/>
+          <w:highlight w:val="yellow"/>
+        </w:rPr>
+        <w:t xml:space="preserve"> }</w:t>
+      </w:r>
+      <w:proofErr w:type="gramEnd"/>
+      <w:r>
+        <w:rPr>
+          <w:rFonts w:ascii="Garamond" w:eastAsia="Garamond" w:hAnsi="Garamond" w:cs="Garamond"/>
+          <w:sz w:val="23"/>
+          <w:szCs w:val="23"/>
+          <w:highlight w:val="yellow"/>
+        </w:rPr>
+        <w:t>}</w:t>
+      </w:r>
+      <w:r>
+        <w:rPr>
+          <w:rFonts w:ascii="Garamond" w:eastAsia="Garamond" w:hAnsi="Garamond" w:cs="Garamond"/>
+          <w:sz w:val="23"/>
+          <w:szCs w:val="23"/>
+        </w:rPr>
+        <w:t xml:space="preserve"> por ciento) de las ventas totales realizadas por el Aliado a través de la Plataforma Rappi durante el mes inmediatamente anterior durante la vigencia del presente Acuerdo.</w:t>
+      </w:r>
+    </w:p>
+    <w:p>
+      <w:pPr>
+        <w:jc w:val="both"/>
+        <w:rPr>
+          <w:rFonts w:ascii="Garamond" w:eastAsia="Garamond" w:hAnsi="Garamond" w:cs="Garamond"/>
+          <w:sz w:val="23"/>
+          <w:szCs w:val="23"/>
+          <w:lang w:val="es-MX"/>
+        </w:rPr>
+      </w:pPr>
+      <w:r>
+        <w:rPr>
+          <w:rFonts w:ascii="Garamond" w:eastAsia="Garamond" w:hAnsi="Garamond" w:cs="Garamond"/>
+          <w:sz w:val="23"/>
+          <w:szCs w:val="23"/>
+          <w:highlight w:val="yellow"/>
+          <w:lang w:val="es-ES"/>
+        </w:rPr>
         <w:t xml:space="preserve">{%p </w:t>
       </w:r>
       <w:proofErr w:type="spellStart"/>
       <w:r>
         <w:rPr>
           <w:rFonts w:ascii="Garamond" w:eastAsia="Garamond" w:hAnsi="Garamond" w:cs="Garamond"/>
-          <w:highlight w:val="yellow"/>
-        </w:rPr>
-        <w:t>elif</w:t>
+          <w:sz w:val="23"/>
+          <w:szCs w:val="23"/>
+          <w:highlight w:val="yellow"/>
+          <w:lang w:val="es-ES"/>
+        </w:rPr>
+        <w:t>endif</w:t>
       </w:r>
       <w:proofErr w:type="spellEnd"/>
       <w:r>
         <w:rPr>
           <w:rFonts w:ascii="Garamond" w:eastAsia="Garamond" w:hAnsi="Garamond" w:cs="Garamond"/>
-          <w:highlight w:val="yellow"/>
+          <w:sz w:val="23"/>
+          <w:szCs w:val="23"/>
+          <w:highlight w:val="yellow"/>
+          <w:lang w:val="es-ES"/>
+        </w:rPr>
+        <w:t xml:space="preserve"> %}</w:t>
+      </w:r>
+    </w:p>
+    <w:p>
+      <w:pPr>
+        <w:jc w:val="both"/>
+        <w:rPr>
+          <w:rFonts w:ascii="Garamond" w:eastAsia="Garamond" w:hAnsi="Garamond" w:cs="Garamond"/>
+          <w:sz w:val="23"/>
+          <w:szCs w:val="23"/>
+          <w:lang w:val="es-ES"/>
+        </w:rPr>
+      </w:pPr>
+      <w:r>
+        <w:rPr>
+          <w:rFonts w:ascii="Garamond" w:eastAsia="Garamond" w:hAnsi="Garamond" w:cs="Garamond"/>
+          <w:sz w:val="23"/>
+          <w:szCs w:val="23"/>
+          <w:highlight w:val="yellow"/>
+          <w:lang w:val="es-ES"/>
+        </w:rPr>
+        <w:t xml:space="preserve">{%p </w:t>
+      </w:r>
+      <w:proofErr w:type="spellStart"/>
+      <w:r>
+        <w:rPr>
+          <w:rFonts w:ascii="Garamond" w:eastAsia="Garamond" w:hAnsi="Garamond" w:cs="Garamond"/>
+          <w:sz w:val="23"/>
+          <w:szCs w:val="23"/>
+          <w:highlight w:val="yellow"/>
+          <w:lang w:val="es-ES"/>
+        </w:rPr>
+        <w:t>if</w:t>
+      </w:r>
+      <w:proofErr w:type="spellEnd"/>
+      <w:r>
+        <w:rPr>
+          <w:rFonts w:ascii="Garamond" w:eastAsia="Garamond" w:hAnsi="Garamond" w:cs="Garamond"/>
+          <w:sz w:val="23"/>
+          <w:szCs w:val="23"/>
+          <w:highlight w:val="yellow"/>
+          <w:lang w:val="es-ES"/>
         </w:rPr>
         <w:t xml:space="preserve"> </w:t>
       </w:r>
@@ -4229,26 +5180,117 @@
       <w:r>
         <w:rPr>
           <w:rFonts w:ascii="Garamond" w:eastAsia="Garamond" w:hAnsi="Garamond" w:cs="Garamond"/>
-          <w:highlight w:val="yellow"/>
-        </w:rPr>
-        <w:t>tipo_ads</w:t>
+          <w:sz w:val="23"/>
+          <w:szCs w:val="23"/>
+          <w:highlight w:val="yellow"/>
+          <w:lang w:val="es-ES"/>
+        </w:rPr>
+        <w:t>activa_publicaciones_redes</w:t>
       </w:r>
       <w:proofErr w:type="spellEnd"/>
       <w:r>
         <w:rPr>
           <w:rFonts w:ascii="Garamond" w:eastAsia="Garamond" w:hAnsi="Garamond" w:cs="Garamond"/>
-          <w:highlight w:val="yellow"/>
-        </w:rPr>
-        <w:t xml:space="preserve"> == </w:t>
-      </w:r>
-      <w:r>
-        <w:rPr>
-          <w:rFonts w:ascii="Garamond" w:eastAsia="Garamond" w:hAnsi="Garamond" w:cs="Garamond"/>
-          <w:sz w:val="23"/>
-          <w:szCs w:val="23"/>
-          <w:highlight w:val="yellow"/>
-        </w:rPr>
-        <w:t>'</w:t>
+          <w:sz w:val="23"/>
+          <w:szCs w:val="23"/>
+          <w:highlight w:val="yellow"/>
+          <w:lang w:val="es-ES"/>
+        </w:rPr>
+        <w:t xml:space="preserve"> %}</w:t>
+      </w:r>
+    </w:p>
+    <w:p>
+      <w:pPr>
+        <w:jc w:val="both"/>
+        <w:rPr>
+          <w:rFonts w:ascii="Garamond" w:eastAsia="Garamond" w:hAnsi="Garamond" w:cs="Garamond"/>
+          <w:sz w:val="23"/>
+          <w:szCs w:val="23"/>
+        </w:rPr>
+      </w:pPr>
+      <w:r>
+        <w:rPr>
+          <w:rFonts w:ascii="Garamond" w:eastAsia="Garamond" w:hAnsi="Garamond" w:cs="Garamond"/>
+          <w:sz w:val="23"/>
+          <w:szCs w:val="23"/>
+        </w:rPr>
+        <w:t xml:space="preserve">{{ ROM_REDES }} Realizar, al menos </w:t>
+      </w:r>
+      <w:proofErr w:type="gramStart"/>
+      <w:r>
+        <w:rPr>
+          <w:rFonts w:ascii="Garamond" w:eastAsia="Garamond" w:hAnsi="Garamond" w:cs="Garamond"/>
+          <w:sz w:val="23"/>
+          <w:szCs w:val="23"/>
+          <w:highlight w:val="yellow"/>
+        </w:rPr>
+        <w:t xml:space="preserve">{{ </w:t>
+      </w:r>
+      <w:r>
+        <w:rPr>
+          <w:rFonts w:ascii="Garamond" w:eastAsia="Garamond" w:hAnsi="Garamond" w:cs="Garamond"/>
+          <w:sz w:val="23"/>
+          <w:szCs w:val="23"/>
+          <w:highlight w:val="yellow"/>
+        </w:rPr>
+        <w:t>N</w:t>
+      </w:r>
+      <w:proofErr w:type="gramEnd"/>
+      <w:r>
+        <w:rPr>
+          <w:rFonts w:ascii="Garamond" w:eastAsia="Garamond" w:hAnsi="Garamond" w:cs="Garamond"/>
+          <w:sz w:val="23"/>
+          <w:szCs w:val="23"/>
+          <w:highlight w:val="yellow"/>
+        </w:rPr>
+        <w:t>_</w:t>
+      </w:r>
+      <w:r>
+        <w:rPr>
+          <w:rFonts w:ascii="Garamond" w:eastAsia="Garamond" w:hAnsi="Garamond" w:cs="Garamond"/>
+          <w:sz w:val="23"/>
+          <w:szCs w:val="23"/>
+          <w:highlight w:val="yellow"/>
+        </w:rPr>
+        <w:t>DESCUENTO_</w:t>
+      </w:r>
+      <w:proofErr w:type="gramStart"/>
+      <w:r>
+        <w:rPr>
+          <w:rFonts w:ascii="Garamond" w:eastAsia="Garamond" w:hAnsi="Garamond" w:cs="Garamond"/>
+          <w:sz w:val="23"/>
+          <w:szCs w:val="23"/>
+          <w:highlight w:val="yellow"/>
+        </w:rPr>
+        <w:t>REDES }</w:t>
+      </w:r>
+      <w:proofErr w:type="gramEnd"/>
+      <w:r>
+        <w:rPr>
+          <w:rFonts w:ascii="Garamond" w:eastAsia="Garamond" w:hAnsi="Garamond" w:cs="Garamond"/>
+          <w:sz w:val="23"/>
+          <w:szCs w:val="23"/>
+          <w:highlight w:val="yellow"/>
+        </w:rPr>
+        <w:t>}</w:t>
+      </w:r>
+      <w:r>
+        <w:rPr>
+          <w:rFonts w:ascii="Garamond" w:eastAsia="Garamond" w:hAnsi="Garamond" w:cs="Garamond"/>
+          <w:sz w:val="23"/>
+          <w:szCs w:val="23"/>
+        </w:rPr>
+        <w:t xml:space="preserve"> (</w:t>
+      </w:r>
+      <w:proofErr w:type="gramStart"/>
+      <w:r>
+        <w:rPr>
+          <w:rFonts w:ascii="Garamond" w:eastAsia="Garamond" w:hAnsi="Garamond" w:cs="Garamond"/>
+          <w:sz w:val="23"/>
+          <w:szCs w:val="23"/>
+          <w:highlight w:val="yellow"/>
+        </w:rPr>
+        <w:t xml:space="preserve">{{ </w:t>
       </w:r>
       <w:proofErr w:type="spellStart"/>
       <w:r>
@@ -4258,7 +5300,36 @@
           <w:szCs w:val="23"/>
           <w:highlight w:val="yellow"/>
         </w:rPr>
-        <w:t>aliado_y_rappi</w:t>
+        <w:t>DESCUENTO</w:t>
+      </w:r>
+      <w:proofErr w:type="gramEnd"/>
+      <w:r>
+        <w:rPr>
+          <w:rFonts w:ascii="Garamond" w:eastAsia="Garamond" w:hAnsi="Garamond" w:cs="Garamond"/>
+          <w:sz w:val="23"/>
+          <w:szCs w:val="23"/>
+          <w:highlight w:val="yellow"/>
+        </w:rPr>
+        <w:t>_REDES</w:t>
+      </w:r>
+      <w:r>
+        <w:rPr>
+          <w:rFonts w:ascii="Garamond" w:eastAsia="Garamond" w:hAnsi="Garamond" w:cs="Garamond"/>
+          <w:sz w:val="23"/>
+          <w:szCs w:val="23"/>
+          <w:highlight w:val="yellow"/>
+        </w:rPr>
+        <w:t>|</w:t>
+      </w:r>
+      <w:proofErr w:type="gramStart"/>
+      <w:r>
+        <w:rPr>
+          <w:rFonts w:ascii="Garamond" w:eastAsia="Garamond" w:hAnsi="Garamond" w:cs="Garamond"/>
+          <w:sz w:val="23"/>
+          <w:szCs w:val="23"/>
+          <w:highlight w:val="yellow"/>
+        </w:rPr>
+        <w:t>lower</w:t>
       </w:r>
       <w:proofErr w:type="spellEnd"/>
       <w:r>
@@ -4268,1251 +5339,139 @@
           <w:szCs w:val="23"/>
           <w:highlight w:val="yellow"/>
         </w:rPr>
-        <w:t>'</w:t>
-      </w:r>
-      <w:r>
-        <w:rPr>
-          <w:rFonts w:ascii="Garamond" w:eastAsia="Garamond" w:hAnsi="Garamond" w:cs="Garamond"/>
-          <w:highlight w:val="yellow"/>
+        <w:t xml:space="preserve"> }</w:t>
+      </w:r>
+      <w:proofErr w:type="gramEnd"/>
+      <w:r>
+        <w:rPr>
+          <w:rFonts w:ascii="Garamond" w:eastAsia="Garamond" w:hAnsi="Garamond" w:cs="Garamond"/>
+          <w:sz w:val="23"/>
+          <w:szCs w:val="23"/>
+          <w:highlight w:val="yellow"/>
+        </w:rPr>
+        <w:t>}</w:t>
+      </w:r>
+      <w:r>
+        <w:rPr>
+          <w:rFonts w:ascii="Garamond" w:eastAsia="Garamond" w:hAnsi="Garamond" w:cs="Garamond"/>
+          <w:sz w:val="23"/>
+          <w:szCs w:val="23"/>
+        </w:rPr>
+        <w:t xml:space="preserve">) publicaciones mensuales en sus redes sociales garantizando que estén dirigidas única y exclusivamente a incrementar sus ventas a través de la Plataforma Rappi, </w:t>
+      </w:r>
+      <w:proofErr w:type="gramStart"/>
+      <w:r>
+        <w:rPr>
+          <w:rFonts w:ascii="Garamond" w:eastAsia="Garamond" w:hAnsi="Garamond" w:cs="Garamond"/>
+          <w:sz w:val="23"/>
+          <w:szCs w:val="23"/>
+        </w:rPr>
+        <w:t>enunciando</w:t>
+      </w:r>
+      <w:proofErr w:type="gramEnd"/>
+      <w:r>
+        <w:rPr>
+          <w:rFonts w:ascii="Garamond" w:eastAsia="Garamond" w:hAnsi="Garamond" w:cs="Garamond"/>
+          <w:sz w:val="23"/>
+          <w:szCs w:val="23"/>
+        </w:rPr>
+        <w:t xml:space="preserve"> pero no limitando, Instagram, Facebook y/o </w:t>
+      </w:r>
+      <w:proofErr w:type="spellStart"/>
+      <w:r>
+        <w:rPr>
+          <w:rFonts w:ascii="Garamond" w:eastAsia="Garamond" w:hAnsi="Garamond" w:cs="Garamond"/>
+          <w:sz w:val="23"/>
+          <w:szCs w:val="23"/>
+        </w:rPr>
+        <w:t>Tik</w:t>
+      </w:r>
+      <w:proofErr w:type="spellEnd"/>
+      <w:r>
+        <w:rPr>
+          <w:rFonts w:ascii="Garamond" w:eastAsia="Garamond" w:hAnsi="Garamond" w:cs="Garamond"/>
+          <w:sz w:val="23"/>
+          <w:szCs w:val="23"/>
+        </w:rPr>
+        <w:t xml:space="preserve"> Tok. Dichas publicaciones deberán ser presentadas y aprobadas por Rappi previo a su publicación.</w:t>
+      </w:r>
+    </w:p>
+    <w:p>
+      <w:pPr>
+        <w:jc w:val="both"/>
+        <w:rPr>
+          <w:rFonts w:ascii="Garamond" w:eastAsia="Garamond" w:hAnsi="Garamond" w:cs="Garamond"/>
+          <w:sz w:val="23"/>
+          <w:szCs w:val="23"/>
+          <w:lang w:val="en-US"/>
+        </w:rPr>
+      </w:pPr>
+      <w:r>
+        <w:rPr>
+          <w:rFonts w:ascii="Garamond" w:eastAsia="Garamond" w:hAnsi="Garamond" w:cs="Garamond"/>
+          <w:sz w:val="23"/>
+          <w:szCs w:val="23"/>
+          <w:highlight w:val="yellow"/>
+          <w:lang w:val="en-US"/>
+        </w:rPr>
+        <w:t>{%p endif %}</w:t>
+      </w:r>
+    </w:p>
+    <w:p>
+      <w:pPr>
+        <w:jc w:val="both"/>
+        <w:rPr>
+          <w:rFonts w:ascii="Garamond" w:eastAsia="Garamond" w:hAnsi="Garamond" w:cs="Garamond"/>
+          <w:sz w:val="23"/>
+          <w:szCs w:val="23"/>
+          <w:lang w:val="en-US"/>
+        </w:rPr>
+      </w:pPr>
+      <w:r>
+        <w:rPr>
+          <w:rFonts w:ascii="Garamond" w:eastAsia="Garamond" w:hAnsi="Garamond" w:cs="Garamond"/>
+          <w:sz w:val="23"/>
+          <w:szCs w:val="23"/>
+          <w:highlight w:val="yellow"/>
+          <w:lang w:val="en-US"/>
+        </w:rPr>
+        <w:t xml:space="preserve">{%p if </w:t>
+      </w:r>
+      <w:proofErr w:type="spellStart"/>
+      <w:r>
+        <w:rPr>
+          <w:rFonts w:ascii="Garamond" w:eastAsia="Garamond" w:hAnsi="Garamond" w:cs="Garamond"/>
+          <w:sz w:val="23"/>
+          <w:szCs w:val="23"/>
+          <w:highlight w:val="yellow"/>
+          <w:lang w:val="en-US"/>
+        </w:rPr>
+        <w:t>activa_platillos_top_seller</w:t>
+      </w:r>
+      <w:proofErr w:type="spellEnd"/>
+      <w:r>
+        <w:rPr>
+          <w:rFonts w:ascii="Garamond" w:eastAsia="Garamond" w:hAnsi="Garamond" w:cs="Garamond"/>
+          <w:sz w:val="23"/>
+          <w:szCs w:val="23"/>
+          <w:highlight w:val="yellow"/>
+          <w:lang w:val="en-US"/>
         </w:rPr>
         <w:t xml:space="preserve"> %}</w:t>
       </w:r>
-      <w:r>
-        <w:rPr>
-          <w:rFonts w:ascii="Garamond" w:eastAsia="Garamond" w:hAnsi="Garamond" w:cs="Garamond"/>
-        </w:rPr>
-        <w:t xml:space="preserve"> </w:t>
-      </w:r>
-      <w:r>
-        <w:rPr>
-          <w:rFonts w:ascii="Garamond" w:eastAsia="Garamond" w:hAnsi="Garamond" w:cs="Garamond"/>
-        </w:rPr>
-        <w:t xml:space="preserve">El Aliado realizará una inversión mensual en </w:t>
-      </w:r>
-      <w:proofErr w:type="spellStart"/>
-      <w:r>
-        <w:rPr>
-          <w:rFonts w:ascii="Garamond" w:eastAsia="Garamond" w:hAnsi="Garamond" w:cs="Garamond"/>
-        </w:rPr>
-        <w:t>Ads</w:t>
-      </w:r>
-      <w:proofErr w:type="spellEnd"/>
-      <w:r>
-        <w:rPr>
-          <w:rFonts w:ascii="Garamond" w:eastAsia="Garamond" w:hAnsi="Garamond" w:cs="Garamond"/>
-        </w:rPr>
-        <w:t xml:space="preserve"> equivalente al </w:t>
-      </w:r>
-      <w:proofErr w:type="gramStart"/>
-      <w:r>
-        <w:rPr>
-          <w:rFonts w:ascii="Garamond" w:eastAsia="Garamond" w:hAnsi="Garamond" w:cs="Garamond"/>
-          <w:highlight w:val="yellow"/>
-          <w:lang w:val="es-ES"/>
-        </w:rPr>
-        <w:t>{{ N</w:t>
-      </w:r>
-      <w:proofErr w:type="gramEnd"/>
-      <w:r>
-        <w:rPr>
-          <w:rFonts w:ascii="Garamond" w:eastAsia="Garamond" w:hAnsi="Garamond" w:cs="Garamond"/>
-          <w:highlight w:val="yellow"/>
-          <w:lang w:val="es-ES"/>
-        </w:rPr>
-        <w:t>_</w:t>
-      </w:r>
-      <w:proofErr w:type="gramStart"/>
-      <w:r>
-        <w:rPr>
-          <w:rFonts w:ascii="Garamond" w:eastAsia="Garamond" w:hAnsi="Garamond" w:cs="Garamond"/>
-          <w:highlight w:val="yellow"/>
-          <w:lang w:val="es-ES"/>
-        </w:rPr>
-        <w:t>ADS }</w:t>
-      </w:r>
-      <w:proofErr w:type="gramEnd"/>
-      <w:r>
-        <w:rPr>
-          <w:rFonts w:ascii="Garamond" w:eastAsia="Garamond" w:hAnsi="Garamond" w:cs="Garamond"/>
-          <w:highlight w:val="yellow"/>
-          <w:lang w:val="es-ES"/>
-        </w:rPr>
-        <w:t>}</w:t>
-      </w:r>
-      <w:r>
-        <w:rPr>
-          <w:rFonts w:ascii="Garamond" w:eastAsia="Garamond" w:hAnsi="Garamond" w:cs="Garamond"/>
-          <w:lang w:val="es-ES"/>
-        </w:rPr>
-        <w:t xml:space="preserve"> % </w:t>
-      </w:r>
-      <w:r>
-        <w:rPr>
-          <w:rFonts w:ascii="Garamond" w:eastAsia="Garamond" w:hAnsi="Garamond" w:cs="Garamond"/>
-          <w:highlight w:val="yellow"/>
-          <w:lang w:val="es-ES"/>
-        </w:rPr>
-        <w:t>(</w:t>
-      </w:r>
-      <w:proofErr w:type="gramStart"/>
-      <w:r>
-        <w:rPr>
-          <w:rFonts w:ascii="Garamond" w:eastAsia="Garamond" w:hAnsi="Garamond" w:cs="Garamond"/>
-          <w:highlight w:val="yellow"/>
-          <w:lang w:val="es-ES"/>
-        </w:rPr>
-        <w:t>{{ VALOR</w:t>
-      </w:r>
-      <w:proofErr w:type="gramEnd"/>
-      <w:r>
-        <w:rPr>
-          <w:rFonts w:ascii="Garamond" w:eastAsia="Garamond" w:hAnsi="Garamond" w:cs="Garamond"/>
-          <w:highlight w:val="yellow"/>
-          <w:lang w:val="es-ES"/>
-        </w:rPr>
-        <w:t>_</w:t>
-      </w:r>
-      <w:proofErr w:type="gramStart"/>
-      <w:r>
-        <w:rPr>
-          <w:rFonts w:ascii="Garamond" w:eastAsia="Garamond" w:hAnsi="Garamond" w:cs="Garamond"/>
-          <w:highlight w:val="yellow"/>
-          <w:lang w:val="es-ES"/>
-        </w:rPr>
-        <w:t>ADS }</w:t>
-      </w:r>
-      <w:proofErr w:type="gramEnd"/>
-      <w:r>
-        <w:rPr>
-          <w:rFonts w:ascii="Garamond" w:eastAsia="Garamond" w:hAnsi="Garamond" w:cs="Garamond"/>
-          <w:highlight w:val="yellow"/>
-          <w:lang w:val="es-ES"/>
-        </w:rPr>
-        <w:t>})</w:t>
-      </w:r>
-      <w:r>
-        <w:rPr>
-          <w:rFonts w:ascii="Garamond" w:eastAsia="Garamond" w:hAnsi="Garamond" w:cs="Garamond"/>
-        </w:rPr>
-        <w:t xml:space="preserve"> de sus ventas totales en la Plataforma Rappi del mes anterior y Rappi realizará una inversión mensual en </w:t>
-      </w:r>
-      <w:proofErr w:type="spellStart"/>
-      <w:r>
-        <w:rPr>
-          <w:rFonts w:ascii="Garamond" w:eastAsia="Garamond" w:hAnsi="Garamond" w:cs="Garamond"/>
-        </w:rPr>
-        <w:t>Ads</w:t>
-      </w:r>
-      <w:proofErr w:type="spellEnd"/>
-      <w:r>
-        <w:rPr>
-          <w:rFonts w:ascii="Garamond" w:eastAsia="Garamond" w:hAnsi="Garamond" w:cs="Garamond"/>
-        </w:rPr>
-        <w:t xml:space="preserve"> </w:t>
-      </w:r>
-      <w:r>
-        <w:rPr>
-          <w:rFonts w:ascii="Garamond" w:eastAsia="Garamond" w:hAnsi="Garamond" w:cs="Garamond"/>
-        </w:rPr>
-        <w:t xml:space="preserve">equivalente al </w:t>
-      </w:r>
-      <w:proofErr w:type="gramStart"/>
-      <w:r>
-        <w:rPr>
-          <w:rFonts w:ascii="Garamond" w:eastAsia="Garamond" w:hAnsi="Garamond" w:cs="Garamond"/>
-          <w:highlight w:val="yellow"/>
-        </w:rPr>
-        <w:t>{{ N</w:t>
-      </w:r>
-      <w:proofErr w:type="gramEnd"/>
-      <w:r>
-        <w:rPr>
-          <w:rFonts w:ascii="Garamond" w:eastAsia="Garamond" w:hAnsi="Garamond" w:cs="Garamond"/>
-          <w:highlight w:val="yellow"/>
-        </w:rPr>
-        <w:t>_ADS_</w:t>
-      </w:r>
-      <w:proofErr w:type="gramStart"/>
-      <w:r>
-        <w:rPr>
-          <w:rFonts w:ascii="Garamond" w:eastAsia="Garamond" w:hAnsi="Garamond" w:cs="Garamond"/>
-          <w:highlight w:val="yellow"/>
-        </w:rPr>
-        <w:t>RAPPI }}</w:t>
-      </w:r>
-      <w:r>
-        <w:rPr>
-          <w:rFonts w:ascii="Garamond" w:eastAsia="Garamond" w:hAnsi="Garamond" w:cs="Garamond"/>
-        </w:rPr>
-        <w:t>%</w:t>
-      </w:r>
-      <w:proofErr w:type="gramEnd"/>
-      <w:r>
-        <w:rPr>
-          <w:rFonts w:ascii="Garamond" w:eastAsia="Garamond" w:hAnsi="Garamond" w:cs="Garamond"/>
-        </w:rPr>
-        <w:t xml:space="preserve"> </w:t>
-      </w:r>
-      <w:r>
-        <w:rPr>
-          <w:rFonts w:ascii="Garamond" w:eastAsia="Garamond" w:hAnsi="Garamond" w:cs="Garamond"/>
-          <w:highlight w:val="yellow"/>
-        </w:rPr>
-        <w:t>(</w:t>
-      </w:r>
-      <w:proofErr w:type="gramStart"/>
-      <w:r>
-        <w:rPr>
-          <w:rFonts w:ascii="Garamond" w:eastAsia="Garamond" w:hAnsi="Garamond" w:cs="Garamond"/>
-          <w:highlight w:val="yellow"/>
-        </w:rPr>
-        <w:t>{{ VALOR</w:t>
-      </w:r>
-      <w:proofErr w:type="gramEnd"/>
-      <w:r>
-        <w:rPr>
-          <w:rFonts w:ascii="Garamond" w:eastAsia="Garamond" w:hAnsi="Garamond" w:cs="Garamond"/>
-          <w:highlight w:val="yellow"/>
-        </w:rPr>
-        <w:t>_ADS_</w:t>
-      </w:r>
-      <w:proofErr w:type="gramStart"/>
-      <w:r>
-        <w:rPr>
-          <w:rFonts w:ascii="Garamond" w:eastAsia="Garamond" w:hAnsi="Garamond" w:cs="Garamond"/>
-          <w:highlight w:val="yellow"/>
-        </w:rPr>
-        <w:t>RAPPI }</w:t>
-      </w:r>
-      <w:proofErr w:type="gramEnd"/>
-      <w:r>
-        <w:rPr>
-          <w:rFonts w:ascii="Garamond" w:eastAsia="Garamond" w:hAnsi="Garamond" w:cs="Garamond"/>
-          <w:highlight w:val="yellow"/>
-        </w:rPr>
-        <w:t>}</w:t>
-      </w:r>
-      <w:r>
-        <w:rPr>
-          <w:rFonts w:ascii="Garamond" w:eastAsia="Garamond" w:hAnsi="Garamond" w:cs="Garamond"/>
-          <w:highlight w:val="yellow"/>
-        </w:rPr>
-        <w:t>)</w:t>
-      </w:r>
-      <w:r>
-        <w:rPr>
-          <w:rFonts w:ascii="Garamond" w:eastAsia="Garamond" w:hAnsi="Garamond" w:cs="Garamond"/>
-        </w:rPr>
-        <w:t xml:space="preserve"> de las ventas totales del Aliado en la Plataforma Rappi del mes anterior. Rappi activará los </w:t>
-      </w:r>
-      <w:proofErr w:type="spellStart"/>
-      <w:r>
-        <w:rPr>
-          <w:rFonts w:ascii="Garamond" w:eastAsia="Garamond" w:hAnsi="Garamond" w:cs="Garamond"/>
-        </w:rPr>
-        <w:t>Ads</w:t>
-      </w:r>
-      <w:proofErr w:type="spellEnd"/>
-      <w:r>
-        <w:rPr>
-          <w:rFonts w:ascii="Garamond" w:eastAsia="Garamond" w:hAnsi="Garamond" w:cs="Garamond"/>
-        </w:rPr>
-        <w:t xml:space="preserve"> en las fechas acordadas por las Partes, sujetándose su ejecución y cobro a los términos disponibles en https://legal.rappi.com.co/mexico/terminos-y-condiciones-ads-vertical-restaurantes-mexico Solo se facturarán los </w:t>
-      </w:r>
-      <w:proofErr w:type="spellStart"/>
-      <w:r>
-        <w:rPr>
-          <w:rFonts w:ascii="Garamond" w:eastAsia="Garamond" w:hAnsi="Garamond" w:cs="Garamond"/>
-        </w:rPr>
-        <w:t>Clicks</w:t>
-      </w:r>
-      <w:proofErr w:type="spellEnd"/>
-      <w:r>
-        <w:rPr>
-          <w:rFonts w:ascii="Garamond" w:eastAsia="Garamond" w:hAnsi="Garamond" w:cs="Garamond"/>
-        </w:rPr>
-        <w:t xml:space="preserve"> efectivamente ejecutados.</w:t>
-      </w:r>
-    </w:p>
-    <w:p>
-      <w:pPr>
-        <w:jc w:val="both"/>
-        <w:rPr>
-          <w:rFonts w:ascii="Garamond" w:eastAsia="Garamond" w:hAnsi="Garamond" w:cs="Garamond"/>
-          <w:sz w:val="23"/>
-          <w:szCs w:val="23"/>
-          <w:lang w:val="pt-PT"/>
-        </w:rPr>
-      </w:pPr>
-      <w:r>
-        <w:rPr>
-          <w:rFonts w:ascii="Garamond" w:eastAsia="Garamond" w:hAnsi="Garamond" w:cs="Garamond"/>
-          <w:sz w:val="23"/>
-          <w:szCs w:val="23"/>
-          <w:highlight w:val="yellow"/>
-          <w:lang w:val="pt-PT"/>
-        </w:rPr>
-        <w:t>{%</w:t>
-      </w:r>
-      <w:r>
-        <w:rPr>
-          <w:rFonts w:ascii="Garamond" w:eastAsia="Garamond" w:hAnsi="Garamond" w:cs="Garamond"/>
-          <w:sz w:val="23"/>
-          <w:szCs w:val="23"/>
-          <w:highlight w:val="yellow"/>
-          <w:lang w:val="pt-PT"/>
-        </w:rPr>
-        <w:t>p</w:t>
-      </w:r>
-      <w:r>
-        <w:rPr>
-          <w:rFonts w:ascii="Garamond" w:eastAsia="Garamond" w:hAnsi="Garamond" w:cs="Garamond"/>
-          <w:sz w:val="23"/>
-          <w:szCs w:val="23"/>
-          <w:highlight w:val="yellow"/>
-          <w:lang w:val="pt-PT"/>
-        </w:rPr>
-        <w:t xml:space="preserve"> endif %}</w:t>
-      </w:r>
-    </w:p>
-    <w:p>
-      <w:pPr>
-        <w:jc w:val="both"/>
-        <w:rPr>
-          <w:rFonts w:ascii="Garamond" w:eastAsia="Garamond" w:hAnsi="Garamond" w:cs="Garamond"/>
-          <w:sz w:val="23"/>
-          <w:szCs w:val="23"/>
-          <w:lang w:val="es-ES"/>
-        </w:rPr>
-      </w:pPr>
-      <w:r>
-        <w:rPr>
-          <w:rFonts w:ascii="Garamond" w:eastAsia="Garamond" w:hAnsi="Garamond" w:cs="Garamond"/>
-          <w:sz w:val="23"/>
-          <w:szCs w:val="23"/>
-          <w:highlight w:val="yellow"/>
-          <w:lang w:val="es-ES"/>
-        </w:rPr>
-        <w:t xml:space="preserve">{%p </w:t>
-      </w:r>
-      <w:proofErr w:type="spellStart"/>
-      <w:r>
-        <w:rPr>
-          <w:rFonts w:ascii="Garamond" w:eastAsia="Garamond" w:hAnsi="Garamond" w:cs="Garamond"/>
-          <w:sz w:val="23"/>
-          <w:szCs w:val="23"/>
-          <w:highlight w:val="yellow"/>
-          <w:lang w:val="es-ES"/>
-        </w:rPr>
-        <w:t>if</w:t>
-      </w:r>
-      <w:proofErr w:type="spellEnd"/>
-      <w:r>
-        <w:rPr>
-          <w:rFonts w:ascii="Garamond" w:eastAsia="Garamond" w:hAnsi="Garamond" w:cs="Garamond"/>
-          <w:sz w:val="23"/>
-          <w:szCs w:val="23"/>
-          <w:highlight w:val="yellow"/>
-          <w:lang w:val="es-ES"/>
-        </w:rPr>
-        <w:t xml:space="preserve"> </w:t>
-      </w:r>
-      <w:proofErr w:type="spellStart"/>
-      <w:r>
-        <w:rPr>
-          <w:rFonts w:ascii="Garamond" w:eastAsia="Garamond" w:hAnsi="Garamond" w:cs="Garamond"/>
-          <w:sz w:val="23"/>
-          <w:szCs w:val="23"/>
-          <w:highlight w:val="yellow"/>
-          <w:lang w:val="es-ES"/>
-        </w:rPr>
-        <w:t>activa_compromisos_ad</w:t>
-      </w:r>
-      <w:r>
-        <w:rPr>
-          <w:rFonts w:ascii="Garamond" w:eastAsia="Garamond" w:hAnsi="Garamond" w:cs="Garamond"/>
-          <w:sz w:val="23"/>
-          <w:szCs w:val="23"/>
-          <w:highlight w:val="yellow"/>
-          <w:lang w:val="es-ES"/>
-        </w:rPr>
-        <w:t>i</w:t>
-      </w:r>
-      <w:r>
-        <w:rPr>
-          <w:rFonts w:ascii="Garamond" w:eastAsia="Garamond" w:hAnsi="Garamond" w:cs="Garamond"/>
-          <w:sz w:val="23"/>
-          <w:szCs w:val="23"/>
-          <w:highlight w:val="yellow"/>
-          <w:lang w:val="es-ES"/>
-        </w:rPr>
-        <w:t>cionales</w:t>
-      </w:r>
-      <w:proofErr w:type="spellEnd"/>
-      <w:r>
-        <w:rPr>
-          <w:rFonts w:ascii="Garamond" w:eastAsia="Garamond" w:hAnsi="Garamond" w:cs="Garamond"/>
-          <w:sz w:val="23"/>
-          <w:szCs w:val="23"/>
-          <w:highlight w:val="yellow"/>
-          <w:lang w:val="es-ES"/>
-        </w:rPr>
-        <w:t xml:space="preserve"> %}</w:t>
-      </w:r>
-    </w:p>
-    <w:p>
-      <w:pPr>
-        <w:jc w:val="both"/>
-        <w:rPr>
-          <w:rFonts w:ascii="Garamond" w:eastAsia="Garamond" w:hAnsi="Garamond" w:cs="Garamond"/>
-          <w:sz w:val="23"/>
-          <w:szCs w:val="23"/>
-        </w:rPr>
-      </w:pPr>
-      <w:r>
-        <w:rPr>
-          <w:rFonts w:ascii="Garamond" w:eastAsia="Garamond" w:hAnsi="Garamond" w:cs="Garamond"/>
-          <w:sz w:val="23"/>
-          <w:szCs w:val="23"/>
-        </w:rPr>
-        <w:t xml:space="preserve">(x) Realizar un descuento de por lo menos el </w:t>
-      </w:r>
-      <w:proofErr w:type="gramStart"/>
-      <w:r>
-        <w:rPr>
-          <w:rFonts w:ascii="Garamond" w:eastAsia="Garamond" w:hAnsi="Garamond" w:cs="Garamond"/>
-          <w:sz w:val="23"/>
-          <w:szCs w:val="23"/>
-          <w:highlight w:val="yellow"/>
-        </w:rPr>
-        <w:t>{{ N</w:t>
-      </w:r>
-      <w:proofErr w:type="gramEnd"/>
-      <w:r>
-        <w:rPr>
-          <w:rFonts w:ascii="Garamond" w:eastAsia="Garamond" w:hAnsi="Garamond" w:cs="Garamond"/>
-          <w:sz w:val="23"/>
-          <w:szCs w:val="23"/>
-          <w:highlight w:val="yellow"/>
-        </w:rPr>
-        <w:t>_DESCUENTO_</w:t>
-      </w:r>
-      <w:proofErr w:type="gramStart"/>
-      <w:r>
-        <w:rPr>
-          <w:rFonts w:ascii="Garamond" w:eastAsia="Garamond" w:hAnsi="Garamond" w:cs="Garamond"/>
-          <w:sz w:val="23"/>
-          <w:szCs w:val="23"/>
-          <w:highlight w:val="yellow"/>
-        </w:rPr>
-        <w:t>MENU }}</w:t>
-      </w:r>
-      <w:r>
-        <w:rPr>
-          <w:rFonts w:ascii="Garamond" w:eastAsia="Garamond" w:hAnsi="Garamond" w:cs="Garamond"/>
-          <w:sz w:val="23"/>
-          <w:szCs w:val="23"/>
-        </w:rPr>
-        <w:t>%</w:t>
-      </w:r>
-      <w:proofErr w:type="gramEnd"/>
-      <w:r>
-        <w:rPr>
-          <w:rFonts w:ascii="Garamond" w:eastAsia="Garamond" w:hAnsi="Garamond" w:cs="Garamond"/>
-          <w:sz w:val="23"/>
-          <w:szCs w:val="23"/>
-        </w:rPr>
-        <w:t xml:space="preserve"> (</w:t>
-      </w:r>
-      <w:proofErr w:type="gramStart"/>
-      <w:r>
-        <w:rPr>
-          <w:rFonts w:ascii="Garamond" w:eastAsia="Garamond" w:hAnsi="Garamond" w:cs="Garamond"/>
-          <w:sz w:val="23"/>
-          <w:szCs w:val="23"/>
-          <w:highlight w:val="yellow"/>
-        </w:rPr>
-        <w:t xml:space="preserve">{{ </w:t>
-      </w:r>
-      <w:proofErr w:type="spellStart"/>
-      <w:r>
-        <w:rPr>
-          <w:rFonts w:ascii="Garamond" w:eastAsia="Garamond" w:hAnsi="Garamond" w:cs="Garamond"/>
-          <w:sz w:val="23"/>
-          <w:szCs w:val="23"/>
-          <w:highlight w:val="yellow"/>
-        </w:rPr>
-        <w:t>VALOR</w:t>
-      </w:r>
-      <w:proofErr w:type="gramEnd"/>
-      <w:r>
-        <w:rPr>
-          <w:rFonts w:ascii="Garamond" w:eastAsia="Garamond" w:hAnsi="Garamond" w:cs="Garamond"/>
-          <w:sz w:val="23"/>
-          <w:szCs w:val="23"/>
-          <w:highlight w:val="yellow"/>
-        </w:rPr>
-        <w:t>_DESCUENTO_MENU</w:t>
-      </w:r>
-      <w:r>
-        <w:rPr>
-          <w:rFonts w:ascii="Garamond" w:eastAsia="Garamond" w:hAnsi="Garamond" w:cs="Garamond"/>
-          <w:sz w:val="23"/>
-          <w:szCs w:val="23"/>
-          <w:highlight w:val="yellow"/>
-        </w:rPr>
-        <w:t>|</w:t>
-      </w:r>
-      <w:proofErr w:type="gramStart"/>
-      <w:r>
-        <w:rPr>
-          <w:rFonts w:ascii="Garamond" w:eastAsia="Garamond" w:hAnsi="Garamond" w:cs="Garamond"/>
-          <w:sz w:val="23"/>
-          <w:szCs w:val="23"/>
-          <w:highlight w:val="yellow"/>
-        </w:rPr>
-        <w:t>lower</w:t>
-      </w:r>
-      <w:proofErr w:type="spellEnd"/>
-      <w:r>
-        <w:rPr>
-          <w:rFonts w:ascii="Garamond" w:eastAsia="Garamond" w:hAnsi="Garamond" w:cs="Garamond"/>
-          <w:sz w:val="23"/>
-          <w:szCs w:val="23"/>
-          <w:highlight w:val="yellow"/>
-        </w:rPr>
-        <w:t xml:space="preserve"> }</w:t>
-      </w:r>
-      <w:proofErr w:type="gramEnd"/>
-      <w:r>
-        <w:rPr>
-          <w:rFonts w:ascii="Garamond" w:eastAsia="Garamond" w:hAnsi="Garamond" w:cs="Garamond"/>
-          <w:sz w:val="23"/>
-          <w:szCs w:val="23"/>
-          <w:highlight w:val="yellow"/>
-        </w:rPr>
-        <w:t>}</w:t>
-      </w:r>
-      <w:r>
-        <w:rPr>
-          <w:rFonts w:ascii="Garamond" w:eastAsia="Garamond" w:hAnsi="Garamond" w:cs="Garamond"/>
-          <w:sz w:val="23"/>
-          <w:szCs w:val="23"/>
-        </w:rPr>
-        <w:t xml:space="preserve"> </w:t>
-      </w:r>
-      <w:r>
-        <w:rPr>
-          <w:rFonts w:ascii="Garamond" w:eastAsia="Garamond" w:hAnsi="Garamond" w:cs="Garamond"/>
-          <w:sz w:val="23"/>
-          <w:szCs w:val="23"/>
-        </w:rPr>
-        <w:t xml:space="preserve">por ciento) en todo el menú dentro de la Plataforma Rappi durante los primeros </w:t>
-      </w:r>
-      <w:proofErr w:type="gramStart"/>
-      <w:r>
-        <w:rPr>
-          <w:rFonts w:ascii="Garamond" w:eastAsia="Garamond" w:hAnsi="Garamond" w:cs="Garamond"/>
-          <w:sz w:val="23"/>
-          <w:szCs w:val="23"/>
-          <w:highlight w:val="yellow"/>
-        </w:rPr>
-        <w:t>{{ N</w:t>
-      </w:r>
-      <w:proofErr w:type="gramEnd"/>
-      <w:r>
-        <w:rPr>
-          <w:rFonts w:ascii="Garamond" w:eastAsia="Garamond" w:hAnsi="Garamond" w:cs="Garamond"/>
-          <w:sz w:val="23"/>
-          <w:szCs w:val="23"/>
-          <w:highlight w:val="yellow"/>
-        </w:rPr>
-        <w:t>_MESES_DESCUENTO_</w:t>
-      </w:r>
-      <w:proofErr w:type="gramStart"/>
-      <w:r>
-        <w:rPr>
-          <w:rFonts w:ascii="Garamond" w:eastAsia="Garamond" w:hAnsi="Garamond" w:cs="Garamond"/>
-          <w:sz w:val="23"/>
-          <w:szCs w:val="23"/>
-          <w:highlight w:val="yellow"/>
-        </w:rPr>
-        <w:t>MENU }</w:t>
-      </w:r>
-      <w:proofErr w:type="gramEnd"/>
-      <w:r>
-        <w:rPr>
-          <w:rFonts w:ascii="Garamond" w:eastAsia="Garamond" w:hAnsi="Garamond" w:cs="Garamond"/>
-          <w:sz w:val="23"/>
-          <w:szCs w:val="23"/>
-          <w:highlight w:val="yellow"/>
-        </w:rPr>
-        <w:t>}</w:t>
-      </w:r>
-      <w:r>
-        <w:rPr>
-          <w:rFonts w:ascii="Garamond" w:eastAsia="Garamond" w:hAnsi="Garamond" w:cs="Garamond"/>
-          <w:sz w:val="23"/>
-          <w:szCs w:val="23"/>
-        </w:rPr>
-        <w:t xml:space="preserve"> (</w:t>
-      </w:r>
-      <w:proofErr w:type="gramStart"/>
-      <w:r>
-        <w:rPr>
-          <w:rFonts w:ascii="Garamond" w:eastAsia="Garamond" w:hAnsi="Garamond" w:cs="Garamond"/>
-          <w:sz w:val="23"/>
-          <w:szCs w:val="23"/>
-          <w:highlight w:val="yellow"/>
-        </w:rPr>
-        <w:t xml:space="preserve">{{ </w:t>
-      </w:r>
-      <w:proofErr w:type="spellStart"/>
-      <w:r>
-        <w:rPr>
-          <w:rFonts w:ascii="Garamond" w:eastAsia="Garamond" w:hAnsi="Garamond" w:cs="Garamond"/>
-          <w:sz w:val="23"/>
-          <w:szCs w:val="23"/>
-          <w:highlight w:val="yellow"/>
-        </w:rPr>
-        <w:t>VALOR</w:t>
-      </w:r>
-      <w:proofErr w:type="gramEnd"/>
-      <w:r>
-        <w:rPr>
-          <w:rFonts w:ascii="Garamond" w:eastAsia="Garamond" w:hAnsi="Garamond" w:cs="Garamond"/>
-          <w:sz w:val="23"/>
-          <w:szCs w:val="23"/>
-          <w:highlight w:val="yellow"/>
-        </w:rPr>
-        <w:t>_MES_DESCUENTO_MENU</w:t>
-      </w:r>
-      <w:r>
-        <w:rPr>
-          <w:rFonts w:ascii="Garamond" w:eastAsia="Garamond" w:hAnsi="Garamond" w:cs="Garamond"/>
-          <w:sz w:val="23"/>
-          <w:szCs w:val="23"/>
-          <w:highlight w:val="yellow"/>
-        </w:rPr>
-        <w:t>|</w:t>
-      </w:r>
-      <w:proofErr w:type="gramStart"/>
-      <w:r>
-        <w:rPr>
-          <w:rFonts w:ascii="Garamond" w:eastAsia="Garamond" w:hAnsi="Garamond" w:cs="Garamond"/>
-          <w:sz w:val="23"/>
-          <w:szCs w:val="23"/>
-          <w:highlight w:val="yellow"/>
-        </w:rPr>
-        <w:t>lower</w:t>
-      </w:r>
-      <w:proofErr w:type="spellEnd"/>
-      <w:r>
-        <w:rPr>
-          <w:rFonts w:ascii="Garamond" w:eastAsia="Garamond" w:hAnsi="Garamond" w:cs="Garamond"/>
-          <w:sz w:val="23"/>
-          <w:szCs w:val="23"/>
-          <w:highlight w:val="yellow"/>
-        </w:rPr>
-        <w:t xml:space="preserve"> }</w:t>
-      </w:r>
-      <w:proofErr w:type="gramEnd"/>
-      <w:r>
-        <w:rPr>
-          <w:rFonts w:ascii="Garamond" w:eastAsia="Garamond" w:hAnsi="Garamond" w:cs="Garamond"/>
-          <w:sz w:val="23"/>
-          <w:szCs w:val="23"/>
-          <w:highlight w:val="yellow"/>
-        </w:rPr>
-        <w:t>}</w:t>
-      </w:r>
-      <w:r>
-        <w:rPr>
-          <w:rFonts w:ascii="Garamond" w:eastAsia="Garamond" w:hAnsi="Garamond" w:cs="Garamond"/>
-          <w:sz w:val="23"/>
-          <w:szCs w:val="23"/>
-        </w:rPr>
-        <w:t>) meses de ejecución del presente Acuerdo.</w:t>
-      </w:r>
-    </w:p>
-    <w:p>
-      <w:pPr>
-        <w:jc w:val="both"/>
-        <w:rPr>
-          <w:rFonts w:ascii="Garamond" w:eastAsia="Garamond" w:hAnsi="Garamond" w:cs="Garamond"/>
-          <w:sz w:val="23"/>
-          <w:szCs w:val="23"/>
-          <w:lang w:val="en-US"/>
-        </w:rPr>
-      </w:pPr>
-      <w:r>
-        <w:rPr>
-          <w:rFonts w:ascii="Garamond" w:eastAsia="Garamond" w:hAnsi="Garamond" w:cs="Garamond"/>
-          <w:sz w:val="23"/>
-          <w:szCs w:val="23"/>
-          <w:highlight w:val="yellow"/>
-          <w:lang w:val="en-US"/>
-        </w:rPr>
-        <w:t>{%p endif %}</w:t>
-      </w:r>
-    </w:p>
-    <w:p>
-      <w:pPr>
-        <w:jc w:val="both"/>
-        <w:rPr>
-          <w:rFonts w:ascii="Garamond" w:eastAsia="Garamond" w:hAnsi="Garamond" w:cs="Garamond"/>
-          <w:sz w:val="23"/>
-          <w:szCs w:val="23"/>
-          <w:lang w:val="en-US"/>
-        </w:rPr>
-      </w:pPr>
-      <w:r>
-        <w:rPr>
-          <w:rFonts w:ascii="Garamond" w:eastAsia="Garamond" w:hAnsi="Garamond" w:cs="Garamond"/>
-          <w:sz w:val="23"/>
-          <w:szCs w:val="23"/>
-          <w:highlight w:val="yellow"/>
-          <w:lang w:val="en-US"/>
-        </w:rPr>
-        <w:t xml:space="preserve">{%p if </w:t>
-      </w:r>
-      <w:proofErr w:type="spellStart"/>
-      <w:r>
-        <w:rPr>
-          <w:rFonts w:ascii="Garamond" w:eastAsia="Garamond" w:hAnsi="Garamond" w:cs="Garamond"/>
-          <w:sz w:val="23"/>
-          <w:szCs w:val="23"/>
-          <w:highlight w:val="yellow"/>
-          <w:lang w:val="en-US"/>
-        </w:rPr>
-        <w:t>activa_mark_down</w:t>
-      </w:r>
-      <w:proofErr w:type="spellEnd"/>
-      <w:r>
-        <w:rPr>
-          <w:rFonts w:ascii="Garamond" w:eastAsia="Garamond" w:hAnsi="Garamond" w:cs="Garamond"/>
-          <w:sz w:val="23"/>
-          <w:szCs w:val="23"/>
-          <w:highlight w:val="yellow"/>
-          <w:lang w:val="en-US"/>
-        </w:rPr>
-        <w:t xml:space="preserve"> %}</w:t>
-      </w:r>
-    </w:p>
-    <w:p>
-      <w:pPr>
-        <w:jc w:val="both"/>
-        <w:rPr>
-          <w:rFonts w:ascii="Garamond" w:eastAsia="Garamond" w:hAnsi="Garamond" w:cs="Garamond"/>
-          <w:sz w:val="23"/>
-          <w:szCs w:val="23"/>
-        </w:rPr>
-      </w:pPr>
-      <w:r>
-        <w:rPr>
-          <w:rFonts w:ascii="Garamond" w:eastAsia="Garamond" w:hAnsi="Garamond" w:cs="Garamond"/>
-          <w:sz w:val="23"/>
-          <w:szCs w:val="23"/>
-        </w:rPr>
-        <w:t xml:space="preserve">(x) Realizar una inversión mensual en promociones del </w:t>
-      </w:r>
-      <w:proofErr w:type="gramStart"/>
-      <w:r>
-        <w:rPr>
-          <w:rFonts w:ascii="Garamond" w:eastAsia="Garamond" w:hAnsi="Garamond" w:cs="Garamond"/>
-          <w:sz w:val="23"/>
-          <w:szCs w:val="23"/>
-          <w:highlight w:val="yellow"/>
-        </w:rPr>
-        <w:t>{{ N</w:t>
-      </w:r>
-      <w:proofErr w:type="gramEnd"/>
-      <w:r>
-        <w:rPr>
-          <w:rFonts w:ascii="Garamond" w:eastAsia="Garamond" w:hAnsi="Garamond" w:cs="Garamond"/>
-          <w:sz w:val="23"/>
-          <w:szCs w:val="23"/>
-          <w:highlight w:val="yellow"/>
-        </w:rPr>
-        <w:t>_DESCUENTO_MARK_</w:t>
-      </w:r>
-      <w:proofErr w:type="gramStart"/>
-      <w:r>
-        <w:rPr>
-          <w:rFonts w:ascii="Garamond" w:eastAsia="Garamond" w:hAnsi="Garamond" w:cs="Garamond"/>
-          <w:sz w:val="23"/>
-          <w:szCs w:val="23"/>
-          <w:highlight w:val="yellow"/>
-        </w:rPr>
-        <w:t>DOWN }}</w:t>
-      </w:r>
-      <w:r>
-        <w:rPr>
-          <w:rFonts w:ascii="Garamond" w:eastAsia="Garamond" w:hAnsi="Garamond" w:cs="Garamond"/>
-          <w:sz w:val="23"/>
-          <w:szCs w:val="23"/>
-        </w:rPr>
-        <w:t>%</w:t>
-      </w:r>
-      <w:proofErr w:type="gramEnd"/>
-      <w:r>
-        <w:rPr>
-          <w:rFonts w:ascii="Garamond" w:eastAsia="Garamond" w:hAnsi="Garamond" w:cs="Garamond"/>
-          <w:sz w:val="23"/>
-          <w:szCs w:val="23"/>
-        </w:rPr>
-        <w:t xml:space="preserve"> (</w:t>
-      </w:r>
-      <w:proofErr w:type="gramStart"/>
-      <w:r>
-        <w:rPr>
-          <w:rFonts w:ascii="Garamond" w:eastAsia="Garamond" w:hAnsi="Garamond" w:cs="Garamond"/>
-          <w:sz w:val="23"/>
-          <w:szCs w:val="23"/>
-          <w:highlight w:val="yellow"/>
-        </w:rPr>
-        <w:t xml:space="preserve">{{ </w:t>
-      </w:r>
-      <w:proofErr w:type="spellStart"/>
-      <w:r>
-        <w:rPr>
-          <w:rFonts w:ascii="Garamond" w:eastAsia="Garamond" w:hAnsi="Garamond" w:cs="Garamond"/>
-          <w:sz w:val="23"/>
-          <w:szCs w:val="23"/>
-          <w:highlight w:val="yellow"/>
-        </w:rPr>
-        <w:t>VALOR</w:t>
-      </w:r>
-      <w:proofErr w:type="gramEnd"/>
-      <w:r>
-        <w:rPr>
-          <w:rFonts w:ascii="Garamond" w:eastAsia="Garamond" w:hAnsi="Garamond" w:cs="Garamond"/>
-          <w:sz w:val="23"/>
-          <w:szCs w:val="23"/>
-          <w:highlight w:val="yellow"/>
-        </w:rPr>
-        <w:t>_DESCUENTO_MARK_DOWN|</w:t>
-      </w:r>
-      <w:proofErr w:type="gramStart"/>
-      <w:r>
-        <w:rPr>
-          <w:rFonts w:ascii="Garamond" w:eastAsia="Garamond" w:hAnsi="Garamond" w:cs="Garamond"/>
-          <w:sz w:val="23"/>
-          <w:szCs w:val="23"/>
-          <w:highlight w:val="yellow"/>
-        </w:rPr>
-        <w:t>lower</w:t>
-      </w:r>
-      <w:proofErr w:type="spellEnd"/>
-      <w:r>
-        <w:rPr>
-          <w:rFonts w:ascii="Garamond" w:eastAsia="Garamond" w:hAnsi="Garamond" w:cs="Garamond"/>
-          <w:sz w:val="23"/>
-          <w:szCs w:val="23"/>
-          <w:highlight w:val="yellow"/>
-        </w:rPr>
-        <w:t xml:space="preserve"> }</w:t>
-      </w:r>
-      <w:proofErr w:type="gramEnd"/>
-      <w:r>
-        <w:rPr>
-          <w:rFonts w:ascii="Garamond" w:eastAsia="Garamond" w:hAnsi="Garamond" w:cs="Garamond"/>
-          <w:sz w:val="23"/>
-          <w:szCs w:val="23"/>
-          <w:highlight w:val="yellow"/>
-        </w:rPr>
-        <w:t>}</w:t>
-      </w:r>
-      <w:r>
-        <w:rPr>
-          <w:rFonts w:ascii="Garamond" w:eastAsia="Garamond" w:hAnsi="Garamond" w:cs="Garamond"/>
-          <w:sz w:val="23"/>
-          <w:szCs w:val="23"/>
-        </w:rPr>
-        <w:t xml:space="preserve"> por ciento) de las ventas totales realizadas por el Aliado a través de la Plataforma Rappi durante el mes inmediatamente anterior durante la vigencia del presente Acuerdo.</w:t>
-      </w:r>
-    </w:p>
-    <w:p>
-      <w:pPr>
-        <w:jc w:val="both"/>
-        <w:rPr>
-          <w:rFonts w:ascii="Garamond" w:eastAsia="Garamond" w:hAnsi="Garamond" w:cs="Garamond"/>
-          <w:sz w:val="23"/>
-          <w:szCs w:val="23"/>
-          <w:lang w:val="es-MX"/>
-        </w:rPr>
-      </w:pPr>
-      <w:r>
-        <w:rPr>
-          <w:rFonts w:ascii="Garamond" w:eastAsia="Garamond" w:hAnsi="Garamond" w:cs="Garamond"/>
-          <w:sz w:val="23"/>
-          <w:szCs w:val="23"/>
-          <w:highlight w:val="yellow"/>
-          <w:lang w:val="es-ES"/>
-        </w:rPr>
-        <w:t xml:space="preserve">{%p </w:t>
-      </w:r>
-      <w:proofErr w:type="spellStart"/>
-      <w:r>
-        <w:rPr>
-          <w:rFonts w:ascii="Garamond" w:eastAsia="Garamond" w:hAnsi="Garamond" w:cs="Garamond"/>
-          <w:sz w:val="23"/>
-          <w:szCs w:val="23"/>
-          <w:highlight w:val="yellow"/>
-          <w:lang w:val="es-ES"/>
-        </w:rPr>
-        <w:t>endif</w:t>
-      </w:r>
-      <w:proofErr w:type="spellEnd"/>
-      <w:r>
-        <w:rPr>
-          <w:rFonts w:ascii="Garamond" w:eastAsia="Garamond" w:hAnsi="Garamond" w:cs="Garamond"/>
-          <w:sz w:val="23"/>
-          <w:szCs w:val="23"/>
-          <w:highlight w:val="yellow"/>
-          <w:lang w:val="es-ES"/>
-        </w:rPr>
-        <w:t xml:space="preserve"> %}</w:t>
-      </w:r>
-    </w:p>
-    <w:p>
-      <w:pPr>
-        <w:jc w:val="both"/>
-        <w:rPr>
-          <w:rFonts w:ascii="Garamond" w:eastAsia="Garamond" w:hAnsi="Garamond" w:cs="Garamond"/>
-          <w:sz w:val="23"/>
-          <w:szCs w:val="23"/>
-          <w:lang w:val="es-ES"/>
-        </w:rPr>
-      </w:pPr>
-      <w:r>
-        <w:rPr>
-          <w:rFonts w:ascii="Garamond" w:eastAsia="Garamond" w:hAnsi="Garamond" w:cs="Garamond"/>
-          <w:sz w:val="23"/>
-          <w:szCs w:val="23"/>
-          <w:highlight w:val="yellow"/>
-          <w:lang w:val="es-ES"/>
-        </w:rPr>
-        <w:t xml:space="preserve">{%p </w:t>
-      </w:r>
-      <w:proofErr w:type="spellStart"/>
-      <w:r>
-        <w:rPr>
-          <w:rFonts w:ascii="Garamond" w:eastAsia="Garamond" w:hAnsi="Garamond" w:cs="Garamond"/>
-          <w:sz w:val="23"/>
-          <w:szCs w:val="23"/>
-          <w:highlight w:val="yellow"/>
-          <w:lang w:val="es-ES"/>
-        </w:rPr>
-        <w:t>if</w:t>
-      </w:r>
-      <w:proofErr w:type="spellEnd"/>
-      <w:r>
-        <w:rPr>
-          <w:rFonts w:ascii="Garamond" w:eastAsia="Garamond" w:hAnsi="Garamond" w:cs="Garamond"/>
-          <w:sz w:val="23"/>
-          <w:szCs w:val="23"/>
-          <w:highlight w:val="yellow"/>
-          <w:lang w:val="es-ES"/>
-        </w:rPr>
-        <w:t xml:space="preserve"> </w:t>
-      </w:r>
-      <w:proofErr w:type="spellStart"/>
-      <w:r>
-        <w:rPr>
-          <w:rFonts w:ascii="Garamond" w:eastAsia="Garamond" w:hAnsi="Garamond" w:cs="Garamond"/>
-          <w:sz w:val="23"/>
-          <w:szCs w:val="23"/>
-          <w:highlight w:val="yellow"/>
-          <w:lang w:val="es-ES"/>
-        </w:rPr>
-        <w:t>activa_publicaciones_redes</w:t>
-      </w:r>
-      <w:proofErr w:type="spellEnd"/>
-      <w:r>
-        <w:rPr>
-          <w:rFonts w:ascii="Garamond" w:eastAsia="Garamond" w:hAnsi="Garamond" w:cs="Garamond"/>
-          <w:sz w:val="23"/>
-          <w:szCs w:val="23"/>
-          <w:highlight w:val="yellow"/>
-          <w:lang w:val="es-ES"/>
-        </w:rPr>
-        <w:t xml:space="preserve"> %}</w:t>
-      </w:r>
-    </w:p>
-    <w:p>
-      <w:pPr>
-        <w:jc w:val="both"/>
-        <w:rPr>
-          <w:rFonts w:ascii="Garamond" w:eastAsia="Garamond" w:hAnsi="Garamond" w:cs="Garamond"/>
-          <w:sz w:val="23"/>
-          <w:szCs w:val="23"/>
-        </w:rPr>
-      </w:pPr>
-      <w:r>
-        <w:rPr>
-          <w:rFonts w:ascii="Garamond" w:eastAsia="Garamond" w:hAnsi="Garamond" w:cs="Garamond"/>
-          <w:sz w:val="23"/>
-          <w:szCs w:val="23"/>
-        </w:rPr>
-        <w:t xml:space="preserve">(x) Realizar, al menos </w:t>
-      </w:r>
-      <w:proofErr w:type="gramStart"/>
-      <w:r>
-        <w:rPr>
-          <w:rFonts w:ascii="Garamond" w:eastAsia="Garamond" w:hAnsi="Garamond" w:cs="Garamond"/>
-          <w:sz w:val="23"/>
-          <w:szCs w:val="23"/>
-          <w:highlight w:val="yellow"/>
-        </w:rPr>
-        <w:t xml:space="preserve">{{ </w:t>
-      </w:r>
-      <w:r>
-        <w:rPr>
-          <w:rFonts w:ascii="Garamond" w:eastAsia="Garamond" w:hAnsi="Garamond" w:cs="Garamond"/>
-          <w:sz w:val="23"/>
-          <w:szCs w:val="23"/>
-          <w:highlight w:val="yellow"/>
-        </w:rPr>
-        <w:t>N</w:t>
-      </w:r>
-      <w:proofErr w:type="gramEnd"/>
-      <w:r>
-        <w:rPr>
-          <w:rFonts w:ascii="Garamond" w:eastAsia="Garamond" w:hAnsi="Garamond" w:cs="Garamond"/>
-          <w:sz w:val="23"/>
-          <w:szCs w:val="23"/>
-          <w:highlight w:val="yellow"/>
-        </w:rPr>
-        <w:t>_</w:t>
-      </w:r>
-      <w:r>
-        <w:rPr>
-          <w:rFonts w:ascii="Garamond" w:eastAsia="Garamond" w:hAnsi="Garamond" w:cs="Garamond"/>
-          <w:sz w:val="23"/>
-          <w:szCs w:val="23"/>
-          <w:highlight w:val="yellow"/>
-        </w:rPr>
-        <w:t>DESCUENTO_</w:t>
-      </w:r>
-      <w:proofErr w:type="gramStart"/>
-      <w:r>
-        <w:rPr>
-          <w:rFonts w:ascii="Garamond" w:eastAsia="Garamond" w:hAnsi="Garamond" w:cs="Garamond"/>
-          <w:sz w:val="23"/>
-          <w:szCs w:val="23"/>
-          <w:highlight w:val="yellow"/>
-        </w:rPr>
-        <w:t>REDES }</w:t>
-      </w:r>
-      <w:proofErr w:type="gramEnd"/>
-      <w:r>
-        <w:rPr>
-          <w:rFonts w:ascii="Garamond" w:eastAsia="Garamond" w:hAnsi="Garamond" w:cs="Garamond"/>
-          <w:sz w:val="23"/>
-          <w:szCs w:val="23"/>
-          <w:highlight w:val="yellow"/>
-        </w:rPr>
-        <w:t>}</w:t>
-      </w:r>
-      <w:r>
-        <w:rPr>
-          <w:rFonts w:ascii="Garamond" w:eastAsia="Garamond" w:hAnsi="Garamond" w:cs="Garamond"/>
-          <w:sz w:val="23"/>
-          <w:szCs w:val="23"/>
-        </w:rPr>
-        <w:t xml:space="preserve"> (</w:t>
-      </w:r>
-      <w:proofErr w:type="gramStart"/>
-      <w:r>
-        <w:rPr>
-          <w:rFonts w:ascii="Garamond" w:eastAsia="Garamond" w:hAnsi="Garamond" w:cs="Garamond"/>
-          <w:sz w:val="23"/>
-          <w:szCs w:val="23"/>
-          <w:highlight w:val="yellow"/>
-        </w:rPr>
-        <w:t xml:space="preserve">{{ </w:t>
-      </w:r>
-      <w:proofErr w:type="spellStart"/>
-      <w:r>
-        <w:rPr>
-          <w:rFonts w:ascii="Garamond" w:eastAsia="Garamond" w:hAnsi="Garamond" w:cs="Garamond"/>
-          <w:sz w:val="23"/>
-          <w:szCs w:val="23"/>
-          <w:highlight w:val="yellow"/>
-        </w:rPr>
-        <w:t>DESCUENTO</w:t>
-      </w:r>
-      <w:proofErr w:type="gramEnd"/>
-      <w:r>
-        <w:rPr>
-          <w:rFonts w:ascii="Garamond" w:eastAsia="Garamond" w:hAnsi="Garamond" w:cs="Garamond"/>
-          <w:sz w:val="23"/>
-          <w:szCs w:val="23"/>
-          <w:highlight w:val="yellow"/>
-        </w:rPr>
-        <w:t>_REDES</w:t>
-      </w:r>
-      <w:r>
-        <w:rPr>
-          <w:rFonts w:ascii="Garamond" w:eastAsia="Garamond" w:hAnsi="Garamond" w:cs="Garamond"/>
-          <w:sz w:val="23"/>
-          <w:szCs w:val="23"/>
-          <w:highlight w:val="yellow"/>
-        </w:rPr>
-        <w:t>|</w:t>
-      </w:r>
-      <w:proofErr w:type="gramStart"/>
-      <w:r>
-        <w:rPr>
-          <w:rFonts w:ascii="Garamond" w:eastAsia="Garamond" w:hAnsi="Garamond" w:cs="Garamond"/>
-          <w:sz w:val="23"/>
-          <w:szCs w:val="23"/>
-          <w:highlight w:val="yellow"/>
-        </w:rPr>
-        <w:t>lower</w:t>
-      </w:r>
-      <w:proofErr w:type="spellEnd"/>
-      <w:r>
-        <w:rPr>
-          <w:rFonts w:ascii="Garamond" w:eastAsia="Garamond" w:hAnsi="Garamond" w:cs="Garamond"/>
-          <w:sz w:val="23"/>
-          <w:szCs w:val="23"/>
-          <w:highlight w:val="yellow"/>
-        </w:rPr>
-        <w:t xml:space="preserve"> }</w:t>
-      </w:r>
-      <w:proofErr w:type="gramEnd"/>
-      <w:r>
-        <w:rPr>
-          <w:rFonts w:ascii="Garamond" w:eastAsia="Garamond" w:hAnsi="Garamond" w:cs="Garamond"/>
-          <w:sz w:val="23"/>
-          <w:szCs w:val="23"/>
-          <w:highlight w:val="yellow"/>
-        </w:rPr>
-        <w:t>}</w:t>
-      </w:r>
-      <w:r>
-        <w:rPr>
-          <w:rFonts w:ascii="Garamond" w:eastAsia="Garamond" w:hAnsi="Garamond" w:cs="Garamond"/>
-          <w:sz w:val="23"/>
-          <w:szCs w:val="23"/>
-        </w:rPr>
-        <w:t xml:space="preserve">) publicaciones mensuales en sus redes sociales garantizando que estén dirigidas única y exclusivamente a incrementar sus ventas a través de la Plataforma Rappi, </w:t>
-      </w:r>
-      <w:proofErr w:type="gramStart"/>
-      <w:r>
-        <w:rPr>
-          <w:rFonts w:ascii="Garamond" w:eastAsia="Garamond" w:hAnsi="Garamond" w:cs="Garamond"/>
-          <w:sz w:val="23"/>
-          <w:szCs w:val="23"/>
-        </w:rPr>
-        <w:t>enunciando</w:t>
-      </w:r>
-      <w:proofErr w:type="gramEnd"/>
-      <w:r>
-        <w:rPr>
-          <w:rFonts w:ascii="Garamond" w:eastAsia="Garamond" w:hAnsi="Garamond" w:cs="Garamond"/>
-          <w:sz w:val="23"/>
-          <w:szCs w:val="23"/>
-        </w:rPr>
-        <w:t xml:space="preserve"> pero no limitando, Instagram, Facebook y/o </w:t>
-      </w:r>
-      <w:proofErr w:type="spellStart"/>
-      <w:r>
-        <w:rPr>
-          <w:rFonts w:ascii="Garamond" w:eastAsia="Garamond" w:hAnsi="Garamond" w:cs="Garamond"/>
-          <w:sz w:val="23"/>
-          <w:szCs w:val="23"/>
-        </w:rPr>
-        <w:t>Tik</w:t>
-      </w:r>
-      <w:proofErr w:type="spellEnd"/>
-      <w:r>
-        <w:rPr>
-          <w:rFonts w:ascii="Garamond" w:eastAsia="Garamond" w:hAnsi="Garamond" w:cs="Garamond"/>
-          <w:sz w:val="23"/>
-          <w:szCs w:val="23"/>
-        </w:rPr>
-        <w:t xml:space="preserve"> Tok. Dichas publicaciones deberán ser presentadas y aprobadas por Rappi previo a su publicación.</w:t>
-      </w:r>
-    </w:p>
-    <w:p>
-      <w:pPr>
-        <w:jc w:val="both"/>
-        <w:rPr>
-          <w:rFonts w:ascii="Garamond" w:eastAsia="Garamond" w:hAnsi="Garamond" w:cs="Garamond"/>
-          <w:sz w:val="23"/>
-          <w:szCs w:val="23"/>
-          <w:lang w:val="en-US"/>
-        </w:rPr>
-      </w:pPr>
-      <w:r>
-        <w:rPr>
-          <w:rFonts w:ascii="Garamond" w:eastAsia="Garamond" w:hAnsi="Garamond" w:cs="Garamond"/>
-          <w:sz w:val="23"/>
-          <w:szCs w:val="23"/>
-          <w:highlight w:val="yellow"/>
-          <w:lang w:val="en-US"/>
-        </w:rPr>
-        <w:t>{%p endif %}</w:t>
-      </w:r>
-    </w:p>
-    <w:p>
-      <w:pPr>
-        <w:jc w:val="both"/>
-        <w:rPr>
-          <w:rFonts w:ascii="Garamond" w:eastAsia="Garamond" w:hAnsi="Garamond" w:cs="Garamond"/>
-          <w:sz w:val="23"/>
-          <w:szCs w:val="23"/>
-          <w:lang w:val="en-US"/>
-        </w:rPr>
-      </w:pPr>
-      <w:r>
-        <w:rPr>
-          <w:rFonts w:ascii="Garamond" w:eastAsia="Garamond" w:hAnsi="Garamond" w:cs="Garamond"/>
-          <w:sz w:val="23"/>
-          <w:szCs w:val="23"/>
-          <w:highlight w:val="yellow"/>
-          <w:lang w:val="en-US"/>
-        </w:rPr>
-        <w:t xml:space="preserve">{%p if </w:t>
-      </w:r>
-      <w:proofErr w:type="spellStart"/>
-      <w:r>
-        <w:rPr>
-          <w:rFonts w:ascii="Garamond" w:eastAsia="Garamond" w:hAnsi="Garamond" w:cs="Garamond"/>
-          <w:sz w:val="23"/>
-          <w:szCs w:val="23"/>
-          <w:highlight w:val="yellow"/>
-          <w:lang w:val="en-US"/>
-        </w:rPr>
-        <w:t>activa_platillos_top_seller</w:t>
-      </w:r>
-      <w:proofErr w:type="spellEnd"/>
-      <w:r>
-        <w:rPr>
-          <w:rFonts w:ascii="Garamond" w:eastAsia="Garamond" w:hAnsi="Garamond" w:cs="Garamond"/>
-          <w:sz w:val="23"/>
-          <w:szCs w:val="23"/>
-          <w:highlight w:val="yellow"/>
-          <w:lang w:val="en-US"/>
-        </w:rPr>
-        <w:t xml:space="preserve"> %}</w:t>
-      </w:r>
-    </w:p>
-    <w:p>
-      <w:pPr>
-        <w:jc w:val="both"/>
-        <w:rPr>
-          <w:rFonts w:ascii="Garamond" w:eastAsia="Garamond" w:hAnsi="Garamond" w:cs="Garamond"/>
-        </w:rPr>
-      </w:pPr>
-      <w:r>
-        <w:rPr>
-          <w:rFonts w:ascii="Garamond" w:eastAsia="Garamond" w:hAnsi="Garamond" w:cs="Garamond"/>
-        </w:rPr>
-        <w:t xml:space="preserve">(x) Ofrecer </w:t>
+    </w:p>
+    <w:p>
+      <w:pPr>
+        <w:jc w:val="both"/>
+        <w:rPr>
+          <w:rFonts w:ascii="Garamond" w:eastAsia="Garamond" w:hAnsi="Garamond" w:cs="Garamond"/>
+        </w:rPr>
+      </w:pPr>
+      <w:r>
+        <w:rPr>
+          <w:rFonts w:ascii="Garamond" w:eastAsia="Garamond" w:hAnsi="Garamond" w:cs="Garamond"/>
+        </w:rPr>
+        <w:t xml:space="preserve">{{ ROM_PLATILLOS }} Ofrecer </w:t>
       </w:r>
       <w:proofErr w:type="gramStart"/>
       <w:r>
@@ -7266,7 +7225,7 @@
           <w:szCs w:val="23"/>
           <w:highlight w:val="yellow"/>
         </w:rPr>
-        <w:t xml:space="preserve">Titular: </w:t>
+        <w:t xml:space="preserve">Titular: {{ RAZÓN_SOCIAL_ENCABEZADO }}</w:t>
       </w:r>
       <w:proofErr w:type="gramStart"/>
       <w:r>
@@ -7279,7 +7238,7 @@
           <w:highlight w:val="yellow"/>
           <w:lang w:val="es-ES"/>
         </w:rPr>
-        <w:t>{{ RAZÓN</w:t>
+        <w:t/>
       </w:r>
       <w:proofErr w:type="gramEnd"/>
       <w:r>
@@ -7292,7 +7251,7 @@
           <w:highlight w:val="yellow"/>
           <w:lang w:val="es-ES"/>
         </w:rPr>
-        <w:t>_</w:t>
+        <w:t/>
       </w:r>
       <w:proofErr w:type="gramStart"/>
       <w:r>
@@ -7305,7 +7264,7 @@
           <w:highlight w:val="yellow"/>
           <w:lang w:val="es-ES"/>
         </w:rPr>
-        <w:t>SOCIAL }</w:t>
+        <w:t/>
       </w:r>
       <w:proofErr w:type="gramEnd"/>
       <w:r>
@@ -7318,7 +7277,7 @@
           <w:highlight w:val="yellow"/>
           <w:lang w:val="es-ES"/>
         </w:rPr>
-        <w:t>}</w:t>
+        <w:t/>
       </w:r>
     </w:p>
     <w:p>
@@ -8998,7 +8957,7 @@
           <w:bCs/>
           <w:u w:val="single"/>
         </w:rPr>
-        <w:t xml:space="preserve"> - </w:t>
+        <w:t xml:space="preserve"> - Exclusividad. </w:t>
       </w:r>
       <w:r>
         <w:rPr>
@@ -9154,6 +9113,18 @@
           <w:lang w:val="pt-PT"/>
         </w:rPr>
         <w:t>.</w:t>
+      </w:r>
+      <w:r>
+        <w:rPr>
+          <w:rFonts w:ascii="Garamond" w:eastAsia="Garamond" w:hAnsi="Garamond" w:cs="Garamond"/>
+          <w:b/>
+          <w:bCs/>
+          <w:sz w:val="23"/>
+          <w:szCs w:val="23"/>
+          <w:u w:val="single"/>
+          <w:lang w:val="pt-PT"/>
+        </w:rPr>
+        <w:t xml:space="preserve"> - Semi Exclusividad.</w:t>
       </w:r>
       <w:r>
         <w:rPr>
@@ -13271,6 +13242,27 @@
         <w:jc w:val="both"/>
         <w:rPr>
           <w:rFonts w:ascii="Garamond" w:eastAsia="Garamond" w:hAnsi="Garamond" w:cs="Garamond"/>
+          <w:sz w:val="23"/>
+          <w:szCs w:val="23"/>
+          <w:lang w:val="en-US"/>
+        </w:rPr>
+      </w:pPr>
+      <w:r>
+        <w:rPr>
+          <w:rFonts w:ascii="Garamond" w:eastAsia="Garamond" w:hAnsi="Garamond" w:cs="Garamond"/>
+          <w:sz w:val="23"/>
+          <w:szCs w:val="23"/>
+          <w:highlight w:val="yellow"/>
+          <w:lang w:val="en-US"/>
+        </w:rPr>
+        <w:t>{%p endif %}</w:t>
+      </w:r>
+    </w:p>
+    <w:p>
+      <w:pPr>
+        <w:jc w:val="both"/>
+        <w:rPr>
+          <w:rFonts w:ascii="Garamond" w:eastAsia="Garamond" w:hAnsi="Garamond" w:cs="Garamond"/>
         </w:rPr>
       </w:pPr>
       <w:r>
@@ -13438,49 +13430,6 @@
           <w:rFonts w:ascii="Garamond" w:eastAsia="Garamond" w:hAnsi="Garamond" w:cs="Garamond"/>
         </w:rPr>
         <w:t xml:space="preserve"> a los Productos que comercializará en la Plataforma Rappi, y, garantiza que cuenta con todos los derechos y facultades necesarios para otorgar la autorización del uso de estas. De esta manera, el Aliado Comercial declara y acepta que será exclusivamente responsable por cualquier infracción de los derechos de terceros sobre la autoría o propiedad de dichos logotipos, imágenes y/o fotografías, sacando en paz y a salvo a Rappi de cualquier reclamación de terceros por este concepto. De conformidad con lo anterior, Rappi podrá eliminar los Productos, imágenes y/o fotografías contenidas en el que infrinjan la Ley Aplicable en materia de propiedad intelectual y/o protección al consumidor.</w:t>
-      </w:r>
-    </w:p>
-    <w:p>
-      <w:pPr>
-        <w:jc w:val="both"/>
-        <w:rPr>
-          <w:rFonts w:ascii="Garamond" w:eastAsia="Garamond" w:hAnsi="Garamond" w:cs="Garamond"/>
-          <w:sz w:val="23"/>
-          <w:szCs w:val="23"/>
-          <w:lang w:val="es-ES"/>
-        </w:rPr>
-      </w:pPr>
-      <w:r>
-        <w:rPr>
-          <w:rFonts w:ascii="Garamond" w:eastAsia="Garamond" w:hAnsi="Garamond" w:cs="Garamond"/>
-          <w:sz w:val="23"/>
-          <w:szCs w:val="23"/>
-          <w:highlight w:val="yellow"/>
-          <w:lang w:val="es-ES"/>
-        </w:rPr>
-        <w:t xml:space="preserve">{%p </w:t>
-      </w:r>
-      <w:proofErr w:type="spellStart"/>
-      <w:r>
-        <w:rPr>
-          <w:rFonts w:ascii="Garamond" w:eastAsia="Garamond" w:hAnsi="Garamond" w:cs="Garamond"/>
-          <w:sz w:val="23"/>
-          <w:szCs w:val="23"/>
-          <w:highlight w:val="yellow"/>
-          <w:lang w:val="es-ES"/>
-        </w:rPr>
-        <w:t>endif</w:t>
-      </w:r>
-      <w:proofErr w:type="spellEnd"/>
-      <w:r>
-        <w:rPr>
-          <w:rFonts w:ascii="Garamond" w:eastAsia="Garamond" w:hAnsi="Garamond" w:cs="Garamond"/>
-          <w:sz w:val="23"/>
-          <w:szCs w:val="23"/>
-          <w:highlight w:val="yellow"/>
-          <w:lang w:val="es-ES"/>
-        </w:rPr>
-        <w:t xml:space="preserve"> %}</w:t>
       </w:r>
     </w:p>
     <w:p>

</xml_diff>

<commit_message>
restripciones en bonos y fondos.
</commit_message>
<xml_diff>
--- a/formatos/New_draft/acuerdo_con_ads_juridica.docx
+++ b/formatos/New_draft/acuerdo_con_ads_juridica.docx
@@ -105,42 +105,7 @@
           <w:szCs w:val="23"/>
           <w:highlight w:val="yellow"/>
         </w:rPr>
-        <w:t xml:space="preserve">{{ RAZÓN_SOCIAL_ENCABEZADO }}</w:t>
-      </w:r>
-      <w:proofErr w:type="spellStart"/>
-      <w:r>
-        <w:rPr>
-          <w:rFonts w:ascii="Garamond" w:eastAsia="Garamond" w:hAnsi="Garamond" w:cs="Garamond"/>
-          <w:b/>
-          <w:bCs/>
-          <w:sz w:val="23"/>
-          <w:szCs w:val="23"/>
-          <w:highlight w:val="yellow"/>
-        </w:rPr>
-        <w:t/>
-      </w:r>
-      <w:r>
-        <w:rPr>
-          <w:rFonts w:ascii="Garamond" w:eastAsia="Garamond" w:hAnsi="Garamond" w:cs="Garamond"/>
-          <w:b/>
-          <w:bCs/>
-          <w:sz w:val="23"/>
-          <w:szCs w:val="23"/>
-          <w:highlight w:val="yellow"/>
-        </w:rPr>
-        <w:t/>
-      </w:r>
-      <w:proofErr w:type="spellEnd"/>
-      <w:r>
-        <w:rPr>
-          <w:rFonts w:ascii="Garamond" w:eastAsia="Garamond" w:hAnsi="Garamond" w:cs="Garamond"/>
-          <w:b/>
-          <w:bCs/>
-          <w:sz w:val="23"/>
-          <w:szCs w:val="23"/>
-          <w:highlight w:val="yellow"/>
-        </w:rPr>
-        <w:t xml:space="preserve"/>
+        <w:t>{{ RAZÓN_SOCIAL_ENCABEZADO }}</w:t>
       </w:r>
       <w:r>
         <w:rPr>
@@ -860,7 +825,7 @@
           <w:szCs w:val="23"/>
           <w:highlight w:val="yellow"/>
         </w:rPr>
-        <w:t xml:space="preserve">{{ </w:t>
+        <w:t xml:space="preserve">{{ UBICACIÓN_NOTARIA }}</w:t>
       </w:r>
       <w:proofErr w:type="spellStart"/>
       <w:r>
@@ -870,7 +835,7 @@
           <w:szCs w:val="23"/>
           <w:highlight w:val="yellow"/>
         </w:rPr>
-        <w:t>UBICACIÓN</w:t>
+        <w:t/>
       </w:r>
       <w:proofErr w:type="gramEnd"/>
       <w:r>
@@ -880,7 +845,7 @@
           <w:szCs w:val="23"/>
           <w:highlight w:val="yellow"/>
         </w:rPr>
-        <w:t>_NOTARIA|</w:t>
+        <w:t/>
       </w:r>
       <w:proofErr w:type="gramStart"/>
       <w:r>
@@ -890,7 +855,7 @@
           <w:szCs w:val="23"/>
           <w:highlight w:val="yellow"/>
         </w:rPr>
-        <w:t>title</w:t>
+        <w:t/>
       </w:r>
       <w:proofErr w:type="spellEnd"/>
       <w:r>
@@ -900,7 +865,7 @@
           <w:szCs w:val="23"/>
           <w:highlight w:val="yellow"/>
         </w:rPr>
-        <w:t xml:space="preserve"> }</w:t>
+        <w:t xml:space="preserve"/>
       </w:r>
       <w:proofErr w:type="gramEnd"/>
       <w:r>
@@ -910,7 +875,7 @@
           <w:szCs w:val="23"/>
           <w:highlight w:val="yellow"/>
         </w:rPr>
-        <w:t>}</w:t>
+        <w:t/>
       </w:r>
       <w:r>
         <w:rPr>
@@ -3995,132 +3960,9 @@
       <w:r>
         <w:rPr>
           <w:rFonts w:ascii="Garamond" w:eastAsia="Garamond" w:hAnsi="Garamond" w:cs="Garamond"/>
-        </w:rPr>
-        <w:t xml:space="preserve"> Eliminar todo el software que pertenezca a Rappi una vez cese el uso de la Plataforma Rappi por parte del Aliado Comercial; y {{ ROM_ADS }} {% if tipo_ads == 'aliado' %}</w:t>
-      </w:r>
-      <w:r>
-        <w:rPr>
-          <w:rFonts w:ascii="Garamond" w:eastAsia="Garamond" w:hAnsi="Garamond" w:cs="Garamond"/>
-          <w:b/>
-          <w:bCs/>
-        </w:rPr>
-        <w:t/>
-      </w:r>
-      <w:proofErr w:type="spellStart"/>
-      <w:r>
-        <w:rPr>
-          <w:rFonts w:ascii="Garamond" w:eastAsia="Garamond" w:hAnsi="Garamond" w:cs="Garamond"/>
-          <w:b/>
-          <w:bCs/>
-        </w:rPr>
-        <w:t/>
-      </w:r>
-      <w:proofErr w:type="spellEnd"/>
-      <w:r>
-        <w:rPr>
-          <w:rFonts w:ascii="Garamond" w:eastAsia="Garamond" w:hAnsi="Garamond" w:cs="Garamond"/>
-          <w:b/>
-          <w:bCs/>
-        </w:rPr>
-        <w:t/>
-      </w:r>
-      <w:r>
-        <w:rPr>
-          <w:rFonts w:ascii="Garamond" w:eastAsia="Garamond" w:hAnsi="Garamond" w:cs="Garamond"/>
-          <w:b/>
-          <w:bCs/>
-        </w:rPr>
-        <w:t xml:space="preserve"/>
-      </w:r>
-      <w:r>
-        <w:rPr>
-          <w:rFonts w:ascii="Garamond" w:eastAsia="Garamond" w:hAnsi="Garamond" w:cs="Garamond"/>
-          <w:highlight w:val="yellow"/>
-        </w:rPr>
-        <w:t xml:space="preserve"/>
-      </w:r>
-      <w:proofErr w:type="spellStart"/>
-      <w:r>
-        <w:rPr>
-          <w:rFonts w:ascii="Garamond" w:eastAsia="Garamond" w:hAnsi="Garamond" w:cs="Garamond"/>
-          <w:highlight w:val="yellow"/>
-        </w:rPr>
-        <w:t/>
-      </w:r>
-      <w:proofErr w:type="spellEnd"/>
-      <w:r>
-        <w:rPr>
-          <w:rFonts w:ascii="Garamond" w:eastAsia="Garamond" w:hAnsi="Garamond" w:cs="Garamond"/>
-          <w:highlight w:val="yellow"/>
-        </w:rPr>
-        <w:t xml:space="preserve"/>
-      </w:r>
-      <w:proofErr w:type="spellStart"/>
-      <w:r>
-        <w:rPr>
-          <w:rFonts w:ascii="Garamond" w:eastAsia="Garamond" w:hAnsi="Garamond" w:cs="Garamond"/>
-          <w:highlight w:val="yellow"/>
-        </w:rPr>
-        <w:t/>
-      </w:r>
-      <w:proofErr w:type="spellEnd"/>
-      <w:r>
-        <w:rPr>
-          <w:rFonts w:ascii="Garamond" w:eastAsia="Garamond" w:hAnsi="Garamond" w:cs="Garamond"/>
-          <w:highlight w:val="yellow"/>
-        </w:rPr>
-        <w:t xml:space="preserve"/>
-      </w:r>
-      <w:r>
-        <w:rPr>
-          <w:rFonts w:ascii="Garamond" w:eastAsia="Garamond" w:hAnsi="Garamond" w:cs="Garamond"/>
-          <w:sz w:val="23"/>
-          <w:szCs w:val="23"/>
-          <w:highlight w:val="yellow"/>
-        </w:rPr>
-        <w:t/>
-      </w:r>
-      <w:r>
-        <w:rPr>
-          <w:rFonts w:ascii="Garamond" w:eastAsia="Garamond" w:hAnsi="Garamond" w:cs="Garamond"/>
-          <w:highlight w:val="yellow"/>
-        </w:rPr>
-        <w:t/>
-      </w:r>
-      <w:r>
-        <w:rPr>
-          <w:rFonts w:ascii="Garamond" w:eastAsia="Garamond" w:hAnsi="Garamond" w:cs="Garamond"/>
-          <w:sz w:val="23"/>
-          <w:szCs w:val="23"/>
-          <w:highlight w:val="yellow"/>
-        </w:rPr>
-        <w:t/>
-      </w:r>
-      <w:r>
-        <w:rPr>
-          <w:rFonts w:ascii="Garamond" w:eastAsia="Garamond" w:hAnsi="Garamond" w:cs="Garamond"/>
-        </w:rPr>
-        <w:t xml:space="preserve"/>
-      </w:r>
-      <w:r>
-        <w:rPr>
-          <w:rFonts w:ascii="Garamond" w:eastAsia="Garamond" w:hAnsi="Garamond" w:cs="Garamond"/>
-          <w:highlight w:val="yellow"/>
-        </w:rPr>
-        <w:t/>
-      </w:r>
-      <w:r>
-        <w:rPr>
-          <w:rFonts w:ascii="Garamond" w:eastAsia="Garamond" w:hAnsi="Garamond" w:cs="Garamond"/>
-          <w:highlight w:val="yellow"/>
-        </w:rPr>
-        <w:t/>
-      </w:r>
-      <w:r>
-        <w:rPr>
-          <w:rFonts w:ascii="Garamond" w:eastAsia="Garamond" w:hAnsi="Garamond" w:cs="Garamond"/>
-        </w:rPr>
-        <w:t xml:space="preserve">Realizar una inversión mensual en </w:t>
+          <w:b/>
+        </w:rPr>
+        <w:t xml:space="preserve"> Eliminar todo el software que pertenezca a Rappi una vez cese el uso de la Plataforma Rappi por parte del Aliado Comercial; y {{ ROM_ADS }} {% if tipo_ads == 'aliado' %}Realizar una inversión mensual en </w:t>
       </w:r>
       <w:proofErr w:type="spellStart"/>
       <w:r>
@@ -4207,1343 +4049,1315 @@
           <w:rFonts w:ascii="Garamond" w:eastAsia="Garamond" w:hAnsi="Garamond" w:cs="Garamond"/>
           <w:highlight w:val="yellow"/>
         </w:rPr>
-        <w:t xml:space="preserve">{% elif tipo_ads == 'aliado_y_rappi' %}</w:t>
+        <w:t>{% elif tipo_ads == 'aliado_y_rappi' %}</w:t>
+      </w:r>
+      <w:r>
+        <w:rPr>
+          <w:rFonts w:ascii="Garamond" w:eastAsia="Garamond" w:hAnsi="Garamond" w:cs="Garamond"/>
+        </w:rPr>
+        <w:t xml:space="preserve"> </w:t>
+      </w:r>
+      <w:r>
+        <w:rPr>
+          <w:rFonts w:ascii="Garamond" w:eastAsia="Garamond" w:hAnsi="Garamond" w:cs="Garamond"/>
+        </w:rPr>
+        <w:t xml:space="preserve">El Aliado realizará una inversión mensual en </w:t>
       </w:r>
       <w:proofErr w:type="spellStart"/>
       <w:r>
         <w:rPr>
           <w:rFonts w:ascii="Garamond" w:eastAsia="Garamond" w:hAnsi="Garamond" w:cs="Garamond"/>
+        </w:rPr>
+        <w:t>Ads</w:t>
+      </w:r>
+      <w:proofErr w:type="spellEnd"/>
+      <w:r>
+        <w:rPr>
+          <w:rFonts w:ascii="Garamond" w:eastAsia="Garamond" w:hAnsi="Garamond" w:cs="Garamond"/>
+        </w:rPr>
+        <w:t xml:space="preserve"> equivalente al </w:t>
+      </w:r>
+      <w:proofErr w:type="gramStart"/>
+      <w:r>
+        <w:rPr>
+          <w:rFonts w:ascii="Garamond" w:eastAsia="Garamond" w:hAnsi="Garamond" w:cs="Garamond"/>
+          <w:highlight w:val="yellow"/>
+          <w:lang w:val="es-ES"/>
+        </w:rPr>
+        <w:t>{{ N</w:t>
+      </w:r>
+      <w:proofErr w:type="gramEnd"/>
+      <w:r>
+        <w:rPr>
+          <w:rFonts w:ascii="Garamond" w:eastAsia="Garamond" w:hAnsi="Garamond" w:cs="Garamond"/>
+          <w:highlight w:val="yellow"/>
+          <w:lang w:val="es-ES"/>
+        </w:rPr>
+        <w:t>_</w:t>
+      </w:r>
+      <w:proofErr w:type="gramStart"/>
+      <w:r>
+        <w:rPr>
+          <w:rFonts w:ascii="Garamond" w:eastAsia="Garamond" w:hAnsi="Garamond" w:cs="Garamond"/>
+          <w:highlight w:val="yellow"/>
+          <w:lang w:val="es-ES"/>
+        </w:rPr>
+        <w:t>ADS }</w:t>
+      </w:r>
+      <w:proofErr w:type="gramEnd"/>
+      <w:r>
+        <w:rPr>
+          <w:rFonts w:ascii="Garamond" w:eastAsia="Garamond" w:hAnsi="Garamond" w:cs="Garamond"/>
+          <w:highlight w:val="yellow"/>
+          <w:lang w:val="es-ES"/>
+        </w:rPr>
+        <w:t>}</w:t>
+      </w:r>
+      <w:r>
+        <w:rPr>
+          <w:rFonts w:ascii="Garamond" w:eastAsia="Garamond" w:hAnsi="Garamond" w:cs="Garamond"/>
+          <w:lang w:val="es-ES"/>
+        </w:rPr>
+        <w:t xml:space="preserve"> % </w:t>
+      </w:r>
+      <w:r>
+        <w:rPr>
+          <w:rFonts w:ascii="Garamond" w:eastAsia="Garamond" w:hAnsi="Garamond" w:cs="Garamond"/>
+          <w:highlight w:val="yellow"/>
+          <w:lang w:val="es-ES"/>
+        </w:rPr>
+        <w:t>(</w:t>
+      </w:r>
+      <w:proofErr w:type="gramStart"/>
+      <w:r>
+        <w:rPr>
+          <w:rFonts w:ascii="Garamond" w:eastAsia="Garamond" w:hAnsi="Garamond" w:cs="Garamond"/>
+          <w:highlight w:val="yellow"/>
+          <w:lang w:val="es-ES"/>
+        </w:rPr>
+        <w:t>{{ VALOR</w:t>
+      </w:r>
+      <w:proofErr w:type="gramEnd"/>
+      <w:r>
+        <w:rPr>
+          <w:rFonts w:ascii="Garamond" w:eastAsia="Garamond" w:hAnsi="Garamond" w:cs="Garamond"/>
+          <w:highlight w:val="yellow"/>
+          <w:lang w:val="es-ES"/>
+        </w:rPr>
+        <w:t>_</w:t>
+      </w:r>
+      <w:proofErr w:type="gramStart"/>
+      <w:r>
+        <w:rPr>
+          <w:rFonts w:ascii="Garamond" w:eastAsia="Garamond" w:hAnsi="Garamond" w:cs="Garamond"/>
+          <w:highlight w:val="yellow"/>
+          <w:lang w:val="es-ES"/>
+        </w:rPr>
+        <w:t>ADS }</w:t>
+      </w:r>
+      <w:proofErr w:type="gramEnd"/>
+      <w:r>
+        <w:rPr>
+          <w:rFonts w:ascii="Garamond" w:eastAsia="Garamond" w:hAnsi="Garamond" w:cs="Garamond"/>
+          <w:highlight w:val="yellow"/>
+          <w:lang w:val="es-ES"/>
+        </w:rPr>
+        <w:t>})</w:t>
+      </w:r>
+      <w:r>
+        <w:rPr>
+          <w:rFonts w:ascii="Garamond" w:eastAsia="Garamond" w:hAnsi="Garamond" w:cs="Garamond"/>
+        </w:rPr>
+        <w:t xml:space="preserve"> de sus ventas totales en la Plataforma Rappi del mes anterior y Rappi realizará una inversión mensual en </w:t>
+      </w:r>
+      <w:proofErr w:type="spellStart"/>
+      <w:r>
+        <w:rPr>
+          <w:rFonts w:ascii="Garamond" w:eastAsia="Garamond" w:hAnsi="Garamond" w:cs="Garamond"/>
+        </w:rPr>
+        <w:t>Ads</w:t>
+      </w:r>
+      <w:proofErr w:type="spellEnd"/>
+      <w:r>
+        <w:rPr>
+          <w:rFonts w:ascii="Garamond" w:eastAsia="Garamond" w:hAnsi="Garamond" w:cs="Garamond"/>
+        </w:rPr>
+        <w:t xml:space="preserve"> </w:t>
+      </w:r>
+      <w:r>
+        <w:rPr>
+          <w:rFonts w:ascii="Garamond" w:eastAsia="Garamond" w:hAnsi="Garamond" w:cs="Garamond"/>
+        </w:rPr>
+        <w:t xml:space="preserve">equivalente al </w:t>
+      </w:r>
+      <w:proofErr w:type="gramStart"/>
+      <w:r>
+        <w:rPr>
+          <w:rFonts w:ascii="Garamond" w:eastAsia="Garamond" w:hAnsi="Garamond" w:cs="Garamond"/>
+          <w:highlight w:val="yellow"/>
+        </w:rPr>
+        <w:t>{{ N</w:t>
+      </w:r>
+      <w:proofErr w:type="gramEnd"/>
+      <w:r>
+        <w:rPr>
+          <w:rFonts w:ascii="Garamond" w:eastAsia="Garamond" w:hAnsi="Garamond" w:cs="Garamond"/>
+          <w:highlight w:val="yellow"/>
+        </w:rPr>
+        <w:t>_ADS_</w:t>
+      </w:r>
+      <w:proofErr w:type="gramStart"/>
+      <w:r>
+        <w:rPr>
+          <w:rFonts w:ascii="Garamond" w:eastAsia="Garamond" w:hAnsi="Garamond" w:cs="Garamond"/>
+          <w:highlight w:val="yellow"/>
+        </w:rPr>
+        <w:t>RAPPI }}</w:t>
+      </w:r>
+      <w:r>
+        <w:rPr>
+          <w:rFonts w:ascii="Garamond" w:eastAsia="Garamond" w:hAnsi="Garamond" w:cs="Garamond"/>
+        </w:rPr>
+        <w:t>%</w:t>
+      </w:r>
+      <w:proofErr w:type="gramEnd"/>
+      <w:r>
+        <w:rPr>
+          <w:rFonts w:ascii="Garamond" w:eastAsia="Garamond" w:hAnsi="Garamond" w:cs="Garamond"/>
+        </w:rPr>
+        <w:t xml:space="preserve"> </w:t>
+      </w:r>
+      <w:r>
+        <w:rPr>
+          <w:rFonts w:ascii="Garamond" w:eastAsia="Garamond" w:hAnsi="Garamond" w:cs="Garamond"/>
+          <w:highlight w:val="yellow"/>
+        </w:rPr>
+        <w:t>(</w:t>
+      </w:r>
+      <w:proofErr w:type="gramStart"/>
+      <w:r>
+        <w:rPr>
+          <w:rFonts w:ascii="Garamond" w:eastAsia="Garamond" w:hAnsi="Garamond" w:cs="Garamond"/>
+          <w:highlight w:val="yellow"/>
+        </w:rPr>
+        <w:t>{{ VALOR</w:t>
+      </w:r>
+      <w:proofErr w:type="gramEnd"/>
+      <w:r>
+        <w:rPr>
+          <w:rFonts w:ascii="Garamond" w:eastAsia="Garamond" w:hAnsi="Garamond" w:cs="Garamond"/>
+          <w:highlight w:val="yellow"/>
+        </w:rPr>
+        <w:t>_ADS_</w:t>
+      </w:r>
+      <w:proofErr w:type="gramStart"/>
+      <w:r>
+        <w:rPr>
+          <w:rFonts w:ascii="Garamond" w:eastAsia="Garamond" w:hAnsi="Garamond" w:cs="Garamond"/>
+          <w:highlight w:val="yellow"/>
+        </w:rPr>
+        <w:t>RAPPI }</w:t>
+      </w:r>
+      <w:proofErr w:type="gramEnd"/>
+      <w:r>
+        <w:rPr>
+          <w:rFonts w:ascii="Garamond" w:eastAsia="Garamond" w:hAnsi="Garamond" w:cs="Garamond"/>
+          <w:highlight w:val="yellow"/>
+        </w:rPr>
+        <w:t>}</w:t>
+      </w:r>
+      <w:r>
+        <w:rPr>
+          <w:rFonts w:ascii="Garamond" w:eastAsia="Garamond" w:hAnsi="Garamond" w:cs="Garamond"/>
+          <w:highlight w:val="yellow"/>
+        </w:rPr>
+        <w:t>)</w:t>
+      </w:r>
+      <w:r>
+        <w:rPr>
+          <w:rFonts w:ascii="Garamond" w:eastAsia="Garamond" w:hAnsi="Garamond" w:cs="Garamond"/>
+        </w:rPr>
+        <w:t xml:space="preserve"> de las ventas totales del Aliado en la Plataforma Rappi del mes anterior. Rappi activará los </w:t>
+      </w:r>
+      <w:proofErr w:type="spellStart"/>
+      <w:r>
+        <w:rPr>
+          <w:rFonts w:ascii="Garamond" w:eastAsia="Garamond" w:hAnsi="Garamond" w:cs="Garamond"/>
+        </w:rPr>
+        <w:t>Ads</w:t>
+      </w:r>
+      <w:proofErr w:type="spellEnd"/>
+      <w:r>
+        <w:rPr>
+          <w:rFonts w:ascii="Garamond" w:eastAsia="Garamond" w:hAnsi="Garamond" w:cs="Garamond"/>
+        </w:rPr>
+        <w:t xml:space="preserve"> en las fechas acordadas por las Partes, sujetándose su ejecución y cobro a los términos disponibles en https://legal.rappi.com.co/mexico/terminos-y-condiciones-ads-vertical-restaurantes-mexico Solo se facturarán los </w:t>
+      </w:r>
+      <w:proofErr w:type="spellStart"/>
+      <w:r>
+        <w:rPr>
+          <w:rFonts w:ascii="Garamond" w:eastAsia="Garamond" w:hAnsi="Garamond" w:cs="Garamond"/>
+        </w:rPr>
+        <w:t>Clicks</w:t>
+      </w:r>
+      <w:proofErr w:type="spellEnd"/>
+      <w:r>
+        <w:rPr>
+          <w:rFonts w:ascii="Garamond" w:eastAsia="Garamond" w:hAnsi="Garamond" w:cs="Garamond"/>
+        </w:rPr>
+        <w:t xml:space="preserve"> efectivamente ejecutados. {% endif %}</w:t>
+      </w:r>
+    </w:p>
+    <w:p>
+      <w:pPr>
+        <w:jc w:val="both"/>
+        <w:rPr>
+          <w:rFonts w:ascii="Garamond" w:eastAsia="Garamond" w:hAnsi="Garamond" w:cs="Garamond"/>
+          <w:sz w:val="23"/>
+          <w:szCs w:val="23"/>
+          <w:lang w:val="es-ES"/>
+        </w:rPr>
+      </w:pPr>
+      <w:r>
+        <w:rPr>
+          <w:rFonts w:ascii="Garamond" w:eastAsia="Garamond" w:hAnsi="Garamond" w:cs="Garamond"/>
+          <w:sz w:val="23"/>
+          <w:szCs w:val="23"/>
+          <w:highlight w:val="yellow"/>
+          <w:lang w:val="es-ES"/>
+        </w:rPr>
+        <w:t>{%p if activa_descuento_menu %}</w:t>
+      </w:r>
+    </w:p>
+    <w:p>
+      <w:pPr>
+        <w:jc w:val="both"/>
+        <w:rPr>
+          <w:rFonts w:ascii="Garamond" w:eastAsia="Garamond" w:hAnsi="Garamond" w:cs="Garamond"/>
+          <w:sz w:val="23"/>
+          <w:szCs w:val="23"/>
+        </w:rPr>
+      </w:pPr>
+      <w:proofErr w:type="gramStart"/>
+      <w:r>
+        <w:rPr>
+          <w:rFonts w:ascii="Garamond" w:eastAsia="Garamond" w:hAnsi="Garamond" w:cs="Garamond"/>
+          <w:sz w:val="23"/>
+          <w:szCs w:val="23"/>
+          <w:b/>
+        </w:rPr>
+        <w:t>{{ ROM</w:t>
+      </w:r>
+      <w:proofErr w:type="gramEnd"/>
+      <w:r>
+        <w:rPr>
+          <w:rFonts w:ascii="Garamond" w:eastAsia="Garamond" w:hAnsi="Garamond" w:cs="Garamond"/>
+          <w:sz w:val="23"/>
+          <w:szCs w:val="23"/>
+          <w:b/>
+        </w:rPr>
+        <w:t>_DESCUENTO_</w:t>
+      </w:r>
+      <w:proofErr w:type="gramStart"/>
+      <w:r>
+        <w:rPr>
+          <w:rFonts w:ascii="Garamond" w:eastAsia="Garamond" w:hAnsi="Garamond" w:cs="Garamond"/>
+          <w:sz w:val="23"/>
+          <w:szCs w:val="23"/>
+          <w:b/>
+        </w:rPr>
+        <w:t>MENU }</w:t>
+      </w:r>
+      <w:proofErr w:type="gramEnd"/>
+      <w:r>
+        <w:rPr>
+          <w:rFonts w:ascii="Garamond" w:eastAsia="Garamond" w:hAnsi="Garamond" w:cs="Garamond"/>
+          <w:sz w:val="23"/>
+          <w:szCs w:val="23"/>
+          <w:b/>
+        </w:rPr>
+        <w:t xml:space="preserve">} Realizar un descuento de por lo menos el </w:t>
+      </w:r>
+      <w:proofErr w:type="gramStart"/>
+      <w:r>
+        <w:rPr>
+          <w:rFonts w:ascii="Garamond" w:eastAsia="Garamond" w:hAnsi="Garamond" w:cs="Garamond"/>
+          <w:sz w:val="23"/>
+          <w:szCs w:val="23"/>
+          <w:highlight w:val="yellow"/>
+        </w:rPr>
+        <w:t>{{ N</w:t>
+      </w:r>
+      <w:proofErr w:type="gramEnd"/>
+      <w:r>
+        <w:rPr>
+          <w:rFonts w:ascii="Garamond" w:eastAsia="Garamond" w:hAnsi="Garamond" w:cs="Garamond"/>
+          <w:sz w:val="23"/>
+          <w:szCs w:val="23"/>
+          <w:highlight w:val="yellow"/>
+        </w:rPr>
+        <w:t>_DESCUENTO_</w:t>
+      </w:r>
+      <w:proofErr w:type="gramStart"/>
+      <w:r>
+        <w:rPr>
+          <w:rFonts w:ascii="Garamond" w:eastAsia="Garamond" w:hAnsi="Garamond" w:cs="Garamond"/>
+          <w:sz w:val="23"/>
+          <w:szCs w:val="23"/>
+          <w:highlight w:val="yellow"/>
+        </w:rPr>
+        <w:t>MENU }}</w:t>
+      </w:r>
+      <w:r>
+        <w:rPr>
+          <w:rFonts w:ascii="Garamond" w:eastAsia="Garamond" w:hAnsi="Garamond" w:cs="Garamond"/>
+          <w:sz w:val="23"/>
+          <w:szCs w:val="23"/>
+        </w:rPr>
+        <w:t>%</w:t>
+      </w:r>
+      <w:proofErr w:type="gramEnd"/>
+      <w:r>
+        <w:rPr>
+          <w:rFonts w:ascii="Garamond" w:eastAsia="Garamond" w:hAnsi="Garamond" w:cs="Garamond"/>
+          <w:sz w:val="23"/>
+          <w:szCs w:val="23"/>
+        </w:rPr>
+        <w:t xml:space="preserve"> (</w:t>
+      </w:r>
+      <w:proofErr w:type="gramStart"/>
+      <w:r>
+        <w:rPr>
+          <w:rFonts w:ascii="Garamond" w:eastAsia="Garamond" w:hAnsi="Garamond" w:cs="Garamond"/>
+          <w:sz w:val="23"/>
+          <w:szCs w:val="23"/>
+          <w:highlight w:val="yellow"/>
+        </w:rPr>
+        <w:t xml:space="preserve">{{ </w:t>
+      </w:r>
+      <w:proofErr w:type="spellStart"/>
+      <w:r>
+        <w:rPr>
+          <w:rFonts w:ascii="Garamond" w:eastAsia="Garamond" w:hAnsi="Garamond" w:cs="Garamond"/>
+          <w:sz w:val="23"/>
+          <w:szCs w:val="23"/>
+          <w:highlight w:val="yellow"/>
+        </w:rPr>
+        <w:t>VALOR</w:t>
+      </w:r>
+      <w:proofErr w:type="gramEnd"/>
+      <w:r>
+        <w:rPr>
+          <w:rFonts w:ascii="Garamond" w:eastAsia="Garamond" w:hAnsi="Garamond" w:cs="Garamond"/>
+          <w:sz w:val="23"/>
+          <w:szCs w:val="23"/>
+          <w:highlight w:val="yellow"/>
+        </w:rPr>
+        <w:t>_DESCUENTO_MENU</w:t>
+      </w:r>
+      <w:r>
+        <w:rPr>
+          <w:rFonts w:ascii="Garamond" w:eastAsia="Garamond" w:hAnsi="Garamond" w:cs="Garamond"/>
+          <w:sz w:val="23"/>
+          <w:szCs w:val="23"/>
+          <w:highlight w:val="yellow"/>
+        </w:rPr>
+        <w:t>|</w:t>
+      </w:r>
+      <w:proofErr w:type="gramStart"/>
+      <w:r>
+        <w:rPr>
+          <w:rFonts w:ascii="Garamond" w:eastAsia="Garamond" w:hAnsi="Garamond" w:cs="Garamond"/>
+          <w:sz w:val="23"/>
+          <w:szCs w:val="23"/>
+          <w:highlight w:val="yellow"/>
+        </w:rPr>
+        <w:t>lower</w:t>
+      </w:r>
+      <w:proofErr w:type="spellEnd"/>
+      <w:r>
+        <w:rPr>
+          <w:rFonts w:ascii="Garamond" w:eastAsia="Garamond" w:hAnsi="Garamond" w:cs="Garamond"/>
+          <w:sz w:val="23"/>
+          <w:szCs w:val="23"/>
+          <w:highlight w:val="yellow"/>
+        </w:rPr>
+        <w:t xml:space="preserve"> }</w:t>
+      </w:r>
+      <w:proofErr w:type="gramEnd"/>
+      <w:r>
+        <w:rPr>
+          <w:rFonts w:ascii="Garamond" w:eastAsia="Garamond" w:hAnsi="Garamond" w:cs="Garamond"/>
+          <w:sz w:val="23"/>
+          <w:szCs w:val="23"/>
+          <w:highlight w:val="yellow"/>
+        </w:rPr>
+        <w:t>}</w:t>
+      </w:r>
+      <w:r>
+        <w:rPr>
+          <w:rFonts w:ascii="Garamond" w:eastAsia="Garamond" w:hAnsi="Garamond" w:cs="Garamond"/>
+          <w:sz w:val="23"/>
+          <w:szCs w:val="23"/>
+        </w:rPr>
+        <w:t xml:space="preserve"> </w:t>
+      </w:r>
+      <w:r>
+        <w:rPr>
+          <w:rFonts w:ascii="Garamond" w:eastAsia="Garamond" w:hAnsi="Garamond" w:cs="Garamond"/>
+          <w:sz w:val="23"/>
+          <w:szCs w:val="23"/>
+        </w:rPr>
+        <w:t xml:space="preserve">por ciento) en todo el menú dentro de la Plataforma Rappi durante los primeros </w:t>
+      </w:r>
+      <w:proofErr w:type="gramStart"/>
+      <w:r>
+        <w:rPr>
+          <w:rFonts w:ascii="Garamond" w:eastAsia="Garamond" w:hAnsi="Garamond" w:cs="Garamond"/>
+          <w:sz w:val="23"/>
+          <w:szCs w:val="23"/>
+          <w:highlight w:val="yellow"/>
+        </w:rPr>
+        <w:t>{{ N</w:t>
+      </w:r>
+      <w:proofErr w:type="gramEnd"/>
+      <w:r>
+        <w:rPr>
+          <w:rFonts w:ascii="Garamond" w:eastAsia="Garamond" w:hAnsi="Garamond" w:cs="Garamond"/>
+          <w:sz w:val="23"/>
+          <w:szCs w:val="23"/>
+          <w:highlight w:val="yellow"/>
+        </w:rPr>
+        <w:t>_MESES_DESCUENTO_</w:t>
+      </w:r>
+      <w:proofErr w:type="gramStart"/>
+      <w:r>
+        <w:rPr>
+          <w:rFonts w:ascii="Garamond" w:eastAsia="Garamond" w:hAnsi="Garamond" w:cs="Garamond"/>
+          <w:sz w:val="23"/>
+          <w:szCs w:val="23"/>
+          <w:highlight w:val="yellow"/>
+        </w:rPr>
+        <w:t>MENU }</w:t>
+      </w:r>
+      <w:proofErr w:type="gramEnd"/>
+      <w:r>
+        <w:rPr>
+          <w:rFonts w:ascii="Garamond" w:eastAsia="Garamond" w:hAnsi="Garamond" w:cs="Garamond"/>
+          <w:sz w:val="23"/>
+          <w:szCs w:val="23"/>
+          <w:highlight w:val="yellow"/>
+        </w:rPr>
+        <w:t>}</w:t>
+      </w:r>
+      <w:r>
+        <w:rPr>
+          <w:rFonts w:ascii="Garamond" w:eastAsia="Garamond" w:hAnsi="Garamond" w:cs="Garamond"/>
+          <w:sz w:val="23"/>
+          <w:szCs w:val="23"/>
+        </w:rPr>
+        <w:t xml:space="preserve"> (</w:t>
+      </w:r>
+      <w:proofErr w:type="gramStart"/>
+      <w:r>
+        <w:rPr>
+          <w:rFonts w:ascii="Garamond" w:eastAsia="Garamond" w:hAnsi="Garamond" w:cs="Garamond"/>
+          <w:sz w:val="23"/>
+          <w:szCs w:val="23"/>
+          <w:highlight w:val="yellow"/>
+        </w:rPr>
+        <w:t xml:space="preserve">{{ </w:t>
+      </w:r>
+      <w:proofErr w:type="spellStart"/>
+      <w:r>
+        <w:rPr>
+          <w:rFonts w:ascii="Garamond" w:eastAsia="Garamond" w:hAnsi="Garamond" w:cs="Garamond"/>
+          <w:sz w:val="23"/>
+          <w:szCs w:val="23"/>
+          <w:highlight w:val="yellow"/>
+        </w:rPr>
+        <w:t>VALOR</w:t>
+      </w:r>
+      <w:proofErr w:type="gramEnd"/>
+      <w:r>
+        <w:rPr>
+          <w:rFonts w:ascii="Garamond" w:eastAsia="Garamond" w:hAnsi="Garamond" w:cs="Garamond"/>
+          <w:sz w:val="23"/>
+          <w:szCs w:val="23"/>
+          <w:highlight w:val="yellow"/>
+        </w:rPr>
+        <w:t>_MES_DESCUENTO_MENU</w:t>
+      </w:r>
+      <w:r>
+        <w:rPr>
+          <w:rFonts w:ascii="Garamond" w:eastAsia="Garamond" w:hAnsi="Garamond" w:cs="Garamond"/>
+          <w:sz w:val="23"/>
+          <w:szCs w:val="23"/>
+          <w:highlight w:val="yellow"/>
+        </w:rPr>
+        <w:t>|</w:t>
+      </w:r>
+      <w:proofErr w:type="gramStart"/>
+      <w:r>
+        <w:rPr>
+          <w:rFonts w:ascii="Garamond" w:eastAsia="Garamond" w:hAnsi="Garamond" w:cs="Garamond"/>
+          <w:sz w:val="23"/>
+          <w:szCs w:val="23"/>
+          <w:highlight w:val="yellow"/>
+        </w:rPr>
+        <w:t>lower</w:t>
+      </w:r>
+      <w:proofErr w:type="spellEnd"/>
+      <w:r>
+        <w:rPr>
+          <w:rFonts w:ascii="Garamond" w:eastAsia="Garamond" w:hAnsi="Garamond" w:cs="Garamond"/>
+          <w:sz w:val="23"/>
+          <w:szCs w:val="23"/>
+          <w:highlight w:val="yellow"/>
+        </w:rPr>
+        <w:t xml:space="preserve"> }</w:t>
+      </w:r>
+      <w:proofErr w:type="gramEnd"/>
+      <w:r>
+        <w:rPr>
+          <w:rFonts w:ascii="Garamond" w:eastAsia="Garamond" w:hAnsi="Garamond" w:cs="Garamond"/>
+          <w:sz w:val="23"/>
+          <w:szCs w:val="23"/>
+          <w:highlight w:val="yellow"/>
+        </w:rPr>
+        <w:t>}</w:t>
+      </w:r>
+      <w:r>
+        <w:rPr>
+          <w:rFonts w:ascii="Garamond" w:eastAsia="Garamond" w:hAnsi="Garamond" w:cs="Garamond"/>
+          <w:sz w:val="23"/>
+          <w:szCs w:val="23"/>
+        </w:rPr>
+        <w:t>) meses de ejecución del presente Acuerdo.</w:t>
+      </w:r>
+    </w:p>
+    <w:p>
+      <w:pPr>
+        <w:jc w:val="both"/>
+        <w:rPr>
+          <w:rFonts w:ascii="Garamond" w:eastAsia="Garamond" w:hAnsi="Garamond" w:cs="Garamond"/>
+          <w:sz w:val="23"/>
+          <w:szCs w:val="23"/>
+          <w:lang w:val="en-US"/>
+        </w:rPr>
+      </w:pPr>
+      <w:r>
+        <w:rPr>
+          <w:rFonts w:ascii="Garamond" w:eastAsia="Garamond" w:hAnsi="Garamond" w:cs="Garamond"/>
+          <w:sz w:val="23"/>
+          <w:szCs w:val="23"/>
+          <w:highlight w:val="yellow"/>
+          <w:lang w:val="en-US"/>
+        </w:rPr>
+        <w:t>{%p endif %}</w:t>
+      </w:r>
+    </w:p>
+    <w:p>
+      <w:pPr>
+        <w:jc w:val="both"/>
+        <w:rPr>
+          <w:rFonts w:ascii="Garamond" w:eastAsia="Garamond" w:hAnsi="Garamond" w:cs="Garamond"/>
+          <w:sz w:val="23"/>
+          <w:szCs w:val="23"/>
+          <w:lang w:val="en-US"/>
+        </w:rPr>
+      </w:pPr>
+      <w:r>
+        <w:rPr>
+          <w:rFonts w:ascii="Garamond" w:eastAsia="Garamond" w:hAnsi="Garamond" w:cs="Garamond"/>
+          <w:sz w:val="23"/>
+          <w:szCs w:val="23"/>
+          <w:highlight w:val="yellow"/>
+          <w:lang w:val="en-US"/>
+        </w:rPr>
+        <w:t xml:space="preserve">{%p if </w:t>
+      </w:r>
+      <w:proofErr w:type="spellStart"/>
+      <w:r>
+        <w:rPr>
+          <w:rFonts w:ascii="Garamond" w:eastAsia="Garamond" w:hAnsi="Garamond" w:cs="Garamond"/>
+          <w:sz w:val="23"/>
+          <w:szCs w:val="23"/>
+          <w:highlight w:val="yellow"/>
+          <w:lang w:val="en-US"/>
+        </w:rPr>
+        <w:t>activa_mark_down</w:t>
+      </w:r>
+      <w:proofErr w:type="spellEnd"/>
+      <w:r>
+        <w:rPr>
+          <w:rFonts w:ascii="Garamond" w:eastAsia="Garamond" w:hAnsi="Garamond" w:cs="Garamond"/>
+          <w:sz w:val="23"/>
+          <w:szCs w:val="23"/>
+          <w:highlight w:val="yellow"/>
+          <w:lang w:val="en-US"/>
+        </w:rPr>
+        <w:t xml:space="preserve"> %}</w:t>
+      </w:r>
+    </w:p>
+    <w:p>
+      <w:pPr>
+        <w:jc w:val="both"/>
+        <w:rPr>
+          <w:rFonts w:ascii="Garamond" w:eastAsia="Garamond" w:hAnsi="Garamond" w:cs="Garamond"/>
+          <w:sz w:val="23"/>
+          <w:szCs w:val="23"/>
+        </w:rPr>
+      </w:pPr>
+      <w:proofErr w:type="gramStart"/>
+      <w:r>
+        <w:rPr>
+          <w:rFonts w:ascii="Garamond" w:eastAsia="Garamond" w:hAnsi="Garamond" w:cs="Garamond"/>
+          <w:sz w:val="23"/>
+          <w:szCs w:val="23"/>
+          <w:b/>
+        </w:rPr>
+        <w:t>{{ ROM</w:t>
+      </w:r>
+      <w:proofErr w:type="gramEnd"/>
+      <w:r>
+        <w:rPr>
+          <w:rFonts w:ascii="Garamond" w:eastAsia="Garamond" w:hAnsi="Garamond" w:cs="Garamond"/>
+          <w:sz w:val="23"/>
+          <w:szCs w:val="23"/>
+          <w:b/>
+        </w:rPr>
+        <w:t>_MARK_</w:t>
+      </w:r>
+      <w:proofErr w:type="gramStart"/>
+      <w:r>
+        <w:rPr>
+          <w:rFonts w:ascii="Garamond" w:eastAsia="Garamond" w:hAnsi="Garamond" w:cs="Garamond"/>
+          <w:sz w:val="23"/>
+          <w:szCs w:val="23"/>
+          <w:b/>
+        </w:rPr>
+        <w:t>DOWN }</w:t>
+      </w:r>
+      <w:proofErr w:type="gramEnd"/>
+      <w:r>
+        <w:rPr>
+          <w:rFonts w:ascii="Garamond" w:eastAsia="Garamond" w:hAnsi="Garamond" w:cs="Garamond"/>
+          <w:sz w:val="23"/>
+          <w:szCs w:val="23"/>
+          <w:b/>
+        </w:rPr>
+        <w:t xml:space="preserve">} Realizar una inversión mensual en promociones del </w:t>
+      </w:r>
+      <w:proofErr w:type="gramStart"/>
+      <w:r>
+        <w:rPr>
+          <w:rFonts w:ascii="Garamond" w:eastAsia="Garamond" w:hAnsi="Garamond" w:cs="Garamond"/>
+          <w:sz w:val="23"/>
+          <w:szCs w:val="23"/>
+          <w:highlight w:val="yellow"/>
+        </w:rPr>
+        <w:t>{{ N</w:t>
+      </w:r>
+      <w:proofErr w:type="gramEnd"/>
+      <w:r>
+        <w:rPr>
+          <w:rFonts w:ascii="Garamond" w:eastAsia="Garamond" w:hAnsi="Garamond" w:cs="Garamond"/>
+          <w:sz w:val="23"/>
+          <w:szCs w:val="23"/>
+          <w:highlight w:val="yellow"/>
+        </w:rPr>
+        <w:t>_DESCUENTO_MARK_</w:t>
+      </w:r>
+      <w:proofErr w:type="gramStart"/>
+      <w:r>
+        <w:rPr>
+          <w:rFonts w:ascii="Garamond" w:eastAsia="Garamond" w:hAnsi="Garamond" w:cs="Garamond"/>
+          <w:sz w:val="23"/>
+          <w:szCs w:val="23"/>
+          <w:highlight w:val="yellow"/>
+        </w:rPr>
+        <w:t>DOWN }}</w:t>
+      </w:r>
+      <w:r>
+        <w:rPr>
+          <w:rFonts w:ascii="Garamond" w:eastAsia="Garamond" w:hAnsi="Garamond" w:cs="Garamond"/>
+          <w:sz w:val="23"/>
+          <w:szCs w:val="23"/>
+        </w:rPr>
+        <w:t>%</w:t>
+      </w:r>
+      <w:proofErr w:type="gramEnd"/>
+      <w:r>
+        <w:rPr>
+          <w:rFonts w:ascii="Garamond" w:eastAsia="Garamond" w:hAnsi="Garamond" w:cs="Garamond"/>
+          <w:sz w:val="23"/>
+          <w:szCs w:val="23"/>
+        </w:rPr>
+        <w:t xml:space="preserve"> (</w:t>
+      </w:r>
+      <w:proofErr w:type="gramStart"/>
+      <w:r>
+        <w:rPr>
+          <w:rFonts w:ascii="Garamond" w:eastAsia="Garamond" w:hAnsi="Garamond" w:cs="Garamond"/>
+          <w:sz w:val="23"/>
+          <w:szCs w:val="23"/>
+          <w:highlight w:val="yellow"/>
+        </w:rPr>
+        <w:t xml:space="preserve">{{ </w:t>
+      </w:r>
+      <w:proofErr w:type="spellStart"/>
+      <w:r>
+        <w:rPr>
+          <w:rFonts w:ascii="Garamond" w:eastAsia="Garamond" w:hAnsi="Garamond" w:cs="Garamond"/>
+          <w:sz w:val="23"/>
+          <w:szCs w:val="23"/>
+          <w:highlight w:val="yellow"/>
+        </w:rPr>
+        <w:t>VALOR</w:t>
+      </w:r>
+      <w:proofErr w:type="gramEnd"/>
+      <w:r>
+        <w:rPr>
+          <w:rFonts w:ascii="Garamond" w:eastAsia="Garamond" w:hAnsi="Garamond" w:cs="Garamond"/>
+          <w:sz w:val="23"/>
+          <w:szCs w:val="23"/>
+          <w:highlight w:val="yellow"/>
+        </w:rPr>
+        <w:t>_DESCUENTO_MARK_DOWN|</w:t>
+      </w:r>
+      <w:proofErr w:type="gramStart"/>
+      <w:r>
+        <w:rPr>
+          <w:rFonts w:ascii="Garamond" w:eastAsia="Garamond" w:hAnsi="Garamond" w:cs="Garamond"/>
+          <w:sz w:val="23"/>
+          <w:szCs w:val="23"/>
+          <w:highlight w:val="yellow"/>
+        </w:rPr>
+        <w:t>lower</w:t>
+      </w:r>
+      <w:proofErr w:type="spellEnd"/>
+      <w:r>
+        <w:rPr>
+          <w:rFonts w:ascii="Garamond" w:eastAsia="Garamond" w:hAnsi="Garamond" w:cs="Garamond"/>
+          <w:sz w:val="23"/>
+          <w:szCs w:val="23"/>
+          <w:highlight w:val="yellow"/>
+        </w:rPr>
+        <w:t xml:space="preserve"> }</w:t>
+      </w:r>
+      <w:proofErr w:type="gramEnd"/>
+      <w:r>
+        <w:rPr>
+          <w:rFonts w:ascii="Garamond" w:eastAsia="Garamond" w:hAnsi="Garamond" w:cs="Garamond"/>
+          <w:sz w:val="23"/>
+          <w:szCs w:val="23"/>
+          <w:highlight w:val="yellow"/>
+        </w:rPr>
+        <w:t>}</w:t>
+      </w:r>
+      <w:r>
+        <w:rPr>
+          <w:rFonts w:ascii="Garamond" w:eastAsia="Garamond" w:hAnsi="Garamond" w:cs="Garamond"/>
+          <w:sz w:val="23"/>
+          <w:szCs w:val="23"/>
+        </w:rPr>
+        <w:t xml:space="preserve"> por ciento) de las ventas totales realizadas por el Aliado a través de la Plataforma Rappi durante el mes inmediatamente anterior durante la vigencia del presente Acuerdo.</w:t>
+      </w:r>
+    </w:p>
+    <w:p>
+      <w:pPr>
+        <w:jc w:val="both"/>
+        <w:rPr>
+          <w:rFonts w:ascii="Garamond" w:eastAsia="Garamond" w:hAnsi="Garamond" w:cs="Garamond"/>
+          <w:sz w:val="23"/>
+          <w:szCs w:val="23"/>
+          <w:lang w:val="es-MX"/>
+        </w:rPr>
+      </w:pPr>
+      <w:r>
+        <w:rPr>
+          <w:rFonts w:ascii="Garamond" w:eastAsia="Garamond" w:hAnsi="Garamond" w:cs="Garamond"/>
+          <w:sz w:val="23"/>
+          <w:szCs w:val="23"/>
+          <w:highlight w:val="yellow"/>
+          <w:lang w:val="es-ES"/>
+        </w:rPr>
+        <w:t xml:space="preserve">{%p </w:t>
+      </w:r>
+      <w:proofErr w:type="spellStart"/>
+      <w:r>
+        <w:rPr>
+          <w:rFonts w:ascii="Garamond" w:eastAsia="Garamond" w:hAnsi="Garamond" w:cs="Garamond"/>
+          <w:sz w:val="23"/>
+          <w:szCs w:val="23"/>
+          <w:highlight w:val="yellow"/>
+          <w:lang w:val="es-ES"/>
+        </w:rPr>
+        <w:t>endif</w:t>
+      </w:r>
+      <w:proofErr w:type="spellEnd"/>
+      <w:r>
+        <w:rPr>
+          <w:rFonts w:ascii="Garamond" w:eastAsia="Garamond" w:hAnsi="Garamond" w:cs="Garamond"/>
+          <w:sz w:val="23"/>
+          <w:szCs w:val="23"/>
+          <w:highlight w:val="yellow"/>
+          <w:lang w:val="es-ES"/>
+        </w:rPr>
+        <w:t xml:space="preserve"> %}</w:t>
+      </w:r>
+    </w:p>
+    <w:p>
+      <w:pPr>
+        <w:jc w:val="both"/>
+        <w:rPr>
+          <w:rFonts w:ascii="Garamond" w:eastAsia="Garamond" w:hAnsi="Garamond" w:cs="Garamond"/>
+          <w:sz w:val="23"/>
+          <w:szCs w:val="23"/>
+          <w:lang w:val="es-ES"/>
+        </w:rPr>
+      </w:pPr>
+      <w:r>
+        <w:rPr>
+          <w:rFonts w:ascii="Garamond" w:eastAsia="Garamond" w:hAnsi="Garamond" w:cs="Garamond"/>
+          <w:sz w:val="23"/>
+          <w:szCs w:val="23"/>
+          <w:highlight w:val="yellow"/>
+          <w:lang w:val="es-ES"/>
+        </w:rPr>
+        <w:t xml:space="preserve">{%p </w:t>
+      </w:r>
+      <w:proofErr w:type="spellStart"/>
+      <w:r>
+        <w:rPr>
+          <w:rFonts w:ascii="Garamond" w:eastAsia="Garamond" w:hAnsi="Garamond" w:cs="Garamond"/>
+          <w:sz w:val="23"/>
+          <w:szCs w:val="23"/>
+          <w:highlight w:val="yellow"/>
+          <w:lang w:val="es-ES"/>
+        </w:rPr>
+        <w:t>if</w:t>
+      </w:r>
+      <w:proofErr w:type="spellEnd"/>
+      <w:r>
+        <w:rPr>
+          <w:rFonts w:ascii="Garamond" w:eastAsia="Garamond" w:hAnsi="Garamond" w:cs="Garamond"/>
+          <w:sz w:val="23"/>
+          <w:szCs w:val="23"/>
+          <w:highlight w:val="yellow"/>
+          <w:lang w:val="es-ES"/>
+        </w:rPr>
+        <w:t xml:space="preserve"> </w:t>
+      </w:r>
+      <w:proofErr w:type="spellStart"/>
+      <w:r>
+        <w:rPr>
+          <w:rFonts w:ascii="Garamond" w:eastAsia="Garamond" w:hAnsi="Garamond" w:cs="Garamond"/>
+          <w:sz w:val="23"/>
+          <w:szCs w:val="23"/>
+          <w:highlight w:val="yellow"/>
+          <w:lang w:val="es-ES"/>
+        </w:rPr>
+        <w:t>activa_publicaciones_redes</w:t>
+      </w:r>
+      <w:proofErr w:type="spellEnd"/>
+      <w:r>
+        <w:rPr>
+          <w:rFonts w:ascii="Garamond" w:eastAsia="Garamond" w:hAnsi="Garamond" w:cs="Garamond"/>
+          <w:sz w:val="23"/>
+          <w:szCs w:val="23"/>
+          <w:highlight w:val="yellow"/>
+          <w:lang w:val="es-ES"/>
+        </w:rPr>
+        <w:t xml:space="preserve"> %}</w:t>
+      </w:r>
+    </w:p>
+    <w:p>
+      <w:pPr>
+        <w:jc w:val="both"/>
+        <w:rPr>
+          <w:rFonts w:ascii="Garamond" w:eastAsia="Garamond" w:hAnsi="Garamond" w:cs="Garamond"/>
+          <w:sz w:val="23"/>
+          <w:szCs w:val="23"/>
+        </w:rPr>
+      </w:pPr>
+      <w:proofErr w:type="gramStart"/>
+      <w:r>
+        <w:rPr>
+          <w:rFonts w:ascii="Garamond" w:eastAsia="Garamond" w:hAnsi="Garamond" w:cs="Garamond"/>
+          <w:sz w:val="23"/>
+          <w:szCs w:val="23"/>
+          <w:b/>
+        </w:rPr>
+        <w:t>{{ ROM</w:t>
+      </w:r>
+      <w:proofErr w:type="gramEnd"/>
+      <w:r>
+        <w:rPr>
+          <w:rFonts w:ascii="Garamond" w:eastAsia="Garamond" w:hAnsi="Garamond" w:cs="Garamond"/>
+          <w:sz w:val="23"/>
+          <w:szCs w:val="23"/>
+          <w:b/>
+        </w:rPr>
+        <w:t>_</w:t>
+      </w:r>
+      <w:proofErr w:type="gramStart"/>
+      <w:r>
+        <w:rPr>
+          <w:rFonts w:ascii="Garamond" w:eastAsia="Garamond" w:hAnsi="Garamond" w:cs="Garamond"/>
+          <w:sz w:val="23"/>
+          <w:szCs w:val="23"/>
+          <w:b/>
+        </w:rPr>
+        <w:t>REDES }</w:t>
+      </w:r>
+      <w:proofErr w:type="gramEnd"/>
+      <w:r>
+        <w:rPr>
+          <w:rFonts w:ascii="Garamond" w:eastAsia="Garamond" w:hAnsi="Garamond" w:cs="Garamond"/>
+          <w:sz w:val="23"/>
+          <w:szCs w:val="23"/>
+          <w:b/>
+        </w:rPr>
+        <w:t xml:space="preserve">} Realizar, al menos </w:t>
+      </w:r>
+      <w:proofErr w:type="gramStart"/>
+      <w:r>
+        <w:rPr>
+          <w:rFonts w:ascii="Garamond" w:eastAsia="Garamond" w:hAnsi="Garamond" w:cs="Garamond"/>
+          <w:sz w:val="23"/>
+          <w:szCs w:val="23"/>
+          <w:highlight w:val="yellow"/>
+        </w:rPr>
+        <w:t xml:space="preserve">{{ </w:t>
+      </w:r>
+      <w:r>
+        <w:rPr>
+          <w:rFonts w:ascii="Garamond" w:eastAsia="Garamond" w:hAnsi="Garamond" w:cs="Garamond"/>
+          <w:sz w:val="23"/>
+          <w:szCs w:val="23"/>
+          <w:highlight w:val="yellow"/>
+        </w:rPr>
+        <w:t>N</w:t>
+      </w:r>
+      <w:proofErr w:type="gramEnd"/>
+      <w:r>
+        <w:rPr>
+          <w:rFonts w:ascii="Garamond" w:eastAsia="Garamond" w:hAnsi="Garamond" w:cs="Garamond"/>
+          <w:sz w:val="23"/>
+          <w:szCs w:val="23"/>
+          <w:highlight w:val="yellow"/>
+        </w:rPr>
+        <w:t>_</w:t>
+      </w:r>
+      <w:r>
+        <w:rPr>
+          <w:rFonts w:ascii="Garamond" w:eastAsia="Garamond" w:hAnsi="Garamond" w:cs="Garamond"/>
+          <w:sz w:val="23"/>
+          <w:szCs w:val="23"/>
+          <w:highlight w:val="yellow"/>
+        </w:rPr>
+        <w:t>DESCUENTO_</w:t>
+      </w:r>
+      <w:proofErr w:type="gramStart"/>
+      <w:r>
+        <w:rPr>
+          <w:rFonts w:ascii="Garamond" w:eastAsia="Garamond" w:hAnsi="Garamond" w:cs="Garamond"/>
+          <w:sz w:val="23"/>
+          <w:szCs w:val="23"/>
+          <w:highlight w:val="yellow"/>
+        </w:rPr>
+        <w:t>REDES }</w:t>
+      </w:r>
+      <w:proofErr w:type="gramEnd"/>
+      <w:r>
+        <w:rPr>
+          <w:rFonts w:ascii="Garamond" w:eastAsia="Garamond" w:hAnsi="Garamond" w:cs="Garamond"/>
+          <w:sz w:val="23"/>
+          <w:szCs w:val="23"/>
+          <w:highlight w:val="yellow"/>
+        </w:rPr>
+        <w:t>}</w:t>
+      </w:r>
+      <w:r>
+        <w:rPr>
+          <w:rFonts w:ascii="Garamond" w:eastAsia="Garamond" w:hAnsi="Garamond" w:cs="Garamond"/>
+          <w:sz w:val="23"/>
+          <w:szCs w:val="23"/>
+        </w:rPr>
+        <w:t xml:space="preserve"> (</w:t>
+      </w:r>
+      <w:proofErr w:type="gramStart"/>
+      <w:r>
+        <w:rPr>
+          <w:rFonts w:ascii="Garamond" w:eastAsia="Garamond" w:hAnsi="Garamond" w:cs="Garamond"/>
+          <w:sz w:val="23"/>
+          <w:szCs w:val="23"/>
+          <w:highlight w:val="yellow"/>
+        </w:rPr>
+        <w:t xml:space="preserve">{{ </w:t>
+      </w:r>
+      <w:proofErr w:type="spellStart"/>
+      <w:r>
+        <w:rPr>
+          <w:rFonts w:ascii="Garamond" w:eastAsia="Garamond" w:hAnsi="Garamond" w:cs="Garamond"/>
+          <w:sz w:val="23"/>
+          <w:szCs w:val="23"/>
+          <w:highlight w:val="yellow"/>
+        </w:rPr>
+        <w:t>DESCUENTO</w:t>
+      </w:r>
+      <w:proofErr w:type="gramEnd"/>
+      <w:r>
+        <w:rPr>
+          <w:rFonts w:ascii="Garamond" w:eastAsia="Garamond" w:hAnsi="Garamond" w:cs="Garamond"/>
+          <w:sz w:val="23"/>
+          <w:szCs w:val="23"/>
+          <w:highlight w:val="yellow"/>
+        </w:rPr>
+        <w:t>_REDES</w:t>
+      </w:r>
+      <w:r>
+        <w:rPr>
+          <w:rFonts w:ascii="Garamond" w:eastAsia="Garamond" w:hAnsi="Garamond" w:cs="Garamond"/>
+          <w:sz w:val="23"/>
+          <w:szCs w:val="23"/>
+          <w:highlight w:val="yellow"/>
+        </w:rPr>
+        <w:t>|</w:t>
+      </w:r>
+      <w:proofErr w:type="gramStart"/>
+      <w:r>
+        <w:rPr>
+          <w:rFonts w:ascii="Garamond" w:eastAsia="Garamond" w:hAnsi="Garamond" w:cs="Garamond"/>
+          <w:sz w:val="23"/>
+          <w:szCs w:val="23"/>
+          <w:highlight w:val="yellow"/>
+        </w:rPr>
+        <w:t>lower</w:t>
+      </w:r>
+      <w:proofErr w:type="spellEnd"/>
+      <w:r>
+        <w:rPr>
+          <w:rFonts w:ascii="Garamond" w:eastAsia="Garamond" w:hAnsi="Garamond" w:cs="Garamond"/>
+          <w:sz w:val="23"/>
+          <w:szCs w:val="23"/>
+          <w:highlight w:val="yellow"/>
+        </w:rPr>
+        <w:t xml:space="preserve"> }</w:t>
+      </w:r>
+      <w:proofErr w:type="gramEnd"/>
+      <w:r>
+        <w:rPr>
+          <w:rFonts w:ascii="Garamond" w:eastAsia="Garamond" w:hAnsi="Garamond" w:cs="Garamond"/>
+          <w:sz w:val="23"/>
+          <w:szCs w:val="23"/>
+          <w:highlight w:val="yellow"/>
+        </w:rPr>
+        <w:t>}</w:t>
+      </w:r>
+      <w:r>
+        <w:rPr>
+          <w:rFonts w:ascii="Garamond" w:eastAsia="Garamond" w:hAnsi="Garamond" w:cs="Garamond"/>
+          <w:sz w:val="23"/>
+          <w:szCs w:val="23"/>
+        </w:rPr>
+        <w:t xml:space="preserve">) publicaciones mensuales en sus redes sociales garantizando que estén dirigidas única y exclusivamente a incrementar sus ventas a través de la Plataforma Rappi, </w:t>
+      </w:r>
+      <w:proofErr w:type="gramStart"/>
+      <w:r>
+        <w:rPr>
+          <w:rFonts w:ascii="Garamond" w:eastAsia="Garamond" w:hAnsi="Garamond" w:cs="Garamond"/>
+          <w:sz w:val="23"/>
+          <w:szCs w:val="23"/>
+        </w:rPr>
+        <w:t>enunciando</w:t>
+      </w:r>
+      <w:proofErr w:type="gramEnd"/>
+      <w:r>
+        <w:rPr>
+          <w:rFonts w:ascii="Garamond" w:eastAsia="Garamond" w:hAnsi="Garamond" w:cs="Garamond"/>
+          <w:sz w:val="23"/>
+          <w:szCs w:val="23"/>
+        </w:rPr>
+        <w:t xml:space="preserve"> pero no limitando, Instagram, Facebook y/o Tik Tok. Dichas publicaciones deberán ser presentadas y aprobadas por Rappi previo a su publicación.</w:t>
+      </w:r>
+    </w:p>
+    <w:p>
+      <w:pPr>
+        <w:jc w:val="both"/>
+        <w:rPr>
+          <w:rFonts w:ascii="Garamond" w:eastAsia="Garamond" w:hAnsi="Garamond" w:cs="Garamond"/>
+          <w:sz w:val="23"/>
+          <w:szCs w:val="23"/>
+          <w:lang w:val="en-US"/>
+        </w:rPr>
+      </w:pPr>
+      <w:r>
+        <w:rPr>
+          <w:rFonts w:ascii="Garamond" w:eastAsia="Garamond" w:hAnsi="Garamond" w:cs="Garamond"/>
+          <w:sz w:val="23"/>
+          <w:szCs w:val="23"/>
+          <w:highlight w:val="yellow"/>
+          <w:lang w:val="en-US"/>
+        </w:rPr>
+        <w:t>{%p endif %}</w:t>
+      </w:r>
+    </w:p>
+    <w:p>
+      <w:pPr>
+        <w:jc w:val="both"/>
+        <w:rPr>
+          <w:rFonts w:ascii="Garamond" w:eastAsia="Garamond" w:hAnsi="Garamond" w:cs="Garamond"/>
+          <w:sz w:val="23"/>
+          <w:szCs w:val="23"/>
+          <w:lang w:val="en-US"/>
+        </w:rPr>
+      </w:pPr>
+      <w:r>
+        <w:rPr>
+          <w:rFonts w:ascii="Garamond" w:eastAsia="Garamond" w:hAnsi="Garamond" w:cs="Garamond"/>
+          <w:sz w:val="23"/>
+          <w:szCs w:val="23"/>
+          <w:highlight w:val="yellow"/>
+          <w:lang w:val="en-US"/>
+        </w:rPr>
+        <w:t xml:space="preserve">{%p if </w:t>
+      </w:r>
+      <w:proofErr w:type="spellStart"/>
+      <w:r>
+        <w:rPr>
+          <w:rFonts w:ascii="Garamond" w:eastAsia="Garamond" w:hAnsi="Garamond" w:cs="Garamond"/>
+          <w:sz w:val="23"/>
+          <w:szCs w:val="23"/>
+          <w:highlight w:val="yellow"/>
+          <w:lang w:val="en-US"/>
+        </w:rPr>
+        <w:t>activa_platillos_top_seller</w:t>
+      </w:r>
+      <w:proofErr w:type="spellEnd"/>
+      <w:r>
+        <w:rPr>
+          <w:rFonts w:ascii="Garamond" w:eastAsia="Garamond" w:hAnsi="Garamond" w:cs="Garamond"/>
+          <w:sz w:val="23"/>
+          <w:szCs w:val="23"/>
+          <w:highlight w:val="yellow"/>
+          <w:lang w:val="en-US"/>
+        </w:rPr>
+        <w:t xml:space="preserve"> %}</w:t>
+      </w:r>
+    </w:p>
+    <w:p>
+      <w:pPr>
+        <w:jc w:val="both"/>
+        <w:rPr>
+          <w:rFonts w:ascii="Garamond" w:eastAsia="Garamond" w:hAnsi="Garamond" w:cs="Garamond"/>
+        </w:rPr>
+      </w:pPr>
+      <w:proofErr w:type="gramStart"/>
+      <w:r>
+        <w:rPr>
+          <w:rFonts w:ascii="Garamond" w:eastAsia="Garamond" w:hAnsi="Garamond" w:cs="Garamond"/>
+          <w:b/>
+        </w:rPr>
+        <w:t>{{ ROM</w:t>
+      </w:r>
+      <w:proofErr w:type="gramEnd"/>
+      <w:r>
+        <w:rPr>
+          <w:rFonts w:ascii="Garamond" w:eastAsia="Garamond" w:hAnsi="Garamond" w:cs="Garamond"/>
+          <w:b/>
+        </w:rPr>
+        <w:t>_</w:t>
+      </w:r>
+      <w:proofErr w:type="gramStart"/>
+      <w:r>
+        <w:rPr>
+          <w:rFonts w:ascii="Garamond" w:eastAsia="Garamond" w:hAnsi="Garamond" w:cs="Garamond"/>
+          <w:b/>
+        </w:rPr>
+        <w:t>PLATILLOS }</w:t>
+      </w:r>
+      <w:proofErr w:type="gramEnd"/>
+      <w:r>
+        <w:rPr>
+          <w:rFonts w:ascii="Garamond" w:eastAsia="Garamond" w:hAnsi="Garamond" w:cs="Garamond"/>
+          <w:b/>
+        </w:rPr>
+        <w:t xml:space="preserve">} Ofrecer {{ N_CANTIDAD_PLATILLOS }} ({{ VALOR_CANTIDAD_PLATILLOS }}) platillos</w:t>
+      </w:r>
+      <w:proofErr w:type="gramStart"/>
+      <w:r>
+        <w:rPr>
+          <w:rFonts w:ascii="Garamond" w:eastAsia="Garamond" w:hAnsi="Garamond" w:cs="Garamond"/>
+          <w:sz w:val="23"/>
+          <w:szCs w:val="23"/>
+          <w:highlight w:val="yellow"/>
+        </w:rPr>
+        <w:t xml:space="preserve"/>
+      </w:r>
+      <w:r>
+        <w:rPr>
+          <w:rFonts w:ascii="Garamond" w:eastAsia="Garamond" w:hAnsi="Garamond" w:cs="Garamond"/>
+          <w:sz w:val="23"/>
+          <w:szCs w:val="23"/>
           <w:highlight w:val="yellow"/>
         </w:rPr>
         <w:t/>
       </w:r>
-      <w:proofErr w:type="spellEnd"/>
-      <w:r>
-        <w:rPr>
-          <w:rFonts w:ascii="Garamond" w:eastAsia="Garamond" w:hAnsi="Garamond" w:cs="Garamond"/>
-          <w:highlight w:val="yellow"/>
+      <w:proofErr w:type="gramEnd"/>
+      <w:r>
+        <w:rPr>
+          <w:rFonts w:ascii="Garamond" w:eastAsia="Garamond" w:hAnsi="Garamond" w:cs="Garamond"/>
+          <w:sz w:val="23"/>
+          <w:szCs w:val="23"/>
+          <w:highlight w:val="yellow"/>
+        </w:rPr>
+        <w:t/>
+      </w:r>
+      <w:r>
+        <w:rPr>
+          <w:rFonts w:ascii="Garamond" w:eastAsia="Garamond" w:hAnsi="Garamond" w:cs="Garamond"/>
+          <w:sz w:val="23"/>
+          <w:szCs w:val="23"/>
+          <w:highlight w:val="yellow"/>
+        </w:rPr>
+        <w:t/>
+      </w:r>
+      <w:proofErr w:type="gramStart"/>
+      <w:r>
+        <w:rPr>
+          <w:rFonts w:ascii="Garamond" w:eastAsia="Garamond" w:hAnsi="Garamond" w:cs="Garamond"/>
+          <w:sz w:val="23"/>
+          <w:szCs w:val="23"/>
+          <w:highlight w:val="yellow"/>
+        </w:rPr>
+        <w:t/>
+      </w:r>
+      <w:proofErr w:type="gramEnd"/>
+      <w:r>
+        <w:rPr>
+          <w:rFonts w:ascii="Garamond" w:eastAsia="Garamond" w:hAnsi="Garamond" w:cs="Garamond"/>
+          <w:sz w:val="23"/>
+          <w:szCs w:val="23"/>
+          <w:highlight w:val="yellow"/>
+        </w:rPr>
+        <w:t/>
+      </w:r>
+      <w:r>
+        <w:rPr>
+          <w:rFonts w:ascii="Garamond" w:eastAsia="Garamond" w:hAnsi="Garamond" w:cs="Garamond"/>
+          <w:sz w:val="23"/>
+          <w:szCs w:val="23"/>
         </w:rPr>
         <w:t xml:space="preserve"/>
       </w:r>
-      <w:proofErr w:type="spellStart"/>
-      <w:r>
-        <w:rPr>
-          <w:rFonts w:ascii="Garamond" w:eastAsia="Garamond" w:hAnsi="Garamond" w:cs="Garamond"/>
-          <w:highlight w:val="yellow"/>
-        </w:rPr>
-        <w:t/>
-      </w:r>
-      <w:proofErr w:type="spellEnd"/>
-      <w:r>
-        <w:rPr>
-          <w:rFonts w:ascii="Garamond" w:eastAsia="Garamond" w:hAnsi="Garamond" w:cs="Garamond"/>
-          <w:highlight w:val="yellow"/>
-        </w:rPr>
-        <w:t xml:space="preserve"/>
-      </w:r>
-      <w:r>
-        <w:rPr>
-          <w:rFonts w:ascii="Garamond" w:eastAsia="Garamond" w:hAnsi="Garamond" w:cs="Garamond"/>
-          <w:sz w:val="23"/>
-          <w:szCs w:val="23"/>
-          <w:highlight w:val="yellow"/>
-        </w:rPr>
-        <w:t/>
-      </w:r>
-      <w:proofErr w:type="spellStart"/>
-      <w:r>
-        <w:rPr>
-          <w:rFonts w:ascii="Garamond" w:eastAsia="Garamond" w:hAnsi="Garamond" w:cs="Garamond"/>
-          <w:sz w:val="23"/>
-          <w:szCs w:val="23"/>
-          <w:highlight w:val="yellow"/>
-        </w:rPr>
-        <w:t/>
-      </w:r>
-      <w:proofErr w:type="spellEnd"/>
-      <w:r>
-        <w:rPr>
-          <w:rFonts w:ascii="Garamond" w:eastAsia="Garamond" w:hAnsi="Garamond" w:cs="Garamond"/>
-          <w:sz w:val="23"/>
-          <w:szCs w:val="23"/>
-          <w:highlight w:val="yellow"/>
-        </w:rPr>
-        <w:t/>
-      </w:r>
-      <w:r>
-        <w:rPr>
-          <w:rFonts w:ascii="Garamond" w:eastAsia="Garamond" w:hAnsi="Garamond" w:cs="Garamond"/>
-          <w:highlight w:val="yellow"/>
-        </w:rPr>
-        <w:t xml:space="preserve"/>
-      </w:r>
-      <w:r>
-        <w:rPr>
-          <w:rFonts w:ascii="Garamond" w:eastAsia="Garamond" w:hAnsi="Garamond" w:cs="Garamond"/>
-        </w:rPr>
-        <w:t xml:space="preserve"> </w:t>
-      </w:r>
-      <w:r>
-        <w:rPr>
-          <w:rFonts w:ascii="Garamond" w:eastAsia="Garamond" w:hAnsi="Garamond" w:cs="Garamond"/>
-        </w:rPr>
-        <w:t xml:space="preserve">El Aliado realizará una inversión mensual en </w:t>
-      </w:r>
-      <w:proofErr w:type="spellStart"/>
-      <w:r>
-        <w:rPr>
-          <w:rFonts w:ascii="Garamond" w:eastAsia="Garamond" w:hAnsi="Garamond" w:cs="Garamond"/>
-        </w:rPr>
-        <w:t>Ads</w:t>
-      </w:r>
-      <w:proofErr w:type="spellEnd"/>
-      <w:r>
-        <w:rPr>
-          <w:rFonts w:ascii="Garamond" w:eastAsia="Garamond" w:hAnsi="Garamond" w:cs="Garamond"/>
-        </w:rPr>
-        <w:t xml:space="preserve"> equivalente al </w:t>
-      </w:r>
-      <w:proofErr w:type="gramStart"/>
-      <w:r>
-        <w:rPr>
-          <w:rFonts w:ascii="Garamond" w:eastAsia="Garamond" w:hAnsi="Garamond" w:cs="Garamond"/>
-          <w:highlight w:val="yellow"/>
-          <w:lang w:val="es-ES"/>
-        </w:rPr>
-        <w:t>{{ N</w:t>
-      </w:r>
-      <w:proofErr w:type="gramEnd"/>
-      <w:r>
-        <w:rPr>
-          <w:rFonts w:ascii="Garamond" w:eastAsia="Garamond" w:hAnsi="Garamond" w:cs="Garamond"/>
-          <w:highlight w:val="yellow"/>
-          <w:lang w:val="es-ES"/>
-        </w:rPr>
-        <w:t>_</w:t>
-      </w:r>
-      <w:proofErr w:type="gramStart"/>
-      <w:r>
-        <w:rPr>
-          <w:rFonts w:ascii="Garamond" w:eastAsia="Garamond" w:hAnsi="Garamond" w:cs="Garamond"/>
-          <w:highlight w:val="yellow"/>
-          <w:lang w:val="es-ES"/>
-        </w:rPr>
-        <w:t>ADS }</w:t>
-      </w:r>
-      <w:proofErr w:type="gramEnd"/>
-      <w:r>
-        <w:rPr>
-          <w:rFonts w:ascii="Garamond" w:eastAsia="Garamond" w:hAnsi="Garamond" w:cs="Garamond"/>
-          <w:highlight w:val="yellow"/>
-          <w:lang w:val="es-ES"/>
-        </w:rPr>
-        <w:t>}</w:t>
-      </w:r>
-      <w:r>
-        <w:rPr>
-          <w:rFonts w:ascii="Garamond" w:eastAsia="Garamond" w:hAnsi="Garamond" w:cs="Garamond"/>
-          <w:lang w:val="es-ES"/>
-        </w:rPr>
-        <w:t xml:space="preserve"> % </w:t>
-      </w:r>
-      <w:r>
-        <w:rPr>
-          <w:rFonts w:ascii="Garamond" w:eastAsia="Garamond" w:hAnsi="Garamond" w:cs="Garamond"/>
-          <w:highlight w:val="yellow"/>
-          <w:lang w:val="es-ES"/>
-        </w:rPr>
-        <w:t>(</w:t>
-      </w:r>
-      <w:proofErr w:type="gramStart"/>
-      <w:r>
-        <w:rPr>
-          <w:rFonts w:ascii="Garamond" w:eastAsia="Garamond" w:hAnsi="Garamond" w:cs="Garamond"/>
-          <w:highlight w:val="yellow"/>
-          <w:lang w:val="es-ES"/>
-        </w:rPr>
-        <w:t>{{ VALOR</w:t>
-      </w:r>
-      <w:proofErr w:type="gramEnd"/>
-      <w:r>
-        <w:rPr>
-          <w:rFonts w:ascii="Garamond" w:eastAsia="Garamond" w:hAnsi="Garamond" w:cs="Garamond"/>
-          <w:highlight w:val="yellow"/>
-          <w:lang w:val="es-ES"/>
-        </w:rPr>
-        <w:t>_</w:t>
-      </w:r>
-      <w:proofErr w:type="gramStart"/>
-      <w:r>
-        <w:rPr>
-          <w:rFonts w:ascii="Garamond" w:eastAsia="Garamond" w:hAnsi="Garamond" w:cs="Garamond"/>
-          <w:highlight w:val="yellow"/>
-          <w:lang w:val="es-ES"/>
-        </w:rPr>
-        <w:t>ADS }</w:t>
-      </w:r>
-      <w:proofErr w:type="gramEnd"/>
-      <w:r>
-        <w:rPr>
-          <w:rFonts w:ascii="Garamond" w:eastAsia="Garamond" w:hAnsi="Garamond" w:cs="Garamond"/>
-          <w:highlight w:val="yellow"/>
-          <w:lang w:val="es-ES"/>
-        </w:rPr>
-        <w:t>})</w:t>
-      </w:r>
-      <w:r>
-        <w:rPr>
-          <w:rFonts w:ascii="Garamond" w:eastAsia="Garamond" w:hAnsi="Garamond" w:cs="Garamond"/>
-        </w:rPr>
-        <w:t xml:space="preserve"> de sus ventas totales en la Plataforma Rappi del mes anterior y Rappi realizará una inversión mensual en </w:t>
-      </w:r>
-      <w:proofErr w:type="spellStart"/>
-      <w:r>
-        <w:rPr>
-          <w:rFonts w:ascii="Garamond" w:eastAsia="Garamond" w:hAnsi="Garamond" w:cs="Garamond"/>
-        </w:rPr>
-        <w:t>Ads</w:t>
-      </w:r>
-      <w:proofErr w:type="spellEnd"/>
-      <w:r>
-        <w:rPr>
-          <w:rFonts w:ascii="Garamond" w:eastAsia="Garamond" w:hAnsi="Garamond" w:cs="Garamond"/>
-        </w:rPr>
-        <w:t xml:space="preserve"> </w:t>
-      </w:r>
-      <w:r>
-        <w:rPr>
-          <w:rFonts w:ascii="Garamond" w:eastAsia="Garamond" w:hAnsi="Garamond" w:cs="Garamond"/>
-        </w:rPr>
-        <w:t xml:space="preserve">equivalente al </w:t>
-      </w:r>
-      <w:proofErr w:type="gramStart"/>
-      <w:r>
-        <w:rPr>
-          <w:rFonts w:ascii="Garamond" w:eastAsia="Garamond" w:hAnsi="Garamond" w:cs="Garamond"/>
-          <w:highlight w:val="yellow"/>
-        </w:rPr>
-        <w:t>{{ N</w:t>
-      </w:r>
-      <w:proofErr w:type="gramEnd"/>
-      <w:r>
-        <w:rPr>
-          <w:rFonts w:ascii="Garamond" w:eastAsia="Garamond" w:hAnsi="Garamond" w:cs="Garamond"/>
-          <w:highlight w:val="yellow"/>
-        </w:rPr>
-        <w:t>_ADS_</w:t>
-      </w:r>
-      <w:proofErr w:type="gramStart"/>
-      <w:r>
-        <w:rPr>
-          <w:rFonts w:ascii="Garamond" w:eastAsia="Garamond" w:hAnsi="Garamond" w:cs="Garamond"/>
-          <w:highlight w:val="yellow"/>
-        </w:rPr>
-        <w:t>RAPPI }}</w:t>
-      </w:r>
-      <w:r>
-        <w:rPr>
-          <w:rFonts w:ascii="Garamond" w:eastAsia="Garamond" w:hAnsi="Garamond" w:cs="Garamond"/>
-        </w:rPr>
-        <w:t>%</w:t>
-      </w:r>
-      <w:proofErr w:type="gramEnd"/>
-      <w:r>
-        <w:rPr>
-          <w:rFonts w:ascii="Garamond" w:eastAsia="Garamond" w:hAnsi="Garamond" w:cs="Garamond"/>
-        </w:rPr>
-        <w:t xml:space="preserve"> </w:t>
-      </w:r>
-      <w:r>
-        <w:rPr>
-          <w:rFonts w:ascii="Garamond" w:eastAsia="Garamond" w:hAnsi="Garamond" w:cs="Garamond"/>
-          <w:highlight w:val="yellow"/>
-        </w:rPr>
-        <w:t>(</w:t>
-      </w:r>
-      <w:proofErr w:type="gramStart"/>
-      <w:r>
-        <w:rPr>
-          <w:rFonts w:ascii="Garamond" w:eastAsia="Garamond" w:hAnsi="Garamond" w:cs="Garamond"/>
-          <w:highlight w:val="yellow"/>
-        </w:rPr>
-        <w:t>{{ VALOR</w:t>
-      </w:r>
-      <w:proofErr w:type="gramEnd"/>
-      <w:r>
-        <w:rPr>
-          <w:rFonts w:ascii="Garamond" w:eastAsia="Garamond" w:hAnsi="Garamond" w:cs="Garamond"/>
-          <w:highlight w:val="yellow"/>
-        </w:rPr>
-        <w:t>_ADS_</w:t>
-      </w:r>
-      <w:proofErr w:type="gramStart"/>
-      <w:r>
-        <w:rPr>
-          <w:rFonts w:ascii="Garamond" w:eastAsia="Garamond" w:hAnsi="Garamond" w:cs="Garamond"/>
-          <w:highlight w:val="yellow"/>
-        </w:rPr>
-        <w:t>RAPPI }</w:t>
-      </w:r>
-      <w:proofErr w:type="gramEnd"/>
-      <w:r>
-        <w:rPr>
-          <w:rFonts w:ascii="Garamond" w:eastAsia="Garamond" w:hAnsi="Garamond" w:cs="Garamond"/>
-          <w:highlight w:val="yellow"/>
-        </w:rPr>
-        <w:t>}</w:t>
-      </w:r>
-      <w:r>
-        <w:rPr>
-          <w:rFonts w:ascii="Garamond" w:eastAsia="Garamond" w:hAnsi="Garamond" w:cs="Garamond"/>
-          <w:highlight w:val="yellow"/>
-        </w:rPr>
-        <w:t>)</w:t>
-      </w:r>
-      <w:r>
-        <w:rPr>
-          <w:rFonts w:ascii="Garamond" w:eastAsia="Garamond" w:hAnsi="Garamond" w:cs="Garamond"/>
-        </w:rPr>
-        <w:t xml:space="preserve"> de las ventas totales del Aliado en la Plataforma Rappi del mes anterior. Rappi activará los </w:t>
-      </w:r>
-      <w:proofErr w:type="spellStart"/>
-      <w:r>
-        <w:rPr>
-          <w:rFonts w:ascii="Garamond" w:eastAsia="Garamond" w:hAnsi="Garamond" w:cs="Garamond"/>
-        </w:rPr>
-        <w:t>Ads</w:t>
-      </w:r>
-      <w:proofErr w:type="spellEnd"/>
-      <w:r>
-        <w:rPr>
-          <w:rFonts w:ascii="Garamond" w:eastAsia="Garamond" w:hAnsi="Garamond" w:cs="Garamond"/>
-        </w:rPr>
-        <w:t xml:space="preserve"> en las fechas acordadas por las Partes, sujetándose su ejecución y cobro a los términos disponibles en https://legal.rappi.com.co/mexico/terminos-y-condiciones-ads-vertical-restaurantes-mexico Solo se facturarán los </w:t>
-      </w:r>
-      <w:proofErr w:type="spellStart"/>
-      <w:r>
-        <w:rPr>
-          <w:rFonts w:ascii="Garamond" w:eastAsia="Garamond" w:hAnsi="Garamond" w:cs="Garamond"/>
-        </w:rPr>
-        <w:t>Clicks</w:t>
-      </w:r>
-      <w:proofErr w:type="spellEnd"/>
-      <w:r>
-        <w:rPr>
-          <w:rFonts w:ascii="Garamond" w:eastAsia="Garamond" w:hAnsi="Garamond" w:cs="Garamond"/>
-        </w:rPr>
-        <w:t xml:space="preserve"> efectivamente ejecutados. {% endif %}</w:t>
-      </w:r>
-    </w:p>
-    <w:p>
-      <w:pPr>
-        <w:jc w:val="both"/>
-        <w:rPr>
-          <w:rFonts w:ascii="Garamond" w:eastAsia="Garamond" w:hAnsi="Garamond" w:cs="Garamond"/>
-          <w:sz w:val="23"/>
-          <w:szCs w:val="23"/>
-          <w:lang w:val="es-ES"/>
-        </w:rPr>
-      </w:pPr>
-      <w:r>
-        <w:rPr>
-          <w:rFonts w:ascii="Garamond" w:eastAsia="Garamond" w:hAnsi="Garamond" w:cs="Garamond"/>
-          <w:sz w:val="23"/>
-          <w:szCs w:val="23"/>
-          <w:highlight w:val="yellow"/>
-          <w:lang w:val="es-ES"/>
-        </w:rPr>
-        <w:t xml:space="preserve">{%p if activa_descuento_menu %}</w:t>
-      </w:r>
-      <w:proofErr w:type="spellStart"/>
-      <w:r>
-        <w:rPr>
-          <w:rFonts w:ascii="Garamond" w:eastAsia="Garamond" w:hAnsi="Garamond" w:cs="Garamond"/>
-          <w:sz w:val="23"/>
-          <w:szCs w:val="23"/>
-          <w:highlight w:val="yellow"/>
-          <w:lang w:val="es-ES"/>
-        </w:rPr>
-        <w:t/>
-      </w:r>
-      <w:proofErr w:type="spellEnd"/>
-      <w:r>
-        <w:rPr>
-          <w:rFonts w:ascii="Garamond" w:eastAsia="Garamond" w:hAnsi="Garamond" w:cs="Garamond"/>
-          <w:sz w:val="23"/>
-          <w:szCs w:val="23"/>
-          <w:highlight w:val="yellow"/>
-          <w:lang w:val="es-ES"/>
-        </w:rPr>
-        <w:t xml:space="preserve"/>
-      </w:r>
-      <w:proofErr w:type="spellStart"/>
-      <w:r>
-        <w:rPr>
-          <w:rFonts w:ascii="Garamond" w:eastAsia="Garamond" w:hAnsi="Garamond" w:cs="Garamond"/>
-          <w:sz w:val="23"/>
-          <w:szCs w:val="23"/>
-          <w:highlight w:val="yellow"/>
-          <w:lang w:val="es-ES"/>
-        </w:rPr>
-        <w:t/>
-      </w:r>
-      <w:r>
-        <w:rPr>
-          <w:rFonts w:ascii="Garamond" w:eastAsia="Garamond" w:hAnsi="Garamond" w:cs="Garamond"/>
-          <w:sz w:val="23"/>
-          <w:szCs w:val="23"/>
-          <w:highlight w:val="yellow"/>
-          <w:lang w:val="es-ES"/>
-        </w:rPr>
-        <w:t/>
-      </w:r>
-      <w:r>
-        <w:rPr>
-          <w:rFonts w:ascii="Garamond" w:eastAsia="Garamond" w:hAnsi="Garamond" w:cs="Garamond"/>
-          <w:sz w:val="23"/>
-          <w:szCs w:val="23"/>
-          <w:highlight w:val="yellow"/>
-          <w:lang w:val="es-ES"/>
-        </w:rPr>
-        <w:t/>
-      </w:r>
-      <w:proofErr w:type="spellEnd"/>
-      <w:r>
-        <w:rPr>
-          <w:rFonts w:ascii="Garamond" w:eastAsia="Garamond" w:hAnsi="Garamond" w:cs="Garamond"/>
-          <w:sz w:val="23"/>
-          <w:szCs w:val="23"/>
-          <w:highlight w:val="yellow"/>
-          <w:lang w:val="es-ES"/>
-        </w:rPr>
-        <w:t xml:space="preserve"/>
-      </w:r>
-    </w:p>
-    <w:p>
-      <w:pPr>
-        <w:jc w:val="both"/>
-        <w:rPr>
-          <w:rFonts w:ascii="Garamond" w:eastAsia="Garamond" w:hAnsi="Garamond" w:cs="Garamond"/>
-          <w:sz w:val="23"/>
-          <w:szCs w:val="23"/>
-        </w:rPr>
-      </w:pPr>
-      <w:r>
-        <w:rPr>
-          <w:rFonts w:ascii="Garamond" w:eastAsia="Garamond" w:hAnsi="Garamond" w:cs="Garamond"/>
-          <w:sz w:val="23"/>
-          <w:szCs w:val="23"/>
-        </w:rPr>
-        <w:t xml:space="preserve">{{ ROM_DESCUENTO_MENU }} Realizar un descuento de por lo menos el </w:t>
-      </w:r>
-      <w:proofErr w:type="gramStart"/>
-      <w:r>
-        <w:rPr>
-          <w:rFonts w:ascii="Garamond" w:eastAsia="Garamond" w:hAnsi="Garamond" w:cs="Garamond"/>
-          <w:sz w:val="23"/>
-          <w:szCs w:val="23"/>
-          <w:highlight w:val="yellow"/>
-        </w:rPr>
-        <w:t>{{ N</w:t>
-      </w:r>
-      <w:proofErr w:type="gramEnd"/>
-      <w:r>
-        <w:rPr>
-          <w:rFonts w:ascii="Garamond" w:eastAsia="Garamond" w:hAnsi="Garamond" w:cs="Garamond"/>
-          <w:sz w:val="23"/>
-          <w:szCs w:val="23"/>
-          <w:highlight w:val="yellow"/>
-        </w:rPr>
-        <w:t>_DESCUENTO_</w:t>
-      </w:r>
-      <w:proofErr w:type="gramStart"/>
-      <w:r>
-        <w:rPr>
-          <w:rFonts w:ascii="Garamond" w:eastAsia="Garamond" w:hAnsi="Garamond" w:cs="Garamond"/>
-          <w:sz w:val="23"/>
-          <w:szCs w:val="23"/>
-          <w:highlight w:val="yellow"/>
-        </w:rPr>
-        <w:t>MENU }}</w:t>
-      </w:r>
-      <w:r>
-        <w:rPr>
-          <w:rFonts w:ascii="Garamond" w:eastAsia="Garamond" w:hAnsi="Garamond" w:cs="Garamond"/>
-          <w:sz w:val="23"/>
-          <w:szCs w:val="23"/>
-        </w:rPr>
-        <w:t>%</w:t>
-      </w:r>
-      <w:proofErr w:type="gramEnd"/>
-      <w:r>
-        <w:rPr>
-          <w:rFonts w:ascii="Garamond" w:eastAsia="Garamond" w:hAnsi="Garamond" w:cs="Garamond"/>
-          <w:sz w:val="23"/>
-          <w:szCs w:val="23"/>
-        </w:rPr>
-        <w:t xml:space="preserve"> (</w:t>
-      </w:r>
-      <w:proofErr w:type="gramStart"/>
-      <w:r>
-        <w:rPr>
-          <w:rFonts w:ascii="Garamond" w:eastAsia="Garamond" w:hAnsi="Garamond" w:cs="Garamond"/>
-          <w:sz w:val="23"/>
-          <w:szCs w:val="23"/>
-          <w:highlight w:val="yellow"/>
-        </w:rPr>
-        <w:t xml:space="preserve">{{ </w:t>
-      </w:r>
-      <w:proofErr w:type="spellStart"/>
-      <w:r>
-        <w:rPr>
-          <w:rFonts w:ascii="Garamond" w:eastAsia="Garamond" w:hAnsi="Garamond" w:cs="Garamond"/>
-          <w:sz w:val="23"/>
-          <w:szCs w:val="23"/>
-          <w:highlight w:val="yellow"/>
-        </w:rPr>
-        <w:t>VALOR</w:t>
-      </w:r>
-      <w:proofErr w:type="gramEnd"/>
-      <w:r>
-        <w:rPr>
-          <w:rFonts w:ascii="Garamond" w:eastAsia="Garamond" w:hAnsi="Garamond" w:cs="Garamond"/>
-          <w:sz w:val="23"/>
-          <w:szCs w:val="23"/>
-          <w:highlight w:val="yellow"/>
-        </w:rPr>
-        <w:t>_DESCUENTO_MENU</w:t>
-      </w:r>
-      <w:r>
-        <w:rPr>
-          <w:rFonts w:ascii="Garamond" w:eastAsia="Garamond" w:hAnsi="Garamond" w:cs="Garamond"/>
-          <w:sz w:val="23"/>
-          <w:szCs w:val="23"/>
-          <w:highlight w:val="yellow"/>
-        </w:rPr>
-        <w:t>|</w:t>
-      </w:r>
-      <w:proofErr w:type="gramStart"/>
-      <w:r>
-        <w:rPr>
-          <w:rFonts w:ascii="Garamond" w:eastAsia="Garamond" w:hAnsi="Garamond" w:cs="Garamond"/>
-          <w:sz w:val="23"/>
-          <w:szCs w:val="23"/>
-          <w:highlight w:val="yellow"/>
-        </w:rPr>
-        <w:t>lower</w:t>
-      </w:r>
-      <w:proofErr w:type="spellEnd"/>
-      <w:r>
-        <w:rPr>
-          <w:rFonts w:ascii="Garamond" w:eastAsia="Garamond" w:hAnsi="Garamond" w:cs="Garamond"/>
-          <w:sz w:val="23"/>
-          <w:szCs w:val="23"/>
-          <w:highlight w:val="yellow"/>
-        </w:rPr>
-        <w:t xml:space="preserve"> }</w:t>
-      </w:r>
-      <w:proofErr w:type="gramEnd"/>
-      <w:r>
-        <w:rPr>
-          <w:rFonts w:ascii="Garamond" w:eastAsia="Garamond" w:hAnsi="Garamond" w:cs="Garamond"/>
-          <w:sz w:val="23"/>
-          <w:szCs w:val="23"/>
-          <w:highlight w:val="yellow"/>
-        </w:rPr>
-        <w:t>}</w:t>
-      </w:r>
-      <w:r>
-        <w:rPr>
-          <w:rFonts w:ascii="Garamond" w:eastAsia="Garamond" w:hAnsi="Garamond" w:cs="Garamond"/>
-          <w:sz w:val="23"/>
-          <w:szCs w:val="23"/>
-        </w:rPr>
-        <w:t xml:space="preserve"> </w:t>
-      </w:r>
-      <w:r>
-        <w:rPr>
-          <w:rFonts w:ascii="Garamond" w:eastAsia="Garamond" w:hAnsi="Garamond" w:cs="Garamond"/>
-          <w:sz w:val="23"/>
-          <w:szCs w:val="23"/>
-        </w:rPr>
-        <w:t xml:space="preserve">por ciento) en todo el menú dentro de la Plataforma Rappi durante los primeros </w:t>
-      </w:r>
-      <w:proofErr w:type="gramStart"/>
-      <w:r>
-        <w:rPr>
-          <w:rFonts w:ascii="Garamond" w:eastAsia="Garamond" w:hAnsi="Garamond" w:cs="Garamond"/>
-          <w:sz w:val="23"/>
-          <w:szCs w:val="23"/>
-          <w:highlight w:val="yellow"/>
-        </w:rPr>
-        <w:t>{{ N</w:t>
-      </w:r>
-      <w:proofErr w:type="gramEnd"/>
-      <w:r>
-        <w:rPr>
-          <w:rFonts w:ascii="Garamond" w:eastAsia="Garamond" w:hAnsi="Garamond" w:cs="Garamond"/>
-          <w:sz w:val="23"/>
-          <w:szCs w:val="23"/>
-          <w:highlight w:val="yellow"/>
-        </w:rPr>
-        <w:t>_MESES_DESCUENTO_</w:t>
-      </w:r>
-      <w:proofErr w:type="gramStart"/>
-      <w:r>
-        <w:rPr>
-          <w:rFonts w:ascii="Garamond" w:eastAsia="Garamond" w:hAnsi="Garamond" w:cs="Garamond"/>
-          <w:sz w:val="23"/>
-          <w:szCs w:val="23"/>
-          <w:highlight w:val="yellow"/>
-        </w:rPr>
-        <w:t>MENU }</w:t>
-      </w:r>
-      <w:proofErr w:type="gramEnd"/>
-      <w:r>
-        <w:rPr>
-          <w:rFonts w:ascii="Garamond" w:eastAsia="Garamond" w:hAnsi="Garamond" w:cs="Garamond"/>
-          <w:sz w:val="23"/>
-          <w:szCs w:val="23"/>
-          <w:highlight w:val="yellow"/>
-        </w:rPr>
-        <w:t>}</w:t>
-      </w:r>
-      <w:r>
-        <w:rPr>
-          <w:rFonts w:ascii="Garamond" w:eastAsia="Garamond" w:hAnsi="Garamond" w:cs="Garamond"/>
-          <w:sz w:val="23"/>
-          <w:szCs w:val="23"/>
-        </w:rPr>
-        <w:t xml:space="preserve"> (</w:t>
-      </w:r>
-      <w:proofErr w:type="gramStart"/>
-      <w:r>
-        <w:rPr>
-          <w:rFonts w:ascii="Garamond" w:eastAsia="Garamond" w:hAnsi="Garamond" w:cs="Garamond"/>
-          <w:sz w:val="23"/>
-          <w:szCs w:val="23"/>
-          <w:highlight w:val="yellow"/>
-        </w:rPr>
-        <w:t xml:space="preserve">{{ </w:t>
-      </w:r>
-      <w:proofErr w:type="spellStart"/>
-      <w:r>
-        <w:rPr>
-          <w:rFonts w:ascii="Garamond" w:eastAsia="Garamond" w:hAnsi="Garamond" w:cs="Garamond"/>
-          <w:sz w:val="23"/>
-          <w:szCs w:val="23"/>
-          <w:highlight w:val="yellow"/>
-        </w:rPr>
-        <w:t>VALOR</w:t>
-      </w:r>
-      <w:proofErr w:type="gramEnd"/>
-      <w:r>
-        <w:rPr>
-          <w:rFonts w:ascii="Garamond" w:eastAsia="Garamond" w:hAnsi="Garamond" w:cs="Garamond"/>
-          <w:sz w:val="23"/>
-          <w:szCs w:val="23"/>
-          <w:highlight w:val="yellow"/>
-        </w:rPr>
-        <w:t>_MES_DESCUENTO_MENU</w:t>
-      </w:r>
-      <w:r>
-        <w:rPr>
-          <w:rFonts w:ascii="Garamond" w:eastAsia="Garamond" w:hAnsi="Garamond" w:cs="Garamond"/>
-          <w:sz w:val="23"/>
-          <w:szCs w:val="23"/>
-          <w:highlight w:val="yellow"/>
-        </w:rPr>
-        <w:t>|</w:t>
-      </w:r>
-      <w:proofErr w:type="gramStart"/>
-      <w:r>
-        <w:rPr>
-          <w:rFonts w:ascii="Garamond" w:eastAsia="Garamond" w:hAnsi="Garamond" w:cs="Garamond"/>
-          <w:sz w:val="23"/>
-          <w:szCs w:val="23"/>
-          <w:highlight w:val="yellow"/>
-        </w:rPr>
-        <w:t>lower</w:t>
-      </w:r>
-      <w:proofErr w:type="spellEnd"/>
-      <w:r>
-        <w:rPr>
-          <w:rFonts w:ascii="Garamond" w:eastAsia="Garamond" w:hAnsi="Garamond" w:cs="Garamond"/>
-          <w:sz w:val="23"/>
-          <w:szCs w:val="23"/>
-          <w:highlight w:val="yellow"/>
-        </w:rPr>
-        <w:t xml:space="preserve"> }</w:t>
-      </w:r>
-      <w:proofErr w:type="gramEnd"/>
-      <w:r>
-        <w:rPr>
-          <w:rFonts w:ascii="Garamond" w:eastAsia="Garamond" w:hAnsi="Garamond" w:cs="Garamond"/>
-          <w:sz w:val="23"/>
-          <w:szCs w:val="23"/>
-          <w:highlight w:val="yellow"/>
-        </w:rPr>
-        <w:t>}</w:t>
-      </w:r>
-      <w:r>
-        <w:rPr>
-          <w:rFonts w:ascii="Garamond" w:eastAsia="Garamond" w:hAnsi="Garamond" w:cs="Garamond"/>
-          <w:sz w:val="23"/>
-          <w:szCs w:val="23"/>
-        </w:rPr>
-        <w:t>) meses de ejecución del presente Acuerdo.</w:t>
-      </w:r>
-    </w:p>
-    <w:p>
-      <w:pPr>
-        <w:jc w:val="both"/>
-        <w:rPr>
-          <w:rFonts w:ascii="Garamond" w:eastAsia="Garamond" w:hAnsi="Garamond" w:cs="Garamond"/>
-          <w:sz w:val="23"/>
-          <w:szCs w:val="23"/>
-          <w:lang w:val="en-US"/>
-        </w:rPr>
-      </w:pPr>
-      <w:r>
-        <w:rPr>
-          <w:rFonts w:ascii="Garamond" w:eastAsia="Garamond" w:hAnsi="Garamond" w:cs="Garamond"/>
-          <w:sz w:val="23"/>
-          <w:szCs w:val="23"/>
-          <w:highlight w:val="yellow"/>
-          <w:lang w:val="en-US"/>
-        </w:rPr>
-        <w:t>{%p endif %}</w:t>
-      </w:r>
-    </w:p>
-    <w:p>
-      <w:pPr>
-        <w:jc w:val="both"/>
-        <w:rPr>
-          <w:rFonts w:ascii="Garamond" w:eastAsia="Garamond" w:hAnsi="Garamond" w:cs="Garamond"/>
-          <w:sz w:val="23"/>
-          <w:szCs w:val="23"/>
-          <w:lang w:val="en-US"/>
-        </w:rPr>
-      </w:pPr>
-      <w:r>
-        <w:rPr>
-          <w:rFonts w:ascii="Garamond" w:eastAsia="Garamond" w:hAnsi="Garamond" w:cs="Garamond"/>
-          <w:sz w:val="23"/>
-          <w:szCs w:val="23"/>
-          <w:highlight w:val="yellow"/>
-          <w:lang w:val="en-US"/>
-        </w:rPr>
-        <w:t xml:space="preserve">{%p if </w:t>
-      </w:r>
-      <w:proofErr w:type="spellStart"/>
-      <w:r>
-        <w:rPr>
-          <w:rFonts w:ascii="Garamond" w:eastAsia="Garamond" w:hAnsi="Garamond" w:cs="Garamond"/>
-          <w:sz w:val="23"/>
-          <w:szCs w:val="23"/>
-          <w:highlight w:val="yellow"/>
-          <w:lang w:val="en-US"/>
-        </w:rPr>
-        <w:t>activa_mark_down</w:t>
-      </w:r>
-      <w:proofErr w:type="spellEnd"/>
-      <w:r>
-        <w:rPr>
-          <w:rFonts w:ascii="Garamond" w:eastAsia="Garamond" w:hAnsi="Garamond" w:cs="Garamond"/>
-          <w:sz w:val="23"/>
-          <w:szCs w:val="23"/>
-          <w:highlight w:val="yellow"/>
-          <w:lang w:val="en-US"/>
-        </w:rPr>
-        <w:t xml:space="preserve"> %}</w:t>
-      </w:r>
-    </w:p>
-    <w:p>
-      <w:pPr>
-        <w:jc w:val="both"/>
-        <w:rPr>
-          <w:rFonts w:ascii="Garamond" w:eastAsia="Garamond" w:hAnsi="Garamond" w:cs="Garamond"/>
-          <w:sz w:val="23"/>
-          <w:szCs w:val="23"/>
-        </w:rPr>
-      </w:pPr>
-      <w:r>
-        <w:rPr>
-          <w:rFonts w:ascii="Garamond" w:eastAsia="Garamond" w:hAnsi="Garamond" w:cs="Garamond"/>
-          <w:sz w:val="23"/>
-          <w:szCs w:val="23"/>
-        </w:rPr>
-        <w:t xml:space="preserve">{{ ROM_MARK_DOWN }} Realizar una inversión mensual en promociones del </w:t>
-      </w:r>
-      <w:proofErr w:type="gramStart"/>
-      <w:r>
-        <w:rPr>
-          <w:rFonts w:ascii="Garamond" w:eastAsia="Garamond" w:hAnsi="Garamond" w:cs="Garamond"/>
-          <w:sz w:val="23"/>
-          <w:szCs w:val="23"/>
-          <w:highlight w:val="yellow"/>
-        </w:rPr>
-        <w:t>{{ N</w:t>
-      </w:r>
-      <w:proofErr w:type="gramEnd"/>
-      <w:r>
-        <w:rPr>
-          <w:rFonts w:ascii="Garamond" w:eastAsia="Garamond" w:hAnsi="Garamond" w:cs="Garamond"/>
-          <w:sz w:val="23"/>
-          <w:szCs w:val="23"/>
-          <w:highlight w:val="yellow"/>
-        </w:rPr>
-        <w:t>_DESCUENTO_MARK_</w:t>
-      </w:r>
-      <w:proofErr w:type="gramStart"/>
-      <w:r>
-        <w:rPr>
-          <w:rFonts w:ascii="Garamond" w:eastAsia="Garamond" w:hAnsi="Garamond" w:cs="Garamond"/>
-          <w:sz w:val="23"/>
-          <w:szCs w:val="23"/>
-          <w:highlight w:val="yellow"/>
-        </w:rPr>
-        <w:t>DOWN }}</w:t>
-      </w:r>
-      <w:r>
-        <w:rPr>
-          <w:rFonts w:ascii="Garamond" w:eastAsia="Garamond" w:hAnsi="Garamond" w:cs="Garamond"/>
-          <w:sz w:val="23"/>
-          <w:szCs w:val="23"/>
-        </w:rPr>
-        <w:t>%</w:t>
-      </w:r>
-      <w:proofErr w:type="gramEnd"/>
-      <w:r>
-        <w:rPr>
-          <w:rFonts w:ascii="Garamond" w:eastAsia="Garamond" w:hAnsi="Garamond" w:cs="Garamond"/>
-          <w:sz w:val="23"/>
-          <w:szCs w:val="23"/>
-        </w:rPr>
-        <w:t xml:space="preserve"> (</w:t>
-      </w:r>
-      <w:proofErr w:type="gramStart"/>
-      <w:r>
-        <w:rPr>
-          <w:rFonts w:ascii="Garamond" w:eastAsia="Garamond" w:hAnsi="Garamond" w:cs="Garamond"/>
-          <w:sz w:val="23"/>
-          <w:szCs w:val="23"/>
-          <w:highlight w:val="yellow"/>
-        </w:rPr>
-        <w:t xml:space="preserve">{{ </w:t>
-      </w:r>
-      <w:proofErr w:type="spellStart"/>
-      <w:r>
-        <w:rPr>
-          <w:rFonts w:ascii="Garamond" w:eastAsia="Garamond" w:hAnsi="Garamond" w:cs="Garamond"/>
-          <w:sz w:val="23"/>
-          <w:szCs w:val="23"/>
-          <w:highlight w:val="yellow"/>
-        </w:rPr>
-        <w:t>VALOR</w:t>
-      </w:r>
-      <w:proofErr w:type="gramEnd"/>
-      <w:r>
-        <w:rPr>
-          <w:rFonts w:ascii="Garamond" w:eastAsia="Garamond" w:hAnsi="Garamond" w:cs="Garamond"/>
-          <w:sz w:val="23"/>
-          <w:szCs w:val="23"/>
-          <w:highlight w:val="yellow"/>
-        </w:rPr>
-        <w:t>_DESCUENTO_MARK_DOWN|</w:t>
-      </w:r>
-      <w:proofErr w:type="gramStart"/>
-      <w:r>
-        <w:rPr>
-          <w:rFonts w:ascii="Garamond" w:eastAsia="Garamond" w:hAnsi="Garamond" w:cs="Garamond"/>
-          <w:sz w:val="23"/>
-          <w:szCs w:val="23"/>
-          <w:highlight w:val="yellow"/>
-        </w:rPr>
-        <w:t>lower</w:t>
-      </w:r>
-      <w:proofErr w:type="spellEnd"/>
-      <w:r>
-        <w:rPr>
-          <w:rFonts w:ascii="Garamond" w:eastAsia="Garamond" w:hAnsi="Garamond" w:cs="Garamond"/>
-          <w:sz w:val="23"/>
-          <w:szCs w:val="23"/>
-          <w:highlight w:val="yellow"/>
-        </w:rPr>
-        <w:t xml:space="preserve"> }</w:t>
-      </w:r>
-      <w:proofErr w:type="gramEnd"/>
-      <w:r>
-        <w:rPr>
-          <w:rFonts w:ascii="Garamond" w:eastAsia="Garamond" w:hAnsi="Garamond" w:cs="Garamond"/>
-          <w:sz w:val="23"/>
-          <w:szCs w:val="23"/>
-          <w:highlight w:val="yellow"/>
-        </w:rPr>
-        <w:t>}</w:t>
-      </w:r>
-      <w:r>
-        <w:rPr>
-          <w:rFonts w:ascii="Garamond" w:eastAsia="Garamond" w:hAnsi="Garamond" w:cs="Garamond"/>
-          <w:sz w:val="23"/>
-          <w:szCs w:val="23"/>
-        </w:rPr>
-        <w:t xml:space="preserve"> por ciento) de las ventas totales realizadas por el Aliado a través de la Plataforma Rappi durante el mes inmediatamente anterior durante la vigencia del presente Acuerdo.</w:t>
-      </w:r>
-    </w:p>
-    <w:p>
-      <w:pPr>
-        <w:jc w:val="both"/>
-        <w:rPr>
-          <w:rFonts w:ascii="Garamond" w:eastAsia="Garamond" w:hAnsi="Garamond" w:cs="Garamond"/>
-          <w:sz w:val="23"/>
-          <w:szCs w:val="23"/>
-          <w:lang w:val="es-MX"/>
-        </w:rPr>
-      </w:pPr>
-      <w:r>
-        <w:rPr>
-          <w:rFonts w:ascii="Garamond" w:eastAsia="Garamond" w:hAnsi="Garamond" w:cs="Garamond"/>
-          <w:sz w:val="23"/>
-          <w:szCs w:val="23"/>
-          <w:highlight w:val="yellow"/>
-          <w:lang w:val="es-ES"/>
-        </w:rPr>
-        <w:t xml:space="preserve">{%p </w:t>
-      </w:r>
-      <w:proofErr w:type="spellStart"/>
-      <w:r>
-        <w:rPr>
-          <w:rFonts w:ascii="Garamond" w:eastAsia="Garamond" w:hAnsi="Garamond" w:cs="Garamond"/>
-          <w:sz w:val="23"/>
-          <w:szCs w:val="23"/>
-          <w:highlight w:val="yellow"/>
-          <w:lang w:val="es-ES"/>
-        </w:rPr>
-        <w:t>endif</w:t>
-      </w:r>
-      <w:proofErr w:type="spellEnd"/>
-      <w:r>
-        <w:rPr>
-          <w:rFonts w:ascii="Garamond" w:eastAsia="Garamond" w:hAnsi="Garamond" w:cs="Garamond"/>
-          <w:sz w:val="23"/>
-          <w:szCs w:val="23"/>
-          <w:highlight w:val="yellow"/>
-          <w:lang w:val="es-ES"/>
-        </w:rPr>
-        <w:t xml:space="preserve"> %}</w:t>
-      </w:r>
-    </w:p>
-    <w:p>
-      <w:pPr>
-        <w:jc w:val="both"/>
-        <w:rPr>
-          <w:rFonts w:ascii="Garamond" w:eastAsia="Garamond" w:hAnsi="Garamond" w:cs="Garamond"/>
-          <w:sz w:val="23"/>
-          <w:szCs w:val="23"/>
-          <w:lang w:val="es-ES"/>
-        </w:rPr>
-      </w:pPr>
-      <w:r>
-        <w:rPr>
-          <w:rFonts w:ascii="Garamond" w:eastAsia="Garamond" w:hAnsi="Garamond" w:cs="Garamond"/>
-          <w:sz w:val="23"/>
-          <w:szCs w:val="23"/>
-          <w:highlight w:val="yellow"/>
-          <w:lang w:val="es-ES"/>
-        </w:rPr>
-        <w:t xml:space="preserve">{%p </w:t>
-      </w:r>
-      <w:proofErr w:type="spellStart"/>
-      <w:r>
-        <w:rPr>
-          <w:rFonts w:ascii="Garamond" w:eastAsia="Garamond" w:hAnsi="Garamond" w:cs="Garamond"/>
-          <w:sz w:val="23"/>
-          <w:szCs w:val="23"/>
-          <w:highlight w:val="yellow"/>
-          <w:lang w:val="es-ES"/>
-        </w:rPr>
-        <w:t>if</w:t>
-      </w:r>
-      <w:proofErr w:type="spellEnd"/>
-      <w:r>
-        <w:rPr>
-          <w:rFonts w:ascii="Garamond" w:eastAsia="Garamond" w:hAnsi="Garamond" w:cs="Garamond"/>
-          <w:sz w:val="23"/>
-          <w:szCs w:val="23"/>
-          <w:highlight w:val="yellow"/>
-          <w:lang w:val="es-ES"/>
-        </w:rPr>
-        <w:t xml:space="preserve"> </w:t>
-      </w:r>
-      <w:proofErr w:type="spellStart"/>
-      <w:r>
-        <w:rPr>
-          <w:rFonts w:ascii="Garamond" w:eastAsia="Garamond" w:hAnsi="Garamond" w:cs="Garamond"/>
-          <w:sz w:val="23"/>
-          <w:szCs w:val="23"/>
-          <w:highlight w:val="yellow"/>
-          <w:lang w:val="es-ES"/>
-        </w:rPr>
-        <w:t>activa_publicaciones_redes</w:t>
-      </w:r>
-      <w:proofErr w:type="spellEnd"/>
-      <w:r>
-        <w:rPr>
-          <w:rFonts w:ascii="Garamond" w:eastAsia="Garamond" w:hAnsi="Garamond" w:cs="Garamond"/>
-          <w:sz w:val="23"/>
-          <w:szCs w:val="23"/>
-          <w:highlight w:val="yellow"/>
-          <w:lang w:val="es-ES"/>
-        </w:rPr>
-        <w:t xml:space="preserve"> %}</w:t>
-      </w:r>
-    </w:p>
-    <w:p>
-      <w:pPr>
-        <w:jc w:val="both"/>
-        <w:rPr>
-          <w:rFonts w:ascii="Garamond" w:eastAsia="Garamond" w:hAnsi="Garamond" w:cs="Garamond"/>
-          <w:sz w:val="23"/>
-          <w:szCs w:val="23"/>
-        </w:rPr>
-      </w:pPr>
-      <w:r>
-        <w:rPr>
-          <w:rFonts w:ascii="Garamond" w:eastAsia="Garamond" w:hAnsi="Garamond" w:cs="Garamond"/>
-          <w:sz w:val="23"/>
-          <w:szCs w:val="23"/>
-        </w:rPr>
-        <w:t xml:space="preserve">{{ ROM_REDES }} Realizar, al menos </w:t>
-      </w:r>
-      <w:proofErr w:type="gramStart"/>
-      <w:r>
-        <w:rPr>
-          <w:rFonts w:ascii="Garamond" w:eastAsia="Garamond" w:hAnsi="Garamond" w:cs="Garamond"/>
-          <w:sz w:val="23"/>
-          <w:szCs w:val="23"/>
-          <w:highlight w:val="yellow"/>
-        </w:rPr>
-        <w:t xml:space="preserve">{{ </w:t>
-      </w:r>
-      <w:r>
-        <w:rPr>
-          <w:rFonts w:ascii="Garamond" w:eastAsia="Garamond" w:hAnsi="Garamond" w:cs="Garamond"/>
-          <w:sz w:val="23"/>
-          <w:szCs w:val="23"/>
-          <w:highlight w:val="yellow"/>
-        </w:rPr>
-        <w:t>N</w:t>
-      </w:r>
-      <w:proofErr w:type="gramEnd"/>
-      <w:r>
-        <w:rPr>
-          <w:rFonts w:ascii="Garamond" w:eastAsia="Garamond" w:hAnsi="Garamond" w:cs="Garamond"/>
-          <w:sz w:val="23"/>
-          <w:szCs w:val="23"/>
-          <w:highlight w:val="yellow"/>
-        </w:rPr>
-        <w:t>_</w:t>
-      </w:r>
-      <w:r>
-        <w:rPr>
-          <w:rFonts w:ascii="Garamond" w:eastAsia="Garamond" w:hAnsi="Garamond" w:cs="Garamond"/>
-          <w:sz w:val="23"/>
-          <w:szCs w:val="23"/>
-          <w:highlight w:val="yellow"/>
-        </w:rPr>
-        <w:t>DESCUENTO_</w:t>
-      </w:r>
-      <w:proofErr w:type="gramStart"/>
-      <w:r>
-        <w:rPr>
-          <w:rFonts w:ascii="Garamond" w:eastAsia="Garamond" w:hAnsi="Garamond" w:cs="Garamond"/>
-          <w:sz w:val="23"/>
-          <w:szCs w:val="23"/>
-          <w:highlight w:val="yellow"/>
-        </w:rPr>
-        <w:t>REDES }</w:t>
-      </w:r>
-      <w:proofErr w:type="gramEnd"/>
-      <w:r>
-        <w:rPr>
-          <w:rFonts w:ascii="Garamond" w:eastAsia="Garamond" w:hAnsi="Garamond" w:cs="Garamond"/>
-          <w:sz w:val="23"/>
-          <w:szCs w:val="23"/>
-          <w:highlight w:val="yellow"/>
-        </w:rPr>
-        <w:t>}</w:t>
-      </w:r>
-      <w:r>
-        <w:rPr>
-          <w:rFonts w:ascii="Garamond" w:eastAsia="Garamond" w:hAnsi="Garamond" w:cs="Garamond"/>
-          <w:sz w:val="23"/>
-          <w:szCs w:val="23"/>
-        </w:rPr>
-        <w:t xml:space="preserve"> (</w:t>
-      </w:r>
-      <w:proofErr w:type="gramStart"/>
-      <w:r>
-        <w:rPr>
-          <w:rFonts w:ascii="Garamond" w:eastAsia="Garamond" w:hAnsi="Garamond" w:cs="Garamond"/>
-          <w:sz w:val="23"/>
-          <w:szCs w:val="23"/>
-          <w:highlight w:val="yellow"/>
-        </w:rPr>
-        <w:t xml:space="preserve">{{ </w:t>
-      </w:r>
-      <w:proofErr w:type="spellStart"/>
-      <w:r>
-        <w:rPr>
-          <w:rFonts w:ascii="Garamond" w:eastAsia="Garamond" w:hAnsi="Garamond" w:cs="Garamond"/>
-          <w:sz w:val="23"/>
-          <w:szCs w:val="23"/>
-          <w:highlight w:val="yellow"/>
-        </w:rPr>
-        <w:t>DESCUENTO</w:t>
-      </w:r>
-      <w:proofErr w:type="gramEnd"/>
-      <w:r>
-        <w:rPr>
-          <w:rFonts w:ascii="Garamond" w:eastAsia="Garamond" w:hAnsi="Garamond" w:cs="Garamond"/>
-          <w:sz w:val="23"/>
-          <w:szCs w:val="23"/>
-          <w:highlight w:val="yellow"/>
-        </w:rPr>
-        <w:t>_REDES</w:t>
-      </w:r>
-      <w:r>
-        <w:rPr>
-          <w:rFonts w:ascii="Garamond" w:eastAsia="Garamond" w:hAnsi="Garamond" w:cs="Garamond"/>
-          <w:sz w:val="23"/>
-          <w:szCs w:val="23"/>
-          <w:highlight w:val="yellow"/>
-        </w:rPr>
-        <w:t>|</w:t>
-      </w:r>
-      <w:proofErr w:type="gramStart"/>
-      <w:r>
-        <w:rPr>
-          <w:rFonts w:ascii="Garamond" w:eastAsia="Garamond" w:hAnsi="Garamond" w:cs="Garamond"/>
-          <w:sz w:val="23"/>
-          <w:szCs w:val="23"/>
-          <w:highlight w:val="yellow"/>
-        </w:rPr>
-        <w:t>lower</w:t>
-      </w:r>
-      <w:proofErr w:type="spellEnd"/>
-      <w:r>
-        <w:rPr>
-          <w:rFonts w:ascii="Garamond" w:eastAsia="Garamond" w:hAnsi="Garamond" w:cs="Garamond"/>
-          <w:sz w:val="23"/>
-          <w:szCs w:val="23"/>
-          <w:highlight w:val="yellow"/>
-        </w:rPr>
-        <w:t xml:space="preserve"> }</w:t>
-      </w:r>
-      <w:proofErr w:type="gramEnd"/>
-      <w:r>
-        <w:rPr>
-          <w:rFonts w:ascii="Garamond" w:eastAsia="Garamond" w:hAnsi="Garamond" w:cs="Garamond"/>
-          <w:sz w:val="23"/>
-          <w:szCs w:val="23"/>
-          <w:highlight w:val="yellow"/>
-        </w:rPr>
-        <w:t>}</w:t>
-      </w:r>
-      <w:r>
-        <w:rPr>
-          <w:rFonts w:ascii="Garamond" w:eastAsia="Garamond" w:hAnsi="Garamond" w:cs="Garamond"/>
-          <w:sz w:val="23"/>
-          <w:szCs w:val="23"/>
-        </w:rPr>
-        <w:t xml:space="preserve">) publicaciones mensuales en sus redes sociales garantizando que estén dirigidas única y exclusivamente a incrementar sus ventas a través de la Plataforma Rappi, </w:t>
-      </w:r>
-      <w:proofErr w:type="gramStart"/>
-      <w:r>
-        <w:rPr>
-          <w:rFonts w:ascii="Garamond" w:eastAsia="Garamond" w:hAnsi="Garamond" w:cs="Garamond"/>
-          <w:sz w:val="23"/>
-          <w:szCs w:val="23"/>
-        </w:rPr>
-        <w:t>enunciando</w:t>
-      </w:r>
-      <w:proofErr w:type="gramEnd"/>
-      <w:r>
-        <w:rPr>
-          <w:rFonts w:ascii="Garamond" w:eastAsia="Garamond" w:hAnsi="Garamond" w:cs="Garamond"/>
-          <w:sz w:val="23"/>
-          <w:szCs w:val="23"/>
-        </w:rPr>
-        <w:t xml:space="preserve"> pero no limitando, Instagram, Facebook y/o </w:t>
-      </w:r>
-      <w:proofErr w:type="spellStart"/>
-      <w:r>
-        <w:rPr>
-          <w:rFonts w:ascii="Garamond" w:eastAsia="Garamond" w:hAnsi="Garamond" w:cs="Garamond"/>
-          <w:sz w:val="23"/>
-          <w:szCs w:val="23"/>
-        </w:rPr>
-        <w:t>Tik</w:t>
-      </w:r>
-      <w:proofErr w:type="spellEnd"/>
-      <w:r>
-        <w:rPr>
-          <w:rFonts w:ascii="Garamond" w:eastAsia="Garamond" w:hAnsi="Garamond" w:cs="Garamond"/>
-          <w:sz w:val="23"/>
-          <w:szCs w:val="23"/>
-        </w:rPr>
-        <w:t xml:space="preserve"> Tok. Dichas publicaciones deberán ser presentadas y aprobadas por Rappi previo a su publicación.</w:t>
-      </w:r>
-    </w:p>
-    <w:p>
-      <w:pPr>
-        <w:jc w:val="both"/>
-        <w:rPr>
-          <w:rFonts w:ascii="Garamond" w:eastAsia="Garamond" w:hAnsi="Garamond" w:cs="Garamond"/>
-          <w:sz w:val="23"/>
-          <w:szCs w:val="23"/>
-          <w:lang w:val="en-US"/>
-        </w:rPr>
-      </w:pPr>
-      <w:r>
-        <w:rPr>
-          <w:rFonts w:ascii="Garamond" w:eastAsia="Garamond" w:hAnsi="Garamond" w:cs="Garamond"/>
-          <w:sz w:val="23"/>
-          <w:szCs w:val="23"/>
-          <w:highlight w:val="yellow"/>
-          <w:lang w:val="en-US"/>
-        </w:rPr>
-        <w:t>{%p endif %}</w:t>
-      </w:r>
-    </w:p>
-    <w:p>
-      <w:pPr>
-        <w:jc w:val="both"/>
-        <w:rPr>
-          <w:rFonts w:ascii="Garamond" w:eastAsia="Garamond" w:hAnsi="Garamond" w:cs="Garamond"/>
-          <w:sz w:val="23"/>
-          <w:szCs w:val="23"/>
-          <w:lang w:val="en-US"/>
-        </w:rPr>
-      </w:pPr>
-      <w:r>
-        <w:rPr>
-          <w:rFonts w:ascii="Garamond" w:eastAsia="Garamond" w:hAnsi="Garamond" w:cs="Garamond"/>
-          <w:sz w:val="23"/>
-          <w:szCs w:val="23"/>
-          <w:highlight w:val="yellow"/>
-          <w:lang w:val="en-US"/>
-        </w:rPr>
-        <w:t xml:space="preserve">{%p if </w:t>
-      </w:r>
-      <w:proofErr w:type="spellStart"/>
-      <w:r>
-        <w:rPr>
-          <w:rFonts w:ascii="Garamond" w:eastAsia="Garamond" w:hAnsi="Garamond" w:cs="Garamond"/>
-          <w:sz w:val="23"/>
-          <w:szCs w:val="23"/>
-          <w:highlight w:val="yellow"/>
-          <w:lang w:val="en-US"/>
-        </w:rPr>
-        <w:t>activa_platillos_top_seller</w:t>
-      </w:r>
-      <w:proofErr w:type="spellEnd"/>
-      <w:r>
-        <w:rPr>
-          <w:rFonts w:ascii="Garamond" w:eastAsia="Garamond" w:hAnsi="Garamond" w:cs="Garamond"/>
-          <w:sz w:val="23"/>
-          <w:szCs w:val="23"/>
-          <w:highlight w:val="yellow"/>
-          <w:lang w:val="en-US"/>
-        </w:rPr>
-        <w:t xml:space="preserve"> %}</w:t>
-      </w:r>
-    </w:p>
-    <w:p>
-      <w:pPr>
-        <w:jc w:val="both"/>
-        <w:rPr>
-          <w:rFonts w:ascii="Garamond" w:eastAsia="Garamond" w:hAnsi="Garamond" w:cs="Garamond"/>
-        </w:rPr>
-      </w:pPr>
-      <w:r>
-        <w:rPr>
-          <w:rFonts w:ascii="Garamond" w:eastAsia="Garamond" w:hAnsi="Garamond" w:cs="Garamond"/>
-        </w:rPr>
-        <w:t xml:space="preserve">{{ ROM_PLATILLOS }} Ofrecer </w:t>
-      </w:r>
-      <w:proofErr w:type="gramStart"/>
-      <w:r>
-        <w:rPr>
-          <w:rFonts w:ascii="Garamond" w:eastAsia="Garamond" w:hAnsi="Garamond" w:cs="Garamond"/>
-          <w:sz w:val="23"/>
-          <w:szCs w:val="23"/>
-          <w:highlight w:val="yellow"/>
-        </w:rPr>
-        <w:t xml:space="preserve">{{ </w:t>
-      </w:r>
-      <w:r>
-        <w:rPr>
-          <w:rFonts w:ascii="Garamond" w:eastAsia="Garamond" w:hAnsi="Garamond" w:cs="Garamond"/>
-          <w:sz w:val="23"/>
-          <w:szCs w:val="23"/>
-          <w:highlight w:val="yellow"/>
-        </w:rPr>
-        <w:t>N</w:t>
-      </w:r>
-      <w:proofErr w:type="gramEnd"/>
-      <w:r>
-        <w:rPr>
-          <w:rFonts w:ascii="Garamond" w:eastAsia="Garamond" w:hAnsi="Garamond" w:cs="Garamond"/>
-          <w:sz w:val="23"/>
-          <w:szCs w:val="23"/>
-          <w:highlight w:val="yellow"/>
-        </w:rPr>
-        <w:t>_</w:t>
-      </w:r>
-      <w:r>
-        <w:rPr>
-          <w:rFonts w:ascii="Garamond" w:eastAsia="Garamond" w:hAnsi="Garamond" w:cs="Garamond"/>
-          <w:sz w:val="23"/>
-          <w:szCs w:val="23"/>
-          <w:highlight w:val="yellow"/>
-        </w:rPr>
-        <w:t>CANTIDAD_</w:t>
-      </w:r>
-      <w:proofErr w:type="gramStart"/>
-      <w:r>
-        <w:rPr>
-          <w:rFonts w:ascii="Garamond" w:eastAsia="Garamond" w:hAnsi="Garamond" w:cs="Garamond"/>
-          <w:sz w:val="23"/>
-          <w:szCs w:val="23"/>
-          <w:highlight w:val="yellow"/>
-        </w:rPr>
-        <w:t>PLATILLOS }</w:t>
-      </w:r>
-      <w:proofErr w:type="gramEnd"/>
-      <w:r>
-        <w:rPr>
-          <w:rFonts w:ascii="Garamond" w:eastAsia="Garamond" w:hAnsi="Garamond" w:cs="Garamond"/>
-          <w:sz w:val="23"/>
-          <w:szCs w:val="23"/>
-          <w:highlight w:val="yellow"/>
-        </w:rPr>
-        <w:t>}</w:t>
-      </w:r>
-      <w:r>
-        <w:rPr>
-          <w:rFonts w:ascii="Garamond" w:eastAsia="Garamond" w:hAnsi="Garamond" w:cs="Garamond"/>
-          <w:sz w:val="23"/>
-          <w:szCs w:val="23"/>
-        </w:rPr>
-        <w:t xml:space="preserve"> </w:t>
-      </w:r>
-      <w:r>
-        <w:rPr>
-          <w:rFonts w:ascii="Garamond" w:eastAsia="Garamond" w:hAnsi="Garamond" w:cs="Garamond"/>
-        </w:rPr>
-        <w:t xml:space="preserve">platillos que sean Top Seller un </w:t>
+      <w:r>
+        <w:rPr>
+          <w:rFonts w:ascii="Garamond" w:eastAsia="Garamond" w:hAnsi="Garamond" w:cs="Garamond"/>
+        </w:rPr>
+        <w:t xml:space="preserve"> que sean Top Seller un </w:t>
       </w:r>
       <w:proofErr w:type="gramStart"/>
       <w:r>
@@ -7225,7 +7039,7 @@
           <w:szCs w:val="23"/>
           <w:highlight w:val="yellow"/>
         </w:rPr>
-        <w:t xml:space="preserve">Titular: {{ RAZÓN_SOCIAL_ENCABEZADO }}</w:t>
+        <w:t xml:space="preserve">Titular: </w:t>
       </w:r>
       <w:proofErr w:type="gramStart"/>
       <w:r>
@@ -7236,9 +7050,8 @@
           <w:sz w:val="23"/>
           <w:szCs w:val="23"/>
           <w:highlight w:val="yellow"/>
-          <w:lang w:val="es-ES"/>
-        </w:rPr>
-        <w:t/>
+        </w:rPr>
+        <w:t>{{ RAZÓN</w:t>
       </w:r>
       <w:proofErr w:type="gramEnd"/>
       <w:r>
@@ -7249,9 +7062,8 @@
           <w:sz w:val="23"/>
           <w:szCs w:val="23"/>
           <w:highlight w:val="yellow"/>
-          <w:lang w:val="es-ES"/>
-        </w:rPr>
-        <w:t/>
+        </w:rPr>
+        <w:t>_SOCIAL_</w:t>
       </w:r>
       <w:proofErr w:type="gramStart"/>
       <w:r>
@@ -7262,9 +7074,8 @@
           <w:sz w:val="23"/>
           <w:szCs w:val="23"/>
           <w:highlight w:val="yellow"/>
-          <w:lang w:val="es-ES"/>
-        </w:rPr>
-        <w:t/>
+        </w:rPr>
+        <w:t>ENCABEZADO }</w:t>
       </w:r>
       <w:proofErr w:type="gramEnd"/>
       <w:r>
@@ -7275,9 +7086,8 @@
           <w:sz w:val="23"/>
           <w:szCs w:val="23"/>
           <w:highlight w:val="yellow"/>
-          <w:lang w:val="es-ES"/>
-        </w:rPr>
-        <w:t/>
+        </w:rPr>
+        <w:t>}</w:t>
       </w:r>
     </w:p>
     <w:p>
@@ -7942,19 +7752,8 @@
           <w:bCs/>
           <w:u w:val="single"/>
         </w:rPr>
-        <w:t xml:space="preserve">CLÁUSULA DÉCIMA SEGUNDA. - </w:t>
-      </w:r>
-      <w:proofErr w:type="spellStart"/>
-      <w:r>
-        <w:rPr>
-          <w:rFonts w:ascii="Garamond" w:eastAsia="Garamond" w:hAnsi="Garamond" w:cs="Garamond"/>
-          <w:b/>
-          <w:bCs/>
-          <w:u w:val="single"/>
-        </w:rPr>
-        <w:t>Tablets</w:t>
-      </w:r>
-      <w:proofErr w:type="spellEnd"/>
+        <w:t>CLÁUSULA DÉCIMA SEGUNDA. - Tablets</w:t>
+      </w:r>
       <w:r>
         <w:rPr>
           <w:rFonts w:ascii="Garamond" w:eastAsia="Garamond" w:hAnsi="Garamond" w:cs="Garamond"/>
@@ -8832,29 +8631,267 @@
           <w:b/>
           <w:bCs/>
           <w:u w:val="single"/>
-        </w:rPr>
-      </w:pPr>
-    </w:p>
-    <w:p>
-      <w:pPr>
-        <w:jc w:val="both"/>
-        <w:rPr>
-          <w:rFonts w:ascii="Garamond" w:eastAsia="Garamond" w:hAnsi="Garamond" w:cs="Garamond"/>
-        </w:rPr>
-      </w:pPr>
-      <w:r>
-        <w:rPr>
-          <w:rFonts w:ascii="Garamond" w:eastAsia="Garamond" w:hAnsi="Garamond" w:cs="Garamond"/>
-          <w:b/>
-          <w:bCs/>
-          <w:sz w:val="23"/>
-          <w:szCs w:val="23"/>
-          <w:u w:val="single"/>
+          <w:lang w:val="pt-PT"/>
+        </w:rPr>
+      </w:pPr>
+    </w:p>
+    <w:p>
+      <w:pPr>
+        <w:jc w:val="both"/>
+        <w:rPr>
+          <w:rFonts w:ascii="Garamond" w:eastAsia="Garamond" w:hAnsi="Garamond" w:cs="Garamond"/>
+        </w:rPr>
+      </w:pPr>
+      <w:r>
+        <w:rPr>
+          <w:rFonts w:ascii="Garamond" w:eastAsia="Garamond" w:hAnsi="Garamond" w:cs="Garamond"/>
+          <w:b/>
+          <w:bCs/>
+          <w:sz w:val="23"/>
+          <w:szCs w:val="23"/>
+          <w:u w:val="single"/>
+          <w:lang w:val="pt-PT"/>
+        </w:rPr>
+        <w:t xml:space="preserve">CLÁUSULA </w:t>
+      </w:r>
+      <w:r>
+        <w:rPr>
+          <w:rFonts w:ascii="Garamond" w:eastAsia="Garamond" w:hAnsi="Garamond" w:cs="Garamond"/>
+          <w:b/>
+          <w:bCs/>
+          <w:sz w:val="23"/>
+          <w:szCs w:val="23"/>
+          <w:highlight w:val="yellow"/>
+          <w:u w:val="single"/>
+          <w:lang w:val="pt-PT"/>
+        </w:rPr>
+        <w:t>{{ NUM_EXCLUSIVIDAD|upper }}</w:t>
+      </w:r>
+      <w:r>
+        <w:rPr>
+          <w:rFonts w:ascii="Garamond" w:eastAsia="Garamond" w:hAnsi="Garamond" w:cs="Garamond"/>
+          <w:b/>
+          <w:bCs/>
+          <w:sz w:val="23"/>
+          <w:szCs w:val="23"/>
+          <w:u w:val="single"/>
+          <w:lang w:val="pt-PT"/>
+        </w:rPr>
+        <w:t>.</w:t>
+      </w:r>
+      <w:r>
+        <w:rPr>
+          <w:rFonts w:ascii="Garamond" w:eastAsia="Garamond" w:hAnsi="Garamond" w:cs="Garamond"/>
+          <w:b/>
+          <w:bCs/>
+          <w:u w:val="single"/>
+          <w:lang w:val="pt-PT"/>
+        </w:rPr>
+        <w:t xml:space="preserve"> - Exclusividad.</w:t>
+      </w:r>
+      <w:r>
+        <w:rPr>
+          <w:rFonts w:ascii="Garamond" w:eastAsia="Garamond" w:hAnsi="Garamond" w:cs="Garamond"/>
+          <w:lang w:val="pt-PT"/>
+        </w:rPr>
+        <w:t xml:space="preserve"> </w:t>
+      </w:r>
+      <w:r>
+        <w:rPr>
+          <w:rFonts w:ascii="Garamond" w:eastAsia="Garamond" w:hAnsi="Garamond" w:cs="Garamond"/>
+        </w:rPr>
+        <w:t>En virtud de las condiciones comerciales preferenciales otorgadas al Aliado y al interés recíproco de impulsar el crecimiento y posicionamiento estratégico del Aliado y su Marca dentro de la Plataforma Rappi, las Partes acuerdan que la obligación descrita en la presente Cláusula constituye un motivo determinante de la voluntad para celebrar el presente Acuerdo. En virtud de lo anterior, el Aliado no podrá contratar, celebrar y/o ejecutar, de manera directa o indirecta, por medio de sus representantes, filiales u otros, ningún tipo de acuerdo con un objeto igual o similar al objeto del presente Acuerdo con cualquier empresa y/o plataforma virtual que preste servicios iguales o similares a Rappi (en adelante, “Empresa Adicional”).</w:t>
+      </w:r>
+    </w:p>
+    <w:p>
+      <w:pPr>
+        <w:jc w:val="both"/>
+        <w:rPr>
+          <w:rFonts w:ascii="Garamond" w:eastAsia="Garamond" w:hAnsi="Garamond" w:cs="Garamond"/>
+        </w:rPr>
+      </w:pPr>
+    </w:p>
+    <w:p>
+      <w:pPr>
+        <w:jc w:val="both"/>
+        <w:rPr>
+          <w:rFonts w:ascii="Garamond" w:eastAsia="Garamond" w:hAnsi="Garamond" w:cs="Garamond"/>
+        </w:rPr>
+      </w:pPr>
+      <w:r>
+        <w:rPr>
+          <w:rFonts w:ascii="Garamond" w:eastAsia="Garamond" w:hAnsi="Garamond" w:cs="Garamond"/>
+        </w:rPr>
+        <w:t>En caso de incumplir con esta obligación, se duplicará de manera automática el porcentaje acordado por concepto del Uso y Alquiler de la Plataforma Rappi.</w:t>
+      </w:r>
+    </w:p>
+    <w:p>
+      <w:pPr>
+        <w:jc w:val="both"/>
+        <w:rPr>
+          <w:rFonts w:ascii="Garamond" w:eastAsia="Garamond" w:hAnsi="Garamond" w:cs="Garamond"/>
+        </w:rPr>
+      </w:pPr>
+    </w:p>
+    <w:p>
+      <w:pPr>
+        <w:jc w:val="both"/>
+        <w:rPr>
+          <w:rFonts w:ascii="Garamond" w:eastAsia="Garamond" w:hAnsi="Garamond" w:cs="Garamond"/>
+        </w:rPr>
+      </w:pPr>
+      <w:r>
+        <w:rPr>
+          <w:rFonts w:ascii="Garamond" w:eastAsia="Garamond" w:hAnsi="Garamond" w:cs="Garamond"/>
+        </w:rPr>
+        <w:t>Esta obligación de exclusividad aplica sobre la Marca objeto de este Acuerdo, así como sobre cualquier otro Producto dentro del Catálogo y que el Aliado prepare y despache desde los Establecimientos de Comercio identificados bajo la Marca. En consecuencia, ningún producto elaborado en dichas ubicaciones podrá comercializarse a través de una Empresa Adicional."</w:t>
+      </w:r>
+    </w:p>
+    <w:p>
+      <w:pPr>
+        <w:jc w:val="both"/>
+        <w:rPr>
+          <w:rFonts w:ascii="Garamond" w:eastAsia="Garamond" w:hAnsi="Garamond" w:cs="Garamond"/>
+          <w:sz w:val="23"/>
+          <w:szCs w:val="23"/>
           <w:lang w:val="es-MX"/>
         </w:rPr>
+      </w:pPr>
+      <w:r>
+        <w:rPr>
+          <w:rFonts w:ascii="Garamond" w:eastAsia="Garamond" w:hAnsi="Garamond" w:cs="Garamond"/>
+          <w:sz w:val="23"/>
+          <w:szCs w:val="23"/>
+          <w:highlight w:val="yellow"/>
+          <w:lang w:val="es-MX"/>
+        </w:rPr>
+        <w:t xml:space="preserve">{%p </w:t>
+      </w:r>
+      <w:proofErr w:type="spellStart"/>
+      <w:r>
+        <w:rPr>
+          <w:rFonts w:ascii="Garamond" w:eastAsia="Garamond" w:hAnsi="Garamond" w:cs="Garamond"/>
+          <w:sz w:val="23"/>
+          <w:szCs w:val="23"/>
+          <w:highlight w:val="yellow"/>
+          <w:lang w:val="es-MX"/>
+        </w:rPr>
+        <w:t>endif</w:t>
+      </w:r>
+      <w:proofErr w:type="spellEnd"/>
+      <w:r>
+        <w:rPr>
+          <w:rFonts w:ascii="Garamond" w:eastAsia="Garamond" w:hAnsi="Garamond" w:cs="Garamond"/>
+          <w:sz w:val="23"/>
+          <w:szCs w:val="23"/>
+          <w:highlight w:val="yellow"/>
+          <w:lang w:val="es-MX"/>
+        </w:rPr>
+        <w:t xml:space="preserve"> %}</w:t>
+      </w:r>
+    </w:p>
+    <w:p>
+      <w:pPr>
+        <w:jc w:val="both"/>
+        <w:rPr>
+          <w:rFonts w:ascii="Garamond" w:eastAsia="Garamond" w:hAnsi="Garamond" w:cs="Garamond"/>
+          <w:sz w:val="23"/>
+          <w:szCs w:val="23"/>
+          <w:lang w:val="es-MX"/>
+        </w:rPr>
+      </w:pPr>
+      <w:r>
+        <w:rPr>
+          <w:rFonts w:ascii="Garamond" w:eastAsia="Garamond" w:hAnsi="Garamond" w:cs="Garamond"/>
+          <w:sz w:val="23"/>
+          <w:szCs w:val="23"/>
+          <w:highlight w:val="yellow"/>
+          <w:lang w:val="es-MX"/>
+        </w:rPr>
+        <w:t xml:space="preserve">{%p </w:t>
+      </w:r>
+      <w:proofErr w:type="spellStart"/>
+      <w:r>
+        <w:rPr>
+          <w:rFonts w:ascii="Garamond" w:eastAsia="Garamond" w:hAnsi="Garamond" w:cs="Garamond"/>
+          <w:sz w:val="23"/>
+          <w:szCs w:val="23"/>
+          <w:highlight w:val="yellow"/>
+          <w:lang w:val="es-MX"/>
+        </w:rPr>
+        <w:t>if</w:t>
+      </w:r>
+      <w:proofErr w:type="spellEnd"/>
+      <w:r>
+        <w:rPr>
+          <w:rFonts w:ascii="Garamond" w:eastAsia="Garamond" w:hAnsi="Garamond" w:cs="Garamond"/>
+          <w:sz w:val="23"/>
+          <w:szCs w:val="23"/>
+          <w:highlight w:val="yellow"/>
+          <w:lang w:val="es-MX"/>
+        </w:rPr>
+        <w:t xml:space="preserve"> </w:t>
+      </w:r>
+      <w:proofErr w:type="spellStart"/>
+      <w:r>
+        <w:rPr>
+          <w:rFonts w:ascii="Garamond" w:eastAsia="Garamond" w:hAnsi="Garamond" w:cs="Garamond"/>
+          <w:sz w:val="23"/>
+          <w:szCs w:val="23"/>
+          <w:highlight w:val="yellow"/>
+          <w:lang w:val="es-MX"/>
+        </w:rPr>
+        <w:t>activa_semi_exclusividad</w:t>
+      </w:r>
+      <w:proofErr w:type="spellEnd"/>
+      <w:r>
+        <w:rPr>
+          <w:rFonts w:ascii="Garamond" w:eastAsia="Garamond" w:hAnsi="Garamond" w:cs="Garamond"/>
+          <w:sz w:val="23"/>
+          <w:szCs w:val="23"/>
+          <w:highlight w:val="yellow"/>
+          <w:lang w:val="es-MX"/>
+        </w:rPr>
+        <w:t xml:space="preserve"> %}</w:t>
+      </w:r>
+    </w:p>
+    <w:p>
+      <w:pPr>
+        <w:jc w:val="both"/>
+        <w:rPr>
+          <w:rFonts w:ascii="Garamond" w:eastAsia="Garamond" w:hAnsi="Garamond" w:cs="Garamond"/>
+          <w:lang w:val="es-MX"/>
+        </w:rPr>
+      </w:pPr>
+    </w:p>
+    <w:p>
+      <w:pPr>
+        <w:jc w:val="both"/>
+        <w:rPr>
+          <w:rFonts w:ascii="Garamond" w:eastAsia="Garamond" w:hAnsi="Garamond" w:cs="Garamond"/>
+          <w:lang w:val="es-MX"/>
+        </w:rPr>
+      </w:pPr>
+    </w:p>
+    <w:p>
+      <w:pPr>
+        <w:jc w:val="both"/>
+        <w:rPr>
+          <w:rFonts w:ascii="Garamond" w:eastAsia="Garamond" w:hAnsi="Garamond" w:cs="Garamond"/>
+        </w:rPr>
+      </w:pPr>
+      <w:r>
+        <w:rPr>
+          <w:rFonts w:ascii="Garamond" w:eastAsia="Garamond" w:hAnsi="Garamond" w:cs="Garamond"/>
+          <w:b/>
+          <w:bCs/>
+          <w:sz w:val="23"/>
+          <w:szCs w:val="23"/>
+          <w:u w:val="single"/>
+          <w:lang w:val="es-MX"/>
+        </w:rPr>
         <w:t xml:space="preserve">CLÁUSULA </w:t>
       </w:r>
-      <w:proofErr w:type="gramStart"/>
       <w:r>
         <w:rPr>
           <w:rFonts w:ascii="Garamond" w:eastAsia="Garamond" w:hAnsi="Garamond" w:cs="Garamond"/>
@@ -8866,285 +8903,39 @@
           <w:u w:val="single"/>
           <w:lang w:val="es-MX"/>
         </w:rPr>
-        <w:t xml:space="preserve">{{ </w:t>
-      </w:r>
-      <w:proofErr w:type="spellStart"/>
-      <w:r>
-        <w:rPr>
-          <w:rFonts w:ascii="Garamond" w:eastAsia="Garamond" w:hAnsi="Garamond" w:cs="Garamond"/>
-          <w:b/>
-          <w:bCs/>
-          <w:sz w:val="23"/>
-          <w:szCs w:val="23"/>
-          <w:highlight w:val="yellow"/>
+        <w:t>{{ NUM_SEMI_EXCLUSIVIDAD|upper }}</w:t>
+      </w:r>
+      <w:r>
+        <w:rPr>
+          <w:rFonts w:ascii="Garamond" w:eastAsia="Garamond" w:hAnsi="Garamond" w:cs="Garamond"/>
+          <w:b/>
+          <w:bCs/>
+          <w:sz w:val="23"/>
+          <w:szCs w:val="23"/>
           <w:u w:val="single"/>
           <w:lang w:val="es-MX"/>
         </w:rPr>
-        <w:t>NUM</w:t>
-      </w:r>
-      <w:proofErr w:type="gramEnd"/>
-      <w:r>
-        <w:rPr>
-          <w:rFonts w:ascii="Garamond" w:eastAsia="Garamond" w:hAnsi="Garamond" w:cs="Garamond"/>
-          <w:b/>
-          <w:bCs/>
-          <w:sz w:val="23"/>
-          <w:szCs w:val="23"/>
-          <w:highlight w:val="yellow"/>
-          <w:u w:val="single"/>
+        <w:t>. - Semi Exclusividad.</w:t>
+      </w:r>
+      <w:r>
+        <w:rPr>
+          <w:rFonts w:ascii="Garamond" w:eastAsia="Garamond" w:hAnsi="Garamond" w:cs="Garamond"/>
           <w:lang w:val="es-MX"/>
         </w:rPr>
-        <w:t>_EXCLUSIVIDAD|</w:t>
-      </w:r>
-      <w:proofErr w:type="gramStart"/>
-      <w:r>
-        <w:rPr>
-          <w:rFonts w:ascii="Garamond" w:eastAsia="Garamond" w:hAnsi="Garamond" w:cs="Garamond"/>
-          <w:b/>
-          <w:bCs/>
-          <w:sz w:val="23"/>
-          <w:szCs w:val="23"/>
-          <w:highlight w:val="yellow"/>
-          <w:u w:val="single"/>
-          <w:lang w:val="es-MX"/>
-        </w:rPr>
-        <w:t>upper</w:t>
-      </w:r>
-      <w:proofErr w:type="spellEnd"/>
-      <w:r>
-        <w:rPr>
-          <w:rFonts w:ascii="Garamond" w:eastAsia="Garamond" w:hAnsi="Garamond" w:cs="Garamond"/>
-          <w:b/>
-          <w:bCs/>
-          <w:sz w:val="23"/>
-          <w:szCs w:val="23"/>
-          <w:highlight w:val="yellow"/>
-          <w:u w:val="single"/>
-          <w:lang w:val="es-MX"/>
-        </w:rPr>
-        <w:t xml:space="preserve"> }</w:t>
-      </w:r>
-      <w:proofErr w:type="gramEnd"/>
-      <w:r>
-        <w:rPr>
-          <w:rFonts w:ascii="Garamond" w:eastAsia="Garamond" w:hAnsi="Garamond" w:cs="Garamond"/>
-          <w:b/>
-          <w:bCs/>
-          <w:sz w:val="23"/>
-          <w:szCs w:val="23"/>
-          <w:highlight w:val="yellow"/>
-          <w:u w:val="single"/>
-          <w:lang w:val="es-MX"/>
-        </w:rPr>
-        <w:t>}</w:t>
-      </w:r>
-      <w:r>
-        <w:rPr>
-          <w:rFonts w:ascii="Garamond" w:eastAsia="Garamond" w:hAnsi="Garamond" w:cs="Garamond"/>
-          <w:b/>
-          <w:bCs/>
-          <w:sz w:val="23"/>
-          <w:szCs w:val="23"/>
-          <w:u w:val="single"/>
-          <w:lang w:val="es-MX"/>
-        </w:rPr>
-        <w:t>.</w:t>
-      </w:r>
-      <w:r>
-        <w:rPr>
-          <w:rFonts w:ascii="Garamond" w:eastAsia="Garamond" w:hAnsi="Garamond" w:cs="Garamond"/>
-          <w:b/>
-          <w:bCs/>
-          <w:u w:val="single"/>
-        </w:rPr>
-        <w:t xml:space="preserve"> - Exclusividad. </w:t>
-      </w:r>
-      <w:r>
-        <w:rPr>
-          <w:rFonts w:ascii="Garamond" w:eastAsia="Garamond" w:hAnsi="Garamond" w:cs="Garamond"/>
-        </w:rPr>
-        <w:t>En virtud de las condiciones comerciales preferenciales otorgadas al Aliado y al interés recíproco de impulsar el crecimiento y posicionamiento estratégico del Aliado y su Marca dentro de la Plataforma Rappi, las Partes acuerdan que la obligación descrita en la presente Cláusula constituye un motivo determinante de la voluntad para celebrar el presente Acuerdo. En virtud de lo anterior, el Aliado no podrá contratar, celebrar y/o ejecutar, de manera directa o indirecta, por medio de sus representantes, filiales u otros, ningún tipo de acuerdo con un objeto igual o similar al objeto del presente Acuerdo con cualquier empresa y/o plataforma virtual que preste servicios iguales o similares a Rappi (en adelante, “Empresa Adicional”).</w:t>
-      </w:r>
-    </w:p>
-    <w:p>
-      <w:pPr>
-        <w:jc w:val="both"/>
-        <w:rPr>
-          <w:rFonts w:ascii="Garamond" w:eastAsia="Garamond" w:hAnsi="Garamond" w:cs="Garamond"/>
-        </w:rPr>
-      </w:pPr>
-    </w:p>
-    <w:p>
-      <w:pPr>
-        <w:jc w:val="both"/>
-        <w:rPr>
-          <w:rFonts w:ascii="Garamond" w:eastAsia="Garamond" w:hAnsi="Garamond" w:cs="Garamond"/>
-        </w:rPr>
-      </w:pPr>
-      <w:r>
-        <w:rPr>
-          <w:rFonts w:ascii="Garamond" w:eastAsia="Garamond" w:hAnsi="Garamond" w:cs="Garamond"/>
-        </w:rPr>
-        <w:t>En caso de incumplir con esta obligación, se duplicará de manera automática el porcentaje acordado por concepto del Uso y Alquiler de la Plataforma Rappi.</w:t>
-      </w:r>
-    </w:p>
-    <w:p>
-      <w:pPr>
-        <w:jc w:val="both"/>
-        <w:rPr>
-          <w:rFonts w:ascii="Garamond" w:eastAsia="Garamond" w:hAnsi="Garamond" w:cs="Garamond"/>
-        </w:rPr>
-      </w:pPr>
-    </w:p>
-    <w:p>
-      <w:pPr>
-        <w:jc w:val="both"/>
-        <w:rPr>
-          <w:rFonts w:ascii="Garamond" w:eastAsia="Garamond" w:hAnsi="Garamond" w:cs="Garamond"/>
-        </w:rPr>
-      </w:pPr>
-      <w:r>
-        <w:rPr>
-          <w:rFonts w:ascii="Garamond" w:eastAsia="Garamond" w:hAnsi="Garamond" w:cs="Garamond"/>
-        </w:rPr>
-        <w:t>Esta obligación de exclusividad aplica sobre la Marca objeto de este Acuerdo, así como sobre cualquier otro Producto dentro del Catálogo y que el Aliado prepare y despache desde los Establecimientos de Comercio identificados bajo la Marca. En consecuencia, ningún producto elaborado en dichas ubicaciones podrá comercializarse a través de una Empresa Adicional."</w:t>
-      </w:r>
-    </w:p>
-    <w:p>
-      <w:pPr>
-        <w:jc w:val="both"/>
-        <w:rPr>
-          <w:rFonts w:ascii="Garamond" w:eastAsia="Garamond" w:hAnsi="Garamond" w:cs="Garamond"/>
-          <w:sz w:val="23"/>
-          <w:szCs w:val="23"/>
-          <w:lang w:val="pt-PT"/>
-        </w:rPr>
-      </w:pPr>
-      <w:r>
-        <w:rPr>
-          <w:rFonts w:ascii="Garamond" w:eastAsia="Garamond" w:hAnsi="Garamond" w:cs="Garamond"/>
-          <w:sz w:val="23"/>
-          <w:szCs w:val="23"/>
-          <w:highlight w:val="yellow"/>
-          <w:lang w:val="pt-PT"/>
-        </w:rPr>
-        <w:t>{%p endif %}</w:t>
-      </w:r>
-    </w:p>
-    <w:p>
-      <w:pPr>
-        <w:jc w:val="both"/>
-        <w:rPr>
-          <w:rFonts w:ascii="Garamond" w:eastAsia="Garamond" w:hAnsi="Garamond" w:cs="Garamond"/>
-          <w:sz w:val="23"/>
-          <w:szCs w:val="23"/>
-          <w:lang w:val="pt-PT"/>
-        </w:rPr>
-      </w:pPr>
-      <w:r>
-        <w:rPr>
-          <w:rFonts w:ascii="Garamond" w:eastAsia="Garamond" w:hAnsi="Garamond" w:cs="Garamond"/>
-          <w:sz w:val="23"/>
-          <w:szCs w:val="23"/>
-          <w:highlight w:val="yellow"/>
-          <w:lang w:val="pt-PT"/>
-        </w:rPr>
-        <w:t>{%p if activa_semi_exclusividad %}</w:t>
-      </w:r>
-    </w:p>
-    <w:p>
-      <w:pPr>
-        <w:jc w:val="both"/>
-        <w:rPr>
-          <w:rFonts w:ascii="Garamond" w:eastAsia="Garamond" w:hAnsi="Garamond" w:cs="Garamond"/>
-          <w:lang w:val="pt-PT"/>
-        </w:rPr>
-      </w:pPr>
-    </w:p>
-    <w:p>
-      <w:pPr>
-        <w:jc w:val="both"/>
-        <w:rPr>
-          <w:rFonts w:ascii="Garamond" w:eastAsia="Garamond" w:hAnsi="Garamond" w:cs="Garamond"/>
-          <w:lang w:val="pt-PT"/>
-        </w:rPr>
-      </w:pPr>
-    </w:p>
-    <w:p>
-      <w:pPr>
-        <w:jc w:val="both"/>
-        <w:rPr>
-          <w:rFonts w:ascii="Garamond" w:eastAsia="Garamond" w:hAnsi="Garamond" w:cs="Garamond"/>
-        </w:rPr>
-      </w:pPr>
-      <w:r>
-        <w:rPr>
-          <w:rFonts w:ascii="Garamond" w:eastAsia="Garamond" w:hAnsi="Garamond" w:cs="Garamond"/>
-          <w:b/>
-          <w:bCs/>
-          <w:sz w:val="23"/>
-          <w:szCs w:val="23"/>
-          <w:u w:val="single"/>
-          <w:lang w:val="pt-PT"/>
-        </w:rPr>
-        <w:t xml:space="preserve">CLÁUSULA </w:t>
-      </w:r>
-      <w:r>
-        <w:rPr>
-          <w:rFonts w:ascii="Garamond" w:eastAsia="Garamond" w:hAnsi="Garamond" w:cs="Garamond"/>
-          <w:b/>
-          <w:bCs/>
-          <w:sz w:val="23"/>
-          <w:szCs w:val="23"/>
-          <w:highlight w:val="yellow"/>
-          <w:u w:val="single"/>
-          <w:lang w:val="pt-PT"/>
-        </w:rPr>
-        <w:t>{{ NUM_SEMI_EXCLUSIVIDAD|upper }}</w:t>
-      </w:r>
-      <w:r>
-        <w:rPr>
-          <w:rFonts w:ascii="Garamond" w:eastAsia="Garamond" w:hAnsi="Garamond" w:cs="Garamond"/>
-          <w:b/>
-          <w:bCs/>
-          <w:sz w:val="23"/>
-          <w:szCs w:val="23"/>
-          <w:u w:val="single"/>
-          <w:lang w:val="pt-PT"/>
-        </w:rPr>
-        <w:t>.</w:t>
-      </w:r>
-      <w:r>
-        <w:rPr>
-          <w:rFonts w:ascii="Garamond" w:eastAsia="Garamond" w:hAnsi="Garamond" w:cs="Garamond"/>
-          <w:b/>
-          <w:bCs/>
-          <w:sz w:val="23"/>
-          <w:szCs w:val="23"/>
-          <w:u w:val="single"/>
-          <w:lang w:val="pt-PT"/>
-        </w:rPr>
-        <w:t xml:space="preserve"> - Semi Exclusividad.</w:t>
-      </w:r>
-      <w:r>
-        <w:rPr>
-          <w:rFonts w:ascii="Garamond" w:eastAsia="Garamond" w:hAnsi="Garamond" w:cs="Garamond"/>
-          <w:lang w:val="pt-PT"/>
-        </w:rPr>
         <w:t xml:space="preserve"> </w:t>
       </w:r>
       <w:r>
         <w:rPr>
           <w:rFonts w:ascii="Garamond" w:eastAsia="Garamond" w:hAnsi="Garamond" w:cs="Garamond"/>
         </w:rPr>
-        <w:t xml:space="preserve">En virtud de las condiciones comerciales preferenciales otorgadas al Aliado y al interés recíproco de impulsar el crecimiento y posicionamiento estratégico del Aliado y su(s) Marca(s) dentro de la Plataforma Rappi, las Partes acuerdan que las obligaciones descritas en la presente Cláusula constituyen un motivo determinante de la voluntad </w:t>
+        <w:t xml:space="preserve">En virtud de las condiciones comerciales preferenciales otorgadas al Aliado y al interés recíproco de impulsar el crecimiento y posicionamiento estratégico del Aliado y su(s) Marca(s) dentro de la Plataforma Rappi, las Partes acuerdan que las obligaciones descritas en la presente Cláusula constituyen un motivo </w:t>
       </w:r>
       <w:r>
         <w:rPr>
           <w:rFonts w:ascii="Garamond" w:eastAsia="Garamond" w:hAnsi="Garamond" w:cs="Garamond"/>
         </w:rPr>
         <w:lastRenderedPageBreak/>
-        <w:t xml:space="preserve">para celebrar el presente Acuerdo. En virtud de lo anterior, el Aliado se obliga a únicamente operar, comercializar, y/o distribuir productos dentro de la Plataforma Rappi y dentro de otra plataforma igual o similar a la Plataforma Rappi (en adelante “Plataforma Adicional Permitida”); por lo que no podrá contratar, celebrar y/o ejecutar, de manera directa o indirecta, ningún tipo de acuerdo con un objeto igual o similar al objeto del presente Acuerdo con una tercera empresa y/o plataforma virtual que preste servicios iguales o similares a Rappi (en adelante, “Empresa Adicional”). </w:t>
+        <w:t xml:space="preserve">determinante de la voluntad para celebrar el presente Acuerdo. En virtud de lo anterior, el Aliado se obliga a únicamente operar, comercializar, y/o distribuir productos dentro de la Plataforma Rappi y dentro de otra plataforma igual o similar a la Plataforma Rappi (en adelante “Plataforma Adicional Permitida”); por lo que no podrá contratar, celebrar y/o ejecutar, de manera directa o indirecta, ningún tipo de acuerdo con un objeto igual o similar al objeto del presente Acuerdo con una tercera empresa y/o plataforma virtual que preste servicios iguales o similares a Rappi (en adelante, “Empresa Adicional”). </w:t>
       </w:r>
       <w:r>
         <w:rPr>
@@ -12335,14 +12126,22 @@
           <w:rFonts w:ascii="Garamond" w:eastAsia="Garamond" w:hAnsi="Garamond" w:cs="Garamond"/>
           <w:b/>
           <w:bCs/>
+          <w:u w:val="single"/>
         </w:rPr>
         <w:t xml:space="preserve"> – Línea de Crédito Nuevas Aperturas</w:t>
       </w:r>
       <w:r>
         <w:rPr>
           <w:rFonts w:ascii="Garamond" w:eastAsia="Garamond" w:hAnsi="Garamond" w:cs="Garamond"/>
-        </w:rPr>
-        <w:t>. Rappi apoyará al Aliado con una línea de crédito (“Línea de Crédito NA”) por una cantidad de hasta $</w:t>
+          <w:u w:val="single"/>
+        </w:rPr>
+        <w:t>.</w:t>
+      </w:r>
+      <w:r>
+        <w:rPr>
+          <w:rFonts w:ascii="Garamond" w:eastAsia="Garamond" w:hAnsi="Garamond" w:cs="Garamond"/>
+        </w:rPr>
+        <w:t xml:space="preserve"> Rappi apoyará al Aliado con una línea de crédito (“Línea de Crédito NA”) por una cantidad de hasta $</w:t>
       </w:r>
       <w:proofErr w:type="gramStart"/>
       <w:r>
@@ -12746,7 +12545,19 @@
           <w:highlight w:val="yellow"/>
           <w:u w:val="single"/>
         </w:rPr>
-        <w:t xml:space="preserve"> }</w:t>
+        <w:t xml:space="preserve"> </w:t>
+      </w:r>
+      <w:r>
+        <w:rPr>
+          <w:rFonts w:ascii="Garamond" w:eastAsia="Garamond" w:hAnsi="Garamond" w:cs="Garamond"/>
+          <w:b/>
+          <w:bCs/>
+          <w:sz w:val="23"/>
+          <w:szCs w:val="23"/>
+          <w:highlight w:val="yellow"/>
+          <w:u w:val="single"/>
+        </w:rPr>
+        <w:t>}</w:t>
       </w:r>
       <w:proofErr w:type="gramEnd"/>
       <w:r>
@@ -12766,24 +12577,9 @@
           <w:rFonts w:ascii="Garamond" w:eastAsia="Garamond" w:hAnsi="Garamond" w:cs="Garamond"/>
           <w:b/>
           <w:bCs/>
-        </w:rPr>
-        <w:t xml:space="preserve">. </w:t>
-      </w:r>
-      <w:r>
-        <w:rPr>
-          <w:rFonts w:ascii="Garamond" w:eastAsia="Garamond" w:hAnsi="Garamond" w:cs="Garamond"/>
-          <w:b/>
-          <w:bCs/>
-        </w:rPr>
-        <w:t xml:space="preserve">-  </w:t>
-      </w:r>
-      <w:r>
-        <w:rPr>
-          <w:rFonts w:ascii="Garamond" w:eastAsia="Garamond" w:hAnsi="Garamond" w:cs="Garamond"/>
-          <w:b/>
-          <w:bCs/>
-        </w:rPr>
-        <w:t>Incumplimiento.</w:t>
+          <w:u w:val="single"/>
+        </w:rPr>
+        <w:t>. -  Incumplimiento.</w:t>
       </w:r>
       <w:r>
         <w:rPr>
@@ -13010,6 +12806,7 @@
           <w:rFonts w:ascii="Garamond" w:eastAsia="Garamond" w:hAnsi="Garamond" w:cs="Garamond"/>
           <w:sz w:val="23"/>
           <w:szCs w:val="23"/>
+          <w:lang w:val="en-US"/>
         </w:rPr>
       </w:pPr>
       <w:r>
@@ -13122,24 +12919,14 @@
           <w:szCs w:val="23"/>
           <w:u w:val="single"/>
         </w:rPr>
-        <w:t>.</w:t>
-      </w:r>
-      <w:r>
-        <w:rPr>
-          <w:rFonts w:ascii="Garamond" w:eastAsia="Garamond" w:hAnsi="Garamond" w:cs="Garamond"/>
-          <w:b/>
-          <w:bCs/>
-          <w:sz w:val="23"/>
-          <w:szCs w:val="23"/>
-          <w:u w:val="single"/>
-        </w:rPr>
-        <w:t xml:space="preserve"> - </w:t>
-      </w:r>
-      <w:r>
-        <w:rPr>
-          <w:rFonts w:ascii="Garamond" w:eastAsia="Garamond" w:hAnsi="Garamond" w:cs="Garamond"/>
-          <w:b/>
-          <w:bCs/>
+        <w:t xml:space="preserve">. - </w:t>
+      </w:r>
+      <w:r>
+        <w:rPr>
+          <w:rFonts w:ascii="Garamond" w:eastAsia="Garamond" w:hAnsi="Garamond" w:cs="Garamond"/>
+          <w:b/>
+          <w:bCs/>
+          <w:u w:val="single"/>
         </w:rPr>
         <w:t xml:space="preserve"> Incumplimiento.</w:t>
       </w:r>
@@ -13225,38 +13012,26 @@
         </w:rPr>
         <w:br/>
       </w:r>
-    </w:p>
-    <w:p>
-      <w:pPr>
-        <w:jc w:val="both"/>
-        <w:rPr>
-          <w:rFonts w:ascii="Garamond" w:eastAsia="Garamond" w:hAnsi="Garamond" w:cs="Garamond"/>
-          <w:b/>
-          <w:bCs/>
-          <w:u w:val="single"/>
-        </w:rPr>
-      </w:pPr>
-    </w:p>
-    <w:p>
-      <w:pPr>
-        <w:jc w:val="both"/>
-        <w:rPr>
-          <w:rFonts w:ascii="Garamond" w:eastAsia="Garamond" w:hAnsi="Garamond" w:cs="Garamond"/>
-          <w:sz w:val="23"/>
-          <w:szCs w:val="23"/>
+      <w:r>
+        <w:rPr>
+          <w:rFonts w:ascii="Garamond" w:eastAsia="Garamond" w:hAnsi="Garamond" w:cs="Garamond"/>
+          <w:sz w:val="23"/>
+          <w:szCs w:val="23"/>
+          <w:highlight w:val="yellow"/>
           <w:lang w:val="en-US"/>
         </w:rPr>
-      </w:pPr>
-      <w:r>
-        <w:rPr>
-          <w:rFonts w:ascii="Garamond" w:eastAsia="Garamond" w:hAnsi="Garamond" w:cs="Garamond"/>
-          <w:sz w:val="23"/>
-          <w:szCs w:val="23"/>
-          <w:highlight w:val="yellow"/>
-          <w:lang w:val="en-US"/>
-        </w:rPr>
         <w:t>{%p endif %}</w:t>
       </w:r>
+    </w:p>
+    <w:p>
+      <w:pPr>
+        <w:jc w:val="both"/>
+        <w:rPr>
+          <w:rFonts w:ascii="Garamond" w:eastAsia="Garamond" w:hAnsi="Garamond" w:cs="Garamond"/>
+          <w:sz w:val="23"/>
+          <w:szCs w:val="23"/>
+        </w:rPr>
+      </w:pPr>
     </w:p>
     <w:p>
       <w:pPr>
@@ -13731,14 +13506,14 @@
         <w:rPr>
           <w:rFonts w:ascii="Garamond" w:eastAsia="Garamond" w:hAnsi="Garamond" w:cs="Garamond"/>
         </w:rPr>
-        <w:t xml:space="preserve">Será información confidencial cualquier información técnica, comercial, financiera, estratégica, legal y/o de cualquier naturaleza relacionada con las operaciones de negocios presente y futuros de las Partes intervinientes en este Acuerdo de Cooperación, las cuales se revelen y/o entreguen por escrito entre estas, indicando expresamente que dicha información es confidencial o que una Persona al momento de la </w:t>
+        <w:t xml:space="preserve">Será información confidencial cualquier información técnica, comercial, financiera, estratégica, legal y/o de cualquier naturaleza relacionada con las operaciones de negocios presente y futuros de las Partes intervinientes en este Acuerdo de Cooperación, las cuales se revelen y/o entreguen por escrito entre estas, indicando expresamente que dicha información es confidencial o que una Persona al momento de la revelación pueda presumir bajo las circunstancias concretas en que se dio la revelación, que dicha </w:t>
       </w:r>
       <w:r>
         <w:rPr>
           <w:rFonts w:ascii="Garamond" w:eastAsia="Garamond" w:hAnsi="Garamond" w:cs="Garamond"/>
         </w:rPr>
         <w:lastRenderedPageBreak/>
-        <w:t xml:space="preserve">revelación pueda presumir bajo las circunstancias concretas en que se dio la revelación, que dicha información es confidencial. Se aclara que la información relacionada con las ventas del Aliado Comercial a través de la Plataforma Rappi no corresponde a información confidencial. Igualmente, el Aliado Comercial acepta y reconoce que la información de ventas y niveles mínimos de servicio será compartida por parte de Rappi con el Aliado Comercial sin que esto implique un incumplimiento de la presente Cláusula. </w:t>
+        <w:t xml:space="preserve">información es confidencial. Se aclara que la información relacionada con las ventas del Aliado Comercial a través de la Plataforma Rappi no corresponde a información confidencial. Igualmente, el Aliado Comercial acepta y reconoce que la información de ventas y niveles mínimos de servicio será compartida por parte de Rappi con el Aliado Comercial sin que esto implique un incumplimiento de la presente Cláusula. </w:t>
       </w:r>
     </w:p>
     <w:p>
@@ -14369,14 +14144,14 @@
         <w:rPr>
           <w:rFonts w:ascii="Garamond" w:eastAsia="Garamond" w:hAnsi="Garamond" w:cs="Garamond"/>
         </w:rPr>
-        <w:t xml:space="preserve">Las Partes acuerdan </w:t>
+        <w:t xml:space="preserve">Las Partes acuerdan mantenerse indemnes respecto de terceros que pudieran ser afectados por una de las Partes por el </w:t>
       </w:r>
       <w:r>
         <w:rPr>
           <w:rFonts w:ascii="Garamond" w:eastAsia="Garamond" w:hAnsi="Garamond" w:cs="Garamond"/>
         </w:rPr>
         <w:lastRenderedPageBreak/>
-        <w:t>mantenerse indemnes respecto de terceros que pudieran ser afectados por una de las Partes por el incumplimiento de este Acuerdo de Cooperación y la Ley Aplicable. En atención a la obligación de mantenerse indemnes, responderán por los daños y/o perjuicios que sus acciones u omisiones pudieran causar a terceros y por los que la otra Parte pudiere resultar afectada.</w:t>
+        <w:t>incumplimiento de este Acuerdo de Cooperación y la Ley Aplicable. En atención a la obligación de mantenerse indemnes, responderán por los daños y/o perjuicios que sus acciones u omisiones pudieran causar a terceros y por los que la otra Parte pudiere resultar afectada.</w:t>
       </w:r>
     </w:p>
     <w:p>
@@ -15051,8 +14826,14 @@
         <w:rPr>
           <w:rFonts w:ascii="Garamond" w:eastAsia="Garamond" w:hAnsi="Garamond" w:cs="Garamond"/>
         </w:rPr>
+        <w:t xml:space="preserve">Igualmente, en el caso en el que se identifique que el Aliado Comercial está haciendo uso indebido de los </w:t>
+      </w:r>
+      <w:r>
+        <w:rPr>
+          <w:rFonts w:ascii="Garamond" w:eastAsia="Garamond" w:hAnsi="Garamond" w:cs="Garamond"/>
+        </w:rPr>
         <w:lastRenderedPageBreak/>
-        <w:t>Igualmente, en el caso en el que se identifique que el Aliado Comercial está haciendo uso indebido de los Datos Personales de los Usuarios/Consumidores transferidos por parte de Rappi para una finalidad diferente a la finalidad de Tratamiento establecida en la presente Cláusula, el Aliado Comercial será responsable de indemnizar los daños y perjuicios que dicho incumplimiento cause a Rappi o a terceros. La determinación y cuantificación de dichos daños y perjuicios se realizará conforme a la legislación aplicable, y el monto correspondiente deberá ser pagado por parte del Aliado Comercial mediante transferencia bancaria a la cuenta determinada por Rappi para dicho fin, dentro de los 30 (treinta) días calendario posteriores al envío de la notificación de incumplimiento.</w:t>
+        <w:t>Datos Personales de los Usuarios/Consumidores transferidos por parte de Rappi para una finalidad diferente a la finalidad de Tratamiento establecida en la presente Cláusula, el Aliado Comercial será responsable de indemnizar los daños y perjuicios que dicho incumplimiento cause a Rappi o a terceros. La determinación y cuantificación de dichos daños y perjuicios se realizará conforme a la legislación aplicable, y el monto correspondiente deberá ser pagado por parte del Aliado Comercial mediante transferencia bancaria a la cuenta determinada por Rappi para dicho fin, dentro de los 30 (treinta) días calendario posteriores al envío de la notificación de incumplimiento.</w:t>
       </w:r>
     </w:p>
     <w:p>
@@ -15637,14 +15418,14 @@
         <w:rPr>
           <w:rFonts w:ascii="Garamond" w:eastAsia="Garamond" w:hAnsi="Garamond" w:cs="Garamond"/>
         </w:rPr>
-        <w:t xml:space="preserve">. En caso </w:t>
+        <w:t xml:space="preserve">. En caso de inestabilidad o inconvenientes técnicos mayores, Rappi no tendrá responsabilidad alguna </w:t>
       </w:r>
       <w:r>
         <w:rPr>
           <w:rFonts w:ascii="Garamond" w:eastAsia="Garamond" w:hAnsi="Garamond" w:cs="Garamond"/>
         </w:rPr>
         <w:lastRenderedPageBreak/>
-        <w:t>de inestabilidad o inconvenientes técnicos mayores, Rappi no tendrá responsabilidad alguna frente al Aliado Comercial, pero hará sus mejores esfuerzos para estabilizar su operatividad.</w:t>
+        <w:t>frente al Aliado Comercial, pero hará sus mejores esfuerzos para estabilizar su operatividad.</w:t>
       </w:r>
       <w:r>
         <w:rPr>
@@ -16341,14 +16122,14 @@
         <w:rPr>
           <w:rFonts w:ascii="Garamond" w:eastAsia="Garamond" w:hAnsi="Garamond" w:cs="Garamond"/>
         </w:rPr>
-        <w:t xml:space="preserve">En caso de incumplimiento por parte del Aliado Comercial de alguna de las </w:t>
+        <w:t xml:space="preserve">En caso de incumplimiento por parte del Aliado Comercial de alguna de las disposiciones del presente Acuerdo de Cooperación, el Aliado Comercial autoriza expresamente </w:t>
       </w:r>
       <w:r>
         <w:rPr>
           <w:rFonts w:ascii="Garamond" w:eastAsia="Garamond" w:hAnsi="Garamond" w:cs="Garamond"/>
         </w:rPr>
         <w:lastRenderedPageBreak/>
-        <w:t xml:space="preserve">disposiciones del presente Acuerdo de Cooperación, el Aliado Comercial autoriza expresamente a Rappi para ejecutar las penalidades y liquidar cualquier adeudo que se tuviere a la fecha, reteniendo para tal efecto las cantidades correspondientes de las ventas semanales de Productos a través de la Plataforma Rappi. </w:t>
+        <w:t xml:space="preserve">a Rappi para ejecutar las penalidades y liquidar cualquier adeudo que se tuviere a la fecha, reteniendo para tal efecto las cantidades correspondientes de las ventas semanales de Productos a través de la Plataforma Rappi. </w:t>
       </w:r>
     </w:p>
     <w:p>
@@ -16701,51 +16482,57 @@
           <w:b/>
           <w:bCs/>
         </w:rPr>
+        <w:t>(</w:t>
+      </w:r>
+      <w:proofErr w:type="spellStart"/>
+      <w:r>
+        <w:rPr>
+          <w:rFonts w:ascii="Garamond" w:eastAsia="Garamond" w:hAnsi="Garamond" w:cs="Garamond"/>
+          <w:b/>
+          <w:bCs/>
+        </w:rPr>
+        <w:t>xvi</w:t>
+      </w:r>
+      <w:proofErr w:type="spellEnd"/>
+      <w:r>
+        <w:rPr>
+          <w:rFonts w:ascii="Garamond" w:eastAsia="Garamond" w:hAnsi="Garamond" w:cs="Garamond"/>
+          <w:b/>
+          <w:bCs/>
+        </w:rPr>
+        <w:t xml:space="preserve">) </w:t>
+      </w:r>
+      <w:proofErr w:type="spellStart"/>
+      <w:r>
+        <w:rPr>
+          <w:rFonts w:ascii="Garamond" w:eastAsia="Garamond" w:hAnsi="Garamond" w:cs="Garamond"/>
+          <w:b/>
+          <w:bCs/>
+          <w:u w:val="single"/>
+        </w:rPr>
+        <w:t>Sourcing</w:t>
+      </w:r>
+      <w:proofErr w:type="spellEnd"/>
+      <w:r>
+        <w:rPr>
+          <w:rFonts w:ascii="Garamond" w:eastAsia="Garamond" w:hAnsi="Garamond" w:cs="Garamond"/>
+          <w:b/>
+          <w:bCs/>
+        </w:rPr>
+        <w:t xml:space="preserve">. </w:t>
+      </w:r>
+      <w:r>
+        <w:rPr>
+          <w:rFonts w:ascii="Garamond" w:eastAsia="Garamond" w:hAnsi="Garamond" w:cs="Garamond"/>
+        </w:rPr>
+        <w:t xml:space="preserve">El Aliado Comercial se compromete a no tener ni mantener una relación </w:t>
+      </w:r>
+      <w:r>
+        <w:rPr>
+          <w:rFonts w:ascii="Garamond" w:eastAsia="Garamond" w:hAnsi="Garamond" w:cs="Garamond"/>
+        </w:rPr>
         <w:lastRenderedPageBreak/>
-        <w:t>(</w:t>
-      </w:r>
-      <w:proofErr w:type="spellStart"/>
-      <w:r>
-        <w:rPr>
-          <w:rFonts w:ascii="Garamond" w:eastAsia="Garamond" w:hAnsi="Garamond" w:cs="Garamond"/>
-          <w:b/>
-          <w:bCs/>
-        </w:rPr>
-        <w:t>xvi</w:t>
-      </w:r>
-      <w:proofErr w:type="spellEnd"/>
-      <w:r>
-        <w:rPr>
-          <w:rFonts w:ascii="Garamond" w:eastAsia="Garamond" w:hAnsi="Garamond" w:cs="Garamond"/>
-          <w:b/>
-          <w:bCs/>
-        </w:rPr>
-        <w:t xml:space="preserve">) </w:t>
-      </w:r>
-      <w:proofErr w:type="spellStart"/>
-      <w:r>
-        <w:rPr>
-          <w:rFonts w:ascii="Garamond" w:eastAsia="Garamond" w:hAnsi="Garamond" w:cs="Garamond"/>
-          <w:b/>
-          <w:bCs/>
-          <w:u w:val="single"/>
-        </w:rPr>
-        <w:t>Sourcing</w:t>
-      </w:r>
-      <w:proofErr w:type="spellEnd"/>
-      <w:r>
-        <w:rPr>
-          <w:rFonts w:ascii="Garamond" w:eastAsia="Garamond" w:hAnsi="Garamond" w:cs="Garamond"/>
-          <w:b/>
-          <w:bCs/>
-        </w:rPr>
-        <w:t xml:space="preserve">. </w:t>
-      </w:r>
-      <w:r>
-        <w:rPr>
-          <w:rFonts w:ascii="Garamond" w:eastAsia="Garamond" w:hAnsi="Garamond" w:cs="Garamond"/>
-        </w:rPr>
-        <w:t xml:space="preserve">El Aliado Comercial se compromete a no tener ni mantener una relación comercial con un proveedor que incumpla con la Ley Aplicable con relación a: </w:t>
+        <w:t xml:space="preserve">comercial con un proveedor que incumpla con la Ley Aplicable con relación a: </w:t>
       </w:r>
       <w:r>
         <w:rPr>

</xml_diff>

<commit_message>
Actualización formatos. se quita negrilla, compromisos adiccionales.
</commit_message>
<xml_diff>
--- a/formatos/New_draft/acuerdo_con_ads_juridica.docx
+++ b/formatos/New_draft/acuerdo_con_ads_juridica.docx
@@ -825,17 +825,7 @@
           <w:szCs w:val="23"/>
           <w:highlight w:val="yellow"/>
         </w:rPr>
-        <w:t xml:space="preserve">{{ UBICACIÓN_NOTARIA }}</w:t>
-      </w:r>
-      <w:proofErr w:type="spellStart"/>
-      <w:r>
-        <w:rPr>
-          <w:rFonts w:ascii="Garamond" w:eastAsia="Garamond" w:hAnsi="Garamond" w:cs="Garamond"/>
-          <w:sz w:val="23"/>
-          <w:szCs w:val="23"/>
-          <w:highlight w:val="yellow"/>
-        </w:rPr>
-        <w:t/>
+        <w:t>{{ UBICACIÓN</w:t>
       </w:r>
       <w:proofErr w:type="gramEnd"/>
       <w:r>
@@ -845,7 +835,7 @@
           <w:szCs w:val="23"/>
           <w:highlight w:val="yellow"/>
         </w:rPr>
-        <w:t/>
+        <w:t>_</w:t>
       </w:r>
       <w:proofErr w:type="gramStart"/>
       <w:r>
@@ -855,17 +845,7 @@
           <w:szCs w:val="23"/>
           <w:highlight w:val="yellow"/>
         </w:rPr>
-        <w:t/>
-      </w:r>
-      <w:proofErr w:type="spellEnd"/>
-      <w:r>
-        <w:rPr>
-          <w:rFonts w:ascii="Garamond" w:eastAsia="Garamond" w:hAnsi="Garamond" w:cs="Garamond"/>
-          <w:sz w:val="23"/>
-          <w:szCs w:val="23"/>
-          <w:highlight w:val="yellow"/>
-        </w:rPr>
-        <w:t xml:space="preserve"/>
+        <w:t>NOTARIA }</w:t>
       </w:r>
       <w:proofErr w:type="gramEnd"/>
       <w:r>
@@ -875,15 +855,15 @@
           <w:szCs w:val="23"/>
           <w:highlight w:val="yellow"/>
         </w:rPr>
-        <w:t/>
-      </w:r>
-      <w:r>
-        <w:rPr>
-          <w:rFonts w:ascii="Garamond" w:eastAsia="Garamond" w:hAnsi="Garamond" w:cs="Garamond"/>
-          <w:sz w:val="23"/>
-          <w:szCs w:val="23"/>
-        </w:rPr>
-        <w:t xml:space="preserve"> e </w:t>
+        <w:t>}</w:t>
+      </w:r>
+      <w:r>
+        <w:rPr>
+          <w:rFonts w:ascii="Garamond" w:eastAsia="Garamond" w:hAnsi="Garamond" w:cs="Garamond"/>
+          <w:sz w:val="23"/>
+          <w:szCs w:val="23"/>
+        </w:rPr>
+        <w:t xml:space="preserve"> e inscrita </w:t>
       </w:r>
       <w:r>
         <w:rPr>
@@ -892,7 +872,7 @@
           <w:szCs w:val="23"/>
         </w:rPr>
         <w:lastRenderedPageBreak/>
-        <w:t xml:space="preserve">inscrita en el Registro Público de Propiedad y Comercio bajo el Folio Mercantil Número </w:t>
+        <w:t xml:space="preserve">en el Registro Público de Propiedad y Comercio bajo el Folio Mercantil Número </w:t>
       </w:r>
       <w:proofErr w:type="gramStart"/>
       <w:r>
@@ -3962,7 +3942,21 @@
           <w:rFonts w:ascii="Garamond" w:eastAsia="Garamond" w:hAnsi="Garamond" w:cs="Garamond"/>
           <w:b/>
         </w:rPr>
-        <w:t xml:space="preserve"> Eliminar todo el software que pertenezca a Rappi una vez cese el uso de la Plataforma Rappi por parte del Aliado Comercial; y {{ ROM_ADS }} {% if tipo_ads == 'aliado' %}Realizar una inversión mensual en </w:t>
+        <w:t xml:space="preserve"> </w:t>
+      </w:r>
+      <w:r>
+        <w:rPr>
+          <w:rFonts w:ascii="Garamond" w:eastAsia="Garamond" w:hAnsi="Garamond" w:cs="Garamond"/>
+          <w:bCs/>
+        </w:rPr>
+        <w:t>Eliminar todo el software que pertenezca a Rappi una vez cese el uso de la Plataforma Rappi por parte del Aliado Comercial; y {{ ROM_ADS }} {% if tipo_ads == 'aliado' %}Realizar una inversión mensual en</w:t>
+      </w:r>
+      <w:r>
+        <w:rPr>
+          <w:rFonts w:ascii="Garamond" w:eastAsia="Garamond" w:hAnsi="Garamond" w:cs="Garamond"/>
+          <w:b/>
+        </w:rPr>
+        <w:t xml:space="preserve"> </w:t>
       </w:r>
       <w:proofErr w:type="spellStart"/>
       <w:r>
@@ -4342,9 +4336,9 @@
       <w:r>
         <w:rPr>
           <w:rFonts w:ascii="Garamond" w:eastAsia="Garamond" w:hAnsi="Garamond" w:cs="Garamond"/>
-          <w:sz w:val="23"/>
-          <w:szCs w:val="23"/>
-          <w:b/>
+          <w:b/>
+          <w:sz w:val="23"/>
+          <w:szCs w:val="23"/>
         </w:rPr>
         <w:t>{{ ROM</w:t>
       </w:r>
@@ -4352,9 +4346,9 @@
       <w:r>
         <w:rPr>
           <w:rFonts w:ascii="Garamond" w:eastAsia="Garamond" w:hAnsi="Garamond" w:cs="Garamond"/>
-          <w:sz w:val="23"/>
-          <w:szCs w:val="23"/>
-          <w:b/>
+          <w:b/>
+          <w:sz w:val="23"/>
+          <w:szCs w:val="23"/>
         </w:rPr>
         <w:t>_DESCUENTO_</w:t>
       </w:r>
@@ -4362,9 +4356,9 @@
       <w:r>
         <w:rPr>
           <w:rFonts w:ascii="Garamond" w:eastAsia="Garamond" w:hAnsi="Garamond" w:cs="Garamond"/>
-          <w:sz w:val="23"/>
-          <w:szCs w:val="23"/>
-          <w:b/>
+          <w:b/>
+          <w:sz w:val="23"/>
+          <w:szCs w:val="23"/>
         </w:rPr>
         <w:t>MENU }</w:t>
       </w:r>
@@ -4372,11 +4366,29 @@
       <w:r>
         <w:rPr>
           <w:rFonts w:ascii="Garamond" w:eastAsia="Garamond" w:hAnsi="Garamond" w:cs="Garamond"/>
-          <w:sz w:val="23"/>
-          <w:szCs w:val="23"/>
-          <w:b/>
-        </w:rPr>
-        <w:t xml:space="preserve">} Realizar un descuento de por lo menos el </w:t>
+          <w:b/>
+          <w:sz w:val="23"/>
+          <w:szCs w:val="23"/>
+        </w:rPr>
+        <w:t xml:space="preserve">} </w:t>
+      </w:r>
+      <w:r>
+        <w:rPr>
+          <w:rFonts w:ascii="Garamond" w:eastAsia="Garamond" w:hAnsi="Garamond" w:cs="Garamond"/>
+          <w:bCs/>
+          <w:sz w:val="23"/>
+          <w:szCs w:val="23"/>
+        </w:rPr>
+        <w:t>Realizar un descuento de por lo menos el</w:t>
+      </w:r>
+      <w:r>
+        <w:rPr>
+          <w:rFonts w:ascii="Garamond" w:eastAsia="Garamond" w:hAnsi="Garamond" w:cs="Garamond"/>
+          <w:b/>
+          <w:sz w:val="23"/>
+          <w:szCs w:val="23"/>
+        </w:rPr>
+        <w:t xml:space="preserve"> </w:t>
       </w:r>
       <w:proofErr w:type="gramStart"/>
       <w:r>
@@ -4713,9 +4725,9 @@
       <w:r>
         <w:rPr>
           <w:rFonts w:ascii="Garamond" w:eastAsia="Garamond" w:hAnsi="Garamond" w:cs="Garamond"/>
-          <w:sz w:val="23"/>
-          <w:szCs w:val="23"/>
-          <w:b/>
+          <w:b/>
+          <w:sz w:val="23"/>
+          <w:szCs w:val="23"/>
         </w:rPr>
         <w:t>{{ ROM</w:t>
       </w:r>
@@ -4723,9 +4735,9 @@
       <w:r>
         <w:rPr>
           <w:rFonts w:ascii="Garamond" w:eastAsia="Garamond" w:hAnsi="Garamond" w:cs="Garamond"/>
-          <w:sz w:val="23"/>
-          <w:szCs w:val="23"/>
-          <w:b/>
+          <w:b/>
+          <w:sz w:val="23"/>
+          <w:szCs w:val="23"/>
         </w:rPr>
         <w:t>_MARK_</w:t>
       </w:r>
@@ -4733,9 +4745,9 @@
       <w:r>
         <w:rPr>
           <w:rFonts w:ascii="Garamond" w:eastAsia="Garamond" w:hAnsi="Garamond" w:cs="Garamond"/>
-          <w:sz w:val="23"/>
-          <w:szCs w:val="23"/>
-          <w:b/>
+          <w:b/>
+          <w:sz w:val="23"/>
+          <w:szCs w:val="23"/>
         </w:rPr>
         <w:t>DOWN }</w:t>
       </w:r>
@@ -4743,11 +4755,29 @@
       <w:r>
         <w:rPr>
           <w:rFonts w:ascii="Garamond" w:eastAsia="Garamond" w:hAnsi="Garamond" w:cs="Garamond"/>
-          <w:sz w:val="23"/>
-          <w:szCs w:val="23"/>
-          <w:b/>
-        </w:rPr>
-        <w:t xml:space="preserve">} Realizar una inversión mensual en promociones del </w:t>
+          <w:b/>
+          <w:sz w:val="23"/>
+          <w:szCs w:val="23"/>
+        </w:rPr>
+        <w:t xml:space="preserve">} </w:t>
+      </w:r>
+      <w:r>
+        <w:rPr>
+          <w:rFonts w:ascii="Garamond" w:eastAsia="Garamond" w:hAnsi="Garamond" w:cs="Garamond"/>
+          <w:bCs/>
+          <w:sz w:val="23"/>
+          <w:szCs w:val="23"/>
+        </w:rPr>
+        <w:t>Realizar una inversión mensual en promociones del</w:t>
+      </w:r>
+      <w:r>
+        <w:rPr>
+          <w:rFonts w:ascii="Garamond" w:eastAsia="Garamond" w:hAnsi="Garamond" w:cs="Garamond"/>
+          <w:b/>
+          <w:sz w:val="23"/>
+          <w:szCs w:val="23"/>
+        </w:rPr>
+        <w:t xml:space="preserve"> </w:t>
       </w:r>
       <w:proofErr w:type="gramStart"/>
       <w:r>
@@ -4986,9 +5016,9 @@
       <w:r>
         <w:rPr>
           <w:rFonts w:ascii="Garamond" w:eastAsia="Garamond" w:hAnsi="Garamond" w:cs="Garamond"/>
-          <w:sz w:val="23"/>
-          <w:szCs w:val="23"/>
-          <w:b/>
+          <w:b/>
+          <w:sz w:val="23"/>
+          <w:szCs w:val="23"/>
         </w:rPr>
         <w:t>{{ ROM</w:t>
       </w:r>
@@ -4996,9 +5026,9 @@
       <w:r>
         <w:rPr>
           <w:rFonts w:ascii="Garamond" w:eastAsia="Garamond" w:hAnsi="Garamond" w:cs="Garamond"/>
-          <w:sz w:val="23"/>
-          <w:szCs w:val="23"/>
-          <w:b/>
+          <w:b/>
+          <w:sz w:val="23"/>
+          <w:szCs w:val="23"/>
         </w:rPr>
         <w:t>_</w:t>
       </w:r>
@@ -5006,9 +5036,9 @@
       <w:r>
         <w:rPr>
           <w:rFonts w:ascii="Garamond" w:eastAsia="Garamond" w:hAnsi="Garamond" w:cs="Garamond"/>
-          <w:sz w:val="23"/>
-          <w:szCs w:val="23"/>
-          <w:b/>
+          <w:b/>
+          <w:sz w:val="23"/>
+          <w:szCs w:val="23"/>
         </w:rPr>
         <w:t>REDES }</w:t>
       </w:r>
@@ -5016,11 +5046,29 @@
       <w:r>
         <w:rPr>
           <w:rFonts w:ascii="Garamond" w:eastAsia="Garamond" w:hAnsi="Garamond" w:cs="Garamond"/>
-          <w:sz w:val="23"/>
-          <w:szCs w:val="23"/>
-          <w:b/>
-        </w:rPr>
-        <w:t xml:space="preserve">} Realizar, al menos </w:t>
+          <w:b/>
+          <w:sz w:val="23"/>
+          <w:szCs w:val="23"/>
+        </w:rPr>
+        <w:t xml:space="preserve">} </w:t>
+      </w:r>
+      <w:r>
+        <w:rPr>
+          <w:rFonts w:ascii="Garamond" w:eastAsia="Garamond" w:hAnsi="Garamond" w:cs="Garamond"/>
+          <w:bCs/>
+          <w:sz w:val="23"/>
+          <w:szCs w:val="23"/>
+        </w:rPr>
+        <w:t>Realizar, al menos</w:t>
+      </w:r>
+      <w:r>
+        <w:rPr>
+          <w:rFonts w:ascii="Garamond" w:eastAsia="Garamond" w:hAnsi="Garamond" w:cs="Garamond"/>
+          <w:b/>
+          <w:sz w:val="23"/>
+          <w:szCs w:val="23"/>
+        </w:rPr>
+        <w:t xml:space="preserve"> </w:t>
       </w:r>
       <w:proofErr w:type="gramStart"/>
       <w:r>
@@ -5285,73 +5333,78 @@
           <w:rFonts w:ascii="Garamond" w:eastAsia="Garamond" w:hAnsi="Garamond" w:cs="Garamond"/>
           <w:b/>
         </w:rPr>
-        <w:t xml:space="preserve">} Ofrecer {{ N_CANTIDAD_PLATILLOS }} ({{ VALOR_CANTIDAD_PLATILLOS }}) platillos</w:t>
+        <w:t xml:space="preserve">} </w:t>
+      </w:r>
+      <w:r>
+        <w:rPr>
+          <w:rFonts w:ascii="Garamond" w:eastAsia="Garamond" w:hAnsi="Garamond" w:cs="Garamond"/>
+          <w:bCs/>
+        </w:rPr>
+        <w:t xml:space="preserve">Ofrecer </w:t>
       </w:r>
       <w:proofErr w:type="gramStart"/>
       <w:r>
         <w:rPr>
           <w:rFonts w:ascii="Garamond" w:eastAsia="Garamond" w:hAnsi="Garamond" w:cs="Garamond"/>
-          <w:sz w:val="23"/>
-          <w:szCs w:val="23"/>
-          <w:highlight w:val="yellow"/>
-        </w:rPr>
-        <w:t xml:space="preserve"/>
-      </w:r>
-      <w:r>
-        <w:rPr>
-          <w:rFonts w:ascii="Garamond" w:eastAsia="Garamond" w:hAnsi="Garamond" w:cs="Garamond"/>
-          <w:sz w:val="23"/>
-          <w:szCs w:val="23"/>
-          <w:highlight w:val="yellow"/>
-        </w:rPr>
-        <w:t/>
+          <w:bCs/>
+        </w:rPr>
+        <w:t>{{ N</w:t>
       </w:r>
       <w:proofErr w:type="gramEnd"/>
       <w:r>
         <w:rPr>
           <w:rFonts w:ascii="Garamond" w:eastAsia="Garamond" w:hAnsi="Garamond" w:cs="Garamond"/>
-          <w:sz w:val="23"/>
-          <w:szCs w:val="23"/>
-          <w:highlight w:val="yellow"/>
-        </w:rPr>
-        <w:t/>
-      </w:r>
-      <w:r>
-        <w:rPr>
-          <w:rFonts w:ascii="Garamond" w:eastAsia="Garamond" w:hAnsi="Garamond" w:cs="Garamond"/>
-          <w:sz w:val="23"/>
-          <w:szCs w:val="23"/>
-          <w:highlight w:val="yellow"/>
-        </w:rPr>
-        <w:t/>
+          <w:bCs/>
+        </w:rPr>
+        <w:t>_CANTIDAD_</w:t>
       </w:r>
       <w:proofErr w:type="gramStart"/>
       <w:r>
         <w:rPr>
           <w:rFonts w:ascii="Garamond" w:eastAsia="Garamond" w:hAnsi="Garamond" w:cs="Garamond"/>
-          <w:sz w:val="23"/>
-          <w:szCs w:val="23"/>
-          <w:highlight w:val="yellow"/>
-        </w:rPr>
-        <w:t/>
+          <w:bCs/>
+        </w:rPr>
+        <w:t>PLATILLOS }</w:t>
       </w:r>
       <w:proofErr w:type="gramEnd"/>
       <w:r>
         <w:rPr>
           <w:rFonts w:ascii="Garamond" w:eastAsia="Garamond" w:hAnsi="Garamond" w:cs="Garamond"/>
-          <w:sz w:val="23"/>
-          <w:szCs w:val="23"/>
-          <w:highlight w:val="yellow"/>
-        </w:rPr>
-        <w:t/>
-      </w:r>
-      <w:r>
-        <w:rPr>
-          <w:rFonts w:ascii="Garamond" w:eastAsia="Garamond" w:hAnsi="Garamond" w:cs="Garamond"/>
-          <w:sz w:val="23"/>
-          <w:szCs w:val="23"/>
-        </w:rPr>
-        <w:t xml:space="preserve"/>
+          <w:bCs/>
+        </w:rPr>
+        <w:t>} (</w:t>
+      </w:r>
+      <w:proofErr w:type="gramStart"/>
+      <w:r>
+        <w:rPr>
+          <w:rFonts w:ascii="Garamond" w:eastAsia="Garamond" w:hAnsi="Garamond" w:cs="Garamond"/>
+          <w:bCs/>
+        </w:rPr>
+        <w:t>{{ VALOR</w:t>
+      </w:r>
+      <w:proofErr w:type="gramEnd"/>
+      <w:r>
+        <w:rPr>
+          <w:rFonts w:ascii="Garamond" w:eastAsia="Garamond" w:hAnsi="Garamond" w:cs="Garamond"/>
+          <w:bCs/>
+        </w:rPr>
+        <w:t>_CANTIDAD_</w:t>
+      </w:r>
+      <w:proofErr w:type="gramStart"/>
+      <w:r>
+        <w:rPr>
+          <w:rFonts w:ascii="Garamond" w:eastAsia="Garamond" w:hAnsi="Garamond" w:cs="Garamond"/>
+          <w:bCs/>
+        </w:rPr>
+        <w:t>PLATILLOS }</w:t>
+      </w:r>
+      <w:proofErr w:type="gramEnd"/>
+      <w:r>
+        <w:rPr>
+          <w:rFonts w:ascii="Garamond" w:eastAsia="Garamond" w:hAnsi="Garamond" w:cs="Garamond"/>
+          <w:bCs/>
+        </w:rPr>
+        <w:t>}) platillos</w:t>
       </w:r>
       <w:r>
         <w:rPr>
@@ -5484,7 +5537,14 @@
         <w:rPr>
           <w:rFonts w:ascii="Garamond" w:eastAsia="Garamond" w:hAnsi="Garamond" w:cs="Garamond"/>
         </w:rPr>
-        <w:t xml:space="preserve"> por ciento) de descuento exclusivo al interior de la Plataforma Rappi, durante los primeros </w:t>
+        <w:t xml:space="preserve"> por </w:t>
+      </w:r>
+      <w:r>
+        <w:rPr>
+          <w:rFonts w:ascii="Garamond" w:eastAsia="Garamond" w:hAnsi="Garamond" w:cs="Garamond"/>
+        </w:rPr>
+        <w:lastRenderedPageBreak/>
+        <w:t xml:space="preserve">ciento) de descuento exclusivo al interior de la Plataforma Rappi, durante los primeros </w:t>
       </w:r>
       <w:proofErr w:type="gramStart"/>
       <w:r>
@@ -5503,7 +5563,6 @@
           <w:szCs w:val="23"/>
           <w:highlight w:val="yellow"/>
         </w:rPr>
-        <w:lastRenderedPageBreak/>
         <w:t>N</w:t>
       </w:r>
       <w:proofErr w:type="gramEnd"/>
@@ -6397,16 +6456,8 @@
           <w:sz w:val="23"/>
           <w:szCs w:val="23"/>
         </w:rPr>
-        <w:t xml:space="preserve">Dicho porcentaje variará dependiendo del mes de ejecución del presente Acuerdo de Cooperación, </w:t>
-      </w:r>
-      <w:r>
-        <w:rPr>
-          <w:rFonts w:ascii="Garamond" w:eastAsia="Garamond" w:hAnsi="Garamond" w:cs="Garamond"/>
-          <w:sz w:val="23"/>
-          <w:szCs w:val="23"/>
-        </w:rPr>
         <w:lastRenderedPageBreak/>
-        <w:t>de la siguiente manera:</w:t>
+        <w:t>Dicho porcentaje variará dependiendo del mes de ejecución del presente Acuerdo de Cooperación, de la siguiente manera:</w:t>
       </w:r>
     </w:p>
     <w:p>
@@ -7415,6 +7466,7 @@
           <w:bCs/>
           <w:u w:val="single"/>
         </w:rPr>
+        <w:lastRenderedPageBreak/>
         <w:t>CLÁUSULA NOVENA. - Conciliaciones</w:t>
       </w:r>
       <w:r>
@@ -7429,14 +7481,7 @@
         <w:rPr>
           <w:rFonts w:ascii="Garamond" w:eastAsia="Garamond" w:hAnsi="Garamond" w:cs="Garamond"/>
         </w:rPr>
-        <w:t xml:space="preserve">Las Partes acuerdan que, en ningún caso, las Partes podrán </w:t>
-      </w:r>
-      <w:r>
-        <w:rPr>
-          <w:rFonts w:ascii="Garamond" w:eastAsia="Garamond" w:hAnsi="Garamond" w:cs="Garamond"/>
-        </w:rPr>
-        <w:lastRenderedPageBreak/>
-        <w:t>conciliar órdenes o pagos que tengan una vigencia superior a 2 (dos) meses desde su creación al interior de la Plataforma Rappi, entendiéndose que cualquier error o diferencia de una orden o pago específico deberá ser conciliado entre las Partes con anterioridad.</w:t>
+        <w:t>Las Partes acuerdan que, en ningún caso, las Partes podrán conciliar órdenes o pagos que tengan una vigencia superior a 2 (dos) meses desde su creación al interior de la Plataforma Rappi, entendiéndose que cualquier error o diferencia de una orden o pago específico deberá ser conciliado entre las Partes con anterioridad.</w:t>
       </w:r>
     </w:p>
     <w:p>
@@ -7856,7 +7901,14 @@
         <w:rPr>
           <w:rFonts w:ascii="Garamond" w:eastAsia="Garamond" w:hAnsi="Garamond" w:cs="Garamond"/>
         </w:rPr>
-        <w:t>(s) haya sido pagado en su totalidad, el Aliado Comercial deberá pagar el valor faltante dentro de los 15 (quince) días hábiles siguientes a la fecha de terminación efectiva.</w:t>
+        <w:t xml:space="preserve">(s) haya sido pagado en su totalidad, el Aliado Comercial deberá pagar el valor faltante dentro </w:t>
+      </w:r>
+      <w:r>
+        <w:rPr>
+          <w:rFonts w:ascii="Garamond" w:eastAsia="Garamond" w:hAnsi="Garamond" w:cs="Garamond"/>
+        </w:rPr>
+        <w:lastRenderedPageBreak/>
+        <w:t>de los 15 (quince) días hábiles siguientes a la fecha de terminación efectiva.</w:t>
       </w:r>
     </w:p>
     <w:p>
@@ -8452,14 +8504,14 @@
         <w:rPr>
           <w:rFonts w:ascii="Garamond" w:eastAsia="Garamond" w:hAnsi="Garamond" w:cs="Garamond"/>
         </w:rPr>
-        <w:t xml:space="preserve">mantenga una inactividad parcial o recurrente, entendiéndose por tal el apagado o suspensión de sus Establecimientos de Comercio y/o una reducción de sus horarios de operación registrados por más de 5 (cinco) días naturales en un mismo mes calendario (ya sean consecutivos o </w:t>
+        <w:t xml:space="preserve">mantenga una inactividad parcial o recurrente, entendiéndose por tal el apagado o suspensión de sus Establecimientos de Comercio y/o una reducción de sus horarios de operación registrados </w:t>
       </w:r>
       <w:r>
         <w:rPr>
           <w:rFonts w:ascii="Garamond" w:eastAsia="Garamond" w:hAnsi="Garamond" w:cs="Garamond"/>
         </w:rPr>
         <w:lastRenderedPageBreak/>
-        <w:t xml:space="preserve">discontinuos) o en más de un 30% (treinta por ciento) de su horario habitual sin justificación previa y por escrito aceptada por Rappi. </w:t>
+        <w:t xml:space="preserve">por más de 5 (cinco) días naturales en un mismo mes calendario (ya sean consecutivos o discontinuos) o en más de un 30% (treinta por ciento) de su horario habitual sin justificación previa y por escrito aceptada por Rappi. </w:t>
       </w:r>
     </w:p>
     <w:p>
@@ -8928,14 +8980,14 @@
         <w:rPr>
           <w:rFonts w:ascii="Garamond" w:eastAsia="Garamond" w:hAnsi="Garamond" w:cs="Garamond"/>
         </w:rPr>
-        <w:t xml:space="preserve">En virtud de las condiciones comerciales preferenciales otorgadas al Aliado y al interés recíproco de impulsar el crecimiento y posicionamiento estratégico del Aliado y su(s) Marca(s) dentro de la Plataforma Rappi, las Partes acuerdan que las obligaciones descritas en la presente Cláusula constituyen un motivo </w:t>
+        <w:t xml:space="preserve">En virtud de las condiciones comerciales preferenciales otorgadas al Aliado y al interés recíproco de impulsar el crecimiento y posicionamiento estratégico del Aliado y su(s) Marca(s) dentro de la Plataforma Rappi, las </w:t>
       </w:r>
       <w:r>
         <w:rPr>
           <w:rFonts w:ascii="Garamond" w:eastAsia="Garamond" w:hAnsi="Garamond" w:cs="Garamond"/>
         </w:rPr>
         <w:lastRenderedPageBreak/>
-        <w:t xml:space="preserve">determinante de la voluntad para celebrar el presente Acuerdo. En virtud de lo anterior, el Aliado se obliga a únicamente operar, comercializar, y/o distribuir productos dentro de la Plataforma Rappi y dentro de otra plataforma igual o similar a la Plataforma Rappi (en adelante “Plataforma Adicional Permitida”); por lo que no podrá contratar, celebrar y/o ejecutar, de manera directa o indirecta, ningún tipo de acuerdo con un objeto igual o similar al objeto del presente Acuerdo con una tercera empresa y/o plataforma virtual que preste servicios iguales o similares a Rappi (en adelante, “Empresa Adicional”). </w:t>
+        <w:t xml:space="preserve">Partes acuerdan que las obligaciones descritas en la presente Cláusula constituyen un motivo determinante de la voluntad para celebrar el presente Acuerdo. En virtud de lo anterior, el Aliado se obliga a únicamente operar, comercializar, y/o distribuir productos dentro de la Plataforma Rappi y dentro de otra plataforma igual o similar a la Plataforma Rappi (en adelante “Plataforma Adicional Permitida”); por lo que no podrá contratar, celebrar y/o ejecutar, de manera directa o indirecta, ningún tipo de acuerdo con un objeto igual o similar al objeto del presente Acuerdo con una tercera empresa y/o plataforma virtual que preste servicios iguales o similares a Rappi (en adelante, “Empresa Adicional”). </w:t>
       </w:r>
       <w:r>
         <w:rPr>
@@ -9482,6 +9534,7 @@
           <w:u w:val="single"/>
           <w:lang w:val="pt-PT"/>
         </w:rPr>
+        <w:lastRenderedPageBreak/>
         <w:t>{%p if activa_bono_mercadotecnia %}</w:t>
       </w:r>
     </w:p>
@@ -10071,7 +10124,14 @@
         <w:rPr>
           <w:rFonts w:ascii="Garamond" w:eastAsia="Garamond" w:hAnsi="Garamond" w:cs="Garamond"/>
         </w:rPr>
-        <w:t>") por hasta $</w:t>
+        <w:t xml:space="preserve">") por </w:t>
+      </w:r>
+      <w:r>
+        <w:rPr>
+          <w:rFonts w:ascii="Garamond" w:eastAsia="Garamond" w:hAnsi="Garamond" w:cs="Garamond"/>
+        </w:rPr>
+        <w:lastRenderedPageBreak/>
+        <w:t>hasta $</w:t>
       </w:r>
       <w:proofErr w:type="gramStart"/>
       <w:r>
@@ -10146,7 +10206,6 @@
           <w:szCs w:val="23"/>
           <w:highlight w:val="yellow"/>
         </w:rPr>
-        <w:lastRenderedPageBreak/>
         <w:t>VALOR</w:t>
       </w:r>
       <w:proofErr w:type="gramEnd"/>
@@ -10923,14 +10982,14 @@
         <w:rPr>
           <w:rFonts w:ascii="Garamond" w:eastAsia="Garamond" w:hAnsi="Garamond" w:cs="Garamond"/>
         </w:rPr>
-        <w:t xml:space="preserve">. Este Bono para Nuevas Aperturas, que constituye un motivo determinante de la voluntad de las Partes, deberá destinarse exclusivamente a la construcción, apertura y activación en </w:t>
+        <w:t xml:space="preserve">. Este Bono para Nuevas Aperturas, que constituye un motivo determinante </w:t>
       </w:r>
       <w:r>
         <w:rPr>
           <w:rFonts w:ascii="Garamond" w:eastAsia="Garamond" w:hAnsi="Garamond" w:cs="Garamond"/>
         </w:rPr>
         <w:lastRenderedPageBreak/>
-        <w:t xml:space="preserve">la Plataforma Rappi de hasta </w:t>
+        <w:t xml:space="preserve">de la voluntad de las Partes, deberá destinarse exclusivamente a la construcción, apertura y activación en la Plataforma Rappi de hasta </w:t>
       </w:r>
       <w:proofErr w:type="gramStart"/>
       <w:r>
@@ -11292,13 +11351,8 @@
         <w:rPr>
           <w:rFonts w:ascii="Garamond" w:eastAsia="Garamond" w:hAnsi="Garamond" w:cs="Garamond"/>
         </w:rPr>
+        <w:lastRenderedPageBreak/>
         <w:br/>
-      </w:r>
-      <w:r>
-        <w:rPr>
-          <w:rFonts w:ascii="Garamond" w:eastAsia="Garamond" w:hAnsi="Garamond" w:cs="Garamond"/>
-        </w:rPr>
-        <w:lastRenderedPageBreak/>
         <w:t xml:space="preserve">El Aliado Comercial acepta y reconoce que es el único responsable del correcto manejo contable y tributario de estos recursos, y del cumplimiento de sus obligaciones fiscales derivadas del Bono para Nuevas Aperturas, obligándose a indemnizar y sacar en paz y a salvo a Rappi de cualquier contingencia, sanción, multa o responsabilidad de carácter fiscal que en su caso las autoridades pudieren imponer en relación con en relación con el Bono para Nuevas Aperturas. </w:t>
       </w:r>
     </w:p>
@@ -12305,14 +12359,13 @@
           <w:rFonts w:ascii="Garamond" w:eastAsia="Garamond" w:hAnsi="Garamond" w:cs="Garamond"/>
         </w:rPr>
         <w:br/>
-        <w:t xml:space="preserve">En cualquier caso, el Aliado le pagará a Rappi los montos correspondientes en cuotas fijas semanales, </w:t>
       </w:r>
       <w:r>
         <w:rPr>
           <w:rFonts w:ascii="Garamond" w:eastAsia="Garamond" w:hAnsi="Garamond" w:cs="Garamond"/>
         </w:rPr>
         <w:lastRenderedPageBreak/>
-        <w:t xml:space="preserve">que serán descontadas de las ventas del Aliado generadas semanalmente a través de la Plataforma Rappi. Se aclara que el Aliado deberá iniciar el pago de cualquier préstamo a más tardar dentro de los 30 (treinta) días naturales siguientes al desembolso del dinero de Rappi, entendiéndose que la totalidad del valor prestado por Rappi deberá ser pagado por el Aliado dentro de un plazo máximo de 12 (doce) meses, contados a partir del desembolso del dinero por parte de Rappi. El valor pagadero por parte del Aliado a Rappi, mencionado anteriormente, es de carácter adicional a aquel pagado por concepto de Uso y Alquiler de la Plataforma Rappi y será pagadero hasta que se cubra completamente el valor del monto desembolsado. El Aliado reconoce y acepta el descuento semanal de estos valores bajo las condiciones aquí estipuladas. </w:t>
+        <w:t xml:space="preserve">En cualquier caso, el Aliado le pagará a Rappi los montos correspondientes en cuotas fijas semanales, que serán descontadas de las ventas del Aliado generadas semanalmente a través de la Plataforma Rappi. Se aclara que el Aliado deberá iniciar el pago de cualquier préstamo a más tardar dentro de los 30 (treinta) días naturales siguientes al desembolso del dinero de Rappi, entendiéndose que la totalidad del valor prestado por Rappi deberá ser pagado por el Aliado dentro de un plazo máximo de 12 (doce) meses, contados a partir del desembolso del dinero por parte de Rappi. El valor pagadero por parte del Aliado a Rappi, mencionado anteriormente, es de carácter adicional a aquel pagado por concepto de Uso y Alquiler de la Plataforma Rappi y será pagadero hasta que se cubra completamente el valor del monto desembolsado. El Aliado reconoce y acepta el descuento semanal de estos valores bajo las condiciones aquí estipuladas. </w:t>
       </w:r>
       <w:r>
         <w:rPr>
@@ -12997,14 +13050,14 @@
         <w:rPr>
           <w:rFonts w:ascii="Garamond" w:eastAsia="Garamond" w:hAnsi="Garamond" w:cs="Garamond"/>
         </w:rPr>
-        <w:t xml:space="preserve"> del Acuerdo frente a Rappi, deberá pagar una penalidad del 10% (diez por ciento) del valor total de las ventas realizadas a través de la Plataforma Rappi hasta el </w:t>
+        <w:t xml:space="preserve"> del Acuerdo frente a Rappi, deberá pagar una penalidad </w:t>
       </w:r>
       <w:r>
         <w:rPr>
           <w:rFonts w:ascii="Garamond" w:eastAsia="Garamond" w:hAnsi="Garamond" w:cs="Garamond"/>
         </w:rPr>
         <w:lastRenderedPageBreak/>
-        <w:t>momento en el que se configure el incumplimiento. El Aliado acepta que el monto señalado anteriormente sea descontado de las ventas semanales generadas a través de la Plataforma Rappi hasta que se cubra la totalidad de la penalidad, y/o mediante depósito bancario a la cuenta que Rappi indique para tal caso dentro de los 30 (treinta) días naturales siguientes a la fecha en la que se actualice el incumplimiento.</w:t>
+        <w:t>del 10% (diez por ciento) del valor total de las ventas realizadas a través de la Plataforma Rappi hasta el momento en el que se configure el incumplimiento. El Aliado acepta que el monto señalado anteriormente sea descontado de las ventas semanales generadas a través de la Plataforma Rappi hasta que se cubra la totalidad de la penalidad, y/o mediante depósito bancario a la cuenta que Rappi indique para tal caso dentro de los 30 (treinta) días naturales siguientes a la fecha en la que se actualice el incumplimiento.</w:t>
       </w:r>
       <w:r>
         <w:rPr>
@@ -13506,14 +13559,14 @@
         <w:rPr>
           <w:rFonts w:ascii="Garamond" w:eastAsia="Garamond" w:hAnsi="Garamond" w:cs="Garamond"/>
         </w:rPr>
-        <w:t xml:space="preserve">Será información confidencial cualquier información técnica, comercial, financiera, estratégica, legal y/o de cualquier naturaleza relacionada con las operaciones de negocios presente y futuros de las Partes intervinientes en este Acuerdo de Cooperación, las cuales se revelen y/o entreguen por escrito entre estas, indicando expresamente que dicha información es confidencial o que una Persona al momento de la revelación pueda presumir bajo las circunstancias concretas en que se dio la revelación, que dicha </w:t>
+        <w:t xml:space="preserve">Será información confidencial cualquier información técnica, comercial, financiera, estratégica, legal y/o de cualquier naturaleza relacionada con las operaciones de negocios presente y futuros de las Partes intervinientes en este Acuerdo de Cooperación, las cuales se revelen y/o entreguen por escrito entre estas, indicando expresamente que dicha información es confidencial o que una Persona al momento de la </w:t>
       </w:r>
       <w:r>
         <w:rPr>
           <w:rFonts w:ascii="Garamond" w:eastAsia="Garamond" w:hAnsi="Garamond" w:cs="Garamond"/>
         </w:rPr>
         <w:lastRenderedPageBreak/>
-        <w:t xml:space="preserve">información es confidencial. Se aclara que la información relacionada con las ventas del Aliado Comercial a través de la Plataforma Rappi no corresponde a información confidencial. Igualmente, el Aliado Comercial acepta y reconoce que la información de ventas y niveles mínimos de servicio será compartida por parte de Rappi con el Aliado Comercial sin que esto implique un incumplimiento de la presente Cláusula. </w:t>
+        <w:t xml:space="preserve">revelación pueda presumir bajo las circunstancias concretas en que se dio la revelación, que dicha información es confidencial. Se aclara que la información relacionada con las ventas del Aliado Comercial a través de la Plataforma Rappi no corresponde a información confidencial. Igualmente, el Aliado Comercial acepta y reconoce que la información de ventas y niveles mínimos de servicio será compartida por parte de Rappi con el Aliado Comercial sin que esto implique un incumplimiento de la presente Cláusula. </w:t>
       </w:r>
     </w:p>
     <w:p>
@@ -14144,14 +14197,14 @@
         <w:rPr>
           <w:rFonts w:ascii="Garamond" w:eastAsia="Garamond" w:hAnsi="Garamond" w:cs="Garamond"/>
         </w:rPr>
-        <w:t xml:space="preserve">Las Partes acuerdan mantenerse indemnes respecto de terceros que pudieran ser afectados por una de las Partes por el </w:t>
+        <w:t xml:space="preserve">Las Partes acuerdan </w:t>
       </w:r>
       <w:r>
         <w:rPr>
           <w:rFonts w:ascii="Garamond" w:eastAsia="Garamond" w:hAnsi="Garamond" w:cs="Garamond"/>
         </w:rPr>
         <w:lastRenderedPageBreak/>
-        <w:t>incumplimiento de este Acuerdo de Cooperación y la Ley Aplicable. En atención a la obligación de mantenerse indemnes, responderán por los daños y/o perjuicios que sus acciones u omisiones pudieran causar a terceros y por los que la otra Parte pudiere resultar afectada.</w:t>
+        <w:t>mantenerse indemnes respecto de terceros que pudieran ser afectados por una de las Partes por el incumplimiento de este Acuerdo de Cooperación y la Ley Aplicable. En atención a la obligación de mantenerse indemnes, responderán por los daños y/o perjuicios que sus acciones u omisiones pudieran causar a terceros y por los que la otra Parte pudiere resultar afectada.</w:t>
       </w:r>
     </w:p>
     <w:p>
@@ -14826,14 +14879,8 @@
         <w:rPr>
           <w:rFonts w:ascii="Garamond" w:eastAsia="Garamond" w:hAnsi="Garamond" w:cs="Garamond"/>
         </w:rPr>
-        <w:t xml:space="preserve">Igualmente, en el caso en el que se identifique que el Aliado Comercial está haciendo uso indebido de los </w:t>
-      </w:r>
-      <w:r>
-        <w:rPr>
-          <w:rFonts w:ascii="Garamond" w:eastAsia="Garamond" w:hAnsi="Garamond" w:cs="Garamond"/>
-        </w:rPr>
         <w:lastRenderedPageBreak/>
-        <w:t>Datos Personales de los Usuarios/Consumidores transferidos por parte de Rappi para una finalidad diferente a la finalidad de Tratamiento establecida en la presente Cláusula, el Aliado Comercial será responsable de indemnizar los daños y perjuicios que dicho incumplimiento cause a Rappi o a terceros. La determinación y cuantificación de dichos daños y perjuicios se realizará conforme a la legislación aplicable, y el monto correspondiente deberá ser pagado por parte del Aliado Comercial mediante transferencia bancaria a la cuenta determinada por Rappi para dicho fin, dentro de los 30 (treinta) días calendario posteriores al envío de la notificación de incumplimiento.</w:t>
+        <w:t>Igualmente, en el caso en el que se identifique que el Aliado Comercial está haciendo uso indebido de los Datos Personales de los Usuarios/Consumidores transferidos por parte de Rappi para una finalidad diferente a la finalidad de Tratamiento establecida en la presente Cláusula, el Aliado Comercial será responsable de indemnizar los daños y perjuicios que dicho incumplimiento cause a Rappi o a terceros. La determinación y cuantificación de dichos daños y perjuicios se realizará conforme a la legislación aplicable, y el monto correspondiente deberá ser pagado por parte del Aliado Comercial mediante transferencia bancaria a la cuenta determinada por Rappi para dicho fin, dentro de los 30 (treinta) días calendario posteriores al envío de la notificación de incumplimiento.</w:t>
       </w:r>
     </w:p>
     <w:p>
@@ -15418,14 +15465,14 @@
         <w:rPr>
           <w:rFonts w:ascii="Garamond" w:eastAsia="Garamond" w:hAnsi="Garamond" w:cs="Garamond"/>
         </w:rPr>
-        <w:t xml:space="preserve">. En caso de inestabilidad o inconvenientes técnicos mayores, Rappi no tendrá responsabilidad alguna </w:t>
+        <w:t xml:space="preserve">. En caso </w:t>
       </w:r>
       <w:r>
         <w:rPr>
           <w:rFonts w:ascii="Garamond" w:eastAsia="Garamond" w:hAnsi="Garamond" w:cs="Garamond"/>
         </w:rPr>
         <w:lastRenderedPageBreak/>
-        <w:t>frente al Aliado Comercial, pero hará sus mejores esfuerzos para estabilizar su operatividad.</w:t>
+        <w:t>de inestabilidad o inconvenientes técnicos mayores, Rappi no tendrá responsabilidad alguna frente al Aliado Comercial, pero hará sus mejores esfuerzos para estabilizar su operatividad.</w:t>
       </w:r>
       <w:r>
         <w:rPr>
@@ -16122,14 +16169,14 @@
         <w:rPr>
           <w:rFonts w:ascii="Garamond" w:eastAsia="Garamond" w:hAnsi="Garamond" w:cs="Garamond"/>
         </w:rPr>
-        <w:t xml:space="preserve">En caso de incumplimiento por parte del Aliado Comercial de alguna de las disposiciones del presente Acuerdo de Cooperación, el Aliado Comercial autoriza expresamente </w:t>
+        <w:t xml:space="preserve">En caso de incumplimiento por parte del Aliado Comercial de alguna de las </w:t>
       </w:r>
       <w:r>
         <w:rPr>
           <w:rFonts w:ascii="Garamond" w:eastAsia="Garamond" w:hAnsi="Garamond" w:cs="Garamond"/>
         </w:rPr>
         <w:lastRenderedPageBreak/>
-        <w:t xml:space="preserve">a Rappi para ejecutar las penalidades y liquidar cualquier adeudo que se tuviere a la fecha, reteniendo para tal efecto las cantidades correspondientes de las ventas semanales de Productos a través de la Plataforma Rappi. </w:t>
+        <w:t xml:space="preserve">disposiciones del presente Acuerdo de Cooperación, el Aliado Comercial autoriza expresamente a Rappi para ejecutar las penalidades y liquidar cualquier adeudo que se tuviere a la fecha, reteniendo para tal efecto las cantidades correspondientes de las ventas semanales de Productos a través de la Plataforma Rappi. </w:t>
       </w:r>
     </w:p>
     <w:p>
@@ -16482,6 +16529,7 @@
           <w:b/>
           <w:bCs/>
         </w:rPr>
+        <w:lastRenderedPageBreak/>
         <w:t>(</w:t>
       </w:r>
       <w:proofErr w:type="spellStart"/>
@@ -16525,14 +16573,7 @@
         <w:rPr>
           <w:rFonts w:ascii="Garamond" w:eastAsia="Garamond" w:hAnsi="Garamond" w:cs="Garamond"/>
         </w:rPr>
-        <w:t xml:space="preserve">El Aliado Comercial se compromete a no tener ni mantener una relación </w:t>
-      </w:r>
-      <w:r>
-        <w:rPr>
-          <w:rFonts w:ascii="Garamond" w:eastAsia="Garamond" w:hAnsi="Garamond" w:cs="Garamond"/>
-        </w:rPr>
-        <w:lastRenderedPageBreak/>
-        <w:t xml:space="preserve">comercial con un proveedor que incumpla con la Ley Aplicable con relación a: </w:t>
+        <w:t xml:space="preserve">El Aliado Comercial se compromete a no tener ni mantener una relación comercial con un proveedor que incumpla con la Ley Aplicable con relación a: </w:t>
       </w:r>
       <w:r>
         <w:rPr>

</xml_diff>

<commit_message>
se actualiza resolución de conflictos
</commit_message>
<xml_diff>
--- a/formatos/New_draft/acuerdo_con_ads_juridica.docx
+++ b/formatos/New_draft/acuerdo_con_ads_juridica.docx
@@ -8412,92 +8412,14 @@
           <w:sz w:val="23"/>
           <w:szCs w:val="23"/>
           <w:u w:val="single"/>
-          <w:lang w:val="es-MX"/>
-        </w:rPr>
-        <w:t xml:space="preserve">CLÁUSULA </w:t>
-      </w:r>
-      <w:proofErr w:type="gramStart"/>
-      <w:r>
-        <w:rPr>
-          <w:rFonts w:ascii="Garamond" w:eastAsia="Garamond" w:hAnsi="Garamond" w:cs="Garamond"/>
-          <w:b/>
-          <w:bCs/>
-          <w:sz w:val="23"/>
-          <w:szCs w:val="23"/>
-          <w:u w:val="single"/>
-          <w:lang w:val="es-MX"/>
-        </w:rPr>
-        <w:t xml:space="preserve">{{ </w:t>
-      </w:r>
-      <w:proofErr w:type="spellStart"/>
-      <w:r>
-        <w:rPr>
-          <w:rFonts w:ascii="Garamond" w:eastAsia="Garamond" w:hAnsi="Garamond" w:cs="Garamond"/>
-          <w:b/>
-          <w:bCs/>
-          <w:sz w:val="23"/>
-          <w:szCs w:val="23"/>
-          <w:u w:val="single"/>
-          <w:lang w:val="es-MX"/>
-        </w:rPr>
-        <w:t>NUM</w:t>
-      </w:r>
-      <w:proofErr w:type="gramEnd"/>
-      <w:r>
-        <w:rPr>
-          <w:rFonts w:ascii="Garamond" w:eastAsia="Garamond" w:hAnsi="Garamond" w:cs="Garamond"/>
-          <w:b/>
-          <w:bCs/>
-          <w:sz w:val="23"/>
-          <w:szCs w:val="23"/>
-          <w:u w:val="single"/>
-          <w:lang w:val="es-MX"/>
-        </w:rPr>
-        <w:t>_SEMI_EXCLUSIVIDAD|</w:t>
-      </w:r>
-      <w:proofErr w:type="gramStart"/>
-      <w:r>
-        <w:rPr>
-          <w:rFonts w:ascii="Garamond" w:eastAsia="Garamond" w:hAnsi="Garamond" w:cs="Garamond"/>
-          <w:b/>
-          <w:bCs/>
-          <w:sz w:val="23"/>
-          <w:szCs w:val="23"/>
-          <w:u w:val="single"/>
-          <w:lang w:val="es-MX"/>
-        </w:rPr>
-        <w:t>upper</w:t>
-      </w:r>
-      <w:proofErr w:type="spellEnd"/>
-      <w:r>
-        <w:rPr>
-          <w:rFonts w:ascii="Garamond" w:eastAsia="Garamond" w:hAnsi="Garamond" w:cs="Garamond"/>
-          <w:b/>
-          <w:bCs/>
-          <w:sz w:val="23"/>
-          <w:szCs w:val="23"/>
-          <w:u w:val="single"/>
-          <w:lang w:val="es-MX"/>
-        </w:rPr>
-        <w:t xml:space="preserve"> }</w:t>
-      </w:r>
-      <w:proofErr w:type="gramEnd"/>
-      <w:r>
-        <w:rPr>
-          <w:rFonts w:ascii="Garamond" w:eastAsia="Garamond" w:hAnsi="Garamond" w:cs="Garamond"/>
-          <w:b/>
-          <w:bCs/>
-          <w:sz w:val="23"/>
-          <w:szCs w:val="23"/>
-          <w:u w:val="single"/>
-          <w:lang w:val="es-MX"/>
-        </w:rPr>
-        <w:t>}. - Semi Exclusividad.</w:t>
-      </w:r>
-      <w:r>
-        <w:rPr>
-          <w:rFonts w:ascii="Garamond" w:eastAsia="Garamond" w:hAnsi="Garamond" w:cs="Garamond"/>
-          <w:lang w:val="es-MX"/>
+          <w:lang w:val="pt-PT"/>
+        </w:rPr>
+        <w:t>CLÁUSULA {{ NUM_SEMI_EXCLUSIVIDAD|upper }}. - Semi Exclusividad.</w:t>
+      </w:r>
+      <w:r>
+        <w:rPr>
+          <w:rFonts w:ascii="Garamond" w:eastAsia="Garamond" w:hAnsi="Garamond" w:cs="Garamond"/>
+          <w:lang w:val="pt-PT"/>
         </w:rPr>
         <w:t xml:space="preserve"> </w:t>
       </w:r>
@@ -14608,7 +14530,76 @@
           <w:bCs/>
           <w:u w:val="single"/>
         </w:rPr>
-        <w:t>Ley Aplicable y Domicilio Contractual</w:t>
+        <w:t>Ley Aplicable y Resolución de Conflictos.</w:t>
+      </w:r>
+      <w:r>
+        <w:rPr>
+          <w:rFonts w:ascii="Garamond" w:eastAsia="Garamond" w:hAnsi="Garamond" w:cs="Garamond"/>
+          <w:b/>
+          <w:bCs/>
+        </w:rPr>
+        <w:t xml:space="preserve"> </w:t>
+      </w:r>
+      <w:r>
+        <w:rPr>
+          <w:rFonts w:ascii="Garamond" w:eastAsia="Garamond" w:hAnsi="Garamond" w:cs="Garamond"/>
+        </w:rPr>
+        <w:t>Para la interpretación, cumplimiento y ejecución del presente contrato, las Partes se someten a las leyes vigentes en los Estados Unidos Mexicanos y a la jurisdicción de los tribunales competentes de la Ciudad de México, renunciando expresa e irrevocablemente a cualquier otro fuero que pudiera corresponderles por razón de sus domicilios presentes o futuros, o por cualquier otra causa.</w:t>
+      </w:r>
+    </w:p>
+    <w:p>
+      <w:pPr>
+        <w:ind w:left="720"/>
+        <w:jc w:val="both"/>
+        <w:rPr>
+          <w:rFonts w:ascii="Garamond" w:eastAsia="Garamond" w:hAnsi="Garamond" w:cs="Garamond"/>
+          <w:b/>
+          <w:bCs/>
+        </w:rPr>
+      </w:pPr>
+    </w:p>
+    <w:p>
+      <w:pPr>
+        <w:ind w:left="720"/>
+        <w:jc w:val="both"/>
+        <w:rPr>
+          <w:rFonts w:ascii="Garamond" w:eastAsia="Garamond" w:hAnsi="Garamond" w:cs="Garamond"/>
+        </w:rPr>
+      </w:pPr>
+      <w:r>
+        <w:rPr>
+          <w:rFonts w:ascii="Garamond" w:eastAsia="Garamond" w:hAnsi="Garamond" w:cs="Garamond"/>
+          <w:b/>
+          <w:bCs/>
+        </w:rPr>
+        <w:t>(</w:t>
+      </w:r>
+      <w:proofErr w:type="spellStart"/>
+      <w:r>
+        <w:rPr>
+          <w:rFonts w:ascii="Garamond" w:eastAsia="Garamond" w:hAnsi="Garamond" w:cs="Garamond"/>
+          <w:b/>
+          <w:bCs/>
+        </w:rPr>
+        <w:t>xii</w:t>
+      </w:r>
+      <w:proofErr w:type="spellEnd"/>
+      <w:r>
+        <w:rPr>
+          <w:rFonts w:ascii="Garamond" w:eastAsia="Garamond" w:hAnsi="Garamond" w:cs="Garamond"/>
+          <w:b/>
+          <w:bCs/>
+        </w:rPr>
+        <w:t xml:space="preserve">) </w:t>
+      </w:r>
+      <w:r>
+        <w:rPr>
+          <w:rFonts w:ascii="Garamond" w:eastAsia="Garamond" w:hAnsi="Garamond" w:cs="Garamond"/>
+          <w:b/>
+          <w:bCs/>
+          <w:u w:val="single"/>
+        </w:rPr>
+        <w:t>Autorización</w:t>
       </w:r>
       <w:r>
         <w:rPr>
@@ -14622,16 +14613,342 @@
         <w:rPr>
           <w:rFonts w:ascii="Garamond" w:eastAsia="Garamond" w:hAnsi="Garamond" w:cs="Garamond"/>
         </w:rPr>
-        <w:t>Para la interpretación y cumplimiento del presente Acuerdo de Cooperación, las Partes se someten a las leyes de los Estados Unidos Mexicanos. Para todos los efectos legales el domicilio contractual será la Ciudad de México, renunciando expresamente a cualquier otra jurisdicción que pudiera corresponderles en razón de sus domicilios presentes o futuros. No obstante, lo anterior, se aclara que para efectos tributarios el domicilio contractual corresponderá al municipio desde donde comercialice los Productos el Aliado Comercial.</w:t>
-      </w:r>
-      <w:r>
-        <w:rPr>
-          <w:rFonts w:ascii="Garamond" w:eastAsia="Garamond" w:hAnsi="Garamond" w:cs="Garamond"/>
-          <w:b/>
-          <w:bCs/>
+        <w:t xml:space="preserve">En caso de incumplimiento por parte del Aliado Comercial de alguna de las disposiciones del presente Acuerdo de Cooperación, el Aliado Comercial autoriza expresamente a Rappi para ejecutar las penalidades y liquidar cualquier adeudo que se tuviere a la fecha, </w:t>
+      </w:r>
+      <w:r>
+        <w:rPr>
+          <w:rFonts w:ascii="Garamond" w:eastAsia="Garamond" w:hAnsi="Garamond" w:cs="Garamond"/>
+        </w:rPr>
+        <w:lastRenderedPageBreak/>
+        <w:t xml:space="preserve">reteniendo para tal efecto las cantidades correspondientes de las ventas semanales de Productos a través de la Plataforma Rappi. </w:t>
+      </w:r>
+    </w:p>
+    <w:p>
+      <w:pPr>
+        <w:ind w:left="720"/>
+        <w:jc w:val="both"/>
+        <w:rPr>
+          <w:rFonts w:ascii="Garamond" w:eastAsia="Garamond" w:hAnsi="Garamond" w:cs="Garamond"/>
+        </w:rPr>
+      </w:pPr>
+    </w:p>
+    <w:p>
+      <w:pPr>
+        <w:ind w:left="720"/>
+        <w:jc w:val="both"/>
+        <w:rPr>
+          <w:rFonts w:ascii="Garamond" w:eastAsia="Garamond" w:hAnsi="Garamond" w:cs="Garamond"/>
+        </w:rPr>
+      </w:pPr>
+      <w:r>
+        <w:rPr>
+          <w:rFonts w:ascii="Garamond" w:eastAsia="Garamond" w:hAnsi="Garamond" w:cs="Garamond"/>
+          <w:b/>
+          <w:bCs/>
+        </w:rPr>
+        <w:t>(</w:t>
+      </w:r>
+      <w:proofErr w:type="spellStart"/>
+      <w:r>
+        <w:rPr>
+          <w:rFonts w:ascii="Garamond" w:eastAsia="Garamond" w:hAnsi="Garamond" w:cs="Garamond"/>
+          <w:b/>
+          <w:bCs/>
+        </w:rPr>
+        <w:t>xiii</w:t>
+      </w:r>
+      <w:proofErr w:type="spellEnd"/>
+      <w:r>
+        <w:rPr>
+          <w:rFonts w:ascii="Garamond" w:eastAsia="Garamond" w:hAnsi="Garamond" w:cs="Garamond"/>
+          <w:b/>
+          <w:bCs/>
+        </w:rPr>
+        <w:t xml:space="preserve">) </w:t>
+      </w:r>
+      <w:r>
+        <w:rPr>
+          <w:rFonts w:ascii="Garamond" w:eastAsia="Garamond" w:hAnsi="Garamond" w:cs="Garamond"/>
+          <w:b/>
+          <w:bCs/>
+          <w:u w:val="single"/>
+        </w:rPr>
+        <w:t>Declaración de Origen de Fondos y Financiación del Terrorismo</w:t>
+      </w:r>
+      <w:r>
+        <w:rPr>
+          <w:rFonts w:ascii="Garamond" w:eastAsia="Garamond" w:hAnsi="Garamond" w:cs="Garamond"/>
+          <w:b/>
+          <w:bCs/>
+        </w:rPr>
+        <w:t xml:space="preserve">. </w:t>
+      </w:r>
+      <w:r>
+        <w:rPr>
+          <w:rFonts w:ascii="Garamond" w:eastAsia="Garamond" w:hAnsi="Garamond" w:cs="Garamond"/>
+        </w:rPr>
+        <w:t xml:space="preserve">Las Partes declaran que sus ingresos provienen de actividades lícitas, que no se encuentran incluidas en listas para el control de lavado de activos y financiación del terrorismo, administradas por cualquier autoridad nacional o extranjera, y que, en consecuencia, se obligan a responder por todos los daños y/o perjuicios que llegasen a causar como consecuencia de esta afirmación. Conforme a lo anterior, cualquiera de las Partes podrá terminar el presente Acuerdo de Cooperación en el caso en el que la otra Parte sea incluida en la lista de la Oficina de Control de Activos en el Exterior – OFAC emitida por la Oficina del Tesoro de los Estados Unidos de Norte América, la lista de la Organización de las Naciones Unidas y otras listas públicas relacionadas con el tema de lavado de activos y financiación del terrorismo. </w:t>
+      </w:r>
+    </w:p>
+    <w:p>
+      <w:pPr>
+        <w:ind w:left="720"/>
+        <w:jc w:val="both"/>
+        <w:rPr>
+          <w:rFonts w:ascii="Garamond" w:eastAsia="Garamond" w:hAnsi="Garamond" w:cs="Garamond"/>
+        </w:rPr>
+      </w:pPr>
+    </w:p>
+    <w:p>
+      <w:pPr>
+        <w:ind w:left="720"/>
+        <w:jc w:val="both"/>
+        <w:rPr>
+          <w:rFonts w:ascii="Garamond" w:eastAsia="Garamond" w:hAnsi="Garamond" w:cs="Garamond"/>
+        </w:rPr>
+      </w:pPr>
+      <w:r>
+        <w:rPr>
+          <w:rFonts w:ascii="Garamond" w:eastAsia="Garamond" w:hAnsi="Garamond" w:cs="Garamond"/>
+          <w:b/>
+          <w:bCs/>
+        </w:rPr>
+        <w:t>(</w:t>
+      </w:r>
+      <w:proofErr w:type="spellStart"/>
+      <w:r>
+        <w:rPr>
+          <w:rFonts w:ascii="Garamond" w:eastAsia="Garamond" w:hAnsi="Garamond" w:cs="Garamond"/>
+          <w:b/>
+          <w:bCs/>
+        </w:rPr>
+        <w:t>xiv</w:t>
+      </w:r>
+      <w:proofErr w:type="spellEnd"/>
+      <w:r>
+        <w:rPr>
+          <w:rFonts w:ascii="Garamond" w:eastAsia="Garamond" w:hAnsi="Garamond" w:cs="Garamond"/>
+          <w:b/>
+          <w:bCs/>
+        </w:rPr>
+        <w:t xml:space="preserve">) </w:t>
+      </w:r>
+      <w:r>
+        <w:rPr>
+          <w:rFonts w:ascii="Garamond" w:eastAsia="Garamond" w:hAnsi="Garamond" w:cs="Garamond"/>
+          <w:b/>
+          <w:bCs/>
+          <w:u w:val="single"/>
+        </w:rPr>
+        <w:t>Política de Gestión y Código de Ética</w:t>
+      </w:r>
+      <w:r>
+        <w:rPr>
+          <w:rFonts w:ascii="Garamond" w:eastAsia="Garamond" w:hAnsi="Garamond" w:cs="Garamond"/>
+          <w:b/>
+          <w:bCs/>
+        </w:rPr>
+        <w:t>.</w:t>
+      </w:r>
+      <w:r>
+        <w:rPr>
+          <w:rFonts w:ascii="Garamond" w:eastAsia="Garamond" w:hAnsi="Garamond" w:cs="Garamond"/>
+        </w:rPr>
+        <w:t xml:space="preserve"> El Aliado Comercial acepta conocer y cumplir la Política de Gestión para la Prevención y Control del Riesgo de Lavado de Activos y de la Financiación del Terrorismo y el Código de Ética de Rappi. </w:t>
+      </w:r>
+    </w:p>
+    <w:p>
+      <w:pPr>
+        <w:ind w:left="720"/>
+        <w:jc w:val="both"/>
+        <w:rPr>
+          <w:rFonts w:ascii="Garamond" w:eastAsia="Garamond" w:hAnsi="Garamond" w:cs="Garamond"/>
+        </w:rPr>
+      </w:pPr>
+    </w:p>
+    <w:p>
+      <w:pPr>
+        <w:ind w:left="720"/>
+        <w:jc w:val="both"/>
+        <w:rPr>
+          <w:rFonts w:ascii="Garamond" w:eastAsia="Garamond" w:hAnsi="Garamond" w:cs="Garamond"/>
+        </w:rPr>
+      </w:pPr>
+      <w:r>
+        <w:rPr>
+          <w:rFonts w:ascii="Garamond" w:eastAsia="Garamond" w:hAnsi="Garamond" w:cs="Garamond"/>
+          <w:b/>
+          <w:bCs/>
+        </w:rPr>
+        <w:t>(</w:t>
+      </w:r>
+      <w:proofErr w:type="spellStart"/>
+      <w:r>
+        <w:rPr>
+          <w:rFonts w:ascii="Garamond" w:eastAsia="Garamond" w:hAnsi="Garamond" w:cs="Garamond"/>
+          <w:b/>
+          <w:bCs/>
+        </w:rPr>
+        <w:t>xv</w:t>
+      </w:r>
+      <w:proofErr w:type="spellEnd"/>
+      <w:r>
+        <w:rPr>
+          <w:rFonts w:ascii="Garamond" w:eastAsia="Garamond" w:hAnsi="Garamond" w:cs="Garamond"/>
+          <w:b/>
+          <w:bCs/>
+        </w:rPr>
+        <w:t>)</w:t>
+      </w:r>
+      <w:r>
+        <w:rPr>
+          <w:rFonts w:ascii="Garamond" w:eastAsia="Garamond" w:hAnsi="Garamond" w:cs="Garamond"/>
         </w:rPr>
         <w:t xml:space="preserve"> </w:t>
       </w:r>
+      <w:r>
+        <w:rPr>
+          <w:rFonts w:ascii="Garamond" w:eastAsia="Garamond" w:hAnsi="Garamond" w:cs="Garamond"/>
+          <w:b/>
+          <w:bCs/>
+          <w:u w:val="single"/>
+        </w:rPr>
+        <w:t>Ética en los Negocios y Anticorrupción</w:t>
+      </w:r>
+      <w:r>
+        <w:rPr>
+          <w:rFonts w:ascii="Garamond" w:eastAsia="Garamond" w:hAnsi="Garamond" w:cs="Garamond"/>
+          <w:b/>
+          <w:bCs/>
+        </w:rPr>
+        <w:t xml:space="preserve">. </w:t>
+      </w:r>
+      <w:r>
+        <w:rPr>
+          <w:rFonts w:ascii="Garamond" w:eastAsia="Garamond" w:hAnsi="Garamond" w:cs="Garamond"/>
+        </w:rPr>
+        <w:t xml:space="preserve">Las Partes se comprometen a implementar mecanismos de control interno con el fin de evitar que se presenten actos de corrupción en las negociaciones que se lleven a cabo. De acuerdo con lo anterior, las Partes se obligan a no recibir ni ofrecer, directa o indirectamente, de y a los empleados, administradores, o subordinados de la otra Parte: </w:t>
+      </w:r>
+      <w:r>
+        <w:rPr>
+          <w:rFonts w:ascii="Garamond" w:eastAsia="Garamond" w:hAnsi="Garamond" w:cs="Garamond"/>
+          <w:b/>
+          <w:bCs/>
+        </w:rPr>
+        <w:t>(i)</w:t>
+      </w:r>
+      <w:r>
+        <w:rPr>
+          <w:rFonts w:ascii="Garamond" w:eastAsia="Garamond" w:hAnsi="Garamond" w:cs="Garamond"/>
+        </w:rPr>
+        <w:t xml:space="preserve"> sumas de dinero, </w:t>
+      </w:r>
+      <w:r>
+        <w:rPr>
+          <w:rFonts w:ascii="Garamond" w:eastAsia="Garamond" w:hAnsi="Garamond" w:cs="Garamond"/>
+          <w:b/>
+          <w:bCs/>
+        </w:rPr>
+        <w:t>(</w:t>
+      </w:r>
+      <w:proofErr w:type="spellStart"/>
+      <w:r>
+        <w:rPr>
+          <w:rFonts w:ascii="Garamond" w:eastAsia="Garamond" w:hAnsi="Garamond" w:cs="Garamond"/>
+          <w:b/>
+          <w:bCs/>
+        </w:rPr>
+        <w:t>ii</w:t>
+      </w:r>
+      <w:proofErr w:type="spellEnd"/>
+      <w:r>
+        <w:rPr>
+          <w:rFonts w:ascii="Garamond" w:eastAsia="Garamond" w:hAnsi="Garamond" w:cs="Garamond"/>
+          <w:b/>
+          <w:bCs/>
+        </w:rPr>
+        <w:t>)</w:t>
+      </w:r>
+      <w:r>
+        <w:rPr>
+          <w:rFonts w:ascii="Garamond" w:eastAsia="Garamond" w:hAnsi="Garamond" w:cs="Garamond"/>
+        </w:rPr>
+        <w:t xml:space="preserve"> cualquier objeto de valor pecuniario; u </w:t>
+      </w:r>
+      <w:r>
+        <w:rPr>
+          <w:rFonts w:ascii="Garamond" w:eastAsia="Garamond" w:hAnsi="Garamond" w:cs="Garamond"/>
+          <w:b/>
+          <w:bCs/>
+        </w:rPr>
+        <w:t>(</w:t>
+      </w:r>
+      <w:proofErr w:type="spellStart"/>
+      <w:r>
+        <w:rPr>
+          <w:rFonts w:ascii="Garamond" w:eastAsia="Garamond" w:hAnsi="Garamond" w:cs="Garamond"/>
+          <w:b/>
+          <w:bCs/>
+        </w:rPr>
+        <w:t>iii</w:t>
+      </w:r>
+      <w:proofErr w:type="spellEnd"/>
+      <w:r>
+        <w:rPr>
+          <w:rFonts w:ascii="Garamond" w:eastAsia="Garamond" w:hAnsi="Garamond" w:cs="Garamond"/>
+          <w:b/>
+          <w:bCs/>
+        </w:rPr>
+        <w:t>)</w:t>
+      </w:r>
+      <w:r>
+        <w:rPr>
+          <w:rFonts w:ascii="Garamond" w:eastAsia="Garamond" w:hAnsi="Garamond" w:cs="Garamond"/>
+        </w:rPr>
+        <w:t xml:space="preserve"> otro beneficio o utilidad, a cambio de:</w:t>
+      </w:r>
+      <w:r>
+        <w:rPr>
+          <w:rFonts w:ascii="Garamond" w:eastAsia="Garamond" w:hAnsi="Garamond" w:cs="Garamond"/>
+          <w:b/>
+          <w:bCs/>
+        </w:rPr>
+        <w:t xml:space="preserve"> (a) </w:t>
+      </w:r>
+      <w:r>
+        <w:rPr>
+          <w:rFonts w:ascii="Garamond" w:eastAsia="Garamond" w:hAnsi="Garamond" w:cs="Garamond"/>
+        </w:rPr>
+        <w:t xml:space="preserve">realizar; </w:t>
+      </w:r>
+      <w:r>
+        <w:rPr>
+          <w:rFonts w:ascii="Garamond" w:eastAsia="Garamond" w:hAnsi="Garamond" w:cs="Garamond"/>
+          <w:b/>
+          <w:bCs/>
+        </w:rPr>
+        <w:t>(b)</w:t>
+      </w:r>
+      <w:r>
+        <w:rPr>
+          <w:rFonts w:ascii="Garamond" w:eastAsia="Garamond" w:hAnsi="Garamond" w:cs="Garamond"/>
+        </w:rPr>
+        <w:t xml:space="preserve"> omitir; o </w:t>
+      </w:r>
+      <w:r>
+        <w:rPr>
+          <w:rFonts w:ascii="Garamond" w:eastAsia="Garamond" w:hAnsi="Garamond" w:cs="Garamond"/>
+          <w:b/>
+          <w:bCs/>
+        </w:rPr>
+        <w:t>(c)</w:t>
+      </w:r>
+      <w:r>
+        <w:rPr>
+          <w:rFonts w:ascii="Garamond" w:eastAsia="Garamond" w:hAnsi="Garamond" w:cs="Garamond"/>
+        </w:rPr>
+        <w:t xml:space="preserve"> retardar, cualquier acto relacionado con el ejercicio de sus funciones. Las Partes declaran y garantizan que tanto ellas como sus funcionarios, empleados, directivos,  o subcontratistas cumplen la Ley Aplicable en materia de anticorrupción, incluyendo, pero sin limitarse a la Ley General de Responsabilidades Administrativas, la Ley sobre Prácticas Corruptas en el Extranjero de EE.UU. de 1977, la Ley sobre Sobornos del Reino Unido de 2010 o aquellas que la modifiquen, subroguen, reglamenten o desarrollen, así como aquellas regulaciones nacionales e internacionales relativas a la prevención del fraude, el soborno, la corrupción, el lavado de dinero y el terrorismo. Igualmente, las Partes declaran y garantizan que ni ellas ni sus funcionarios, empleados, directivos, o subcontratistas son objeto de investigaciones, acusaciones o procesos relativos a la violación de la Ley Aplicable en materia de anticorrupción ni han sido objeto de sanciones penales, disciplinarias o contractuales derivadas de la violación de tal Ley Aplicable. Las Partes se obligan a cumplir la Ley Aplicable en materia de anticorrupción y declaran que cualquier incumplimiento constituye una violación al presente Acuerdo de Cooperación, que da derecho exclusivo a la otra Parte de terminar el presente Acuerdo de Cooperación.    Igualmente, cada Parte se obliga a notificar a la otra Parte cualquier notificación asociada a una investigación, procedimiento, sanción o similar, iniciado en su contra o en contra de cualquiera de sus funcionarios, empleados, directivos, o subcontratistas, dentro de las 24 (veinticuatro) horas siguientes a la fecha en la que tenga conocimiento de la notificación de la investigación. </w:t>
+      </w:r>
     </w:p>
     <w:p>
       <w:pPr>
@@ -14639,8 +14956,6 @@
         <w:jc w:val="both"/>
         <w:rPr>
           <w:rFonts w:ascii="Garamond" w:eastAsia="Garamond" w:hAnsi="Garamond" w:cs="Garamond"/>
-          <w:b/>
-          <w:bCs/>
         </w:rPr>
       </w:pPr>
     </w:p>
@@ -14667,7 +14982,7 @@
           <w:b/>
           <w:bCs/>
         </w:rPr>
-        <w:t>xii</w:t>
+        <w:t>xvi</w:t>
       </w:r>
       <w:proofErr w:type="spellEnd"/>
       <w:r>
@@ -14678,15 +14993,17 @@
         </w:rPr>
         <w:t xml:space="preserve">) </w:t>
       </w:r>
-      <w:r>
-        <w:rPr>
-          <w:rFonts w:ascii="Garamond" w:eastAsia="Garamond" w:hAnsi="Garamond" w:cs="Garamond"/>
-          <w:b/>
-          <w:bCs/>
-          <w:u w:val="single"/>
-        </w:rPr>
-        <w:t>Autorización</w:t>
-      </w:r>
+      <w:proofErr w:type="spellStart"/>
+      <w:r>
+        <w:rPr>
+          <w:rFonts w:ascii="Garamond" w:eastAsia="Garamond" w:hAnsi="Garamond" w:cs="Garamond"/>
+          <w:b/>
+          <w:bCs/>
+          <w:u w:val="single"/>
+        </w:rPr>
+        <w:t>Sourcing</w:t>
+      </w:r>
+      <w:proofErr w:type="spellEnd"/>
       <w:r>
         <w:rPr>
           <w:rFonts w:ascii="Garamond" w:eastAsia="Garamond" w:hAnsi="Garamond" w:cs="Garamond"/>
@@ -14699,425 +15016,28 @@
         <w:rPr>
           <w:rFonts w:ascii="Garamond" w:eastAsia="Garamond" w:hAnsi="Garamond" w:cs="Garamond"/>
         </w:rPr>
-        <w:t xml:space="preserve">En caso de incumplimiento por parte del Aliado Comercial de alguna de las </w:t>
+        <w:t xml:space="preserve">El Aliado Comercial se compromete a no tener ni mantener una relación comercial con un proveedor que incumpla con la Ley Aplicable con relación a: </w:t>
+      </w:r>
+      <w:r>
+        <w:rPr>
+          <w:rFonts w:ascii="Garamond" w:eastAsia="Garamond" w:hAnsi="Garamond" w:cs="Garamond"/>
+          <w:b/>
+          <w:bCs/>
+        </w:rPr>
+        <w:t>(a)</w:t>
+      </w:r>
+      <w:r>
+        <w:rPr>
+          <w:rFonts w:ascii="Garamond" w:eastAsia="Garamond" w:hAnsi="Garamond" w:cs="Garamond"/>
+        </w:rPr>
+        <w:t xml:space="preserve"> la </w:t>
       </w:r>
       <w:r>
         <w:rPr>
           <w:rFonts w:ascii="Garamond" w:eastAsia="Garamond" w:hAnsi="Garamond" w:cs="Garamond"/>
         </w:rPr>
         <w:lastRenderedPageBreak/>
-        <w:t xml:space="preserve">disposiciones del presente Acuerdo de Cooperación, el Aliado Comercial autoriza expresamente a Rappi para ejecutar las penalidades y liquidar cualquier adeudo que se tuviere a la fecha, reteniendo para tal efecto las cantidades correspondientes de las ventas semanales de Productos a través de la Plataforma Rappi. </w:t>
-      </w:r>
-    </w:p>
-    <w:p>
-      <w:pPr>
-        <w:ind w:left="720"/>
-        <w:jc w:val="both"/>
-        <w:rPr>
-          <w:rFonts w:ascii="Garamond" w:eastAsia="Garamond" w:hAnsi="Garamond" w:cs="Garamond"/>
-        </w:rPr>
-      </w:pPr>
-    </w:p>
-    <w:p>
-      <w:pPr>
-        <w:ind w:left="720"/>
-        <w:jc w:val="both"/>
-        <w:rPr>
-          <w:rFonts w:ascii="Garamond" w:eastAsia="Garamond" w:hAnsi="Garamond" w:cs="Garamond"/>
-        </w:rPr>
-      </w:pPr>
-      <w:r>
-        <w:rPr>
-          <w:rFonts w:ascii="Garamond" w:eastAsia="Garamond" w:hAnsi="Garamond" w:cs="Garamond"/>
-          <w:b/>
-          <w:bCs/>
-        </w:rPr>
-        <w:t>(</w:t>
-      </w:r>
-      <w:proofErr w:type="spellStart"/>
-      <w:r>
-        <w:rPr>
-          <w:rFonts w:ascii="Garamond" w:eastAsia="Garamond" w:hAnsi="Garamond" w:cs="Garamond"/>
-          <w:b/>
-          <w:bCs/>
-        </w:rPr>
-        <w:t>xiii</w:t>
-      </w:r>
-      <w:proofErr w:type="spellEnd"/>
-      <w:r>
-        <w:rPr>
-          <w:rFonts w:ascii="Garamond" w:eastAsia="Garamond" w:hAnsi="Garamond" w:cs="Garamond"/>
-          <w:b/>
-          <w:bCs/>
-        </w:rPr>
-        <w:t xml:space="preserve">) </w:t>
-      </w:r>
-      <w:r>
-        <w:rPr>
-          <w:rFonts w:ascii="Garamond" w:eastAsia="Garamond" w:hAnsi="Garamond" w:cs="Garamond"/>
-          <w:b/>
-          <w:bCs/>
-          <w:u w:val="single"/>
-        </w:rPr>
-        <w:t>Declaración de Origen de Fondos y Financiación del Terrorismo</w:t>
-      </w:r>
-      <w:r>
-        <w:rPr>
-          <w:rFonts w:ascii="Garamond" w:eastAsia="Garamond" w:hAnsi="Garamond" w:cs="Garamond"/>
-          <w:b/>
-          <w:bCs/>
-        </w:rPr>
-        <w:t xml:space="preserve">. </w:t>
-      </w:r>
-      <w:r>
-        <w:rPr>
-          <w:rFonts w:ascii="Garamond" w:eastAsia="Garamond" w:hAnsi="Garamond" w:cs="Garamond"/>
-        </w:rPr>
-        <w:t xml:space="preserve">Las Partes declaran que sus ingresos provienen de actividades lícitas, que no se encuentran incluidas en listas para el control de lavado de activos y financiación del terrorismo, administradas por cualquier autoridad nacional o extranjera, y que, en consecuencia, se obligan a responder por todos los daños y/o perjuicios que llegasen a causar como consecuencia de esta afirmación. Conforme a lo anterior, cualquiera de las Partes podrá terminar el presente Acuerdo de Cooperación en el caso en el que la otra Parte sea incluida en la lista de la Oficina de Control de Activos en el Exterior – OFAC emitida por la Oficina del Tesoro de los Estados Unidos de Norte América, la lista de la Organización de las Naciones Unidas y otras listas públicas relacionadas con el tema de lavado de activos y financiación del terrorismo. </w:t>
-      </w:r>
-    </w:p>
-    <w:p>
-      <w:pPr>
-        <w:ind w:left="720"/>
-        <w:jc w:val="both"/>
-        <w:rPr>
-          <w:rFonts w:ascii="Garamond" w:eastAsia="Garamond" w:hAnsi="Garamond" w:cs="Garamond"/>
-        </w:rPr>
-      </w:pPr>
-    </w:p>
-    <w:p>
-      <w:pPr>
-        <w:ind w:left="720"/>
-        <w:jc w:val="both"/>
-        <w:rPr>
-          <w:rFonts w:ascii="Garamond" w:eastAsia="Garamond" w:hAnsi="Garamond" w:cs="Garamond"/>
-        </w:rPr>
-      </w:pPr>
-      <w:r>
-        <w:rPr>
-          <w:rFonts w:ascii="Garamond" w:eastAsia="Garamond" w:hAnsi="Garamond" w:cs="Garamond"/>
-          <w:b/>
-          <w:bCs/>
-        </w:rPr>
-        <w:t>(</w:t>
-      </w:r>
-      <w:proofErr w:type="spellStart"/>
-      <w:r>
-        <w:rPr>
-          <w:rFonts w:ascii="Garamond" w:eastAsia="Garamond" w:hAnsi="Garamond" w:cs="Garamond"/>
-          <w:b/>
-          <w:bCs/>
-        </w:rPr>
-        <w:t>xiv</w:t>
-      </w:r>
-      <w:proofErr w:type="spellEnd"/>
-      <w:r>
-        <w:rPr>
-          <w:rFonts w:ascii="Garamond" w:eastAsia="Garamond" w:hAnsi="Garamond" w:cs="Garamond"/>
-          <w:b/>
-          <w:bCs/>
-        </w:rPr>
-        <w:t xml:space="preserve">) </w:t>
-      </w:r>
-      <w:r>
-        <w:rPr>
-          <w:rFonts w:ascii="Garamond" w:eastAsia="Garamond" w:hAnsi="Garamond" w:cs="Garamond"/>
-          <w:b/>
-          <w:bCs/>
-          <w:u w:val="single"/>
-        </w:rPr>
-        <w:t>Política de Gestión y Código de Ética</w:t>
-      </w:r>
-      <w:r>
-        <w:rPr>
-          <w:rFonts w:ascii="Garamond" w:eastAsia="Garamond" w:hAnsi="Garamond" w:cs="Garamond"/>
-          <w:b/>
-          <w:bCs/>
-        </w:rPr>
-        <w:t>.</w:t>
-      </w:r>
-      <w:r>
-        <w:rPr>
-          <w:rFonts w:ascii="Garamond" w:eastAsia="Garamond" w:hAnsi="Garamond" w:cs="Garamond"/>
-        </w:rPr>
-        <w:t xml:space="preserve"> El Aliado Comercial acepta conocer y cumplir la Política de Gestión para la Prevención y Control del Riesgo de Lavado de Activos y de la Financiación del Terrorismo y el Código de Ética de Rappi. </w:t>
-      </w:r>
-    </w:p>
-    <w:p>
-      <w:pPr>
-        <w:ind w:left="720"/>
-        <w:jc w:val="both"/>
-        <w:rPr>
-          <w:rFonts w:ascii="Garamond" w:eastAsia="Garamond" w:hAnsi="Garamond" w:cs="Garamond"/>
-        </w:rPr>
-      </w:pPr>
-    </w:p>
-    <w:p>
-      <w:pPr>
-        <w:ind w:left="720"/>
-        <w:jc w:val="both"/>
-        <w:rPr>
-          <w:rFonts w:ascii="Garamond" w:eastAsia="Garamond" w:hAnsi="Garamond" w:cs="Garamond"/>
-        </w:rPr>
-      </w:pPr>
-      <w:r>
-        <w:rPr>
-          <w:rFonts w:ascii="Garamond" w:eastAsia="Garamond" w:hAnsi="Garamond" w:cs="Garamond"/>
-          <w:b/>
-          <w:bCs/>
-        </w:rPr>
-        <w:t>(</w:t>
-      </w:r>
-      <w:proofErr w:type="spellStart"/>
-      <w:r>
-        <w:rPr>
-          <w:rFonts w:ascii="Garamond" w:eastAsia="Garamond" w:hAnsi="Garamond" w:cs="Garamond"/>
-          <w:b/>
-          <w:bCs/>
-        </w:rPr>
-        <w:t>xv</w:t>
-      </w:r>
-      <w:proofErr w:type="spellEnd"/>
-      <w:r>
-        <w:rPr>
-          <w:rFonts w:ascii="Garamond" w:eastAsia="Garamond" w:hAnsi="Garamond" w:cs="Garamond"/>
-          <w:b/>
-          <w:bCs/>
-        </w:rPr>
-        <w:t>)</w:t>
-      </w:r>
-      <w:r>
-        <w:rPr>
-          <w:rFonts w:ascii="Garamond" w:eastAsia="Garamond" w:hAnsi="Garamond" w:cs="Garamond"/>
-        </w:rPr>
-        <w:t xml:space="preserve"> </w:t>
-      </w:r>
-      <w:r>
-        <w:rPr>
-          <w:rFonts w:ascii="Garamond" w:eastAsia="Garamond" w:hAnsi="Garamond" w:cs="Garamond"/>
-          <w:b/>
-          <w:bCs/>
-          <w:u w:val="single"/>
-        </w:rPr>
-        <w:t>Ética en los Negocios y Anticorrupción</w:t>
-      </w:r>
-      <w:r>
-        <w:rPr>
-          <w:rFonts w:ascii="Garamond" w:eastAsia="Garamond" w:hAnsi="Garamond" w:cs="Garamond"/>
-          <w:b/>
-          <w:bCs/>
-        </w:rPr>
-        <w:t xml:space="preserve">. </w:t>
-      </w:r>
-      <w:r>
-        <w:rPr>
-          <w:rFonts w:ascii="Garamond" w:eastAsia="Garamond" w:hAnsi="Garamond" w:cs="Garamond"/>
-        </w:rPr>
-        <w:t xml:space="preserve">Las Partes se comprometen a implementar mecanismos de control interno con el fin de evitar que se presenten actos de corrupción en las negociaciones que se lleven a cabo. De acuerdo con lo anterior, las Partes se obligan a no recibir ni ofrecer, directa o indirectamente, de y a los empleados, administradores, o subordinados de la otra Parte: </w:t>
-      </w:r>
-      <w:r>
-        <w:rPr>
-          <w:rFonts w:ascii="Garamond" w:eastAsia="Garamond" w:hAnsi="Garamond" w:cs="Garamond"/>
-          <w:b/>
-          <w:bCs/>
-        </w:rPr>
-        <w:t>(i)</w:t>
-      </w:r>
-      <w:r>
-        <w:rPr>
-          <w:rFonts w:ascii="Garamond" w:eastAsia="Garamond" w:hAnsi="Garamond" w:cs="Garamond"/>
-        </w:rPr>
-        <w:t xml:space="preserve"> sumas de dinero, </w:t>
-      </w:r>
-      <w:r>
-        <w:rPr>
-          <w:rFonts w:ascii="Garamond" w:eastAsia="Garamond" w:hAnsi="Garamond" w:cs="Garamond"/>
-          <w:b/>
-          <w:bCs/>
-        </w:rPr>
-        <w:t>(</w:t>
-      </w:r>
-      <w:proofErr w:type="spellStart"/>
-      <w:r>
-        <w:rPr>
-          <w:rFonts w:ascii="Garamond" w:eastAsia="Garamond" w:hAnsi="Garamond" w:cs="Garamond"/>
-          <w:b/>
-          <w:bCs/>
-        </w:rPr>
-        <w:t>ii</w:t>
-      </w:r>
-      <w:proofErr w:type="spellEnd"/>
-      <w:r>
-        <w:rPr>
-          <w:rFonts w:ascii="Garamond" w:eastAsia="Garamond" w:hAnsi="Garamond" w:cs="Garamond"/>
-          <w:b/>
-          <w:bCs/>
-        </w:rPr>
-        <w:t>)</w:t>
-      </w:r>
-      <w:r>
-        <w:rPr>
-          <w:rFonts w:ascii="Garamond" w:eastAsia="Garamond" w:hAnsi="Garamond" w:cs="Garamond"/>
-        </w:rPr>
-        <w:t xml:space="preserve"> cualquier objeto de valor pecuniario; u </w:t>
-      </w:r>
-      <w:r>
-        <w:rPr>
-          <w:rFonts w:ascii="Garamond" w:eastAsia="Garamond" w:hAnsi="Garamond" w:cs="Garamond"/>
-          <w:b/>
-          <w:bCs/>
-        </w:rPr>
-        <w:t>(</w:t>
-      </w:r>
-      <w:proofErr w:type="spellStart"/>
-      <w:r>
-        <w:rPr>
-          <w:rFonts w:ascii="Garamond" w:eastAsia="Garamond" w:hAnsi="Garamond" w:cs="Garamond"/>
-          <w:b/>
-          <w:bCs/>
-        </w:rPr>
-        <w:t>iii</w:t>
-      </w:r>
-      <w:proofErr w:type="spellEnd"/>
-      <w:r>
-        <w:rPr>
-          <w:rFonts w:ascii="Garamond" w:eastAsia="Garamond" w:hAnsi="Garamond" w:cs="Garamond"/>
-          <w:b/>
-          <w:bCs/>
-        </w:rPr>
-        <w:t>)</w:t>
-      </w:r>
-      <w:r>
-        <w:rPr>
-          <w:rFonts w:ascii="Garamond" w:eastAsia="Garamond" w:hAnsi="Garamond" w:cs="Garamond"/>
-        </w:rPr>
-        <w:t xml:space="preserve"> otro beneficio o utilidad, a cambio de:</w:t>
-      </w:r>
-      <w:r>
-        <w:rPr>
-          <w:rFonts w:ascii="Garamond" w:eastAsia="Garamond" w:hAnsi="Garamond" w:cs="Garamond"/>
-          <w:b/>
-          <w:bCs/>
-        </w:rPr>
-        <w:t xml:space="preserve"> (a) </w:t>
-      </w:r>
-      <w:r>
-        <w:rPr>
-          <w:rFonts w:ascii="Garamond" w:eastAsia="Garamond" w:hAnsi="Garamond" w:cs="Garamond"/>
-        </w:rPr>
-        <w:t xml:space="preserve">realizar; </w:t>
-      </w:r>
-      <w:r>
-        <w:rPr>
-          <w:rFonts w:ascii="Garamond" w:eastAsia="Garamond" w:hAnsi="Garamond" w:cs="Garamond"/>
-          <w:b/>
-          <w:bCs/>
-        </w:rPr>
-        <w:t>(b)</w:t>
-      </w:r>
-      <w:r>
-        <w:rPr>
-          <w:rFonts w:ascii="Garamond" w:eastAsia="Garamond" w:hAnsi="Garamond" w:cs="Garamond"/>
-        </w:rPr>
-        <w:t xml:space="preserve"> omitir; o </w:t>
-      </w:r>
-      <w:r>
-        <w:rPr>
-          <w:rFonts w:ascii="Garamond" w:eastAsia="Garamond" w:hAnsi="Garamond" w:cs="Garamond"/>
-          <w:b/>
-          <w:bCs/>
-        </w:rPr>
-        <w:t>(c)</w:t>
-      </w:r>
-      <w:r>
-        <w:rPr>
-          <w:rFonts w:ascii="Garamond" w:eastAsia="Garamond" w:hAnsi="Garamond" w:cs="Garamond"/>
-        </w:rPr>
-        <w:t xml:space="preserve"> retardar, cualquier acto relacionado con el ejercicio de sus funciones. Las Partes declaran y garantizan que tanto ellas como sus funcionarios, empleados, directivos,  o subcontratistas cumplen la Ley Aplicable en materia de anticorrupción, incluyendo, pero sin limitarse a la Ley General de Responsabilidades Administrativas, la Ley sobre Prácticas Corruptas en el Extranjero de EE.UU. de 1977, la Ley sobre Sobornos del Reino Unido de 2010 o aquellas que la modifiquen, subroguen, reglamenten o desarrollen, así como aquellas regulaciones nacionales e internacionales relativas a la prevención del fraude, el soborno, la corrupción, el lavado de dinero y el terrorismo. Igualmente, las Partes declaran y garantizan que ni ellas ni sus funcionarios, empleados, directivos, o subcontratistas son objeto de investigaciones, acusaciones o procesos relativos a la violación de la Ley Aplicable en materia de anticorrupción ni han sido objeto de sanciones penales, disciplinarias o contractuales derivadas de la violación de tal Ley Aplicable. Las Partes se obligan a cumplir la Ley Aplicable en materia de anticorrupción y declaran que cualquier incumplimiento constituye una violación al presente Acuerdo de Cooperación, que da derecho exclusivo a la otra Parte de terminar el presente Acuerdo de Cooperación.    Igualmente, cada Parte se obliga a notificar a la otra Parte cualquier notificación asociada a una investigación, procedimiento, sanción o similar, iniciado en su contra o en contra de cualquiera de sus funcionarios, empleados, directivos, o subcontratistas, dentro de las 24 (veinticuatro) horas siguientes a la fecha en la que tenga conocimiento de la notificación de la investigación. </w:t>
-      </w:r>
-    </w:p>
-    <w:p>
-      <w:pPr>
-        <w:ind w:left="720"/>
-        <w:jc w:val="both"/>
-        <w:rPr>
-          <w:rFonts w:ascii="Garamond" w:eastAsia="Garamond" w:hAnsi="Garamond" w:cs="Garamond"/>
-        </w:rPr>
-      </w:pPr>
-    </w:p>
-    <w:p>
-      <w:pPr>
-        <w:ind w:left="720"/>
-        <w:jc w:val="both"/>
-        <w:rPr>
-          <w:rFonts w:ascii="Garamond" w:eastAsia="Garamond" w:hAnsi="Garamond" w:cs="Garamond"/>
-        </w:rPr>
-      </w:pPr>
-      <w:r>
-        <w:rPr>
-          <w:rFonts w:ascii="Garamond" w:eastAsia="Garamond" w:hAnsi="Garamond" w:cs="Garamond"/>
-          <w:b/>
-          <w:bCs/>
-        </w:rPr>
-        <w:lastRenderedPageBreak/>
-        <w:t>(</w:t>
-      </w:r>
-      <w:proofErr w:type="spellStart"/>
-      <w:r>
-        <w:rPr>
-          <w:rFonts w:ascii="Garamond" w:eastAsia="Garamond" w:hAnsi="Garamond" w:cs="Garamond"/>
-          <w:b/>
-          <w:bCs/>
-        </w:rPr>
-        <w:t>xvi</w:t>
-      </w:r>
-      <w:proofErr w:type="spellEnd"/>
-      <w:r>
-        <w:rPr>
-          <w:rFonts w:ascii="Garamond" w:eastAsia="Garamond" w:hAnsi="Garamond" w:cs="Garamond"/>
-          <w:b/>
-          <w:bCs/>
-        </w:rPr>
-        <w:t xml:space="preserve">) </w:t>
-      </w:r>
-      <w:proofErr w:type="spellStart"/>
-      <w:r>
-        <w:rPr>
-          <w:rFonts w:ascii="Garamond" w:eastAsia="Garamond" w:hAnsi="Garamond" w:cs="Garamond"/>
-          <w:b/>
-          <w:bCs/>
-          <w:u w:val="single"/>
-        </w:rPr>
-        <w:t>Sourcing</w:t>
-      </w:r>
-      <w:proofErr w:type="spellEnd"/>
-      <w:r>
-        <w:rPr>
-          <w:rFonts w:ascii="Garamond" w:eastAsia="Garamond" w:hAnsi="Garamond" w:cs="Garamond"/>
-          <w:b/>
-          <w:bCs/>
-        </w:rPr>
-        <w:t xml:space="preserve">. </w:t>
-      </w:r>
-      <w:r>
-        <w:rPr>
-          <w:rFonts w:ascii="Garamond" w:eastAsia="Garamond" w:hAnsi="Garamond" w:cs="Garamond"/>
-        </w:rPr>
-        <w:t xml:space="preserve">El Aliado Comercial se compromete a no tener ni mantener una relación comercial con un proveedor que incumpla con la Ley Aplicable con relación a: </w:t>
-      </w:r>
-      <w:r>
-        <w:rPr>
-          <w:rFonts w:ascii="Garamond" w:eastAsia="Garamond" w:hAnsi="Garamond" w:cs="Garamond"/>
-          <w:b/>
-          <w:bCs/>
-        </w:rPr>
-        <w:t>(a)</w:t>
-      </w:r>
-      <w:r>
-        <w:rPr>
-          <w:rFonts w:ascii="Garamond" w:eastAsia="Garamond" w:hAnsi="Garamond" w:cs="Garamond"/>
-        </w:rPr>
-        <w:t xml:space="preserve"> la discriminación por motivos de raza o género; </w:t>
+        <w:t xml:space="preserve">discriminación por motivos de raza o género; </w:t>
       </w:r>
       <w:r>
         <w:rPr>

</xml_diff>